<commit_message>
Digest + summary: 2026-08-31
</commit_message>
<xml_diff>
--- a/NEEDS_DATA.docx
+++ b/NEEDS_DATA.docx
@@ -17,7 +17,7 @@
     </w:p>
     <w:p>
       <w:r>
-        <w:t xml:space="preserve">Generated 2026-08-30. Every field below was blank in the automated sources. Fill any of them in </w:t>
+        <w:t xml:space="preserve">Generated 2026-08-31. Every field below was blank in the automated sources. Fill any of them in </w:t>
       </w:r>
       <w:r>
         <w:rPr>
@@ -1387,7 +1387,7 @@
         <w:pStyle w:val="Heading2"/>
       </w:pPr>
       <w:r>
-        <w:t>Studies with no numeric performance figure (93 of 96)</w:t>
+        <w:t>Studies with no numeric performance figure (103 of 108)</w:t>
       </w:r>
     </w:p>
     <w:p>
@@ -2475,7 +2475,7 @@
               <w:rPr>
                 <w:sz w:val="16"/>
               </w:rPr>
-              <w:t>GRACE-1L-OAM, SevenNet-0, MACE-MP-0, MatterSim</w:t>
+              <w:t>GRACE-1L-OAM, SevenNet-0, MatterSim, MACE-MP-0</w:t>
             </w:r>
           </w:p>
         </w:tc>
@@ -3317,7 +3317,7 @@
               <w:rPr>
                 <w:sz w:val="16"/>
               </w:rPr>
-              <w:t>MatterSim, MatterGen</w:t>
+              <w:t>MatterGen, MatterSim</w:t>
             </w:r>
           </w:p>
         </w:tc>
@@ -3405,112 +3405,6 @@
                   <w:sz w:val="16"/>
                   <w:u w:val="single"/>
                 </w:rPr>
-                <w:t>Realistic Simulations of Energy Materials Using Foundation Models and Electrode-Potential Learning</w:t>
-              </w:r>
-            </w:hyperlink>
-          </w:p>
-        </w:tc>
-        <w:tc>
-          <w:tcPr>
-            <w:tcW w:type="dxa" w:w="1680"/>
-          </w:tcPr>
-          <w:p>
-            <w:pPr>
-              <w:jc w:val="left"/>
-            </w:pPr>
-            <w:r/>
-            <w:r>
-              <w:rPr>
-                <w:sz w:val="16"/>
-              </w:rPr>
-              <w:t>SevenNet</w:t>
-            </w:r>
-          </w:p>
-        </w:tc>
-        <w:tc>
-          <w:tcPr>
-            <w:tcW w:type="dxa" w:w="1680"/>
-          </w:tcPr>
-          <w:p>
-            <w:pPr>
-              <w:jc w:val="left"/>
-            </w:pPr>
-            <w:r/>
-          </w:p>
-        </w:tc>
-        <w:tc>
-          <w:tcPr>
-            <w:tcW w:type="dxa" w:w="1680"/>
-          </w:tcPr>
-          <w:p>
-            <w:pPr>
-              <w:jc w:val="left"/>
-            </w:pPr>
-            <w:r/>
-            <w:r>
-              <w:rPr>
-                <w:sz w:val="16"/>
-              </w:rPr>
-              <w:t>DFT, MLIP</w:t>
-            </w:r>
-          </w:p>
-        </w:tc>
-        <w:tc>
-          <w:tcPr>
-            <w:tcW w:type="dxa" w:w="1680"/>
-          </w:tcPr>
-          <w:p>
-            <w:pPr>
-              <w:jc w:val="left"/>
-            </w:pPr>
-            <w:r/>
-            <w:r>
-              <w:rPr>
-                <w:sz w:val="16"/>
-              </w:rPr>
-              <w:t>2026-08-26</w:t>
-            </w:r>
-          </w:p>
-        </w:tc>
-        <w:tc>
-          <w:tcPr>
-            <w:tcW w:type="dxa" w:w="1680"/>
-          </w:tcPr>
-          <w:p>
-            <w:pPr>
-              <w:jc w:val="left"/>
-            </w:pPr>
-            <w:r/>
-            <w:hyperlink r:id="rId51">
-              <w:r>
-                <w:rPr>
-                  <w:color w:val="0B4F9E"/>
-                  <w:sz w:val="16"/>
-                  <w:u w:val="single"/>
-                </w:rPr>
-                <w:t>10.26434/chemrxiv.15007895/v1</w:t>
-              </w:r>
-            </w:hyperlink>
-          </w:p>
-        </w:tc>
-      </w:tr>
-      <w:tr>
-        <w:tc>
-          <w:tcPr>
-            <w:tcW w:type="dxa" w:w="1680"/>
-          </w:tcPr>
-          <w:p>
-            <w:pPr>
-              <w:jc w:val="left"/>
-            </w:pPr>
-            <w:r/>
-            <w:hyperlink r:id="rId52">
-              <w:r>
-                <w:rPr>
-                  <w:color w:val="0B4F9E"/>
-                  <w:sz w:val="16"/>
-                  <w:u w:val="single"/>
-                </w:rPr>
                 <w:t>Grain-Boundary Premelting in High-Entropy Transition Metal Carbides</w:t>
               </w:r>
             </w:hyperlink>
@@ -3587,7 +3481,7 @@
               <w:jc w:val="left"/>
             </w:pPr>
             <w:r/>
-            <w:hyperlink r:id="rId52">
+            <w:hyperlink r:id="rId51">
               <w:r>
                 <w:rPr>
                   <w:color w:val="0B4F9E"/>
@@ -3610,7 +3504,7 @@
               <w:jc w:val="left"/>
             </w:pPr>
             <w:r/>
-            <w:hyperlink r:id="rId53">
+            <w:hyperlink r:id="rId52">
               <w:r>
                 <w:rPr>
                   <w:color w:val="0B4F9E"/>
@@ -3635,7 +3529,7 @@
               <w:rPr>
                 <w:sz w:val="16"/>
               </w:rPr>
-              <w:t>MatterSim, SevenNet, CHGNet, NequIP, MACE, UMA</w:t>
+              <w:t>MatterSim, SevenNet, NequIP, CHGNet, MACE, UMA</w:t>
             </w:r>
           </w:p>
         </w:tc>
@@ -3684,6 +3578,29 @@
             </w:r>
           </w:p>
         </w:tc>
+        <w:tc>
+          <w:tcPr>
+            <w:tcW w:type="dxa" w:w="1680"/>
+          </w:tcPr>
+          <w:p>
+            <w:pPr>
+              <w:jc w:val="left"/>
+            </w:pPr>
+            <w:r/>
+            <w:hyperlink r:id="rId52">
+              <w:r>
+                <w:rPr>
+                  <w:color w:val="0B4F9E"/>
+                  <w:sz w:val="16"/>
+                  <w:u w:val="single"/>
+                </w:rPr>
+                <w:t>10.5281/zenodo.21807793</w:t>
+              </w:r>
+            </w:hyperlink>
+          </w:p>
+        </w:tc>
+      </w:tr>
+      <w:tr>
         <w:tc>
           <w:tcPr>
             <w:tcW w:type="dxa" w:w="1680"/>
@@ -3700,7 +3617,90 @@
                   <w:sz w:val="16"/>
                   <w:u w:val="single"/>
                 </w:rPr>
-                <w:t>10.5281/zenodo.21807793</w:t>
+                <w:t>Realistic Simulations of Energy Materials Using Foundation Models and Electrode-Potential Learning</w:t>
+              </w:r>
+            </w:hyperlink>
+          </w:p>
+        </w:tc>
+        <w:tc>
+          <w:tcPr>
+            <w:tcW w:type="dxa" w:w="1680"/>
+          </w:tcPr>
+          <w:p>
+            <w:pPr>
+              <w:jc w:val="left"/>
+            </w:pPr>
+            <w:r/>
+            <w:r>
+              <w:rPr>
+                <w:sz w:val="16"/>
+              </w:rPr>
+              <w:t>SevenNet</w:t>
+            </w:r>
+          </w:p>
+        </w:tc>
+        <w:tc>
+          <w:tcPr>
+            <w:tcW w:type="dxa" w:w="1680"/>
+          </w:tcPr>
+          <w:p>
+            <w:pPr>
+              <w:jc w:val="left"/>
+            </w:pPr>
+            <w:r/>
+          </w:p>
+        </w:tc>
+        <w:tc>
+          <w:tcPr>
+            <w:tcW w:type="dxa" w:w="1680"/>
+          </w:tcPr>
+          <w:p>
+            <w:pPr>
+              <w:jc w:val="left"/>
+            </w:pPr>
+            <w:r/>
+            <w:r>
+              <w:rPr>
+                <w:sz w:val="16"/>
+              </w:rPr>
+              <w:t>DFT, MLIP</w:t>
+            </w:r>
+          </w:p>
+        </w:tc>
+        <w:tc>
+          <w:tcPr>
+            <w:tcW w:type="dxa" w:w="1680"/>
+          </w:tcPr>
+          <w:p>
+            <w:pPr>
+              <w:jc w:val="left"/>
+            </w:pPr>
+            <w:r/>
+            <w:r>
+              <w:rPr>
+                <w:sz w:val="16"/>
+              </w:rPr>
+              <w:t>2026-08-31</w:t>
+            </w:r>
+          </w:p>
+        </w:tc>
+        <w:tc>
+          <w:tcPr>
+            <w:tcW w:type="dxa" w:w="1680"/>
+          </w:tcPr>
+          <w:p>
+            <w:pPr>
+              <w:jc w:val="left"/>
+            </w:pPr>
+            <w:r/>
+            <w:hyperlink r:id="rId53">
+              <w:r>
+                <w:rPr>
+                  <w:color w:val="0B4F9E"/>
+                  <w:sz w:val="16"/>
+                  <w:u w:val="single"/>
+                </w:rPr>
+                <w:t>10.26434/chemrxiv.15007895/v2</w:t>
               </w:r>
             </w:hyperlink>
           </w:p>
@@ -6961,7 +6961,7 @@
                   <w:sz w:val="16"/>
                   <w:u w:val="single"/>
                 </w:rPr>
-                <w:t>Atomistic simulations of high-entropy alloys: from density functional theory to machine-learning interatomic potentials</w:t>
+                <w:t>uMOF: A Universal Database, Benchmark, and Machine Learning Interatomic Potentials for Metal-Organic Frameworks</w:t>
               </w:r>
             </w:hyperlink>
           </w:p>
@@ -6990,7 +6990,7 @@
               <w:rPr>
                 <w:sz w:val="16"/>
               </w:rPr>
-              <w:t>alloy</w:t>
+              <w:t>MOF</w:t>
             </w:r>
           </w:p>
         </w:tc>
@@ -7007,7 +7007,7 @@
               <w:rPr>
                 <w:sz w:val="16"/>
               </w:rPr>
-              <w:t>DFT, MLIP, free energy</w:t>
+              <w:t>r2SCAN, DFT, MLIP</w:t>
             </w:r>
           </w:p>
         </w:tc>
@@ -7024,7 +7024,7 @@
               <w:rPr>
                 <w:sz w:val="16"/>
               </w:rPr>
-              <w:t>2026-08-29</w:t>
+              <w:t>2026-08-28</w:t>
             </w:r>
           </w:p>
         </w:tc>
@@ -7044,7 +7044,7 @@
                   <w:sz w:val="16"/>
                   <w:u w:val="single"/>
                 </w:rPr>
-                <w:t>10.1007/s10853-026-13520-2</w:t>
+                <w:t>link</w:t>
               </w:r>
             </w:hyperlink>
           </w:p>
@@ -7067,31 +7067,9 @@
                   <w:sz w:val="16"/>
                   <w:u w:val="single"/>
                 </w:rPr>
-                <w:t>From Empirical Design To Autonomous Ecosystems: AI-Driven Advances, Challenges, And Future Directions In Precision Nanom</w:t>
+                <w:t>Work Function and High-Coverage Adsorption Energy as Hydrogen-Evolution Descriptors on Ag-Au-Pd-Pt Alloys</w:t>
               </w:r>
             </w:hyperlink>
-          </w:p>
-        </w:tc>
-        <w:tc>
-          <w:tcPr>
-            <w:tcW w:type="dxa" w:w="1680"/>
-          </w:tcPr>
-          <w:p>
-            <w:pPr>
-              <w:jc w:val="left"/>
-            </w:pPr>
-            <w:r/>
-          </w:p>
-        </w:tc>
-        <w:tc>
-          <w:tcPr>
-            <w:tcW w:type="dxa" w:w="1680"/>
-          </w:tcPr>
-          <w:p>
-            <w:pPr>
-              <w:jc w:val="left"/>
-            </w:pPr>
-            <w:r/>
           </w:p>
         </w:tc>
         <w:tc>
@@ -7118,7 +7096,35 @@
               <w:rPr>
                 <w:sz w:val="16"/>
               </w:rPr>
-              <w:t>2026-08-14</w:t>
+              <w:t>alloy</w:t>
+            </w:r>
+          </w:p>
+        </w:tc>
+        <w:tc>
+          <w:tcPr>
+            <w:tcW w:type="dxa" w:w="1680"/>
+          </w:tcPr>
+          <w:p>
+            <w:pPr>
+              <w:jc w:val="left"/>
+            </w:pPr>
+            <w:r/>
+          </w:p>
+        </w:tc>
+        <w:tc>
+          <w:tcPr>
+            <w:tcW w:type="dxa" w:w="1680"/>
+          </w:tcPr>
+          <w:p>
+            <w:pPr>
+              <w:jc w:val="left"/>
+            </w:pPr>
+            <w:r/>
+            <w:r>
+              <w:rPr>
+                <w:sz w:val="16"/>
+              </w:rPr>
+              <w:t>2026-08-28</w:t>
             </w:r>
           </w:p>
         </w:tc>
@@ -7138,7 +7144,7 @@
                   <w:sz w:val="16"/>
                   <w:u w:val="single"/>
                 </w:rPr>
-                <w:t>10.5281/zenodo.21931873</w:t>
+                <w:t>link</w:t>
               </w:r>
             </w:hyperlink>
           </w:p>
@@ -7161,20 +7167,9 @@
                   <w:sz w:val="16"/>
                   <w:u w:val="single"/>
                 </w:rPr>
-                <w:t>Electrostatic Phenomenology Benchmarks for Machine-Learned Interatomic Potentials in Electrochemistry: Beyond the Energy</w:t>
+                <w:t>Compact Variational Neural Networks for Spectral Inference from a Single Nonlinear 2D Perovskite Photodetector</w:t>
               </w:r>
             </w:hyperlink>
-          </w:p>
-        </w:tc>
-        <w:tc>
-          <w:tcPr>
-            <w:tcW w:type="dxa" w:w="1680"/>
-          </w:tcPr>
-          <w:p>
-            <w:pPr>
-              <w:jc w:val="left"/>
-            </w:pPr>
-            <w:r/>
           </w:p>
         </w:tc>
         <w:tc>
@@ -7201,8 +7196,19 @@
               <w:rPr>
                 <w:sz w:val="16"/>
               </w:rPr>
-              <w:t>MLIP</w:t>
+              <w:t>perovskite</w:t>
             </w:r>
+          </w:p>
+        </w:tc>
+        <w:tc>
+          <w:tcPr>
+            <w:tcW w:type="dxa" w:w="1680"/>
+          </w:tcPr>
+          <w:p>
+            <w:pPr>
+              <w:jc w:val="left"/>
+            </w:pPr>
+            <w:r/>
           </w:p>
         </w:tc>
         <w:tc>
@@ -7218,7 +7224,7 @@
               <w:rPr>
                 <w:sz w:val="16"/>
               </w:rPr>
-              <w:t>2026-08-14</w:t>
+              <w:t>2026-08-28</w:t>
             </w:r>
           </w:p>
         </w:tc>
@@ -7261,20 +7267,9 @@
                   <w:sz w:val="16"/>
                   <w:u w:val="single"/>
                 </w:rPr>
-                <w:t>The Past and Future of AI Scientists</w:t>
+                <w:t>QUBO-Compatible Active Learning for Inverse Design of High-Entropy Alloys</w:t>
               </w:r>
             </w:hyperlink>
-          </w:p>
-        </w:tc>
-        <w:tc>
-          <w:tcPr>
-            <w:tcW w:type="dxa" w:w="1680"/>
-          </w:tcPr>
-          <w:p>
-            <w:pPr>
-              <w:jc w:val="left"/>
-            </w:pPr>
-            <w:r/>
           </w:p>
         </w:tc>
         <w:tc>
@@ -7301,8 +7296,19 @@
               <w:rPr>
                 <w:sz w:val="16"/>
               </w:rPr>
-              <w:t>MLIP</w:t>
+              <w:t>alloy</w:t>
             </w:r>
+          </w:p>
+        </w:tc>
+        <w:tc>
+          <w:tcPr>
+            <w:tcW w:type="dxa" w:w="1680"/>
+          </w:tcPr>
+          <w:p>
+            <w:pPr>
+              <w:jc w:val="left"/>
+            </w:pPr>
+            <w:r/>
           </w:p>
         </w:tc>
         <w:tc>
@@ -7318,7 +7324,7 @@
               <w:rPr>
                 <w:sz w:val="16"/>
               </w:rPr>
-              <w:t>2026-08-14</w:t>
+              <w:t>2026-08-28</w:t>
             </w:r>
           </w:p>
         </w:tc>
@@ -7361,20 +7367,9 @@
                   <w:sz w:val="16"/>
                   <w:u w:val="single"/>
                 </w:rPr>
-                <w:t>Graph neural network prediction of temperature-dependent hydrogen diffusion and thermal conductivity tensors of tungsten</w:t>
+                <w:t>Atomistic simulations of high-entropy alloys: from density functional theory to machine-learning interatomic potentials</w:t>
               </w:r>
             </w:hyperlink>
-          </w:p>
-        </w:tc>
-        <w:tc>
-          <w:tcPr>
-            <w:tcW w:type="dxa" w:w="1680"/>
-          </w:tcPr>
-          <w:p>
-            <w:pPr>
-              <w:jc w:val="left"/>
-            </w:pPr>
-            <w:r/>
           </w:p>
         </w:tc>
         <w:tc>
@@ -7401,7 +7396,7 @@
               <w:rPr>
                 <w:sz w:val="16"/>
               </w:rPr>
-              <w:t>MD</w:t>
+              <w:t>alloy</w:t>
             </w:r>
           </w:p>
         </w:tc>
@@ -7418,7 +7413,24 @@
               <w:rPr>
                 <w:sz w:val="16"/>
               </w:rPr>
-              <w:t>2026-08-16</w:t>
+              <w:t>DFT, MLIP, free energy</w:t>
+            </w:r>
+          </w:p>
+        </w:tc>
+        <w:tc>
+          <w:tcPr>
+            <w:tcW w:type="dxa" w:w="1680"/>
+          </w:tcPr>
+          <w:p>
+            <w:pPr>
+              <w:jc w:val="left"/>
+            </w:pPr>
+            <w:r/>
+            <w:r>
+              <w:rPr>
+                <w:sz w:val="16"/>
+              </w:rPr>
+              <w:t>2026-08-29</w:t>
             </w:r>
           </w:p>
         </w:tc>
@@ -7438,7 +7450,7 @@
                   <w:sz w:val="16"/>
                   <w:u w:val="single"/>
                 </w:rPr>
-                <w:t>link</w:t>
+                <w:t>10.1007/s10853-026-13520-2</w:t>
               </w:r>
             </w:hyperlink>
           </w:p>
@@ -7461,20 +7473,9 @@
                   <w:sz w:val="16"/>
                   <w:u w:val="single"/>
                 </w:rPr>
-                <w:t>Machine Learning-Accelerated Band-Edge Engineering of Pnictogen Chalcohalide Solid Solutions for Solar Energy Technologi</w:t>
+                <w:t>Multiscale insights into the diffusion of SF6/N2 mixtures via machine-learning interatomic potentials</w:t>
               </w:r>
             </w:hyperlink>
-          </w:p>
-        </w:tc>
-        <w:tc>
-          <w:tcPr>
-            <w:tcW w:type="dxa" w:w="1680"/>
-          </w:tcPr>
-          <w:p>
-            <w:pPr>
-              <w:jc w:val="left"/>
-            </w:pPr>
-            <w:r/>
           </w:p>
         </w:tc>
         <w:tc>
@@ -7501,7 +7502,7 @@
               <w:rPr>
                 <w:sz w:val="16"/>
               </w:rPr>
-              <w:t>DFT</w:t>
+              <w:t>SF6</w:t>
             </w:r>
           </w:p>
         </w:tc>
@@ -7518,7 +7519,24 @@
               <w:rPr>
                 <w:sz w:val="16"/>
               </w:rPr>
-              <w:t>2026-08-17</w:t>
+              <w:t>DFT, AIMD, MD, MLIP</w:t>
+            </w:r>
+          </w:p>
+        </w:tc>
+        <w:tc>
+          <w:tcPr>
+            <w:tcW w:type="dxa" w:w="1680"/>
+          </w:tcPr>
+          <w:p>
+            <w:pPr>
+              <w:jc w:val="left"/>
+            </w:pPr>
+            <w:r/>
+            <w:r>
+              <w:rPr>
+                <w:sz w:val="16"/>
+              </w:rPr>
+              <w:t>2026-08-30</w:t>
             </w:r>
           </w:p>
         </w:tc>
@@ -7538,7 +7556,7 @@
                   <w:sz w:val="16"/>
                   <w:u w:val="single"/>
                 </w:rPr>
-                <w:t>link</w:t>
+                <w:t>10.1038/s41598-026-67691-8</w:t>
               </w:r>
             </w:hyperlink>
           </w:p>
@@ -7561,31 +7579,9 @@
                   <w:sz w:val="16"/>
                   <w:u w:val="single"/>
                 </w:rPr>
-                <w:t xml:space="preserve">Extracting a nitrile-centered, ether-assisted motif hierarchy for lithium-battery electrolyte design from billion-scale </w:t>
+                <w:t>Inverse design of functional materials: a case study in thermoelectrics</w:t>
               </w:r>
             </w:hyperlink>
-          </w:p>
-        </w:tc>
-        <w:tc>
-          <w:tcPr>
-            <w:tcW w:type="dxa" w:w="1680"/>
-          </w:tcPr>
-          <w:p>
-            <w:pPr>
-              <w:jc w:val="left"/>
-            </w:pPr>
-            <w:r/>
-          </w:p>
-        </w:tc>
-        <w:tc>
-          <w:tcPr>
-            <w:tcW w:type="dxa" w:w="1680"/>
-          </w:tcPr>
-          <w:p>
-            <w:pPr>
-              <w:jc w:val="left"/>
-            </w:pPr>
-            <w:r/>
           </w:p>
         </w:tc>
         <w:tc>
@@ -7612,7 +7608,7 @@
               <w:rPr>
                 <w:sz w:val="16"/>
               </w:rPr>
-              <w:t>2026-08-17</w:t>
+              <w:t>thermoelectric</w:t>
             </w:r>
           </w:p>
         </w:tc>
@@ -7625,20 +7621,25 @@
               <w:jc w:val="left"/>
             </w:pPr>
             <w:r/>
-            <w:hyperlink r:id="rId91">
-              <w:r>
-                <w:rPr>
-                  <w:color w:val="0B4F9E"/>
-                  <w:sz w:val="16"/>
-                  <w:u w:val="single"/>
-                </w:rPr>
-                <w:t>link</w:t>
-              </w:r>
-            </w:hyperlink>
-          </w:p>
-        </w:tc>
-      </w:tr>
-      <w:tr>
+          </w:p>
+        </w:tc>
+        <w:tc>
+          <w:tcPr>
+            <w:tcW w:type="dxa" w:w="1680"/>
+          </w:tcPr>
+          <w:p>
+            <w:pPr>
+              <w:jc w:val="left"/>
+            </w:pPr>
+            <w:r/>
+            <w:r>
+              <w:rPr>
+                <w:sz w:val="16"/>
+              </w:rPr>
+              <w:t>2026-08-31</w:t>
+            </w:r>
+          </w:p>
+        </w:tc>
         <w:tc>
           <w:tcPr>
             <w:tcW w:type="dxa" w:w="1680"/>
@@ -7655,84 +7656,7 @@
                   <w:sz w:val="16"/>
                   <w:u w:val="single"/>
                 </w:rPr>
-                <w:t>Discovery of novel magnetic Y-Mn-B compounds via advanced machine learning guided framework</w:t>
-              </w:r>
-            </w:hyperlink>
-          </w:p>
-        </w:tc>
-        <w:tc>
-          <w:tcPr>
-            <w:tcW w:type="dxa" w:w="1680"/>
-          </w:tcPr>
-          <w:p>
-            <w:pPr>
-              <w:jc w:val="left"/>
-            </w:pPr>
-            <w:r/>
-          </w:p>
-        </w:tc>
-        <w:tc>
-          <w:tcPr>
-            <w:tcW w:type="dxa" w:w="1680"/>
-          </w:tcPr>
-          <w:p>
-            <w:pPr>
-              <w:jc w:val="left"/>
-            </w:pPr>
-            <w:r/>
-          </w:p>
-        </w:tc>
-        <w:tc>
-          <w:tcPr>
-            <w:tcW w:type="dxa" w:w="1680"/>
-          </w:tcPr>
-          <w:p>
-            <w:pPr>
-              <w:jc w:val="left"/>
-            </w:pPr>
-            <w:r/>
-            <w:r>
-              <w:rPr>
-                <w:sz w:val="16"/>
-              </w:rPr>
-              <w:t>DFT</w:t>
-            </w:r>
-          </w:p>
-        </w:tc>
-        <w:tc>
-          <w:tcPr>
-            <w:tcW w:type="dxa" w:w="1680"/>
-          </w:tcPr>
-          <w:p>
-            <w:pPr>
-              <w:jc w:val="left"/>
-            </w:pPr>
-            <w:r/>
-            <w:r>
-              <w:rPr>
-                <w:sz w:val="16"/>
-              </w:rPr>
-              <w:t>2026-08-17</w:t>
-            </w:r>
-          </w:p>
-        </w:tc>
-        <w:tc>
-          <w:tcPr>
-            <w:tcW w:type="dxa" w:w="1680"/>
-          </w:tcPr>
-          <w:p>
-            <w:pPr>
-              <w:jc w:val="left"/>
-            </w:pPr>
-            <w:r/>
-            <w:hyperlink r:id="rId92">
-              <w:r>
-                <w:rPr>
-                  <w:color w:val="0B4F9E"/>
-                  <w:sz w:val="16"/>
-                  <w:u w:val="single"/>
-                </w:rPr>
-                <w:t>link</w:t>
+                <w:t>10.1038/s41524-026-02307-3</w:t>
               </w:r>
             </w:hyperlink>
           </w:p>
@@ -7755,9 +7679,20 @@
                   <w:sz w:val="16"/>
                   <w:u w:val="single"/>
                 </w:rPr>
-                <w:t>Unlocking Multi-Component Bulk-Materials Molecular Dynamics with a Small-Footprint Machine Learning Interatomic Potentia</w:t>
+                <w:t>From Empirical Design To Autonomous Ecosystems: AI-Driven Advances, Challenges, And Future Directions In Precision Nanom</w:t>
               </w:r>
             </w:hyperlink>
+          </w:p>
+        </w:tc>
+        <w:tc>
+          <w:tcPr>
+            <w:tcW w:type="dxa" w:w="1680"/>
+          </w:tcPr>
+          <w:p>
+            <w:pPr>
+              <w:jc w:val="left"/>
+            </w:pPr>
+            <w:r/>
           </w:p>
         </w:tc>
         <w:tc>
@@ -7795,24 +7730,7 @@
               <w:rPr>
                 <w:sz w:val="16"/>
               </w:rPr>
-              <w:t>MD, MLIP</w:t>
-            </w:r>
-          </w:p>
-        </w:tc>
-        <w:tc>
-          <w:tcPr>
-            <w:tcW w:type="dxa" w:w="1680"/>
-          </w:tcPr>
-          <w:p>
-            <w:pPr>
-              <w:jc w:val="left"/>
-            </w:pPr>
-            <w:r/>
-            <w:r>
-              <w:rPr>
-                <w:sz w:val="16"/>
-              </w:rPr>
-              <w:t>2026-08-17</w:t>
+              <w:t>2026-08-14</w:t>
             </w:r>
           </w:p>
         </w:tc>
@@ -7832,7 +7750,7 @@
                   <w:sz w:val="16"/>
                   <w:u w:val="single"/>
                 </w:rPr>
-                <w:t>link</w:t>
+                <w:t>10.5281/zenodo.21931873</w:t>
               </w:r>
             </w:hyperlink>
           </w:p>
@@ -7855,7 +7773,7 @@
                   <w:sz w:val="16"/>
                   <w:u w:val="single"/>
                 </w:rPr>
-                <w:t>ChemReporter: A Framework for Curating and Exporting Large-Scale Chemical Datasets for MLIP Training</w:t>
+                <w:t>Electrostatic Phenomenology Benchmarks for Machine-Learned Interatomic Potentials in Electrochemistry: Beyond the Energy</w:t>
               </w:r>
             </w:hyperlink>
           </w:p>
@@ -7912,7 +7830,7 @@
               <w:rPr>
                 <w:sz w:val="16"/>
               </w:rPr>
-              <w:t>2026-08-17</w:t>
+              <w:t>2026-08-14</w:t>
             </w:r>
           </w:p>
         </w:tc>
@@ -7955,20 +7873,9 @@
                   <w:sz w:val="16"/>
                   <w:u w:val="single"/>
                 </w:rPr>
-                <w:t>Active learning molecular beam epitaxy of complex quantum materials</w:t>
+                <w:t>The Past and Future of AI Scientists</w:t>
               </w:r>
             </w:hyperlink>
-          </w:p>
-        </w:tc>
-        <w:tc>
-          <w:tcPr>
-            <w:tcW w:type="dxa" w:w="1680"/>
-          </w:tcPr>
-          <w:p>
-            <w:pPr>
-              <w:jc w:val="left"/>
-            </w:pPr>
-            <w:r/>
           </w:p>
         </w:tc>
         <w:tc>
@@ -8006,7 +7913,24 @@
               <w:rPr>
                 <w:sz w:val="16"/>
               </w:rPr>
-              <w:t>2026-08-18</w:t>
+              <w:t>MLIP</w:t>
+            </w:r>
+          </w:p>
+        </w:tc>
+        <w:tc>
+          <w:tcPr>
+            <w:tcW w:type="dxa" w:w="1680"/>
+          </w:tcPr>
+          <w:p>
+            <w:pPr>
+              <w:jc w:val="left"/>
+            </w:pPr>
+            <w:r/>
+            <w:r>
+              <w:rPr>
+                <w:sz w:val="16"/>
+              </w:rPr>
+              <w:t>2026-08-14</w:t>
             </w:r>
           </w:p>
         </w:tc>
@@ -8049,7 +7973,7 @@
                   <w:sz w:val="16"/>
                   <w:u w:val="single"/>
                 </w:rPr>
-                <w:t>PyAPX: python toolkit for atomic configuration pattern exploration</w:t>
+                <w:t>Graph neural network prediction of temperature-dependent hydrogen diffusion and thermal conductivity tensors of tungsten</w:t>
               </w:r>
             </w:hyperlink>
           </w:p>
@@ -8089,7 +8013,7 @@
               <w:rPr>
                 <w:sz w:val="16"/>
               </w:rPr>
-              <w:t>DFT, MLIP</w:t>
+              <w:t>MD</w:t>
             </w:r>
           </w:p>
         </w:tc>
@@ -8106,7 +8030,7 @@
               <w:rPr>
                 <w:sz w:val="16"/>
               </w:rPr>
-              <w:t>2026-08-19</w:t>
+              <w:t>2026-08-16</w:t>
             </w:r>
           </w:p>
         </w:tc>
@@ -8126,7 +8050,7 @@
                   <w:sz w:val="16"/>
                   <w:u w:val="single"/>
                 </w:rPr>
-                <w:t>10.1038/s41598-026-66072-5</w:t>
+                <w:t>link</w:t>
               </w:r>
             </w:hyperlink>
           </w:p>
@@ -8149,7 +8073,7 @@
                   <w:sz w:val="16"/>
                   <w:u w:val="single"/>
                 </w:rPr>
-                <w:t>A single design choice determines whether machine learning models of materials make physically impossible predictions</w:t>
+                <w:t>Machine Learning-Accelerated Band-Edge Engineering of Pnictogen Chalcohalide Solid Solutions for Solar Energy Technologi</w:t>
               </w:r>
             </w:hyperlink>
           </w:p>
@@ -8206,7 +8130,7 @@
               <w:rPr>
                 <w:sz w:val="16"/>
               </w:rPr>
-              <w:t>2026-08-19</w:t>
+              <w:t>2026-08-17</w:t>
             </w:r>
           </w:p>
         </w:tc>
@@ -8249,9 +8173,20 @@
                   <w:sz w:val="16"/>
                   <w:u w:val="single"/>
                 </w:rPr>
-                <w:t>Dynamic Ensembles of Phosphine-Stabilized Gold Nanoclusters</w:t>
+                <w:t xml:space="preserve">Extracting a nitrile-centered, ether-assisted motif hierarchy for lithium-battery electrolyte design from billion-scale </w:t>
               </w:r>
             </w:hyperlink>
+          </w:p>
+        </w:tc>
+        <w:tc>
+          <w:tcPr>
+            <w:tcW w:type="dxa" w:w="1680"/>
+          </w:tcPr>
+          <w:p>
+            <w:pPr>
+              <w:jc w:val="left"/>
+            </w:pPr>
+            <w:r/>
           </w:p>
         </w:tc>
         <w:tc>
@@ -8289,24 +8224,7 @@
               <w:rPr>
                 <w:sz w:val="16"/>
               </w:rPr>
-              <w:t>MD, MLIP</w:t>
-            </w:r>
-          </w:p>
-        </w:tc>
-        <w:tc>
-          <w:tcPr>
-            <w:tcW w:type="dxa" w:w="1680"/>
-          </w:tcPr>
-          <w:p>
-            <w:pPr>
-              <w:jc w:val="left"/>
-            </w:pPr>
-            <w:r/>
-            <w:r>
-              <w:rPr>
-                <w:sz w:val="16"/>
-              </w:rPr>
-              <w:t>2026-08-19</w:t>
+              <w:t>2026-08-17</w:t>
             </w:r>
           </w:p>
         </w:tc>
@@ -8349,20 +8267,9 @@
                   <w:sz w:val="16"/>
                   <w:u w:val="single"/>
                 </w:rPr>
-                <w:t>Generative AI and Emerging Technologies: Transforming Engineering, Innovation and Entrepreneurship</w:t>
+                <w:t>Discovery of novel magnetic Y-Mn-B compounds via advanced machine learning guided framework</w:t>
               </w:r>
             </w:hyperlink>
-          </w:p>
-        </w:tc>
-        <w:tc>
-          <w:tcPr>
-            <w:tcW w:type="dxa" w:w="1680"/>
-          </w:tcPr>
-          <w:p>
-            <w:pPr>
-              <w:jc w:val="left"/>
-            </w:pPr>
-            <w:r/>
           </w:p>
         </w:tc>
         <w:tc>
@@ -8400,7 +8307,24 @@
               <w:rPr>
                 <w:sz w:val="16"/>
               </w:rPr>
-              <w:t>2026-08-20</w:t>
+              <w:t>DFT</w:t>
+            </w:r>
+          </w:p>
+        </w:tc>
+        <w:tc>
+          <w:tcPr>
+            <w:tcW w:type="dxa" w:w="1680"/>
+          </w:tcPr>
+          <w:p>
+            <w:pPr>
+              <w:jc w:val="left"/>
+            </w:pPr>
+            <w:r/>
+            <w:r>
+              <w:rPr>
+                <w:sz w:val="16"/>
+              </w:rPr>
+              <w:t>2026-08-17</w:t>
             </w:r>
           </w:p>
         </w:tc>
@@ -8420,7 +8344,7 @@
                   <w:sz w:val="16"/>
                   <w:u w:val="single"/>
                 </w:rPr>
-                <w:t>10.5281/zenodo.22025110</w:t>
+                <w:t>link</w:t>
               </w:r>
             </w:hyperlink>
           </w:p>
@@ -8443,7 +8367,7 @@
                   <w:sz w:val="16"/>
                   <w:u w:val="single"/>
                 </w:rPr>
-                <w:t>Machine Learning to Foundation Models: Artificial Intelligence for Nanophotonic Modeling and Scientific Discovery</w:t>
+                <w:t>Unlocking Multi-Component Bulk-Materials Molecular Dynamics with a Small-Footprint Machine Learning Interatomic Potentia</w:t>
               </w:r>
             </w:hyperlink>
           </w:p>
@@ -8483,7 +8407,7 @@
               <w:rPr>
                 <w:sz w:val="16"/>
               </w:rPr>
-              <w:t>MLIP</w:t>
+              <w:t>MD, MLIP</w:t>
             </w:r>
           </w:p>
         </w:tc>
@@ -8500,7 +8424,7 @@
               <w:rPr>
                 <w:sz w:val="16"/>
               </w:rPr>
-              <w:t>2026-08-21</w:t>
+              <w:t>2026-08-17</w:t>
             </w:r>
           </w:p>
         </w:tc>
@@ -8520,7 +8444,7 @@
                   <w:sz w:val="16"/>
                   <w:u w:val="single"/>
                 </w:rPr>
-                <w:t>10.48550/arxiv.2608.21612</w:t>
+                <w:t>link</w:t>
               </w:r>
             </w:hyperlink>
           </w:p>
@@ -8543,20 +8467,9 @@
                   <w:sz w:val="16"/>
                   <w:u w:val="single"/>
                 </w:rPr>
-                <w:t>Diagnosing and narrowing the simulation-to-real gap in powder X-ray diffraction with a wet-dry agentic loop</w:t>
+                <w:t>ChemReporter: A Framework for Curating and Exporting Large-Scale Chemical Datasets for MLIP Training</w:t>
               </w:r>
             </w:hyperlink>
-          </w:p>
-        </w:tc>
-        <w:tc>
-          <w:tcPr>
-            <w:tcW w:type="dxa" w:w="1680"/>
-          </w:tcPr>
-          <w:p>
-            <w:pPr>
-              <w:jc w:val="left"/>
-            </w:pPr>
-            <w:r/>
           </w:p>
         </w:tc>
         <w:tc>
@@ -8594,7 +8507,24 @@
               <w:rPr>
                 <w:sz w:val="16"/>
               </w:rPr>
-              <w:t>2026-08-23</w:t>
+              <w:t>MLIP</w:t>
+            </w:r>
+          </w:p>
+        </w:tc>
+        <w:tc>
+          <w:tcPr>
+            <w:tcW w:type="dxa" w:w="1680"/>
+          </w:tcPr>
+          <w:p>
+            <w:pPr>
+              <w:jc w:val="left"/>
+            </w:pPr>
+            <w:r/>
+            <w:r>
+              <w:rPr>
+                <w:sz w:val="16"/>
+              </w:rPr>
+              <w:t>2026-08-17</w:t>
             </w:r>
           </w:p>
         </w:tc>
@@ -8637,6 +8567,688 @@
                   <w:sz w:val="16"/>
                   <w:u w:val="single"/>
                 </w:rPr>
+                <w:t>Active learning molecular beam epitaxy of complex quantum materials</w:t>
+              </w:r>
+            </w:hyperlink>
+          </w:p>
+        </w:tc>
+        <w:tc>
+          <w:tcPr>
+            <w:tcW w:type="dxa" w:w="1680"/>
+          </w:tcPr>
+          <w:p>
+            <w:pPr>
+              <w:jc w:val="left"/>
+            </w:pPr>
+            <w:r/>
+          </w:p>
+        </w:tc>
+        <w:tc>
+          <w:tcPr>
+            <w:tcW w:type="dxa" w:w="1680"/>
+          </w:tcPr>
+          <w:p>
+            <w:pPr>
+              <w:jc w:val="left"/>
+            </w:pPr>
+            <w:r/>
+          </w:p>
+        </w:tc>
+        <w:tc>
+          <w:tcPr>
+            <w:tcW w:type="dxa" w:w="1680"/>
+          </w:tcPr>
+          <w:p>
+            <w:pPr>
+              <w:jc w:val="left"/>
+            </w:pPr>
+            <w:r/>
+          </w:p>
+        </w:tc>
+        <w:tc>
+          <w:tcPr>
+            <w:tcW w:type="dxa" w:w="1680"/>
+          </w:tcPr>
+          <w:p>
+            <w:pPr>
+              <w:jc w:val="left"/>
+            </w:pPr>
+            <w:r/>
+            <w:r>
+              <w:rPr>
+                <w:sz w:val="16"/>
+              </w:rPr>
+              <w:t>2026-08-18</w:t>
+            </w:r>
+          </w:p>
+        </w:tc>
+        <w:tc>
+          <w:tcPr>
+            <w:tcW w:type="dxa" w:w="1680"/>
+          </w:tcPr>
+          <w:p>
+            <w:pPr>
+              <w:jc w:val="left"/>
+            </w:pPr>
+            <w:r/>
+            <w:hyperlink r:id="rId102">
+              <w:r>
+                <w:rPr>
+                  <w:color w:val="0B4F9E"/>
+                  <w:sz w:val="16"/>
+                  <w:u w:val="single"/>
+                </w:rPr>
+                <w:t>link</w:t>
+              </w:r>
+            </w:hyperlink>
+          </w:p>
+        </w:tc>
+      </w:tr>
+      <w:tr>
+        <w:tc>
+          <w:tcPr>
+            <w:tcW w:type="dxa" w:w="1680"/>
+          </w:tcPr>
+          <w:p>
+            <w:pPr>
+              <w:jc w:val="left"/>
+            </w:pPr>
+            <w:r/>
+            <w:hyperlink r:id="rId103">
+              <w:r>
+                <w:rPr>
+                  <w:color w:val="0B4F9E"/>
+                  <w:sz w:val="16"/>
+                  <w:u w:val="single"/>
+                </w:rPr>
+                <w:t>PyAPX: python toolkit for atomic configuration pattern exploration</w:t>
+              </w:r>
+            </w:hyperlink>
+          </w:p>
+        </w:tc>
+        <w:tc>
+          <w:tcPr>
+            <w:tcW w:type="dxa" w:w="1680"/>
+          </w:tcPr>
+          <w:p>
+            <w:pPr>
+              <w:jc w:val="left"/>
+            </w:pPr>
+            <w:r/>
+          </w:p>
+        </w:tc>
+        <w:tc>
+          <w:tcPr>
+            <w:tcW w:type="dxa" w:w="1680"/>
+          </w:tcPr>
+          <w:p>
+            <w:pPr>
+              <w:jc w:val="left"/>
+            </w:pPr>
+            <w:r/>
+          </w:p>
+        </w:tc>
+        <w:tc>
+          <w:tcPr>
+            <w:tcW w:type="dxa" w:w="1680"/>
+          </w:tcPr>
+          <w:p>
+            <w:pPr>
+              <w:jc w:val="left"/>
+            </w:pPr>
+            <w:r/>
+            <w:r>
+              <w:rPr>
+                <w:sz w:val="16"/>
+              </w:rPr>
+              <w:t>DFT, MLIP</w:t>
+            </w:r>
+          </w:p>
+        </w:tc>
+        <w:tc>
+          <w:tcPr>
+            <w:tcW w:type="dxa" w:w="1680"/>
+          </w:tcPr>
+          <w:p>
+            <w:pPr>
+              <w:jc w:val="left"/>
+            </w:pPr>
+            <w:r/>
+            <w:r>
+              <w:rPr>
+                <w:sz w:val="16"/>
+              </w:rPr>
+              <w:t>2026-08-19</w:t>
+            </w:r>
+          </w:p>
+        </w:tc>
+        <w:tc>
+          <w:tcPr>
+            <w:tcW w:type="dxa" w:w="1680"/>
+          </w:tcPr>
+          <w:p>
+            <w:pPr>
+              <w:jc w:val="left"/>
+            </w:pPr>
+            <w:r/>
+            <w:hyperlink r:id="rId103">
+              <w:r>
+                <w:rPr>
+                  <w:color w:val="0B4F9E"/>
+                  <w:sz w:val="16"/>
+                  <w:u w:val="single"/>
+                </w:rPr>
+                <w:t>10.1038/s41598-026-66072-5</w:t>
+              </w:r>
+            </w:hyperlink>
+          </w:p>
+        </w:tc>
+      </w:tr>
+      <w:tr>
+        <w:tc>
+          <w:tcPr>
+            <w:tcW w:type="dxa" w:w="1680"/>
+          </w:tcPr>
+          <w:p>
+            <w:pPr>
+              <w:jc w:val="left"/>
+            </w:pPr>
+            <w:r/>
+            <w:hyperlink r:id="rId104">
+              <w:r>
+                <w:rPr>
+                  <w:color w:val="0B4F9E"/>
+                  <w:sz w:val="16"/>
+                  <w:u w:val="single"/>
+                </w:rPr>
+                <w:t>A single design choice determines whether machine learning models of materials make physically impossible predictions</w:t>
+              </w:r>
+            </w:hyperlink>
+          </w:p>
+        </w:tc>
+        <w:tc>
+          <w:tcPr>
+            <w:tcW w:type="dxa" w:w="1680"/>
+          </w:tcPr>
+          <w:p>
+            <w:pPr>
+              <w:jc w:val="left"/>
+            </w:pPr>
+            <w:r/>
+          </w:p>
+        </w:tc>
+        <w:tc>
+          <w:tcPr>
+            <w:tcW w:type="dxa" w:w="1680"/>
+          </w:tcPr>
+          <w:p>
+            <w:pPr>
+              <w:jc w:val="left"/>
+            </w:pPr>
+            <w:r/>
+          </w:p>
+        </w:tc>
+        <w:tc>
+          <w:tcPr>
+            <w:tcW w:type="dxa" w:w="1680"/>
+          </w:tcPr>
+          <w:p>
+            <w:pPr>
+              <w:jc w:val="left"/>
+            </w:pPr>
+            <w:r/>
+            <w:r>
+              <w:rPr>
+                <w:sz w:val="16"/>
+              </w:rPr>
+              <w:t>DFT</w:t>
+            </w:r>
+          </w:p>
+        </w:tc>
+        <w:tc>
+          <w:tcPr>
+            <w:tcW w:type="dxa" w:w="1680"/>
+          </w:tcPr>
+          <w:p>
+            <w:pPr>
+              <w:jc w:val="left"/>
+            </w:pPr>
+            <w:r/>
+            <w:r>
+              <w:rPr>
+                <w:sz w:val="16"/>
+              </w:rPr>
+              <w:t>2026-08-19</w:t>
+            </w:r>
+          </w:p>
+        </w:tc>
+        <w:tc>
+          <w:tcPr>
+            <w:tcW w:type="dxa" w:w="1680"/>
+          </w:tcPr>
+          <w:p>
+            <w:pPr>
+              <w:jc w:val="left"/>
+            </w:pPr>
+            <w:r/>
+            <w:hyperlink r:id="rId104">
+              <w:r>
+                <w:rPr>
+                  <w:color w:val="0B4F9E"/>
+                  <w:sz w:val="16"/>
+                  <w:u w:val="single"/>
+                </w:rPr>
+                <w:t>link</w:t>
+              </w:r>
+            </w:hyperlink>
+          </w:p>
+        </w:tc>
+      </w:tr>
+      <w:tr>
+        <w:tc>
+          <w:tcPr>
+            <w:tcW w:type="dxa" w:w="1680"/>
+          </w:tcPr>
+          <w:p>
+            <w:pPr>
+              <w:jc w:val="left"/>
+            </w:pPr>
+            <w:r/>
+            <w:hyperlink r:id="rId105">
+              <w:r>
+                <w:rPr>
+                  <w:color w:val="0B4F9E"/>
+                  <w:sz w:val="16"/>
+                  <w:u w:val="single"/>
+                </w:rPr>
+                <w:t>Dynamic Ensembles of Phosphine-Stabilized Gold Nanoclusters</w:t>
+              </w:r>
+            </w:hyperlink>
+          </w:p>
+        </w:tc>
+        <w:tc>
+          <w:tcPr>
+            <w:tcW w:type="dxa" w:w="1680"/>
+          </w:tcPr>
+          <w:p>
+            <w:pPr>
+              <w:jc w:val="left"/>
+            </w:pPr>
+            <w:r/>
+          </w:p>
+        </w:tc>
+        <w:tc>
+          <w:tcPr>
+            <w:tcW w:type="dxa" w:w="1680"/>
+          </w:tcPr>
+          <w:p>
+            <w:pPr>
+              <w:jc w:val="left"/>
+            </w:pPr>
+            <w:r/>
+          </w:p>
+        </w:tc>
+        <w:tc>
+          <w:tcPr>
+            <w:tcW w:type="dxa" w:w="1680"/>
+          </w:tcPr>
+          <w:p>
+            <w:pPr>
+              <w:jc w:val="left"/>
+            </w:pPr>
+            <w:r/>
+            <w:r>
+              <w:rPr>
+                <w:sz w:val="16"/>
+              </w:rPr>
+              <w:t>MD, MLIP</w:t>
+            </w:r>
+          </w:p>
+        </w:tc>
+        <w:tc>
+          <w:tcPr>
+            <w:tcW w:type="dxa" w:w="1680"/>
+          </w:tcPr>
+          <w:p>
+            <w:pPr>
+              <w:jc w:val="left"/>
+            </w:pPr>
+            <w:r/>
+            <w:r>
+              <w:rPr>
+                <w:sz w:val="16"/>
+              </w:rPr>
+              <w:t>2026-08-19</w:t>
+            </w:r>
+          </w:p>
+        </w:tc>
+        <w:tc>
+          <w:tcPr>
+            <w:tcW w:type="dxa" w:w="1680"/>
+          </w:tcPr>
+          <w:p>
+            <w:pPr>
+              <w:jc w:val="left"/>
+            </w:pPr>
+            <w:r/>
+            <w:hyperlink r:id="rId105">
+              <w:r>
+                <w:rPr>
+                  <w:color w:val="0B4F9E"/>
+                  <w:sz w:val="16"/>
+                  <w:u w:val="single"/>
+                </w:rPr>
+                <w:t>link</w:t>
+              </w:r>
+            </w:hyperlink>
+          </w:p>
+        </w:tc>
+      </w:tr>
+      <w:tr>
+        <w:tc>
+          <w:tcPr>
+            <w:tcW w:type="dxa" w:w="1680"/>
+          </w:tcPr>
+          <w:p>
+            <w:pPr>
+              <w:jc w:val="left"/>
+            </w:pPr>
+            <w:r/>
+            <w:hyperlink r:id="rId106">
+              <w:r>
+                <w:rPr>
+                  <w:color w:val="0B4F9E"/>
+                  <w:sz w:val="16"/>
+                  <w:u w:val="single"/>
+                </w:rPr>
+                <w:t>Generative AI and Emerging Technologies: Transforming Engineering, Innovation and Entrepreneurship</w:t>
+              </w:r>
+            </w:hyperlink>
+          </w:p>
+        </w:tc>
+        <w:tc>
+          <w:tcPr>
+            <w:tcW w:type="dxa" w:w="1680"/>
+          </w:tcPr>
+          <w:p>
+            <w:pPr>
+              <w:jc w:val="left"/>
+            </w:pPr>
+            <w:r/>
+          </w:p>
+        </w:tc>
+        <w:tc>
+          <w:tcPr>
+            <w:tcW w:type="dxa" w:w="1680"/>
+          </w:tcPr>
+          <w:p>
+            <w:pPr>
+              <w:jc w:val="left"/>
+            </w:pPr>
+            <w:r/>
+          </w:p>
+        </w:tc>
+        <w:tc>
+          <w:tcPr>
+            <w:tcW w:type="dxa" w:w="1680"/>
+          </w:tcPr>
+          <w:p>
+            <w:pPr>
+              <w:jc w:val="left"/>
+            </w:pPr>
+            <w:r/>
+          </w:p>
+        </w:tc>
+        <w:tc>
+          <w:tcPr>
+            <w:tcW w:type="dxa" w:w="1680"/>
+          </w:tcPr>
+          <w:p>
+            <w:pPr>
+              <w:jc w:val="left"/>
+            </w:pPr>
+            <w:r/>
+            <w:r>
+              <w:rPr>
+                <w:sz w:val="16"/>
+              </w:rPr>
+              <w:t>2026-08-20</w:t>
+            </w:r>
+          </w:p>
+        </w:tc>
+        <w:tc>
+          <w:tcPr>
+            <w:tcW w:type="dxa" w:w="1680"/>
+          </w:tcPr>
+          <w:p>
+            <w:pPr>
+              <w:jc w:val="left"/>
+            </w:pPr>
+            <w:r/>
+            <w:hyperlink r:id="rId106">
+              <w:r>
+                <w:rPr>
+                  <w:color w:val="0B4F9E"/>
+                  <w:sz w:val="16"/>
+                  <w:u w:val="single"/>
+                </w:rPr>
+                <w:t>10.5281/zenodo.22025110</w:t>
+              </w:r>
+            </w:hyperlink>
+          </w:p>
+        </w:tc>
+      </w:tr>
+      <w:tr>
+        <w:tc>
+          <w:tcPr>
+            <w:tcW w:type="dxa" w:w="1680"/>
+          </w:tcPr>
+          <w:p>
+            <w:pPr>
+              <w:jc w:val="left"/>
+            </w:pPr>
+            <w:r/>
+            <w:hyperlink r:id="rId107">
+              <w:r>
+                <w:rPr>
+                  <w:color w:val="0B4F9E"/>
+                  <w:sz w:val="16"/>
+                  <w:u w:val="single"/>
+                </w:rPr>
+                <w:t>Machine Learning to Foundation Models: Artificial Intelligence for Nanophotonic Modeling and Scientific Discovery</w:t>
+              </w:r>
+            </w:hyperlink>
+          </w:p>
+        </w:tc>
+        <w:tc>
+          <w:tcPr>
+            <w:tcW w:type="dxa" w:w="1680"/>
+          </w:tcPr>
+          <w:p>
+            <w:pPr>
+              <w:jc w:val="left"/>
+            </w:pPr>
+            <w:r/>
+          </w:p>
+        </w:tc>
+        <w:tc>
+          <w:tcPr>
+            <w:tcW w:type="dxa" w:w="1680"/>
+          </w:tcPr>
+          <w:p>
+            <w:pPr>
+              <w:jc w:val="left"/>
+            </w:pPr>
+            <w:r/>
+          </w:p>
+        </w:tc>
+        <w:tc>
+          <w:tcPr>
+            <w:tcW w:type="dxa" w:w="1680"/>
+          </w:tcPr>
+          <w:p>
+            <w:pPr>
+              <w:jc w:val="left"/>
+            </w:pPr>
+            <w:r/>
+            <w:r>
+              <w:rPr>
+                <w:sz w:val="16"/>
+              </w:rPr>
+              <w:t>MLIP</w:t>
+            </w:r>
+          </w:p>
+        </w:tc>
+        <w:tc>
+          <w:tcPr>
+            <w:tcW w:type="dxa" w:w="1680"/>
+          </w:tcPr>
+          <w:p>
+            <w:pPr>
+              <w:jc w:val="left"/>
+            </w:pPr>
+            <w:r/>
+            <w:r>
+              <w:rPr>
+                <w:sz w:val="16"/>
+              </w:rPr>
+              <w:t>2026-08-21</w:t>
+            </w:r>
+          </w:p>
+        </w:tc>
+        <w:tc>
+          <w:tcPr>
+            <w:tcW w:type="dxa" w:w="1680"/>
+          </w:tcPr>
+          <w:p>
+            <w:pPr>
+              <w:jc w:val="left"/>
+            </w:pPr>
+            <w:r/>
+            <w:hyperlink r:id="rId107">
+              <w:r>
+                <w:rPr>
+                  <w:color w:val="0B4F9E"/>
+                  <w:sz w:val="16"/>
+                  <w:u w:val="single"/>
+                </w:rPr>
+                <w:t>10.48550/arxiv.2608.21612</w:t>
+              </w:r>
+            </w:hyperlink>
+          </w:p>
+        </w:tc>
+      </w:tr>
+      <w:tr>
+        <w:tc>
+          <w:tcPr>
+            <w:tcW w:type="dxa" w:w="1680"/>
+          </w:tcPr>
+          <w:p>
+            <w:pPr>
+              <w:jc w:val="left"/>
+            </w:pPr>
+            <w:r/>
+            <w:hyperlink r:id="rId108">
+              <w:r>
+                <w:rPr>
+                  <w:color w:val="0B4F9E"/>
+                  <w:sz w:val="16"/>
+                  <w:u w:val="single"/>
+                </w:rPr>
+                <w:t>Diagnosing and narrowing the simulation-to-real gap in powder X-ray diffraction with a wet-dry agentic loop</w:t>
+              </w:r>
+            </w:hyperlink>
+          </w:p>
+        </w:tc>
+        <w:tc>
+          <w:tcPr>
+            <w:tcW w:type="dxa" w:w="1680"/>
+          </w:tcPr>
+          <w:p>
+            <w:pPr>
+              <w:jc w:val="left"/>
+            </w:pPr>
+            <w:r/>
+          </w:p>
+        </w:tc>
+        <w:tc>
+          <w:tcPr>
+            <w:tcW w:type="dxa" w:w="1680"/>
+          </w:tcPr>
+          <w:p>
+            <w:pPr>
+              <w:jc w:val="left"/>
+            </w:pPr>
+            <w:r/>
+          </w:p>
+        </w:tc>
+        <w:tc>
+          <w:tcPr>
+            <w:tcW w:type="dxa" w:w="1680"/>
+          </w:tcPr>
+          <w:p>
+            <w:pPr>
+              <w:jc w:val="left"/>
+            </w:pPr>
+            <w:r/>
+          </w:p>
+        </w:tc>
+        <w:tc>
+          <w:tcPr>
+            <w:tcW w:type="dxa" w:w="1680"/>
+          </w:tcPr>
+          <w:p>
+            <w:pPr>
+              <w:jc w:val="left"/>
+            </w:pPr>
+            <w:r/>
+            <w:r>
+              <w:rPr>
+                <w:sz w:val="16"/>
+              </w:rPr>
+              <w:t>2026-08-23</w:t>
+            </w:r>
+          </w:p>
+        </w:tc>
+        <w:tc>
+          <w:tcPr>
+            <w:tcW w:type="dxa" w:w="1680"/>
+          </w:tcPr>
+          <w:p>
+            <w:pPr>
+              <w:jc w:val="left"/>
+            </w:pPr>
+            <w:r/>
+            <w:hyperlink r:id="rId108">
+              <w:r>
+                <w:rPr>
+                  <w:color w:val="0B4F9E"/>
+                  <w:sz w:val="16"/>
+                  <w:u w:val="single"/>
+                </w:rPr>
+                <w:t>link</w:t>
+              </w:r>
+            </w:hyperlink>
+          </w:p>
+        </w:tc>
+      </w:tr>
+      <w:tr>
+        <w:tc>
+          <w:tcPr>
+            <w:tcW w:type="dxa" w:w="1680"/>
+          </w:tcPr>
+          <w:p>
+            <w:pPr>
+              <w:jc w:val="left"/>
+            </w:pPr>
+            <w:r/>
+            <w:hyperlink r:id="rId109">
+              <w:r>
+                <w:rPr>
+                  <w:color w:val="0B4F9E"/>
+                  <w:sz w:val="16"/>
+                  <w:u w:val="single"/>
+                </w:rPr>
                 <w:t xml:space="preserve">Dataset for the publication- A cylindrical sintering method for more realistic grain boundaries in nanocrystalline thin </w:t>
               </w:r>
             </w:hyperlink>
@@ -8701,7 +9313,7 @@
               <w:jc w:val="left"/>
             </w:pPr>
             <w:r/>
-            <w:hyperlink r:id="rId102">
+            <w:hyperlink r:id="rId109">
               <w:r>
                 <w:rPr>
                   <w:color w:val="0B4F9E"/>
@@ -8724,7 +9336,7 @@
               <w:jc w:val="left"/>
             </w:pPr>
             <w:r/>
-            <w:hyperlink r:id="rId103">
+            <w:hyperlink r:id="rId110">
               <w:r>
                 <w:rPr>
                   <w:color w:val="0B4F9E"/>
@@ -8801,7 +9413,7 @@
               <w:jc w:val="left"/>
             </w:pPr>
             <w:r/>
-            <w:hyperlink r:id="rId103">
+            <w:hyperlink r:id="rId110">
               <w:r>
                 <w:rPr>
                   <w:color w:val="0B4F9E"/>
@@ -8824,7 +9436,7 @@
               <w:jc w:val="left"/>
             </w:pPr>
             <w:r/>
-            <w:hyperlink r:id="rId104">
+            <w:hyperlink r:id="rId111">
               <w:r>
                 <w:rPr>
                   <w:color w:val="0B4F9E"/>
@@ -8901,7 +9513,7 @@
               <w:jc w:val="left"/>
             </w:pPr>
             <w:r/>
-            <w:hyperlink r:id="rId104">
+            <w:hyperlink r:id="rId111">
               <w:r>
                 <w:rPr>
                   <w:color w:val="0B4F9E"/>
@@ -8924,7 +9536,7 @@
               <w:jc w:val="left"/>
             </w:pPr>
             <w:r/>
-            <w:hyperlink r:id="rId105">
+            <w:hyperlink r:id="rId112">
               <w:r>
                 <w:rPr>
                   <w:color w:val="0B4F9E"/>
@@ -8995,7 +9607,7 @@
               <w:jc w:val="left"/>
             </w:pPr>
             <w:r/>
-            <w:hyperlink r:id="rId105">
+            <w:hyperlink r:id="rId112">
               <w:r>
                 <w:rPr>
                   <w:color w:val="0B4F9E"/>
@@ -9018,7 +9630,7 @@
               <w:jc w:val="left"/>
             </w:pPr>
             <w:r/>
-            <w:hyperlink r:id="rId106">
+            <w:hyperlink r:id="rId113">
               <w:r>
                 <w:rPr>
                   <w:color w:val="0B4F9E"/>
@@ -9095,7 +9707,7 @@
               <w:jc w:val="left"/>
             </w:pPr>
             <w:r/>
-            <w:hyperlink r:id="rId106">
+            <w:hyperlink r:id="rId113">
               <w:r>
                 <w:rPr>
                   <w:color w:val="0B4F9E"/>
@@ -9118,7 +9730,7 @@
               <w:jc w:val="left"/>
             </w:pPr>
             <w:r/>
-            <w:hyperlink r:id="rId107">
+            <w:hyperlink r:id="rId114">
               <w:r>
                 <w:rPr>
                   <w:color w:val="0B4F9E"/>
@@ -9195,7 +9807,7 @@
               <w:jc w:val="left"/>
             </w:pPr>
             <w:r/>
-            <w:hyperlink r:id="rId107">
+            <w:hyperlink r:id="rId114">
               <w:r>
                 <w:rPr>
                   <w:color w:val="0B4F9E"/>
@@ -9218,7 +9830,7 @@
               <w:jc w:val="left"/>
             </w:pPr>
             <w:r/>
-            <w:hyperlink r:id="rId108">
+            <w:hyperlink r:id="rId115">
               <w:r>
                 <w:rPr>
                   <w:color w:val="0B4F9E"/>
@@ -9289,7 +9901,7 @@
               <w:jc w:val="left"/>
             </w:pPr>
             <w:r/>
-            <w:hyperlink r:id="rId108">
+            <w:hyperlink r:id="rId115">
               <w:r>
                 <w:rPr>
                   <w:color w:val="0B4F9E"/>
@@ -9312,7 +9924,7 @@
               <w:jc w:val="left"/>
             </w:pPr>
             <w:r/>
-            <w:hyperlink r:id="rId109">
+            <w:hyperlink r:id="rId116">
               <w:r>
                 <w:rPr>
                   <w:color w:val="0B4F9E"/>
@@ -9383,7 +9995,7 @@
               <w:jc w:val="left"/>
             </w:pPr>
             <w:r/>
-            <w:hyperlink r:id="rId110">
+            <w:hyperlink r:id="rId117">
               <w:r>
                 <w:rPr>
                   <w:color w:val="0B4F9E"/>
@@ -9406,7 +10018,7 @@
               <w:jc w:val="left"/>
             </w:pPr>
             <w:r/>
-            <w:hyperlink r:id="rId111">
+            <w:hyperlink r:id="rId118">
               <w:r>
                 <w:rPr>
                   <w:color w:val="0B4F9E"/>
@@ -9477,7 +10089,7 @@
               <w:jc w:val="left"/>
             </w:pPr>
             <w:r/>
-            <w:hyperlink r:id="rId111">
+            <w:hyperlink r:id="rId118">
               <w:r>
                 <w:rPr>
                   <w:color w:val="0B4F9E"/>
@@ -9500,7 +10112,7 @@
               <w:jc w:val="left"/>
             </w:pPr>
             <w:r/>
-            <w:hyperlink r:id="rId112">
+            <w:hyperlink r:id="rId119">
               <w:r>
                 <w:rPr>
                   <w:color w:val="0B4F9E"/>
@@ -9577,7 +10189,7 @@
               <w:jc w:val="left"/>
             </w:pPr>
             <w:r/>
-            <w:hyperlink r:id="rId112">
+            <w:hyperlink r:id="rId119">
               <w:r>
                 <w:rPr>
                   <w:color w:val="0B4F9E"/>
@@ -9600,7 +10212,7 @@
               <w:jc w:val="left"/>
             </w:pPr>
             <w:r/>
-            <w:hyperlink r:id="rId113">
+            <w:hyperlink r:id="rId120">
               <w:r>
                 <w:rPr>
                   <w:color w:val="0B4F9E"/>
@@ -9677,7 +10289,7 @@
               <w:jc w:val="left"/>
             </w:pPr>
             <w:r/>
-            <w:hyperlink r:id="rId113">
+            <w:hyperlink r:id="rId120">
               <w:r>
                 <w:rPr>
                   <w:color w:val="0B4F9E"/>
@@ -9700,7 +10312,7 @@
               <w:jc w:val="left"/>
             </w:pPr>
             <w:r/>
-            <w:hyperlink r:id="rId114">
+            <w:hyperlink r:id="rId121">
               <w:r>
                 <w:rPr>
                   <w:color w:val="0B4F9E"/>
@@ -9777,7 +10389,7 @@
               <w:jc w:val="left"/>
             </w:pPr>
             <w:r/>
-            <w:hyperlink r:id="rId114">
+            <w:hyperlink r:id="rId121">
               <w:r>
                 <w:rPr>
                   <w:color w:val="0B4F9E"/>
@@ -9800,7 +10412,7 @@
               <w:jc w:val="left"/>
             </w:pPr>
             <w:r/>
-            <w:hyperlink r:id="rId115">
+            <w:hyperlink r:id="rId122">
               <w:r>
                 <w:rPr>
                   <w:color w:val="0B4F9E"/>
@@ -9877,7 +10489,7 @@
               <w:jc w:val="left"/>
             </w:pPr>
             <w:r/>
-            <w:hyperlink r:id="rId115">
+            <w:hyperlink r:id="rId122">
               <w:r>
                 <w:rPr>
                   <w:color w:val="0B4F9E"/>
@@ -9900,7 +10512,7 @@
               <w:jc w:val="left"/>
             </w:pPr>
             <w:r/>
-            <w:hyperlink r:id="rId116">
+            <w:hyperlink r:id="rId123">
               <w:r>
                 <w:rPr>
                   <w:color w:val="0B4F9E"/>
@@ -9971,7 +10583,7 @@
               <w:jc w:val="left"/>
             </w:pPr>
             <w:r/>
-            <w:hyperlink r:id="rId116">
+            <w:hyperlink r:id="rId123">
               <w:r>
                 <w:rPr>
                   <w:color w:val="0B4F9E"/>
@@ -9994,7 +10606,7 @@
               <w:jc w:val="left"/>
             </w:pPr>
             <w:r/>
-            <w:hyperlink r:id="rId117">
+            <w:hyperlink r:id="rId124">
               <w:r>
                 <w:rPr>
                   <w:color w:val="0B4F9E"/>
@@ -10065,7 +10677,7 @@
               <w:jc w:val="left"/>
             </w:pPr>
             <w:r/>
-            <w:hyperlink r:id="rId117">
+            <w:hyperlink r:id="rId124">
               <w:r>
                 <w:rPr>
                   <w:color w:val="0B4F9E"/>
@@ -10088,7 +10700,7 @@
               <w:jc w:val="left"/>
             </w:pPr>
             <w:r/>
-            <w:hyperlink r:id="rId118">
+            <w:hyperlink r:id="rId125">
               <w:r>
                 <w:rPr>
                   <w:color w:val="0B4F9E"/>
@@ -10159,7 +10771,7 @@
               <w:jc w:val="left"/>
             </w:pPr>
             <w:r/>
-            <w:hyperlink r:id="rId118">
+            <w:hyperlink r:id="rId125">
               <w:r>
                 <w:rPr>
                   <w:color w:val="0B4F9E"/>
@@ -10182,7 +10794,7 @@
               <w:jc w:val="left"/>
             </w:pPr>
             <w:r/>
-            <w:hyperlink r:id="rId119">
+            <w:hyperlink r:id="rId126">
               <w:r>
                 <w:rPr>
                   <w:color w:val="0B4F9E"/>
@@ -10253,7 +10865,7 @@
               <w:jc w:val="left"/>
             </w:pPr>
             <w:r/>
-            <w:hyperlink r:id="rId119">
+            <w:hyperlink r:id="rId126">
               <w:r>
                 <w:rPr>
                   <w:color w:val="0B4F9E"/>
@@ -10276,7 +10888,7 @@
               <w:jc w:val="left"/>
             </w:pPr>
             <w:r/>
-            <w:hyperlink r:id="rId120">
+            <w:hyperlink r:id="rId127">
               <w:r>
                 <w:rPr>
                   <w:color w:val="0B4F9E"/>
@@ -10353,7 +10965,7 @@
               <w:jc w:val="left"/>
             </w:pPr>
             <w:r/>
-            <w:hyperlink r:id="rId120">
+            <w:hyperlink r:id="rId127">
               <w:r>
                 <w:rPr>
                   <w:color w:val="0B4F9E"/>
@@ -10376,7 +10988,7 @@
               <w:jc w:val="left"/>
             </w:pPr>
             <w:r/>
-            <w:hyperlink r:id="rId121">
+            <w:hyperlink r:id="rId128">
               <w:r>
                 <w:rPr>
                   <w:color w:val="0B4F9E"/>
@@ -10447,7 +11059,7 @@
               <w:jc w:val="left"/>
             </w:pPr>
             <w:r/>
-            <w:hyperlink r:id="rId122">
+            <w:hyperlink r:id="rId129">
               <w:r>
                 <w:rPr>
                   <w:color w:val="0B4F9E"/>
@@ -10470,7 +11082,107 @@
               <w:jc w:val="left"/>
             </w:pPr>
             <w:r/>
-            <w:hyperlink r:id="rId123">
+            <w:hyperlink r:id="rId130">
+              <w:r>
+                <w:rPr>
+                  <w:color w:val="0B4F9E"/>
+                  <w:sz w:val="16"/>
+                  <w:u w:val="single"/>
+                </w:rPr>
+                <w:t>OrbGNN: A Wave function-based Machine Learning Interelectronic Representation</w:t>
+              </w:r>
+            </w:hyperlink>
+          </w:p>
+        </w:tc>
+        <w:tc>
+          <w:tcPr>
+            <w:tcW w:type="dxa" w:w="1680"/>
+          </w:tcPr>
+          <w:p>
+            <w:pPr>
+              <w:jc w:val="left"/>
+            </w:pPr>
+            <w:r/>
+          </w:p>
+        </w:tc>
+        <w:tc>
+          <w:tcPr>
+            <w:tcW w:type="dxa" w:w="1680"/>
+          </w:tcPr>
+          <w:p>
+            <w:pPr>
+              <w:jc w:val="left"/>
+            </w:pPr>
+            <w:r/>
+          </w:p>
+        </w:tc>
+        <w:tc>
+          <w:tcPr>
+            <w:tcW w:type="dxa" w:w="1680"/>
+          </w:tcPr>
+          <w:p>
+            <w:pPr>
+              <w:jc w:val="left"/>
+            </w:pPr>
+            <w:r/>
+            <w:r>
+              <w:rPr>
+                <w:sz w:val="16"/>
+              </w:rPr>
+              <w:t>MLIP</w:t>
+            </w:r>
+          </w:p>
+        </w:tc>
+        <w:tc>
+          <w:tcPr>
+            <w:tcW w:type="dxa" w:w="1680"/>
+          </w:tcPr>
+          <w:p>
+            <w:pPr>
+              <w:jc w:val="left"/>
+            </w:pPr>
+            <w:r/>
+            <w:r>
+              <w:rPr>
+                <w:sz w:val="16"/>
+              </w:rPr>
+              <w:t>2026-08-28</w:t>
+            </w:r>
+          </w:p>
+        </w:tc>
+        <w:tc>
+          <w:tcPr>
+            <w:tcW w:type="dxa" w:w="1680"/>
+          </w:tcPr>
+          <w:p>
+            <w:pPr>
+              <w:jc w:val="left"/>
+            </w:pPr>
+            <w:r/>
+            <w:hyperlink r:id="rId130">
+              <w:r>
+                <w:rPr>
+                  <w:color w:val="0B4F9E"/>
+                  <w:sz w:val="16"/>
+                  <w:u w:val="single"/>
+                </w:rPr>
+                <w:t>link</w:t>
+              </w:r>
+            </w:hyperlink>
+          </w:p>
+        </w:tc>
+      </w:tr>
+      <w:tr>
+        <w:tc>
+          <w:tcPr>
+            <w:tcW w:type="dxa" w:w="1680"/>
+          </w:tcPr>
+          <w:p>
+            <w:pPr>
+              <w:jc w:val="left"/>
+            </w:pPr>
+            <w:r/>
+            <w:hyperlink r:id="rId131">
               <w:r>
                 <w:rPr>
                   <w:color w:val="0B4F9E"/>
@@ -10547,7 +11259,7 @@
               <w:jc w:val="left"/>
             </w:pPr>
             <w:r/>
-            <w:hyperlink r:id="rId123">
+            <w:hyperlink r:id="rId131">
               <w:r>
                 <w:rPr>
                   <w:color w:val="0B4F9E"/>
@@ -10570,7 +11282,7 @@
               <w:jc w:val="left"/>
             </w:pPr>
             <w:r/>
-            <w:hyperlink r:id="rId124">
+            <w:hyperlink r:id="rId132">
               <w:r>
                 <w:rPr>
                   <w:color w:val="0B4F9E"/>
@@ -10641,7 +11353,7 @@
               <w:jc w:val="left"/>
             </w:pPr>
             <w:r/>
-            <w:hyperlink r:id="rId124">
+            <w:hyperlink r:id="rId132">
               <w:r>
                 <w:rPr>
                   <w:color w:val="0B4F9E"/>
@@ -10664,7 +11376,7 @@
               <w:jc w:val="left"/>
             </w:pPr>
             <w:r/>
-            <w:hyperlink r:id="rId125">
+            <w:hyperlink r:id="rId133">
               <w:r>
                 <w:rPr>
                   <w:color w:val="0B4F9E"/>
@@ -10741,7 +11453,7 @@
               <w:jc w:val="left"/>
             </w:pPr>
             <w:r/>
-            <w:hyperlink r:id="rId125">
+            <w:hyperlink r:id="rId133">
               <w:r>
                 <w:rPr>
                   <w:color w:val="0B4F9E"/>
@@ -10764,7 +11476,7 @@
               <w:jc w:val="left"/>
             </w:pPr>
             <w:r/>
-            <w:hyperlink r:id="rId126">
+            <w:hyperlink r:id="rId134">
               <w:r>
                 <w:rPr>
                   <w:color w:val="0B4F9E"/>
@@ -10835,7 +11547,7 @@
               <w:jc w:val="left"/>
             </w:pPr>
             <w:r/>
-            <w:hyperlink r:id="rId126">
+            <w:hyperlink r:id="rId134">
               <w:r>
                 <w:rPr>
                   <w:color w:val="0B4F9E"/>
@@ -10858,7 +11570,101 @@
               <w:jc w:val="left"/>
             </w:pPr>
             <w:r/>
-            <w:hyperlink r:id="rId127">
+            <w:hyperlink r:id="rId135">
+              <w:r>
+                <w:rPr>
+                  <w:color w:val="0B4F9E"/>
+                  <w:sz w:val="16"/>
+                  <w:u w:val="single"/>
+                </w:rPr>
+                <w:t>Accelerating Materials Discovery: A Review of Machine Learning in X‐Ray Absorption Spectroscopy</w:t>
+              </w:r>
+            </w:hyperlink>
+          </w:p>
+        </w:tc>
+        <w:tc>
+          <w:tcPr>
+            <w:tcW w:type="dxa" w:w="1680"/>
+          </w:tcPr>
+          <w:p>
+            <w:pPr>
+              <w:jc w:val="left"/>
+            </w:pPr>
+            <w:r/>
+          </w:p>
+        </w:tc>
+        <w:tc>
+          <w:tcPr>
+            <w:tcW w:type="dxa" w:w="1680"/>
+          </w:tcPr>
+          <w:p>
+            <w:pPr>
+              <w:jc w:val="left"/>
+            </w:pPr>
+            <w:r/>
+          </w:p>
+        </w:tc>
+        <w:tc>
+          <w:tcPr>
+            <w:tcW w:type="dxa" w:w="1680"/>
+          </w:tcPr>
+          <w:p>
+            <w:pPr>
+              <w:jc w:val="left"/>
+            </w:pPr>
+            <w:r/>
+          </w:p>
+        </w:tc>
+        <w:tc>
+          <w:tcPr>
+            <w:tcW w:type="dxa" w:w="1680"/>
+          </w:tcPr>
+          <w:p>
+            <w:pPr>
+              <w:jc w:val="left"/>
+            </w:pPr>
+            <w:r/>
+            <w:r>
+              <w:rPr>
+                <w:sz w:val="16"/>
+              </w:rPr>
+              <w:t>2026-08-30</w:t>
+            </w:r>
+          </w:p>
+        </w:tc>
+        <w:tc>
+          <w:tcPr>
+            <w:tcW w:type="dxa" w:w="1680"/>
+          </w:tcPr>
+          <w:p>
+            <w:pPr>
+              <w:jc w:val="left"/>
+            </w:pPr>
+            <w:r/>
+            <w:hyperlink r:id="rId135">
+              <w:r>
+                <w:rPr>
+                  <w:color w:val="0B4F9E"/>
+                  <w:sz w:val="16"/>
+                  <w:u w:val="single"/>
+                </w:rPr>
+                <w:t>10.1002/aisy.70529</w:t>
+              </w:r>
+            </w:hyperlink>
+          </w:p>
+        </w:tc>
+      </w:tr>
+      <w:tr>
+        <w:tc>
+          <w:tcPr>
+            <w:tcW w:type="dxa" w:w="1680"/>
+          </w:tcPr>
+          <w:p>
+            <w:pPr>
+              <w:jc w:val="left"/>
+            </w:pPr>
+            <w:r/>
+            <w:hyperlink r:id="rId136">
               <w:r>
                 <w:rPr>
                   <w:color w:val="0B4F9E"/>
@@ -10929,7 +11735,7 @@
               <w:jc w:val="left"/>
             </w:pPr>
             <w:r/>
-            <w:hyperlink r:id="rId127">
+            <w:hyperlink r:id="rId136">
               <w:r>
                 <w:rPr>
                   <w:color w:val="0B4F9E"/>
@@ -10952,7 +11758,7 @@
               <w:jc w:val="left"/>
             </w:pPr>
             <w:r/>
-            <w:hyperlink r:id="rId128">
+            <w:hyperlink r:id="rId137">
               <w:r>
                 <w:rPr>
                   <w:color w:val="0B4F9E"/>
@@ -11029,7 +11835,7 @@
               <w:jc w:val="left"/>
             </w:pPr>
             <w:r/>
-            <w:hyperlink r:id="rId128">
+            <w:hyperlink r:id="rId137">
               <w:r>
                 <w:rPr>
                   <w:color w:val="0B4F9E"/>
@@ -11037,6 +11843,200 @@
                   <w:u w:val="single"/>
                 </w:rPr>
                 <w:t>10.1016/j.robot.2026.105733</w:t>
+              </w:r>
+            </w:hyperlink>
+          </w:p>
+        </w:tc>
+      </w:tr>
+      <w:tr>
+        <w:tc>
+          <w:tcPr>
+            <w:tcW w:type="dxa" w:w="1680"/>
+          </w:tcPr>
+          <w:p>
+            <w:pPr>
+              <w:jc w:val="left"/>
+            </w:pPr>
+            <w:r/>
+            <w:hyperlink r:id="rId138">
+              <w:r>
+                <w:rPr>
+                  <w:color w:val="0B4F9E"/>
+                  <w:sz w:val="16"/>
+                  <w:u w:val="single"/>
+                </w:rPr>
+                <w:t>Workflow design as a research variable in computational materials discovery</w:t>
+              </w:r>
+            </w:hyperlink>
+          </w:p>
+        </w:tc>
+        <w:tc>
+          <w:tcPr>
+            <w:tcW w:type="dxa" w:w="1680"/>
+          </w:tcPr>
+          <w:p>
+            <w:pPr>
+              <w:jc w:val="left"/>
+            </w:pPr>
+            <w:r/>
+          </w:p>
+        </w:tc>
+        <w:tc>
+          <w:tcPr>
+            <w:tcW w:type="dxa" w:w="1680"/>
+          </w:tcPr>
+          <w:p>
+            <w:pPr>
+              <w:jc w:val="left"/>
+            </w:pPr>
+            <w:r/>
+          </w:p>
+        </w:tc>
+        <w:tc>
+          <w:tcPr>
+            <w:tcW w:type="dxa" w:w="1680"/>
+          </w:tcPr>
+          <w:p>
+            <w:pPr>
+              <w:jc w:val="left"/>
+            </w:pPr>
+            <w:r/>
+          </w:p>
+        </w:tc>
+        <w:tc>
+          <w:tcPr>
+            <w:tcW w:type="dxa" w:w="1680"/>
+          </w:tcPr>
+          <w:p>
+            <w:pPr>
+              <w:jc w:val="left"/>
+            </w:pPr>
+            <w:r/>
+            <w:r>
+              <w:rPr>
+                <w:sz w:val="16"/>
+              </w:rPr>
+              <w:t>2026-08-31</w:t>
+            </w:r>
+          </w:p>
+        </w:tc>
+        <w:tc>
+          <w:tcPr>
+            <w:tcW w:type="dxa" w:w="1680"/>
+          </w:tcPr>
+          <w:p>
+            <w:pPr>
+              <w:jc w:val="left"/>
+            </w:pPr>
+            <w:r/>
+            <w:hyperlink r:id="rId138">
+              <w:r>
+                <w:rPr>
+                  <w:color w:val="0B4F9E"/>
+                  <w:sz w:val="16"/>
+                  <w:u w:val="single"/>
+                </w:rPr>
+                <w:t>10.26434/chemrxiv.15008076/v1</w:t>
+              </w:r>
+            </w:hyperlink>
+          </w:p>
+        </w:tc>
+      </w:tr>
+      <w:tr>
+        <w:tc>
+          <w:tcPr>
+            <w:tcW w:type="dxa" w:w="1680"/>
+          </w:tcPr>
+          <w:p>
+            <w:pPr>
+              <w:jc w:val="left"/>
+            </w:pPr>
+            <w:r/>
+            <w:hyperlink r:id="rId139">
+              <w:r>
+                <w:rPr>
+                  <w:color w:val="0B4F9E"/>
+                  <w:sz w:val="16"/>
+                  <w:u w:val="single"/>
+                </w:rPr>
+                <w:t>GigaPath-Flash and GigaTIME-Flash: Toward population-scale discovery with efficient pathology foundation models</w:t>
+              </w:r>
+            </w:hyperlink>
+          </w:p>
+        </w:tc>
+        <w:tc>
+          <w:tcPr>
+            <w:tcW w:type="dxa" w:w="1680"/>
+          </w:tcPr>
+          <w:p>
+            <w:pPr>
+              <w:jc w:val="left"/>
+            </w:pPr>
+            <w:r/>
+          </w:p>
+        </w:tc>
+        <w:tc>
+          <w:tcPr>
+            <w:tcW w:type="dxa" w:w="1680"/>
+          </w:tcPr>
+          <w:p>
+            <w:pPr>
+              <w:jc w:val="left"/>
+            </w:pPr>
+            <w:r/>
+          </w:p>
+        </w:tc>
+        <w:tc>
+          <w:tcPr>
+            <w:tcW w:type="dxa" w:w="1680"/>
+          </w:tcPr>
+          <w:p>
+            <w:pPr>
+              <w:jc w:val="left"/>
+            </w:pPr>
+            <w:r/>
+            <w:r>
+              <w:rPr>
+                <w:sz w:val="16"/>
+              </w:rPr>
+              <w:t>MLIP</w:t>
+            </w:r>
+          </w:p>
+        </w:tc>
+        <w:tc>
+          <w:tcPr>
+            <w:tcW w:type="dxa" w:w="1680"/>
+          </w:tcPr>
+          <w:p>
+            <w:pPr>
+              <w:jc w:val="left"/>
+            </w:pPr>
+            <w:r/>
+            <w:r>
+              <w:rPr>
+                <w:sz w:val="16"/>
+              </w:rPr>
+              <w:t>2026-08-31</w:t>
+            </w:r>
+          </w:p>
+        </w:tc>
+        <w:tc>
+          <w:tcPr>
+            <w:tcW w:type="dxa" w:w="1680"/>
+          </w:tcPr>
+          <w:p>
+            <w:pPr>
+              <w:jc w:val="left"/>
+            </w:pPr>
+            <w:r/>
+            <w:hyperlink r:id="rId139">
+              <w:r>
+                <w:rPr>
+                  <w:color w:val="0B4F9E"/>
+                  <w:sz w:val="16"/>
+                  <w:u w:val="single"/>
+                </w:rPr>
+                <w:t>link</w:t>
               </w:r>
             </w:hyperlink>
           </w:p>
@@ -11063,7 +12063,7 @@
         <w:rPr>
           <w:b/>
         </w:rPr>
-        <w:t>75</w:t>
+        <w:t>87</w:t>
       </w:r>
     </w:p>
     <w:p>
@@ -11077,7 +12077,7 @@
         <w:rPr>
           <w:b/>
         </w:rPr>
-        <w:t>27</w:t>
+        <w:t>35</w:t>
       </w:r>
     </w:p>
     <w:p>
@@ -11091,7 +12091,7 @@
         <w:rPr>
           <w:b/>
         </w:rPr>
-        <w:t>93</w:t>
+        <w:t>103</w:t>
       </w:r>
     </w:p>
     <w:p>

</xml_diff>

<commit_message>
Digest + summary: 2026-09-04
</commit_message>
<xml_diff>
--- a/NEEDS_DATA.docx
+++ b/NEEDS_DATA.docx
@@ -17,7 +17,7 @@
     </w:p>
     <w:p>
       <w:r>
-        <w:t xml:space="preserve">Generated 2026-09-03. Every field below was blank in the automated sources. Fill any of them in </w:t>
+        <w:t xml:space="preserve">Generated 2026-09-04. Every field below was blank in the automated sources. Fill any of them in </w:t>
       </w:r>
       <w:r>
         <w:rPr>
@@ -1387,7 +1387,7 @@
         <w:pStyle w:val="Heading2"/>
       </w:pPr>
       <w:r>
-        <w:t>Studies with no numeric performance figure (153 of 159)</w:t>
+        <w:t>Studies with no numeric performance figure (164 of 173)</w:t>
       </w:r>
     </w:p>
     <w:p>
@@ -1809,7 +1809,7 @@
               <w:rPr>
                 <w:sz w:val="16"/>
               </w:rPr>
-              <w:t>ALIGNN, MEGNet, CGCNN</w:t>
+              <w:t>MEGNet, ALIGNN, CGCNN</w:t>
             </w:r>
           </w:p>
         </w:tc>
@@ -3541,7 +3541,7 @@
               <w:rPr>
                 <w:sz w:val="16"/>
               </w:rPr>
-              <w:t>ALIGNN, CHGNet</w:t>
+              <w:t>CHGNet, ALIGNN</w:t>
             </w:r>
           </w:p>
         </w:tc>
@@ -9257,6 +9257,106 @@
                   <w:sz w:val="16"/>
                   <w:u w:val="single"/>
                 </w:rPr>
+                <w:t>Predicting Faster Than We Can Make: Polymer‐Specific Process Physics as a Frontier for Autonomous Soft‐Matter Discovery</w:t>
+              </w:r>
+            </w:hyperlink>
+          </w:p>
+        </w:tc>
+        <w:tc>
+          <w:tcPr>
+            <w:tcW w:type="dxa" w:w="1680"/>
+          </w:tcPr>
+          <w:p>
+            <w:pPr>
+              <w:jc w:val="left"/>
+            </w:pPr>
+            <w:r/>
+          </w:p>
+        </w:tc>
+        <w:tc>
+          <w:tcPr>
+            <w:tcW w:type="dxa" w:w="1680"/>
+          </w:tcPr>
+          <w:p>
+            <w:pPr>
+              <w:jc w:val="left"/>
+            </w:pPr>
+            <w:r/>
+            <w:r>
+              <w:rPr>
+                <w:sz w:val="16"/>
+              </w:rPr>
+              <w:t>polymer</w:t>
+            </w:r>
+          </w:p>
+        </w:tc>
+        <w:tc>
+          <w:tcPr>
+            <w:tcW w:type="dxa" w:w="1680"/>
+          </w:tcPr>
+          <w:p>
+            <w:pPr>
+              <w:jc w:val="left"/>
+            </w:pPr>
+            <w:r/>
+          </w:p>
+        </w:tc>
+        <w:tc>
+          <w:tcPr>
+            <w:tcW w:type="dxa" w:w="1680"/>
+          </w:tcPr>
+          <w:p>
+            <w:pPr>
+              <w:jc w:val="left"/>
+            </w:pPr>
+            <w:r/>
+            <w:r>
+              <w:rPr>
+                <w:sz w:val="16"/>
+              </w:rPr>
+              <w:t>2026-09-01</w:t>
+            </w:r>
+          </w:p>
+        </w:tc>
+        <w:tc>
+          <w:tcPr>
+            <w:tcW w:type="dxa" w:w="1680"/>
+          </w:tcPr>
+          <w:p>
+            <w:pPr>
+              <w:jc w:val="left"/>
+            </w:pPr>
+            <w:r/>
+            <w:hyperlink r:id="rId108">
+              <w:r>
+                <w:rPr>
+                  <w:color w:val="0B4F9E"/>
+                  <w:sz w:val="16"/>
+                  <w:u w:val="single"/>
+                </w:rPr>
+                <w:t>10.1002/marc.70420</w:t>
+              </w:r>
+            </w:hyperlink>
+          </w:p>
+        </w:tc>
+      </w:tr>
+      <w:tr>
+        <w:tc>
+          <w:tcPr>
+            <w:tcW w:type="dxa" w:w="1680"/>
+          </w:tcPr>
+          <w:p>
+            <w:pPr>
+              <w:jc w:val="left"/>
+            </w:pPr>
+            <w:r/>
+            <w:hyperlink r:id="rId109">
+              <w:r>
+                <w:rPr>
+                  <w:color w:val="0B4F9E"/>
+                  <w:sz w:val="16"/>
+                  <w:u w:val="single"/>
+                </w:rPr>
                 <w:t>Lead-free piezoelectric perovskites for arterial-pulse e-skin: from configurational complexity to equivariant machine-le</w:t>
               </w:r>
             </w:hyperlink>
@@ -9333,7 +9433,7 @@
               <w:jc w:val="left"/>
             </w:pPr>
             <w:r/>
-            <w:hyperlink r:id="rId108">
+            <w:hyperlink r:id="rId109">
               <w:r>
                 <w:rPr>
                   <w:color w:val="0B4F9E"/>
@@ -9356,7 +9456,7 @@
               <w:jc w:val="left"/>
             </w:pPr>
             <w:r/>
-            <w:hyperlink r:id="rId109">
+            <w:hyperlink r:id="rId110">
               <w:r>
                 <w:rPr>
                   <w:color w:val="0B4F9E"/>
@@ -9433,7 +9533,7 @@
               <w:jc w:val="left"/>
             </w:pPr>
             <w:r/>
-            <w:hyperlink r:id="rId109">
+            <w:hyperlink r:id="rId110">
               <w:r>
                 <w:rPr>
                   <w:color w:val="0B4F9E"/>
@@ -9456,7 +9556,7 @@
               <w:jc w:val="left"/>
             </w:pPr>
             <w:r/>
-            <w:hyperlink r:id="rId110">
+            <w:hyperlink r:id="rId111">
               <w:r>
                 <w:rPr>
                   <w:color w:val="0B4F9E"/>
@@ -9533,7 +9633,7 @@
               <w:jc w:val="left"/>
             </w:pPr>
             <w:r/>
-            <w:hyperlink r:id="rId111">
+            <w:hyperlink r:id="rId112">
               <w:r>
                 <w:rPr>
                   <w:color w:val="0B4F9E"/>
@@ -9556,7 +9656,107 @@
               <w:jc w:val="left"/>
             </w:pPr>
             <w:r/>
-            <w:hyperlink r:id="rId112">
+            <w:hyperlink r:id="rId113">
+              <w:r>
+                <w:rPr>
+                  <w:color w:val="0B4F9E"/>
+                  <w:sz w:val="16"/>
+                  <w:u w:val="single"/>
+                </w:rPr>
+                <w:t>HiPoly: a hierarchical polymer-native AI framework for property prediction and generative design</w:t>
+              </w:r>
+            </w:hyperlink>
+          </w:p>
+        </w:tc>
+        <w:tc>
+          <w:tcPr>
+            <w:tcW w:type="dxa" w:w="1680"/>
+          </w:tcPr>
+          <w:p>
+            <w:pPr>
+              <w:jc w:val="left"/>
+            </w:pPr>
+            <w:r/>
+          </w:p>
+        </w:tc>
+        <w:tc>
+          <w:tcPr>
+            <w:tcW w:type="dxa" w:w="1680"/>
+          </w:tcPr>
+          <w:p>
+            <w:pPr>
+              <w:jc w:val="left"/>
+            </w:pPr>
+            <w:r/>
+            <w:r>
+              <w:rPr>
+                <w:sz w:val="16"/>
+              </w:rPr>
+              <w:t>polymer</w:t>
+            </w:r>
+          </w:p>
+        </w:tc>
+        <w:tc>
+          <w:tcPr>
+            <w:tcW w:type="dxa" w:w="1680"/>
+          </w:tcPr>
+          <w:p>
+            <w:pPr>
+              <w:jc w:val="left"/>
+            </w:pPr>
+            <w:r/>
+          </w:p>
+        </w:tc>
+        <w:tc>
+          <w:tcPr>
+            <w:tcW w:type="dxa" w:w="1680"/>
+          </w:tcPr>
+          <w:p>
+            <w:pPr>
+              <w:jc w:val="left"/>
+            </w:pPr>
+            <w:r/>
+            <w:r>
+              <w:rPr>
+                <w:sz w:val="16"/>
+              </w:rPr>
+              <w:t>2026-09-02</w:t>
+            </w:r>
+          </w:p>
+        </w:tc>
+        <w:tc>
+          <w:tcPr>
+            <w:tcW w:type="dxa" w:w="1680"/>
+          </w:tcPr>
+          <w:p>
+            <w:pPr>
+              <w:jc w:val="left"/>
+            </w:pPr>
+            <w:r/>
+            <w:hyperlink r:id="rId113">
+              <w:r>
+                <w:rPr>
+                  <w:color w:val="0B4F9E"/>
+                  <w:sz w:val="16"/>
+                  <w:u w:val="single"/>
+                </w:rPr>
+                <w:t>10.48550/arxiv.2609.02746</w:t>
+              </w:r>
+            </w:hyperlink>
+          </w:p>
+        </w:tc>
+      </w:tr>
+      <w:tr>
+        <w:tc>
+          <w:tcPr>
+            <w:tcW w:type="dxa" w:w="1680"/>
+          </w:tcPr>
+          <w:p>
+            <w:pPr>
+              <w:jc w:val="left"/>
+            </w:pPr>
+            <w:r/>
+            <w:hyperlink r:id="rId114">
               <w:r>
                 <w:rPr>
                   <w:color w:val="0B4F9E"/>
@@ -9639,7 +9839,7 @@
               <w:jc w:val="left"/>
             </w:pPr>
             <w:r/>
-            <w:hyperlink r:id="rId113">
+            <w:hyperlink r:id="rId115">
               <w:r>
                 <w:rPr>
                   <w:color w:val="0B4F9E"/>
@@ -9662,7 +9862,7 @@
               <w:jc w:val="left"/>
             </w:pPr>
             <w:r/>
-            <w:hyperlink r:id="rId114">
+            <w:hyperlink r:id="rId116">
               <w:r>
                 <w:rPr>
                   <w:color w:val="0B4F9E"/>
@@ -9739,7 +9939,7 @@
               <w:jc w:val="left"/>
             </w:pPr>
             <w:r/>
-            <w:hyperlink r:id="rId114">
+            <w:hyperlink r:id="rId116">
               <w:r>
                 <w:rPr>
                   <w:color w:val="0B4F9E"/>
@@ -9762,7 +9962,7 @@
               <w:jc w:val="left"/>
             </w:pPr>
             <w:r/>
-            <w:hyperlink r:id="rId115">
+            <w:hyperlink r:id="rId117">
               <w:r>
                 <w:rPr>
                   <w:color w:val="0B4F9E"/>
@@ -9839,7 +10039,7 @@
               <w:jc w:val="left"/>
             </w:pPr>
             <w:r/>
-            <w:hyperlink r:id="rId115">
+            <w:hyperlink r:id="rId117">
               <w:r>
                 <w:rPr>
                   <w:color w:val="0B4F9E"/>
@@ -9862,7 +10062,7 @@
               <w:jc w:val="left"/>
             </w:pPr>
             <w:r/>
-            <w:hyperlink r:id="rId116">
+            <w:hyperlink r:id="rId118">
               <w:r>
                 <w:rPr>
                   <w:color w:val="0B4F9E"/>
@@ -9945,7 +10145,7 @@
               <w:jc w:val="left"/>
             </w:pPr>
             <w:r/>
-            <w:hyperlink r:id="rId116">
+            <w:hyperlink r:id="rId118">
               <w:r>
                 <w:rPr>
                   <w:color w:val="0B4F9E"/>
@@ -9968,14 +10168,14 @@
               <w:jc w:val="left"/>
             </w:pPr>
             <w:r/>
-            <w:hyperlink r:id="rId117">
+            <w:hyperlink r:id="rId119">
               <w:r>
                 <w:rPr>
                   <w:color w:val="0B4F9E"/>
                   <w:sz w:val="16"/>
                   <w:u w:val="single"/>
                 </w:rPr>
-                <w:t>HiPoly: a hierarchical polymer-native AI framework for property prediction and generative design</w:t>
+                <w:t>Low-Temperature Transport in Li-Ion Battery EC/EMC/FEC Electrolytes: Molecular Dynamics and Machine-Learning Modeling</w:t>
               </w:r>
             </w:hyperlink>
           </w:p>
@@ -10004,7 +10204,7 @@
               <w:rPr>
                 <w:sz w:val="16"/>
               </w:rPr>
-              <w:t>polymer</w:t>
+              <w:t>Li-ion battery</w:t>
             </w:r>
           </w:p>
         </w:tc>
@@ -10017,6 +10217,12 @@
               <w:jc w:val="left"/>
             </w:pPr>
             <w:r/>
+            <w:r>
+              <w:rPr>
+                <w:sz w:val="16"/>
+              </w:rPr>
+              <w:t>MD</w:t>
+            </w:r>
           </w:p>
         </w:tc>
         <w:tc>
@@ -10045,7 +10251,7 @@
               <w:jc w:val="left"/>
             </w:pPr>
             <w:r/>
-            <w:hyperlink r:id="rId117">
+            <w:hyperlink r:id="rId119">
               <w:r>
                 <w:rPr>
                   <w:color w:val="0B4F9E"/>
@@ -10068,14 +10274,14 @@
               <w:jc w:val="left"/>
             </w:pPr>
             <w:r/>
-            <w:hyperlink r:id="rId118">
+            <w:hyperlink r:id="rId120">
               <w:r>
                 <w:rPr>
                   <w:color w:val="0B4F9E"/>
                   <w:sz w:val="16"/>
                   <w:u w:val="single"/>
                 </w:rPr>
-                <w:t>Low-Temperature Transport in Li-Ion Battery EC/EMC/FEC Electrolytes: Molecular Dynamics and Machine-Learning Modeling</w:t>
+                <w:t>Physics-Informed Neural Network Surrogate for Oxygen Vacancy Dynamics in epitaxial $\mathrm{SrTiO_3}$ on Si memristors v</w:t>
               </w:r>
             </w:hyperlink>
           </w:p>
@@ -10104,7 +10310,7 @@
               <w:rPr>
                 <w:sz w:val="16"/>
               </w:rPr>
-              <w:t>Li-ion battery</w:t>
+              <w:t>semiconductor, oxide</w:t>
             </w:r>
           </w:p>
         </w:tc>
@@ -10117,12 +10323,6 @@
               <w:jc w:val="left"/>
             </w:pPr>
             <w:r/>
-            <w:r>
-              <w:rPr>
-                <w:sz w:val="16"/>
-              </w:rPr>
-              <w:t>MD</w:t>
-            </w:r>
           </w:p>
         </w:tc>
         <w:tc>
@@ -10151,7 +10351,7 @@
               <w:jc w:val="left"/>
             </w:pPr>
             <w:r/>
-            <w:hyperlink r:id="rId118">
+            <w:hyperlink r:id="rId120">
               <w:r>
                 <w:rPr>
                   <w:color w:val="0B4F9E"/>
@@ -10174,7 +10374,7 @@
               <w:jc w:val="left"/>
             </w:pPr>
             <w:r/>
-            <w:hyperlink r:id="rId119">
+            <w:hyperlink r:id="rId121">
               <w:r>
                 <w:rPr>
                   <w:color w:val="0B4F9E"/>
@@ -10251,7 +10451,7 @@
               <w:jc w:val="left"/>
             </w:pPr>
             <w:r/>
-            <w:hyperlink r:id="rId119">
+            <w:hyperlink r:id="rId121">
               <w:r>
                 <w:rPr>
                   <w:color w:val="0B4F9E"/>
@@ -10274,7 +10474,7 @@
               <w:jc w:val="left"/>
             </w:pPr>
             <w:r/>
-            <w:hyperlink r:id="rId120">
+            <w:hyperlink r:id="rId122">
               <w:r>
                 <w:rPr>
                   <w:color w:val="0B4F9E"/>
@@ -10351,7 +10551,7 @@
               <w:jc w:val="left"/>
             </w:pPr>
             <w:r/>
-            <w:hyperlink r:id="rId120">
+            <w:hyperlink r:id="rId122">
               <w:r>
                 <w:rPr>
                   <w:color w:val="0B4F9E"/>
@@ -10374,200 +10574,6 @@
               <w:jc w:val="left"/>
             </w:pPr>
             <w:r/>
-            <w:hyperlink r:id="rId121">
-              <w:r>
-                <w:rPr>
-                  <w:color w:val="0B4F9E"/>
-                  <w:sz w:val="16"/>
-                  <w:u w:val="single"/>
-                </w:rPr>
-                <w:t>From Empirical Design To Autonomous Ecosystems: AI-Driven Advances, Challenges, And Future Directions In Precision Nanom</w:t>
-              </w:r>
-            </w:hyperlink>
-          </w:p>
-        </w:tc>
-        <w:tc>
-          <w:tcPr>
-            <w:tcW w:type="dxa" w:w="1680"/>
-          </w:tcPr>
-          <w:p>
-            <w:pPr>
-              <w:jc w:val="left"/>
-            </w:pPr>
-            <w:r/>
-          </w:p>
-        </w:tc>
-        <w:tc>
-          <w:tcPr>
-            <w:tcW w:type="dxa" w:w="1680"/>
-          </w:tcPr>
-          <w:p>
-            <w:pPr>
-              <w:jc w:val="left"/>
-            </w:pPr>
-            <w:r/>
-          </w:p>
-        </w:tc>
-        <w:tc>
-          <w:tcPr>
-            <w:tcW w:type="dxa" w:w="1680"/>
-          </w:tcPr>
-          <w:p>
-            <w:pPr>
-              <w:jc w:val="left"/>
-            </w:pPr>
-            <w:r/>
-          </w:p>
-        </w:tc>
-        <w:tc>
-          <w:tcPr>
-            <w:tcW w:type="dxa" w:w="1680"/>
-          </w:tcPr>
-          <w:p>
-            <w:pPr>
-              <w:jc w:val="left"/>
-            </w:pPr>
-            <w:r/>
-            <w:r>
-              <w:rPr>
-                <w:sz w:val="16"/>
-              </w:rPr>
-              <w:t>2026-08-14</w:t>
-            </w:r>
-          </w:p>
-        </w:tc>
-        <w:tc>
-          <w:tcPr>
-            <w:tcW w:type="dxa" w:w="1680"/>
-          </w:tcPr>
-          <w:p>
-            <w:pPr>
-              <w:jc w:val="left"/>
-            </w:pPr>
-            <w:r/>
-            <w:hyperlink r:id="rId121">
-              <w:r>
-                <w:rPr>
-                  <w:color w:val="0B4F9E"/>
-                  <w:sz w:val="16"/>
-                  <w:u w:val="single"/>
-                </w:rPr>
-                <w:t>10.5281/zenodo.21931873</w:t>
-              </w:r>
-            </w:hyperlink>
-          </w:p>
-        </w:tc>
-      </w:tr>
-      <w:tr>
-        <w:tc>
-          <w:tcPr>
-            <w:tcW w:type="dxa" w:w="1680"/>
-          </w:tcPr>
-          <w:p>
-            <w:pPr>
-              <w:jc w:val="left"/>
-            </w:pPr>
-            <w:r/>
-            <w:hyperlink r:id="rId122">
-              <w:r>
-                <w:rPr>
-                  <w:color w:val="0B4F9E"/>
-                  <w:sz w:val="16"/>
-                  <w:u w:val="single"/>
-                </w:rPr>
-                <w:t>Electrostatic Phenomenology Benchmarks for Machine-Learned Interatomic Potentials in Electrochemistry: Beyond the Energy</w:t>
-              </w:r>
-            </w:hyperlink>
-          </w:p>
-        </w:tc>
-        <w:tc>
-          <w:tcPr>
-            <w:tcW w:type="dxa" w:w="1680"/>
-          </w:tcPr>
-          <w:p>
-            <w:pPr>
-              <w:jc w:val="left"/>
-            </w:pPr>
-            <w:r/>
-          </w:p>
-        </w:tc>
-        <w:tc>
-          <w:tcPr>
-            <w:tcW w:type="dxa" w:w="1680"/>
-          </w:tcPr>
-          <w:p>
-            <w:pPr>
-              <w:jc w:val="left"/>
-            </w:pPr>
-            <w:r/>
-          </w:p>
-        </w:tc>
-        <w:tc>
-          <w:tcPr>
-            <w:tcW w:type="dxa" w:w="1680"/>
-          </w:tcPr>
-          <w:p>
-            <w:pPr>
-              <w:jc w:val="left"/>
-            </w:pPr>
-            <w:r/>
-            <w:r>
-              <w:rPr>
-                <w:sz w:val="16"/>
-              </w:rPr>
-              <w:t>MLIP</w:t>
-            </w:r>
-          </w:p>
-        </w:tc>
-        <w:tc>
-          <w:tcPr>
-            <w:tcW w:type="dxa" w:w="1680"/>
-          </w:tcPr>
-          <w:p>
-            <w:pPr>
-              <w:jc w:val="left"/>
-            </w:pPr>
-            <w:r/>
-            <w:r>
-              <w:rPr>
-                <w:sz w:val="16"/>
-              </w:rPr>
-              <w:t>2026-08-14</w:t>
-            </w:r>
-          </w:p>
-        </w:tc>
-        <w:tc>
-          <w:tcPr>
-            <w:tcW w:type="dxa" w:w="1680"/>
-          </w:tcPr>
-          <w:p>
-            <w:pPr>
-              <w:jc w:val="left"/>
-            </w:pPr>
-            <w:r/>
-            <w:hyperlink r:id="rId122">
-              <w:r>
-                <w:rPr>
-                  <w:color w:val="0B4F9E"/>
-                  <w:sz w:val="16"/>
-                  <w:u w:val="single"/>
-                </w:rPr>
-                <w:t>link</w:t>
-              </w:r>
-            </w:hyperlink>
-          </w:p>
-        </w:tc>
-      </w:tr>
-      <w:tr>
-        <w:tc>
-          <w:tcPr>
-            <w:tcW w:type="dxa" w:w="1680"/>
-          </w:tcPr>
-          <w:p>
-            <w:pPr>
-              <w:jc w:val="left"/>
-            </w:pPr>
-            <w:r/>
             <w:hyperlink r:id="rId123">
               <w:r>
                 <w:rPr>
@@ -10575,20 +10581,9 @@
                   <w:sz w:val="16"/>
                   <w:u w:val="single"/>
                 </w:rPr>
-                <w:t>The Past and Future of AI Scientists</w:t>
+                <w:t>Interplay of B-Site Off-Centering and Molecular Orientations in the Mixed Hybrid Perovskite MAGe1xSnxI3</w:t>
               </w:r>
             </w:hyperlink>
-          </w:p>
-        </w:tc>
-        <w:tc>
-          <w:tcPr>
-            <w:tcW w:type="dxa" w:w="1680"/>
-          </w:tcPr>
-          <w:p>
-            <w:pPr>
-              <w:jc w:val="left"/>
-            </w:pPr>
-            <w:r/>
           </w:p>
         </w:tc>
         <w:tc>
@@ -10615,7 +10610,7 @@
               <w:rPr>
                 <w:sz w:val="16"/>
               </w:rPr>
-              <w:t>MLIP</w:t>
+              <w:t>perovskite, halide perovskite</w:t>
             </w:r>
           </w:p>
         </w:tc>
@@ -10632,7 +10627,24 @@
               <w:rPr>
                 <w:sz w:val="16"/>
               </w:rPr>
-              <w:t>2026-08-14</w:t>
+              <w:t>MD, MLIP</w:t>
+            </w:r>
+          </w:p>
+        </w:tc>
+        <w:tc>
+          <w:tcPr>
+            <w:tcW w:type="dxa" w:w="1680"/>
+          </w:tcPr>
+          <w:p>
+            <w:pPr>
+              <w:jc w:val="left"/>
+            </w:pPr>
+            <w:r/>
+            <w:r>
+              <w:rPr>
+                <w:sz w:val="16"/>
+              </w:rPr>
+              <w:t>2026-09-03</w:t>
             </w:r>
           </w:p>
         </w:tc>
@@ -10675,20 +10687,9 @@
                   <w:sz w:val="16"/>
                   <w:u w:val="single"/>
                 </w:rPr>
-                <w:t>Graph neural network prediction of temperature-dependent hydrogen diffusion and thermal conductivity tensors of tungsten</w:t>
+                <w:t>BiFuN: Machine Learning-Guided Bifunctional Catalysis in Hydrogenation Reactions</w:t>
               </w:r>
             </w:hyperlink>
-          </w:p>
-        </w:tc>
-        <w:tc>
-          <w:tcPr>
-            <w:tcW w:type="dxa" w:w="1680"/>
-          </w:tcPr>
-          <w:p>
-            <w:pPr>
-              <w:jc w:val="left"/>
-            </w:pPr>
-            <w:r/>
           </w:p>
         </w:tc>
         <w:tc>
@@ -10715,8 +10716,19 @@
               <w:rPr>
                 <w:sz w:val="16"/>
               </w:rPr>
-              <w:t>MD</w:t>
+              <w:t>catalyst, CO2</w:t>
             </w:r>
+          </w:p>
+        </w:tc>
+        <w:tc>
+          <w:tcPr>
+            <w:tcW w:type="dxa" w:w="1680"/>
+          </w:tcPr>
+          <w:p>
+            <w:pPr>
+              <w:jc w:val="left"/>
+            </w:pPr>
+            <w:r/>
           </w:p>
         </w:tc>
         <w:tc>
@@ -10732,7 +10744,7 @@
               <w:rPr>
                 <w:sz w:val="16"/>
               </w:rPr>
-              <w:t>2026-08-16</w:t>
+              <w:t>2026-09-04</w:t>
             </w:r>
           </w:p>
         </w:tc>
@@ -10752,7 +10764,7 @@
                   <w:sz w:val="16"/>
                   <w:u w:val="single"/>
                 </w:rPr>
-                <w:t>link</w:t>
+                <w:t>10.26434/chemrxiv.15008296/v1</w:t>
               </w:r>
             </w:hyperlink>
           </w:p>
@@ -10775,9 +10787,20 @@
                   <w:sz w:val="16"/>
                   <w:u w:val="single"/>
                 </w:rPr>
-                <w:t>Machine Learning-Accelerated Band-Edge Engineering of Pnictogen Chalcohalide Solid Solutions for Solar Energy Technologi</w:t>
+                <w:t>From Empirical Design To Autonomous Ecosystems: AI-Driven Advances, Challenges, And Future Directions In Precision Nanom</w:t>
               </w:r>
             </w:hyperlink>
+          </w:p>
+        </w:tc>
+        <w:tc>
+          <w:tcPr>
+            <w:tcW w:type="dxa" w:w="1680"/>
+          </w:tcPr>
+          <w:p>
+            <w:pPr>
+              <w:jc w:val="left"/>
+            </w:pPr>
+            <w:r/>
           </w:p>
         </w:tc>
         <w:tc>
@@ -10815,24 +10838,7 @@
               <w:rPr>
                 <w:sz w:val="16"/>
               </w:rPr>
-              <w:t>DFT</w:t>
-            </w:r>
-          </w:p>
-        </w:tc>
-        <w:tc>
-          <w:tcPr>
-            <w:tcW w:type="dxa" w:w="1680"/>
-          </w:tcPr>
-          <w:p>
-            <w:pPr>
-              <w:jc w:val="left"/>
-            </w:pPr>
-            <w:r/>
-            <w:r>
-              <w:rPr>
-                <w:sz w:val="16"/>
-              </w:rPr>
-              <w:t>2026-08-17</w:t>
+              <w:t>2026-08-14</w:t>
             </w:r>
           </w:p>
         </w:tc>
@@ -10852,7 +10858,7 @@
                   <w:sz w:val="16"/>
                   <w:u w:val="single"/>
                 </w:rPr>
-                <w:t>link</w:t>
+                <w:t>10.5281/zenodo.21931873</w:t>
               </w:r>
             </w:hyperlink>
           </w:p>
@@ -10875,20 +10881,9 @@
                   <w:sz w:val="16"/>
                   <w:u w:val="single"/>
                 </w:rPr>
-                <w:t xml:space="preserve">Extracting a nitrile-centered, ether-assisted motif hierarchy for lithium-battery electrolyte design from billion-scale </w:t>
+                <w:t>Electrostatic Phenomenology Benchmarks for Machine-Learned Interatomic Potentials in Electrochemistry: Beyond the Energy</w:t>
               </w:r>
             </w:hyperlink>
-          </w:p>
-        </w:tc>
-        <w:tc>
-          <w:tcPr>
-            <w:tcW w:type="dxa" w:w="1680"/>
-          </w:tcPr>
-          <w:p>
-            <w:pPr>
-              <w:jc w:val="left"/>
-            </w:pPr>
-            <w:r/>
           </w:p>
         </w:tc>
         <w:tc>
@@ -10926,7 +10921,24 @@
               <w:rPr>
                 <w:sz w:val="16"/>
               </w:rPr>
-              <w:t>2026-08-17</w:t>
+              <w:t>MLIP</w:t>
+            </w:r>
+          </w:p>
+        </w:tc>
+        <w:tc>
+          <w:tcPr>
+            <w:tcW w:type="dxa" w:w="1680"/>
+          </w:tcPr>
+          <w:p>
+            <w:pPr>
+              <w:jc w:val="left"/>
+            </w:pPr>
+            <w:r/>
+            <w:r>
+              <w:rPr>
+                <w:sz w:val="16"/>
+              </w:rPr>
+              <w:t>2026-08-14</w:t>
             </w:r>
           </w:p>
         </w:tc>
@@ -10969,7 +10981,7 @@
                   <w:sz w:val="16"/>
                   <w:u w:val="single"/>
                 </w:rPr>
-                <w:t>Discovery of novel magnetic Y-Mn-B compounds via advanced machine learning guided framework</w:t>
+                <w:t>The Past and Future of AI Scientists</w:t>
               </w:r>
             </w:hyperlink>
           </w:p>
@@ -11009,7 +11021,7 @@
               <w:rPr>
                 <w:sz w:val="16"/>
               </w:rPr>
-              <w:t>DFT</w:t>
+              <w:t>MLIP</w:t>
             </w:r>
           </w:p>
         </w:tc>
@@ -11026,7 +11038,7 @@
               <w:rPr>
                 <w:sz w:val="16"/>
               </w:rPr>
-              <w:t>2026-08-17</w:t>
+              <w:t>2026-08-14</w:t>
             </w:r>
           </w:p>
         </w:tc>
@@ -11069,7 +11081,7 @@
                   <w:sz w:val="16"/>
                   <w:u w:val="single"/>
                 </w:rPr>
-                <w:t>Unlocking Multi-Component Bulk-Materials Molecular Dynamics with a Small-Footprint Machine Learning Interatomic Potentia</w:t>
+                <w:t>Graph neural network prediction of temperature-dependent hydrogen diffusion and thermal conductivity tensors of tungsten</w:t>
               </w:r>
             </w:hyperlink>
           </w:p>
@@ -11109,7 +11121,7 @@
               <w:rPr>
                 <w:sz w:val="16"/>
               </w:rPr>
-              <w:t>MD, MLIP</w:t>
+              <w:t>MD</w:t>
             </w:r>
           </w:p>
         </w:tc>
@@ -11126,7 +11138,7 @@
               <w:rPr>
                 <w:sz w:val="16"/>
               </w:rPr>
-              <w:t>2026-08-17</w:t>
+              <w:t>2026-08-16</w:t>
             </w:r>
           </w:p>
         </w:tc>
@@ -11169,7 +11181,7 @@
                   <w:sz w:val="16"/>
                   <w:u w:val="single"/>
                 </w:rPr>
-                <w:t>ChemReporter: A Framework for Curating and Exporting Large-Scale Chemical Datasets for MLIP Training</w:t>
+                <w:t>Machine Learning-Accelerated Band-Edge Engineering of Pnictogen Chalcohalide Solid Solutions for Solar Energy Technologi</w:t>
               </w:r>
             </w:hyperlink>
           </w:p>
@@ -11209,7 +11221,7 @@
               <w:rPr>
                 <w:sz w:val="16"/>
               </w:rPr>
-              <w:t>MLIP</w:t>
+              <w:t>DFT</w:t>
             </w:r>
           </w:p>
         </w:tc>
@@ -11269,7 +11281,7 @@
                   <w:sz w:val="16"/>
                   <w:u w:val="single"/>
                 </w:rPr>
-                <w:t>Active learning molecular beam epitaxy of complex quantum materials</w:t>
+                <w:t xml:space="preserve">Extracting a nitrile-centered, ether-assisted motif hierarchy for lithium-battery electrolyte design from billion-scale </w:t>
               </w:r>
             </w:hyperlink>
           </w:p>
@@ -11320,7 +11332,7 @@
               <w:rPr>
                 <w:sz w:val="16"/>
               </w:rPr>
-              <w:t>2026-08-18</w:t>
+              <w:t>2026-08-17</w:t>
             </w:r>
           </w:p>
         </w:tc>
@@ -11363,7 +11375,7 @@
                   <w:sz w:val="16"/>
                   <w:u w:val="single"/>
                 </w:rPr>
-                <w:t>PyAPX: python toolkit for atomic configuration pattern exploration</w:t>
+                <w:t>Discovery of novel magnetic Y-Mn-B compounds via advanced machine learning guided framework</w:t>
               </w:r>
             </w:hyperlink>
           </w:p>
@@ -11403,7 +11415,7 @@
               <w:rPr>
                 <w:sz w:val="16"/>
               </w:rPr>
-              <w:t>DFT, MLIP</w:t>
+              <w:t>DFT</w:t>
             </w:r>
           </w:p>
         </w:tc>
@@ -11420,7 +11432,7 @@
               <w:rPr>
                 <w:sz w:val="16"/>
               </w:rPr>
-              <w:t>2026-08-19</w:t>
+              <w:t>2026-08-17</w:t>
             </w:r>
           </w:p>
         </w:tc>
@@ -11440,7 +11452,7 @@
                   <w:sz w:val="16"/>
                   <w:u w:val="single"/>
                 </w:rPr>
-                <w:t>10.1038/s41598-026-66072-5</w:t>
+                <w:t>link</w:t>
               </w:r>
             </w:hyperlink>
           </w:p>
@@ -11463,7 +11475,7 @@
                   <w:sz w:val="16"/>
                   <w:u w:val="single"/>
                 </w:rPr>
-                <w:t>A single design choice determines whether machine learning models of materials make physically impossible predictions</w:t>
+                <w:t>Unlocking Multi-Component Bulk-Materials Molecular Dynamics with a Small-Footprint Machine Learning Interatomic Potentia</w:t>
               </w:r>
             </w:hyperlink>
           </w:p>
@@ -11503,7 +11515,7 @@
               <w:rPr>
                 <w:sz w:val="16"/>
               </w:rPr>
-              <w:t>DFT</w:t>
+              <w:t>MD, MLIP</w:t>
             </w:r>
           </w:p>
         </w:tc>
@@ -11520,7 +11532,7 @@
               <w:rPr>
                 <w:sz w:val="16"/>
               </w:rPr>
-              <w:t>2026-08-19</w:t>
+              <w:t>2026-08-17</w:t>
             </w:r>
           </w:p>
         </w:tc>
@@ -11563,7 +11575,7 @@
                   <w:sz w:val="16"/>
                   <w:u w:val="single"/>
                 </w:rPr>
-                <w:t>Dynamic Ensembles of Phosphine-Stabilized Gold Nanoclusters</w:t>
+                <w:t>ChemReporter: A Framework for Curating and Exporting Large-Scale Chemical Datasets for MLIP Training</w:t>
               </w:r>
             </w:hyperlink>
           </w:p>
@@ -11603,7 +11615,7 @@
               <w:rPr>
                 <w:sz w:val="16"/>
               </w:rPr>
-              <w:t>MD, MLIP</w:t>
+              <w:t>MLIP</w:t>
             </w:r>
           </w:p>
         </w:tc>
@@ -11620,7 +11632,7 @@
               <w:rPr>
                 <w:sz w:val="16"/>
               </w:rPr>
-              <w:t>2026-08-19</w:t>
+              <w:t>2026-08-17</w:t>
             </w:r>
           </w:p>
         </w:tc>
@@ -11663,7 +11675,7 @@
                   <w:sz w:val="16"/>
                   <w:u w:val="single"/>
                 </w:rPr>
-                <w:t>Generative AI and Emerging Technologies: Transforming Engineering, Innovation and Entrepreneurship</w:t>
+                <w:t>Active learning molecular beam epitaxy of complex quantum materials</w:t>
               </w:r>
             </w:hyperlink>
           </w:p>
@@ -11714,7 +11726,7 @@
               <w:rPr>
                 <w:sz w:val="16"/>
               </w:rPr>
-              <w:t>2026-08-20</w:t>
+              <w:t>2026-08-18</w:t>
             </w:r>
           </w:p>
         </w:tc>
@@ -11734,7 +11746,7 @@
                   <w:sz w:val="16"/>
                   <w:u w:val="single"/>
                 </w:rPr>
-                <w:t>10.5281/zenodo.22025110</w:t>
+                <w:t>link</w:t>
               </w:r>
             </w:hyperlink>
           </w:p>
@@ -11757,7 +11769,7 @@
                   <w:sz w:val="16"/>
                   <w:u w:val="single"/>
                 </w:rPr>
-                <w:t>Machine Learning to Foundation Models: Artificial Intelligence for Nanophotonic Modeling and Scientific Discovery</w:t>
+                <w:t>PyAPX: python toolkit for atomic configuration pattern exploration</w:t>
               </w:r>
             </w:hyperlink>
           </w:p>
@@ -11797,7 +11809,7 @@
               <w:rPr>
                 <w:sz w:val="16"/>
               </w:rPr>
-              <w:t>MLIP</w:t>
+              <w:t>DFT, MLIP</w:t>
             </w:r>
           </w:p>
         </w:tc>
@@ -11814,7 +11826,7 @@
               <w:rPr>
                 <w:sz w:val="16"/>
               </w:rPr>
-              <w:t>2026-08-21</w:t>
+              <w:t>2026-08-19</w:t>
             </w:r>
           </w:p>
         </w:tc>
@@ -11834,7 +11846,7 @@
                   <w:sz w:val="16"/>
                   <w:u w:val="single"/>
                 </w:rPr>
-                <w:t>10.48550/arxiv.2608.21612</w:t>
+                <w:t>10.1038/s41598-026-66072-5</w:t>
               </w:r>
             </w:hyperlink>
           </w:p>
@@ -11857,20 +11869,9 @@
                   <w:sz w:val="16"/>
                   <w:u w:val="single"/>
                 </w:rPr>
-                <w:t>Diagnosing and narrowing the simulation-to-real gap in powder X-ray diffraction with a wet-dry agentic loop</w:t>
+                <w:t>A single design choice determines whether machine learning models of materials make physically impossible predictions</w:t>
               </w:r>
             </w:hyperlink>
-          </w:p>
-        </w:tc>
-        <w:tc>
-          <w:tcPr>
-            <w:tcW w:type="dxa" w:w="1680"/>
-          </w:tcPr>
-          <w:p>
-            <w:pPr>
-              <w:jc w:val="left"/>
-            </w:pPr>
-            <w:r/>
           </w:p>
         </w:tc>
         <w:tc>
@@ -11908,7 +11909,24 @@
               <w:rPr>
                 <w:sz w:val="16"/>
               </w:rPr>
-              <w:t>2026-08-23</w:t>
+              <w:t>DFT</w:t>
+            </w:r>
+          </w:p>
+        </w:tc>
+        <w:tc>
+          <w:tcPr>
+            <w:tcW w:type="dxa" w:w="1680"/>
+          </w:tcPr>
+          <w:p>
+            <w:pPr>
+              <w:jc w:val="left"/>
+            </w:pPr>
+            <w:r/>
+            <w:r>
+              <w:rPr>
+                <w:sz w:val="16"/>
+              </w:rPr>
+              <w:t>2026-08-19</w:t>
             </w:r>
           </w:p>
         </w:tc>
@@ -11951,6 +11969,394 @@
                   <w:sz w:val="16"/>
                   <w:u w:val="single"/>
                 </w:rPr>
+                <w:t>Dynamic Ensembles of Phosphine-Stabilized Gold Nanoclusters</w:t>
+              </w:r>
+            </w:hyperlink>
+          </w:p>
+        </w:tc>
+        <w:tc>
+          <w:tcPr>
+            <w:tcW w:type="dxa" w:w="1680"/>
+          </w:tcPr>
+          <w:p>
+            <w:pPr>
+              <w:jc w:val="left"/>
+            </w:pPr>
+            <w:r/>
+          </w:p>
+        </w:tc>
+        <w:tc>
+          <w:tcPr>
+            <w:tcW w:type="dxa" w:w="1680"/>
+          </w:tcPr>
+          <w:p>
+            <w:pPr>
+              <w:jc w:val="left"/>
+            </w:pPr>
+            <w:r/>
+          </w:p>
+        </w:tc>
+        <w:tc>
+          <w:tcPr>
+            <w:tcW w:type="dxa" w:w="1680"/>
+          </w:tcPr>
+          <w:p>
+            <w:pPr>
+              <w:jc w:val="left"/>
+            </w:pPr>
+            <w:r/>
+            <w:r>
+              <w:rPr>
+                <w:sz w:val="16"/>
+              </w:rPr>
+              <w:t>MD, MLIP</w:t>
+            </w:r>
+          </w:p>
+        </w:tc>
+        <w:tc>
+          <w:tcPr>
+            <w:tcW w:type="dxa" w:w="1680"/>
+          </w:tcPr>
+          <w:p>
+            <w:pPr>
+              <w:jc w:val="left"/>
+            </w:pPr>
+            <w:r/>
+            <w:r>
+              <w:rPr>
+                <w:sz w:val="16"/>
+              </w:rPr>
+              <w:t>2026-08-19</w:t>
+            </w:r>
+          </w:p>
+        </w:tc>
+        <w:tc>
+          <w:tcPr>
+            <w:tcW w:type="dxa" w:w="1680"/>
+          </w:tcPr>
+          <w:p>
+            <w:pPr>
+              <w:jc w:val="left"/>
+            </w:pPr>
+            <w:r/>
+            <w:hyperlink r:id="rId137">
+              <w:r>
+                <w:rPr>
+                  <w:color w:val="0B4F9E"/>
+                  <w:sz w:val="16"/>
+                  <w:u w:val="single"/>
+                </w:rPr>
+                <w:t>link</w:t>
+              </w:r>
+            </w:hyperlink>
+          </w:p>
+        </w:tc>
+      </w:tr>
+      <w:tr>
+        <w:tc>
+          <w:tcPr>
+            <w:tcW w:type="dxa" w:w="1680"/>
+          </w:tcPr>
+          <w:p>
+            <w:pPr>
+              <w:jc w:val="left"/>
+            </w:pPr>
+            <w:r/>
+            <w:hyperlink r:id="rId138">
+              <w:r>
+                <w:rPr>
+                  <w:color w:val="0B4F9E"/>
+                  <w:sz w:val="16"/>
+                  <w:u w:val="single"/>
+                </w:rPr>
+                <w:t>Generative AI and Emerging Technologies: Transforming Engineering, Innovation and Entrepreneurship</w:t>
+              </w:r>
+            </w:hyperlink>
+          </w:p>
+        </w:tc>
+        <w:tc>
+          <w:tcPr>
+            <w:tcW w:type="dxa" w:w="1680"/>
+          </w:tcPr>
+          <w:p>
+            <w:pPr>
+              <w:jc w:val="left"/>
+            </w:pPr>
+            <w:r/>
+          </w:p>
+        </w:tc>
+        <w:tc>
+          <w:tcPr>
+            <w:tcW w:type="dxa" w:w="1680"/>
+          </w:tcPr>
+          <w:p>
+            <w:pPr>
+              <w:jc w:val="left"/>
+            </w:pPr>
+            <w:r/>
+          </w:p>
+        </w:tc>
+        <w:tc>
+          <w:tcPr>
+            <w:tcW w:type="dxa" w:w="1680"/>
+          </w:tcPr>
+          <w:p>
+            <w:pPr>
+              <w:jc w:val="left"/>
+            </w:pPr>
+            <w:r/>
+          </w:p>
+        </w:tc>
+        <w:tc>
+          <w:tcPr>
+            <w:tcW w:type="dxa" w:w="1680"/>
+          </w:tcPr>
+          <w:p>
+            <w:pPr>
+              <w:jc w:val="left"/>
+            </w:pPr>
+            <w:r/>
+            <w:r>
+              <w:rPr>
+                <w:sz w:val="16"/>
+              </w:rPr>
+              <w:t>2026-08-20</w:t>
+            </w:r>
+          </w:p>
+        </w:tc>
+        <w:tc>
+          <w:tcPr>
+            <w:tcW w:type="dxa" w:w="1680"/>
+          </w:tcPr>
+          <w:p>
+            <w:pPr>
+              <w:jc w:val="left"/>
+            </w:pPr>
+            <w:r/>
+            <w:hyperlink r:id="rId138">
+              <w:r>
+                <w:rPr>
+                  <w:color w:val="0B4F9E"/>
+                  <w:sz w:val="16"/>
+                  <w:u w:val="single"/>
+                </w:rPr>
+                <w:t>10.5281/zenodo.22025110</w:t>
+              </w:r>
+            </w:hyperlink>
+          </w:p>
+        </w:tc>
+      </w:tr>
+      <w:tr>
+        <w:tc>
+          <w:tcPr>
+            <w:tcW w:type="dxa" w:w="1680"/>
+          </w:tcPr>
+          <w:p>
+            <w:pPr>
+              <w:jc w:val="left"/>
+            </w:pPr>
+            <w:r/>
+            <w:hyperlink r:id="rId139">
+              <w:r>
+                <w:rPr>
+                  <w:color w:val="0B4F9E"/>
+                  <w:sz w:val="16"/>
+                  <w:u w:val="single"/>
+                </w:rPr>
+                <w:t>Machine Learning to Foundation Models: Artificial Intelligence for Nanophotonic Modeling and Scientific Discovery</w:t>
+              </w:r>
+            </w:hyperlink>
+          </w:p>
+        </w:tc>
+        <w:tc>
+          <w:tcPr>
+            <w:tcW w:type="dxa" w:w="1680"/>
+          </w:tcPr>
+          <w:p>
+            <w:pPr>
+              <w:jc w:val="left"/>
+            </w:pPr>
+            <w:r/>
+          </w:p>
+        </w:tc>
+        <w:tc>
+          <w:tcPr>
+            <w:tcW w:type="dxa" w:w="1680"/>
+          </w:tcPr>
+          <w:p>
+            <w:pPr>
+              <w:jc w:val="left"/>
+            </w:pPr>
+            <w:r/>
+          </w:p>
+        </w:tc>
+        <w:tc>
+          <w:tcPr>
+            <w:tcW w:type="dxa" w:w="1680"/>
+          </w:tcPr>
+          <w:p>
+            <w:pPr>
+              <w:jc w:val="left"/>
+            </w:pPr>
+            <w:r/>
+            <w:r>
+              <w:rPr>
+                <w:sz w:val="16"/>
+              </w:rPr>
+              <w:t>MLIP</w:t>
+            </w:r>
+          </w:p>
+        </w:tc>
+        <w:tc>
+          <w:tcPr>
+            <w:tcW w:type="dxa" w:w="1680"/>
+          </w:tcPr>
+          <w:p>
+            <w:pPr>
+              <w:jc w:val="left"/>
+            </w:pPr>
+            <w:r/>
+            <w:r>
+              <w:rPr>
+                <w:sz w:val="16"/>
+              </w:rPr>
+              <w:t>2026-08-21</w:t>
+            </w:r>
+          </w:p>
+        </w:tc>
+        <w:tc>
+          <w:tcPr>
+            <w:tcW w:type="dxa" w:w="1680"/>
+          </w:tcPr>
+          <w:p>
+            <w:pPr>
+              <w:jc w:val="left"/>
+            </w:pPr>
+            <w:r/>
+            <w:hyperlink r:id="rId139">
+              <w:r>
+                <w:rPr>
+                  <w:color w:val="0B4F9E"/>
+                  <w:sz w:val="16"/>
+                  <w:u w:val="single"/>
+                </w:rPr>
+                <w:t>10.48550/arxiv.2608.21612</w:t>
+              </w:r>
+            </w:hyperlink>
+          </w:p>
+        </w:tc>
+      </w:tr>
+      <w:tr>
+        <w:tc>
+          <w:tcPr>
+            <w:tcW w:type="dxa" w:w="1680"/>
+          </w:tcPr>
+          <w:p>
+            <w:pPr>
+              <w:jc w:val="left"/>
+            </w:pPr>
+            <w:r/>
+            <w:hyperlink r:id="rId140">
+              <w:r>
+                <w:rPr>
+                  <w:color w:val="0B4F9E"/>
+                  <w:sz w:val="16"/>
+                  <w:u w:val="single"/>
+                </w:rPr>
+                <w:t>Diagnosing and narrowing the simulation-to-real gap in powder X-ray diffraction with a wet-dry agentic loop</w:t>
+              </w:r>
+            </w:hyperlink>
+          </w:p>
+        </w:tc>
+        <w:tc>
+          <w:tcPr>
+            <w:tcW w:type="dxa" w:w="1680"/>
+          </w:tcPr>
+          <w:p>
+            <w:pPr>
+              <w:jc w:val="left"/>
+            </w:pPr>
+            <w:r/>
+          </w:p>
+        </w:tc>
+        <w:tc>
+          <w:tcPr>
+            <w:tcW w:type="dxa" w:w="1680"/>
+          </w:tcPr>
+          <w:p>
+            <w:pPr>
+              <w:jc w:val="left"/>
+            </w:pPr>
+            <w:r/>
+          </w:p>
+        </w:tc>
+        <w:tc>
+          <w:tcPr>
+            <w:tcW w:type="dxa" w:w="1680"/>
+          </w:tcPr>
+          <w:p>
+            <w:pPr>
+              <w:jc w:val="left"/>
+            </w:pPr>
+            <w:r/>
+          </w:p>
+        </w:tc>
+        <w:tc>
+          <w:tcPr>
+            <w:tcW w:type="dxa" w:w="1680"/>
+          </w:tcPr>
+          <w:p>
+            <w:pPr>
+              <w:jc w:val="left"/>
+            </w:pPr>
+            <w:r/>
+            <w:r>
+              <w:rPr>
+                <w:sz w:val="16"/>
+              </w:rPr>
+              <w:t>2026-08-23</w:t>
+            </w:r>
+          </w:p>
+        </w:tc>
+        <w:tc>
+          <w:tcPr>
+            <w:tcW w:type="dxa" w:w="1680"/>
+          </w:tcPr>
+          <w:p>
+            <w:pPr>
+              <w:jc w:val="left"/>
+            </w:pPr>
+            <w:r/>
+            <w:hyperlink r:id="rId140">
+              <w:r>
+                <w:rPr>
+                  <w:color w:val="0B4F9E"/>
+                  <w:sz w:val="16"/>
+                  <w:u w:val="single"/>
+                </w:rPr>
+                <w:t>link</w:t>
+              </w:r>
+            </w:hyperlink>
+          </w:p>
+        </w:tc>
+      </w:tr>
+      <w:tr>
+        <w:tc>
+          <w:tcPr>
+            <w:tcW w:type="dxa" w:w="1680"/>
+          </w:tcPr>
+          <w:p>
+            <w:pPr>
+              <w:jc w:val="left"/>
+            </w:pPr>
+            <w:r/>
+            <w:hyperlink r:id="rId141">
+              <w:r>
+                <w:rPr>
+                  <w:color w:val="0B4F9E"/>
+                  <w:sz w:val="16"/>
+                  <w:u w:val="single"/>
+                </w:rPr>
                 <w:t xml:space="preserve">Dataset for the publication- A cylindrical sintering method for more realistic grain boundaries in nanocrystalline thin </w:t>
               </w:r>
             </w:hyperlink>
@@ -12015,7 +12421,7 @@
               <w:jc w:val="left"/>
             </w:pPr>
             <w:r/>
-            <w:hyperlink r:id="rId137">
+            <w:hyperlink r:id="rId141">
               <w:r>
                 <w:rPr>
                   <w:color w:val="0B4F9E"/>
@@ -12038,7 +12444,7 @@
               <w:jc w:val="left"/>
             </w:pPr>
             <w:r/>
-            <w:hyperlink r:id="rId138">
+            <w:hyperlink r:id="rId142">
               <w:r>
                 <w:rPr>
                   <w:color w:val="0B4F9E"/>
@@ -12115,7 +12521,7 @@
               <w:jc w:val="left"/>
             </w:pPr>
             <w:r/>
-            <w:hyperlink r:id="rId138">
+            <w:hyperlink r:id="rId142">
               <w:r>
                 <w:rPr>
                   <w:color w:val="0B4F9E"/>
@@ -12138,7 +12544,7 @@
               <w:jc w:val="left"/>
             </w:pPr>
             <w:r/>
-            <w:hyperlink r:id="rId139">
+            <w:hyperlink r:id="rId143">
               <w:r>
                 <w:rPr>
                   <w:color w:val="0B4F9E"/>
@@ -12215,7 +12621,7 @@
               <w:jc w:val="left"/>
             </w:pPr>
             <w:r/>
-            <w:hyperlink r:id="rId139">
+            <w:hyperlink r:id="rId143">
               <w:r>
                 <w:rPr>
                   <w:color w:val="0B4F9E"/>
@@ -12238,7 +12644,7 @@
               <w:jc w:val="left"/>
             </w:pPr>
             <w:r/>
-            <w:hyperlink r:id="rId140">
+            <w:hyperlink r:id="rId144">
               <w:r>
                 <w:rPr>
                   <w:color w:val="0B4F9E"/>
@@ -12309,7 +12715,7 @@
               <w:jc w:val="left"/>
             </w:pPr>
             <w:r/>
-            <w:hyperlink r:id="rId140">
+            <w:hyperlink r:id="rId144">
               <w:r>
                 <w:rPr>
                   <w:color w:val="0B4F9E"/>
@@ -12332,7 +12738,7 @@
               <w:jc w:val="left"/>
             </w:pPr>
             <w:r/>
-            <w:hyperlink r:id="rId141">
+            <w:hyperlink r:id="rId145">
               <w:r>
                 <w:rPr>
                   <w:color w:val="0B4F9E"/>
@@ -12409,7 +12815,7 @@
               <w:jc w:val="left"/>
             </w:pPr>
             <w:r/>
-            <w:hyperlink r:id="rId141">
+            <w:hyperlink r:id="rId145">
               <w:r>
                 <w:rPr>
                   <w:color w:val="0B4F9E"/>
@@ -12432,7 +12838,7 @@
               <w:jc w:val="left"/>
             </w:pPr>
             <w:r/>
-            <w:hyperlink r:id="rId142">
+            <w:hyperlink r:id="rId146">
               <w:r>
                 <w:rPr>
                   <w:color w:val="0B4F9E"/>
@@ -12503,7 +12909,7 @@
               <w:jc w:val="left"/>
             </w:pPr>
             <w:r/>
-            <w:hyperlink r:id="rId142">
+            <w:hyperlink r:id="rId146">
               <w:r>
                 <w:rPr>
                   <w:color w:val="0B4F9E"/>
@@ -12526,7 +12932,7 @@
               <w:jc w:val="left"/>
             </w:pPr>
             <w:r/>
-            <w:hyperlink r:id="rId143">
+            <w:hyperlink r:id="rId147">
               <w:r>
                 <w:rPr>
                   <w:color w:val="0B4F9E"/>
@@ -12597,7 +13003,7 @@
               <w:jc w:val="left"/>
             </w:pPr>
             <w:r/>
-            <w:hyperlink r:id="rId144">
+            <w:hyperlink r:id="rId148">
               <w:r>
                 <w:rPr>
                   <w:color w:val="0B4F9E"/>
@@ -12620,7 +13026,7 @@
               <w:jc w:val="left"/>
             </w:pPr>
             <w:r/>
-            <w:hyperlink r:id="rId145">
+            <w:hyperlink r:id="rId149">
               <w:r>
                 <w:rPr>
                   <w:color w:val="0B4F9E"/>
@@ -12691,7 +13097,7 @@
               <w:jc w:val="left"/>
             </w:pPr>
             <w:r/>
-            <w:hyperlink r:id="rId145">
+            <w:hyperlink r:id="rId149">
               <w:r>
                 <w:rPr>
                   <w:color w:val="0B4F9E"/>
@@ -12714,7 +13120,7 @@
               <w:jc w:val="left"/>
             </w:pPr>
             <w:r/>
-            <w:hyperlink r:id="rId146">
+            <w:hyperlink r:id="rId150">
               <w:r>
                 <w:rPr>
                   <w:color w:val="0B4F9E"/>
@@ -12791,7 +13197,7 @@
               <w:jc w:val="left"/>
             </w:pPr>
             <w:r/>
-            <w:hyperlink r:id="rId146">
+            <w:hyperlink r:id="rId150">
               <w:r>
                 <w:rPr>
                   <w:color w:val="0B4F9E"/>
@@ -12814,7 +13220,7 @@
               <w:jc w:val="left"/>
             </w:pPr>
             <w:r/>
-            <w:hyperlink r:id="rId147">
+            <w:hyperlink r:id="rId151">
               <w:r>
                 <w:rPr>
                   <w:color w:val="0B4F9E"/>
@@ -12891,7 +13297,7 @@
               <w:jc w:val="left"/>
             </w:pPr>
             <w:r/>
-            <w:hyperlink r:id="rId147">
+            <w:hyperlink r:id="rId151">
               <w:r>
                 <w:rPr>
                   <w:color w:val="0B4F9E"/>
@@ -12914,7 +13320,7 @@
               <w:jc w:val="left"/>
             </w:pPr>
             <w:r/>
-            <w:hyperlink r:id="rId148">
+            <w:hyperlink r:id="rId152">
               <w:r>
                 <w:rPr>
                   <w:color w:val="0B4F9E"/>
@@ -12991,7 +13397,7 @@
               <w:jc w:val="left"/>
             </w:pPr>
             <w:r/>
-            <w:hyperlink r:id="rId148">
+            <w:hyperlink r:id="rId152">
               <w:r>
                 <w:rPr>
                   <w:color w:val="0B4F9E"/>
@@ -13014,7 +13420,7 @@
               <w:jc w:val="left"/>
             </w:pPr>
             <w:r/>
-            <w:hyperlink r:id="rId149">
+            <w:hyperlink r:id="rId153">
               <w:r>
                 <w:rPr>
                   <w:color w:val="0B4F9E"/>
@@ -13091,7 +13497,7 @@
               <w:jc w:val="left"/>
             </w:pPr>
             <w:r/>
-            <w:hyperlink r:id="rId149">
+            <w:hyperlink r:id="rId153">
               <w:r>
                 <w:rPr>
                   <w:color w:val="0B4F9E"/>
@@ -13114,7 +13520,7 @@
               <w:jc w:val="left"/>
             </w:pPr>
             <w:r/>
-            <w:hyperlink r:id="rId150">
+            <w:hyperlink r:id="rId154">
               <w:r>
                 <w:rPr>
                   <w:color w:val="0B4F9E"/>
@@ -13185,7 +13591,7 @@
               <w:jc w:val="left"/>
             </w:pPr>
             <w:r/>
-            <w:hyperlink r:id="rId150">
+            <w:hyperlink r:id="rId154">
               <w:r>
                 <w:rPr>
                   <w:color w:val="0B4F9E"/>
@@ -13208,7 +13614,7 @@
               <w:jc w:val="left"/>
             </w:pPr>
             <w:r/>
-            <w:hyperlink r:id="rId151">
+            <w:hyperlink r:id="rId155">
               <w:r>
                 <w:rPr>
                   <w:color w:val="0B4F9E"/>
@@ -13279,7 +13685,7 @@
               <w:jc w:val="left"/>
             </w:pPr>
             <w:r/>
-            <w:hyperlink r:id="rId151">
+            <w:hyperlink r:id="rId155">
               <w:r>
                 <w:rPr>
                   <w:color w:val="0B4F9E"/>
@@ -13302,7 +13708,7 @@
               <w:jc w:val="left"/>
             </w:pPr>
             <w:r/>
-            <w:hyperlink r:id="rId152">
+            <w:hyperlink r:id="rId156">
               <w:r>
                 <w:rPr>
                   <w:color w:val="0B4F9E"/>
@@ -13373,7 +13779,7 @@
               <w:jc w:val="left"/>
             </w:pPr>
             <w:r/>
-            <w:hyperlink r:id="rId152">
+            <w:hyperlink r:id="rId156">
               <w:r>
                 <w:rPr>
                   <w:color w:val="0B4F9E"/>
@@ -13396,7 +13802,7 @@
               <w:jc w:val="left"/>
             </w:pPr>
             <w:r/>
-            <w:hyperlink r:id="rId153">
+            <w:hyperlink r:id="rId157">
               <w:r>
                 <w:rPr>
                   <w:color w:val="0B4F9E"/>
@@ -13467,7 +13873,7 @@
               <w:jc w:val="left"/>
             </w:pPr>
             <w:r/>
-            <w:hyperlink r:id="rId153">
+            <w:hyperlink r:id="rId157">
               <w:r>
                 <w:rPr>
                   <w:color w:val="0B4F9E"/>
@@ -13490,7 +13896,7 @@
               <w:jc w:val="left"/>
             </w:pPr>
             <w:r/>
-            <w:hyperlink r:id="rId154">
+            <w:hyperlink r:id="rId158">
               <w:r>
                 <w:rPr>
                   <w:color w:val="0B4F9E"/>
@@ -13567,7 +13973,7 @@
               <w:jc w:val="left"/>
             </w:pPr>
             <w:r/>
-            <w:hyperlink r:id="rId154">
+            <w:hyperlink r:id="rId158">
               <w:r>
                 <w:rPr>
                   <w:color w:val="0B4F9E"/>
@@ -13590,7 +13996,7 @@
               <w:jc w:val="left"/>
             </w:pPr>
             <w:r/>
-            <w:hyperlink r:id="rId155">
+            <w:hyperlink r:id="rId159">
               <w:r>
                 <w:rPr>
                   <w:color w:val="0B4F9E"/>
@@ -13661,7 +14067,7 @@
               <w:jc w:val="left"/>
             </w:pPr>
             <w:r/>
-            <w:hyperlink r:id="rId156">
+            <w:hyperlink r:id="rId160">
               <w:r>
                 <w:rPr>
                   <w:color w:val="0B4F9E"/>
@@ -13684,7 +14090,7 @@
               <w:jc w:val="left"/>
             </w:pPr>
             <w:r/>
-            <w:hyperlink r:id="rId157">
+            <w:hyperlink r:id="rId161">
               <w:r>
                 <w:rPr>
                   <w:color w:val="0B4F9E"/>
@@ -13761,7 +14167,7 @@
               <w:jc w:val="left"/>
             </w:pPr>
             <w:r/>
-            <w:hyperlink r:id="rId157">
+            <w:hyperlink r:id="rId161">
               <w:r>
                 <w:rPr>
                   <w:color w:val="0B4F9E"/>
@@ -13784,7 +14190,7 @@
               <w:jc w:val="left"/>
             </w:pPr>
             <w:r/>
-            <w:hyperlink r:id="rId158">
+            <w:hyperlink r:id="rId162">
               <w:r>
                 <w:rPr>
                   <w:color w:val="0B4F9E"/>
@@ -13861,7 +14267,7 @@
               <w:jc w:val="left"/>
             </w:pPr>
             <w:r/>
-            <w:hyperlink r:id="rId158">
+            <w:hyperlink r:id="rId162">
               <w:r>
                 <w:rPr>
                   <w:color w:val="0B4F9E"/>
@@ -13884,7 +14290,7 @@
               <w:jc w:val="left"/>
             </w:pPr>
             <w:r/>
-            <w:hyperlink r:id="rId159">
+            <w:hyperlink r:id="rId163">
               <w:r>
                 <w:rPr>
                   <w:color w:val="0B4F9E"/>
@@ -13955,7 +14361,7 @@
               <w:jc w:val="left"/>
             </w:pPr>
             <w:r/>
-            <w:hyperlink r:id="rId159">
+            <w:hyperlink r:id="rId163">
               <w:r>
                 <w:rPr>
                   <w:color w:val="0B4F9E"/>
@@ -13978,7 +14384,7 @@
               <w:jc w:val="left"/>
             </w:pPr>
             <w:r/>
-            <w:hyperlink r:id="rId160">
+            <w:hyperlink r:id="rId164">
               <w:r>
                 <w:rPr>
                   <w:color w:val="0B4F9E"/>
@@ -14055,7 +14461,7 @@
               <w:jc w:val="left"/>
             </w:pPr>
             <w:r/>
-            <w:hyperlink r:id="rId160">
+            <w:hyperlink r:id="rId164">
               <w:r>
                 <w:rPr>
                   <w:color w:val="0B4F9E"/>
@@ -14078,7 +14484,7 @@
               <w:jc w:val="left"/>
             </w:pPr>
             <w:r/>
-            <w:hyperlink r:id="rId161">
+            <w:hyperlink r:id="rId165">
               <w:r>
                 <w:rPr>
                   <w:color w:val="0B4F9E"/>
@@ -14149,7 +14555,7 @@
               <w:jc w:val="left"/>
             </w:pPr>
             <w:r/>
-            <w:hyperlink r:id="rId161">
+            <w:hyperlink r:id="rId165">
               <w:r>
                 <w:rPr>
                   <w:color w:val="0B4F9E"/>
@@ -14172,7 +14578,7 @@
               <w:jc w:val="left"/>
             </w:pPr>
             <w:r/>
-            <w:hyperlink r:id="rId162">
+            <w:hyperlink r:id="rId166">
               <w:r>
                 <w:rPr>
                   <w:color w:val="0B4F9E"/>
@@ -14243,7 +14649,7 @@
               <w:jc w:val="left"/>
             </w:pPr>
             <w:r/>
-            <w:hyperlink r:id="rId162">
+            <w:hyperlink r:id="rId166">
               <w:r>
                 <w:rPr>
                   <w:color w:val="0B4F9E"/>
@@ -14266,7 +14672,7 @@
               <w:jc w:val="left"/>
             </w:pPr>
             <w:r/>
-            <w:hyperlink r:id="rId163">
+            <w:hyperlink r:id="rId167">
               <w:r>
                 <w:rPr>
                   <w:color w:val="0B4F9E"/>
@@ -14337,7 +14743,7 @@
               <w:jc w:val="left"/>
             </w:pPr>
             <w:r/>
-            <w:hyperlink r:id="rId163">
+            <w:hyperlink r:id="rId167">
               <w:r>
                 <w:rPr>
                   <w:color w:val="0B4F9E"/>
@@ -14360,7 +14766,7 @@
               <w:jc w:val="left"/>
             </w:pPr>
             <w:r/>
-            <w:hyperlink r:id="rId164">
+            <w:hyperlink r:id="rId168">
               <w:r>
                 <w:rPr>
                   <w:color w:val="0B4F9E"/>
@@ -14437,7 +14843,7 @@
               <w:jc w:val="left"/>
             </w:pPr>
             <w:r/>
-            <w:hyperlink r:id="rId164">
+            <w:hyperlink r:id="rId168">
               <w:r>
                 <w:rPr>
                   <w:color w:val="0B4F9E"/>
@@ -14460,7 +14866,7 @@
               <w:jc w:val="left"/>
             </w:pPr>
             <w:r/>
-            <w:hyperlink r:id="rId165">
+            <w:hyperlink r:id="rId169">
               <w:r>
                 <w:rPr>
                   <w:color w:val="0B4F9E"/>
@@ -14537,7 +14943,7 @@
               <w:jc w:val="left"/>
             </w:pPr>
             <w:r/>
-            <w:hyperlink r:id="rId165">
+            <w:hyperlink r:id="rId169">
               <w:r>
                 <w:rPr>
                   <w:color w:val="0B4F9E"/>
@@ -14560,7 +14966,7 @@
               <w:jc w:val="left"/>
             </w:pPr>
             <w:r/>
-            <w:hyperlink r:id="rId166">
+            <w:hyperlink r:id="rId170">
               <w:r>
                 <w:rPr>
                   <w:color w:val="0B4F9E"/>
@@ -14637,7 +15043,7 @@
               <w:jc w:val="left"/>
             </w:pPr>
             <w:r/>
-            <w:hyperlink r:id="rId166">
+            <w:hyperlink r:id="rId170">
               <w:r>
                 <w:rPr>
                   <w:color w:val="0B4F9E"/>
@@ -14660,7 +15066,7 @@
               <w:jc w:val="left"/>
             </w:pPr>
             <w:r/>
-            <w:hyperlink r:id="rId167">
+            <w:hyperlink r:id="rId171">
               <w:r>
                 <w:rPr>
                   <w:color w:val="0B4F9E"/>
@@ -14737,7 +15143,7 @@
               <w:jc w:val="left"/>
             </w:pPr>
             <w:r/>
-            <w:hyperlink r:id="rId167">
+            <w:hyperlink r:id="rId171">
               <w:r>
                 <w:rPr>
                   <w:color w:val="0B4F9E"/>
@@ -14760,7 +15166,7 @@
               <w:jc w:val="left"/>
             </w:pPr>
             <w:r/>
-            <w:hyperlink r:id="rId168">
+            <w:hyperlink r:id="rId172">
               <w:r>
                 <w:rPr>
                   <w:color w:val="0B4F9E"/>
@@ -14837,7 +15243,7 @@
               <w:jc w:val="left"/>
             </w:pPr>
             <w:r/>
-            <w:hyperlink r:id="rId168">
+            <w:hyperlink r:id="rId172">
               <w:r>
                 <w:rPr>
                   <w:color w:val="0B4F9E"/>
@@ -14860,7 +15266,7 @@
               <w:jc w:val="left"/>
             </w:pPr>
             <w:r/>
-            <w:hyperlink r:id="rId169">
+            <w:hyperlink r:id="rId173">
               <w:r>
                 <w:rPr>
                   <w:color w:val="0B4F9E"/>
@@ -14931,7 +15337,7 @@
               <w:jc w:val="left"/>
             </w:pPr>
             <w:r/>
-            <w:hyperlink r:id="rId169">
+            <w:hyperlink r:id="rId173">
               <w:r>
                 <w:rPr>
                   <w:color w:val="0B4F9E"/>
@@ -14954,7 +15360,7 @@
               <w:jc w:val="left"/>
             </w:pPr>
             <w:r/>
-            <w:hyperlink r:id="rId170">
+            <w:hyperlink r:id="rId174">
               <w:r>
                 <w:rPr>
                   <w:color w:val="0B4F9E"/>
@@ -15025,7 +15431,7 @@
               <w:jc w:val="left"/>
             </w:pPr>
             <w:r/>
-            <w:hyperlink r:id="rId170">
+            <w:hyperlink r:id="rId174">
               <w:r>
                 <w:rPr>
                   <w:color w:val="0B4F9E"/>
@@ -15048,7 +15454,7 @@
               <w:jc w:val="left"/>
             </w:pPr>
             <w:r/>
-            <w:hyperlink r:id="rId171">
+            <w:hyperlink r:id="rId175">
               <w:r>
                 <w:rPr>
                   <w:color w:val="0B4F9E"/>
@@ -15125,7 +15531,7 @@
               <w:jc w:val="left"/>
             </w:pPr>
             <w:r/>
-            <w:hyperlink r:id="rId171">
+            <w:hyperlink r:id="rId175">
               <w:r>
                 <w:rPr>
                   <w:color w:val="0B4F9E"/>
@@ -15148,7 +15554,7 @@
               <w:jc w:val="left"/>
             </w:pPr>
             <w:r/>
-            <w:hyperlink r:id="rId172">
+            <w:hyperlink r:id="rId176">
               <w:r>
                 <w:rPr>
                   <w:color w:val="0B4F9E"/>
@@ -15219,7 +15625,7 @@
               <w:jc w:val="left"/>
             </w:pPr>
             <w:r/>
-            <w:hyperlink r:id="rId172">
+            <w:hyperlink r:id="rId176">
               <w:r>
                 <w:rPr>
                   <w:color w:val="0B4F9E"/>
@@ -15242,7 +15648,7 @@
               <w:jc w:val="left"/>
             </w:pPr>
             <w:r/>
-            <w:hyperlink r:id="rId173">
+            <w:hyperlink r:id="rId177">
               <w:r>
                 <w:rPr>
                   <w:color w:val="0B4F9E"/>
@@ -15319,7 +15725,7 @@
               <w:jc w:val="left"/>
             </w:pPr>
             <w:r/>
-            <w:hyperlink r:id="rId173">
+            <w:hyperlink r:id="rId177">
               <w:r>
                 <w:rPr>
                   <w:color w:val="0B4F9E"/>
@@ -15342,7 +15748,7 @@
               <w:jc w:val="left"/>
             </w:pPr>
             <w:r/>
-            <w:hyperlink r:id="rId174">
+            <w:hyperlink r:id="rId178">
               <w:r>
                 <w:rPr>
                   <w:color w:val="0B4F9E"/>
@@ -15419,7 +15825,7 @@
               <w:jc w:val="left"/>
             </w:pPr>
             <w:r/>
-            <w:hyperlink r:id="rId174">
+            <w:hyperlink r:id="rId178">
               <w:r>
                 <w:rPr>
                   <w:color w:val="0B4F9E"/>
@@ -15442,7 +15848,7 @@
               <w:jc w:val="left"/>
             </w:pPr>
             <w:r/>
-            <w:hyperlink r:id="rId175">
+            <w:hyperlink r:id="rId179">
               <w:r>
                 <w:rPr>
                   <w:color w:val="0B4F9E"/>
@@ -15519,7 +15925,7 @@
               <w:jc w:val="left"/>
             </w:pPr>
             <w:r/>
-            <w:hyperlink r:id="rId175">
+            <w:hyperlink r:id="rId179">
               <w:r>
                 <w:rPr>
                   <w:color w:val="0B4F9E"/>
@@ -15542,7 +15948,7 @@
               <w:jc w:val="left"/>
             </w:pPr>
             <w:r/>
-            <w:hyperlink r:id="rId176">
+            <w:hyperlink r:id="rId180">
               <w:r>
                 <w:rPr>
                   <w:color w:val="0B4F9E"/>
@@ -15613,7 +16019,7 @@
               <w:jc w:val="left"/>
             </w:pPr>
             <w:r/>
-            <w:hyperlink r:id="rId176">
+            <w:hyperlink r:id="rId180">
               <w:r>
                 <w:rPr>
                   <w:color w:val="0B4F9E"/>
@@ -15636,7 +16042,107 @@
               <w:jc w:val="left"/>
             </w:pPr>
             <w:r/>
-            <w:hyperlink r:id="rId177">
+            <w:hyperlink r:id="rId181">
+              <w:r>
+                <w:rPr>
+                  <w:color w:val="0B4F9E"/>
+                  <w:sz w:val="16"/>
+                  <w:u w:val="single"/>
+                </w:rPr>
+                <w:t>AtomVoxelizer: Periodic atom-centered voxel grids for fast spatial atomistic analysis</w:t>
+              </w:r>
+            </w:hyperlink>
+          </w:p>
+        </w:tc>
+        <w:tc>
+          <w:tcPr>
+            <w:tcW w:type="dxa" w:w="1680"/>
+          </w:tcPr>
+          <w:p>
+            <w:pPr>
+              <w:jc w:val="left"/>
+            </w:pPr>
+            <w:r/>
+          </w:p>
+        </w:tc>
+        <w:tc>
+          <w:tcPr>
+            <w:tcW w:type="dxa" w:w="1680"/>
+          </w:tcPr>
+          <w:p>
+            <w:pPr>
+              <w:jc w:val="left"/>
+            </w:pPr>
+            <w:r/>
+          </w:p>
+        </w:tc>
+        <w:tc>
+          <w:tcPr>
+            <w:tcW w:type="dxa" w:w="1680"/>
+          </w:tcPr>
+          <w:p>
+            <w:pPr>
+              <w:jc w:val="left"/>
+            </w:pPr>
+            <w:r/>
+            <w:r>
+              <w:rPr>
+                <w:sz w:val="16"/>
+              </w:rPr>
+              <w:t>MLIP</w:t>
+            </w:r>
+          </w:p>
+        </w:tc>
+        <w:tc>
+          <w:tcPr>
+            <w:tcW w:type="dxa" w:w="1680"/>
+          </w:tcPr>
+          <w:p>
+            <w:pPr>
+              <w:jc w:val="left"/>
+            </w:pPr>
+            <w:r/>
+            <w:r>
+              <w:rPr>
+                <w:sz w:val="16"/>
+              </w:rPr>
+              <w:t>2026-09-01</w:t>
+            </w:r>
+          </w:p>
+        </w:tc>
+        <w:tc>
+          <w:tcPr>
+            <w:tcW w:type="dxa" w:w="1680"/>
+          </w:tcPr>
+          <w:p>
+            <w:pPr>
+              <w:jc w:val="left"/>
+            </w:pPr>
+            <w:r/>
+            <w:hyperlink r:id="rId181">
+              <w:r>
+                <w:rPr>
+                  <w:color w:val="0B4F9E"/>
+                  <w:sz w:val="16"/>
+                  <w:u w:val="single"/>
+                </w:rPr>
+                <w:t>10.1016/j.softx.2026.102992</w:t>
+              </w:r>
+            </w:hyperlink>
+          </w:p>
+        </w:tc>
+      </w:tr>
+      <w:tr>
+        <w:tc>
+          <w:tcPr>
+            <w:tcW w:type="dxa" w:w="1680"/>
+          </w:tcPr>
+          <w:p>
+            <w:pPr>
+              <w:jc w:val="left"/>
+            </w:pPr>
+            <w:r/>
+            <w:hyperlink r:id="rId182">
               <w:r>
                 <w:rPr>
                   <w:color w:val="0B4F9E"/>
@@ -15707,7 +16213,7 @@
               <w:jc w:val="left"/>
             </w:pPr>
             <w:r/>
-            <w:hyperlink r:id="rId177">
+            <w:hyperlink r:id="rId182">
               <w:r>
                 <w:rPr>
                   <w:color w:val="0B4F9E"/>
@@ -15730,7 +16236,7 @@
               <w:jc w:val="left"/>
             </w:pPr>
             <w:r/>
-            <w:hyperlink r:id="rId178">
+            <w:hyperlink r:id="rId183">
               <w:r>
                 <w:rPr>
                   <w:color w:val="0B4F9E"/>
@@ -15801,7 +16307,7 @@
               <w:jc w:val="left"/>
             </w:pPr>
             <w:r/>
-            <w:hyperlink r:id="rId178">
+            <w:hyperlink r:id="rId183">
               <w:r>
                 <w:rPr>
                   <w:color w:val="0B4F9E"/>
@@ -15824,7 +16330,7 @@
               <w:jc w:val="left"/>
             </w:pPr>
             <w:r/>
-            <w:hyperlink r:id="rId179">
+            <w:hyperlink r:id="rId184">
               <w:r>
                 <w:rPr>
                   <w:color w:val="0B4F9E"/>
@@ -15895,7 +16401,7 @@
               <w:jc w:val="left"/>
             </w:pPr>
             <w:r/>
-            <w:hyperlink r:id="rId179">
+            <w:hyperlink r:id="rId184">
               <w:r>
                 <w:rPr>
                   <w:color w:val="0B4F9E"/>
@@ -15918,7 +16424,7 @@
               <w:jc w:val="left"/>
             </w:pPr>
             <w:r/>
-            <w:hyperlink r:id="rId180">
+            <w:hyperlink r:id="rId185">
               <w:r>
                 <w:rPr>
                   <w:color w:val="0B4F9E"/>
@@ -15995,7 +16501,7 @@
               <w:jc w:val="left"/>
             </w:pPr>
             <w:r/>
-            <w:hyperlink r:id="rId180">
+            <w:hyperlink r:id="rId185">
               <w:r>
                 <w:rPr>
                   <w:color w:val="0B4F9E"/>
@@ -16018,7 +16524,7 @@
               <w:jc w:val="left"/>
             </w:pPr>
             <w:r/>
-            <w:hyperlink r:id="rId181">
+            <w:hyperlink r:id="rId186">
               <w:r>
                 <w:rPr>
                   <w:color w:val="0B4F9E"/>
@@ -16089,7 +16595,7 @@
               <w:jc w:val="left"/>
             </w:pPr>
             <w:r/>
-            <w:hyperlink r:id="rId181">
+            <w:hyperlink r:id="rId186">
               <w:r>
                 <w:rPr>
                   <w:color w:val="0B4F9E"/>
@@ -16112,7 +16618,7 @@
               <w:jc w:val="left"/>
             </w:pPr>
             <w:r/>
-            <w:hyperlink r:id="rId182">
+            <w:hyperlink r:id="rId187">
               <w:r>
                 <w:rPr>
                   <w:color w:val="0B4F9E"/>
@@ -16183,7 +16689,7 @@
               <w:jc w:val="left"/>
             </w:pPr>
             <w:r/>
-            <w:hyperlink r:id="rId182">
+            <w:hyperlink r:id="rId187">
               <w:r>
                 <w:rPr>
                   <w:color w:val="0B4F9E"/>
@@ -16206,7 +16712,7 @@
               <w:jc w:val="left"/>
             </w:pPr>
             <w:r/>
-            <w:hyperlink r:id="rId183">
+            <w:hyperlink r:id="rId188">
               <w:r>
                 <w:rPr>
                   <w:color w:val="0B4F9E"/>
@@ -16277,7 +16783,7 @@
               <w:jc w:val="left"/>
             </w:pPr>
             <w:r/>
-            <w:hyperlink r:id="rId183">
+            <w:hyperlink r:id="rId188">
               <w:r>
                 <w:rPr>
                   <w:color w:val="0B4F9E"/>
@@ -16300,7 +16806,7 @@
               <w:jc w:val="left"/>
             </w:pPr>
             <w:r/>
-            <w:hyperlink r:id="rId184">
+            <w:hyperlink r:id="rId189">
               <w:r>
                 <w:rPr>
                   <w:color w:val="0B4F9E"/>
@@ -16377,7 +16883,7 @@
               <w:jc w:val="left"/>
             </w:pPr>
             <w:r/>
-            <w:hyperlink r:id="rId184">
+            <w:hyperlink r:id="rId189">
               <w:r>
                 <w:rPr>
                   <w:color w:val="0B4F9E"/>
@@ -16400,7 +16906,7 @@
               <w:jc w:val="left"/>
             </w:pPr>
             <w:r/>
-            <w:hyperlink r:id="rId185">
+            <w:hyperlink r:id="rId190">
               <w:r>
                 <w:rPr>
                   <w:color w:val="0B4F9E"/>
@@ -16471,7 +16977,7 @@
               <w:jc w:val="left"/>
             </w:pPr>
             <w:r/>
-            <w:hyperlink r:id="rId185">
+            <w:hyperlink r:id="rId190">
               <w:r>
                 <w:rPr>
                   <w:color w:val="0B4F9E"/>
@@ -16494,7 +17000,7 @@
               <w:jc w:val="left"/>
             </w:pPr>
             <w:r/>
-            <w:hyperlink r:id="rId186">
+            <w:hyperlink r:id="rId191">
               <w:r>
                 <w:rPr>
                   <w:color w:val="0B4F9E"/>
@@ -16565,7 +17071,7 @@
               <w:jc w:val="left"/>
             </w:pPr>
             <w:r/>
-            <w:hyperlink r:id="rId186">
+            <w:hyperlink r:id="rId191">
               <w:r>
                 <w:rPr>
                   <w:color w:val="0B4F9E"/>
@@ -16588,7 +17094,7 @@
               <w:jc w:val="left"/>
             </w:pPr>
             <w:r/>
-            <w:hyperlink r:id="rId187">
+            <w:hyperlink r:id="rId192">
               <w:r>
                 <w:rPr>
                   <w:color w:val="0B4F9E"/>
@@ -16659,7 +17165,7 @@
               <w:jc w:val="left"/>
             </w:pPr>
             <w:r/>
-            <w:hyperlink r:id="rId187">
+            <w:hyperlink r:id="rId192">
               <w:r>
                 <w:rPr>
                   <w:color w:val="0B4F9E"/>
@@ -16682,7 +17188,7 @@
               <w:jc w:val="left"/>
             </w:pPr>
             <w:r/>
-            <w:hyperlink r:id="rId188">
+            <w:hyperlink r:id="rId193">
               <w:r>
                 <w:rPr>
                   <w:color w:val="0B4F9E"/>
@@ -16753,7 +17259,7 @@
               <w:jc w:val="left"/>
             </w:pPr>
             <w:r/>
-            <w:hyperlink r:id="rId188">
+            <w:hyperlink r:id="rId193">
               <w:r>
                 <w:rPr>
                   <w:color w:val="0B4F9E"/>
@@ -16776,7 +17282,7 @@
               <w:jc w:val="left"/>
             </w:pPr>
             <w:r/>
-            <w:hyperlink r:id="rId189">
+            <w:hyperlink r:id="rId194">
               <w:r>
                 <w:rPr>
                   <w:color w:val="0B4F9E"/>
@@ -16847,7 +17353,7 @@
               <w:jc w:val="left"/>
             </w:pPr>
             <w:r/>
-            <w:hyperlink r:id="rId189">
+            <w:hyperlink r:id="rId194">
               <w:r>
                 <w:rPr>
                   <w:color w:val="0B4F9E"/>
@@ -16870,7 +17376,101 @@
               <w:jc w:val="left"/>
             </w:pPr>
             <w:r/>
-            <w:hyperlink r:id="rId190">
+            <w:hyperlink r:id="rId195">
+              <w:r>
+                <w:rPr>
+                  <w:color w:val="0B4F9E"/>
+                  <w:sz w:val="16"/>
+                  <w:u w:val="single"/>
+                </w:rPr>
+                <w:t>Deep Learning for Discovering Novel Materials with Desired Properties</w:t>
+              </w:r>
+            </w:hyperlink>
+          </w:p>
+        </w:tc>
+        <w:tc>
+          <w:tcPr>
+            <w:tcW w:type="dxa" w:w="1680"/>
+          </w:tcPr>
+          <w:p>
+            <w:pPr>
+              <w:jc w:val="left"/>
+            </w:pPr>
+            <w:r/>
+          </w:p>
+        </w:tc>
+        <w:tc>
+          <w:tcPr>
+            <w:tcW w:type="dxa" w:w="1680"/>
+          </w:tcPr>
+          <w:p>
+            <w:pPr>
+              <w:jc w:val="left"/>
+            </w:pPr>
+            <w:r/>
+          </w:p>
+        </w:tc>
+        <w:tc>
+          <w:tcPr>
+            <w:tcW w:type="dxa" w:w="1680"/>
+          </w:tcPr>
+          <w:p>
+            <w:pPr>
+              <w:jc w:val="left"/>
+            </w:pPr>
+            <w:r/>
+          </w:p>
+        </w:tc>
+        <w:tc>
+          <w:tcPr>
+            <w:tcW w:type="dxa" w:w="1680"/>
+          </w:tcPr>
+          <w:p>
+            <w:pPr>
+              <w:jc w:val="left"/>
+            </w:pPr>
+            <w:r/>
+            <w:r>
+              <w:rPr>
+                <w:sz w:val="16"/>
+              </w:rPr>
+              <w:t>2026-09-03</w:t>
+            </w:r>
+          </w:p>
+        </w:tc>
+        <w:tc>
+          <w:tcPr>
+            <w:tcW w:type="dxa" w:w="1680"/>
+          </w:tcPr>
+          <w:p>
+            <w:pPr>
+              <w:jc w:val="left"/>
+            </w:pPr>
+            <w:r/>
+            <w:hyperlink r:id="rId195">
+              <w:r>
+                <w:rPr>
+                  <w:color w:val="0B4F9E"/>
+                  <w:sz w:val="16"/>
+                  <w:u w:val="single"/>
+                </w:rPr>
+                <w:t>10.5281/zenodo.22270638</w:t>
+              </w:r>
+            </w:hyperlink>
+          </w:p>
+        </w:tc>
+      </w:tr>
+      <w:tr>
+        <w:tc>
+          <w:tcPr>
+            <w:tcW w:type="dxa" w:w="1680"/>
+          </w:tcPr>
+          <w:p>
+            <w:pPr>
+              <w:jc w:val="left"/>
+            </w:pPr>
+            <w:r/>
+            <w:hyperlink r:id="rId196">
               <w:r>
                 <w:rPr>
                   <w:color w:val="0B4F9E"/>
@@ -16941,7 +17541,7 @@
               <w:jc w:val="left"/>
             </w:pPr>
             <w:r/>
-            <w:hyperlink r:id="rId190">
+            <w:hyperlink r:id="rId196">
               <w:r>
                 <w:rPr>
                   <w:color w:val="0B4F9E"/>
@@ -16964,7 +17564,7 @@
               <w:jc w:val="left"/>
             </w:pPr>
             <w:r/>
-            <w:hyperlink r:id="rId191">
+            <w:hyperlink r:id="rId197">
               <w:r>
                 <w:rPr>
                   <w:color w:val="0B4F9E"/>
@@ -17035,7 +17635,7 @@
               <w:jc w:val="left"/>
             </w:pPr>
             <w:r/>
-            <w:hyperlink r:id="rId191">
+            <w:hyperlink r:id="rId197">
               <w:r>
                 <w:rPr>
                   <w:color w:val="0B4F9E"/>
@@ -17043,6 +17643,482 @@
                   <w:u w:val="single"/>
                 </w:rPr>
                 <w:t>10.1016/j.commatsci.2026.115034</w:t>
+              </w:r>
+            </w:hyperlink>
+          </w:p>
+        </w:tc>
+      </w:tr>
+      <w:tr>
+        <w:tc>
+          <w:tcPr>
+            <w:tcW w:type="dxa" w:w="1680"/>
+          </w:tcPr>
+          <w:p>
+            <w:pPr>
+              <w:jc w:val="left"/>
+            </w:pPr>
+            <w:r/>
+            <w:hyperlink r:id="rId198">
+              <w:r>
+                <w:rPr>
+                  <w:color w:val="0B4F9E"/>
+                  <w:sz w:val="16"/>
+                  <w:u w:val="single"/>
+                </w:rPr>
+                <w:t>A Robust and Sustainable Machine Learning Framework for Indoor Localization in Mobile IoT Networks</w:t>
+              </w:r>
+            </w:hyperlink>
+          </w:p>
+        </w:tc>
+        <w:tc>
+          <w:tcPr>
+            <w:tcW w:type="dxa" w:w="1680"/>
+          </w:tcPr>
+          <w:p>
+            <w:pPr>
+              <w:jc w:val="left"/>
+            </w:pPr>
+            <w:r/>
+          </w:p>
+        </w:tc>
+        <w:tc>
+          <w:tcPr>
+            <w:tcW w:type="dxa" w:w="1680"/>
+          </w:tcPr>
+          <w:p>
+            <w:pPr>
+              <w:jc w:val="left"/>
+            </w:pPr>
+            <w:r/>
+          </w:p>
+        </w:tc>
+        <w:tc>
+          <w:tcPr>
+            <w:tcW w:type="dxa" w:w="1680"/>
+          </w:tcPr>
+          <w:p>
+            <w:pPr>
+              <w:jc w:val="left"/>
+            </w:pPr>
+            <w:r/>
+          </w:p>
+        </w:tc>
+        <w:tc>
+          <w:tcPr>
+            <w:tcW w:type="dxa" w:w="1680"/>
+          </w:tcPr>
+          <w:p>
+            <w:pPr>
+              <w:jc w:val="left"/>
+            </w:pPr>
+            <w:r/>
+            <w:r>
+              <w:rPr>
+                <w:sz w:val="16"/>
+              </w:rPr>
+              <w:t>2026-09-04</w:t>
+            </w:r>
+          </w:p>
+        </w:tc>
+        <w:tc>
+          <w:tcPr>
+            <w:tcW w:type="dxa" w:w="1680"/>
+          </w:tcPr>
+          <w:p>
+            <w:pPr>
+              <w:jc w:val="left"/>
+            </w:pPr>
+            <w:r/>
+            <w:hyperlink r:id="rId198">
+              <w:r>
+                <w:rPr>
+                  <w:color w:val="0B4F9E"/>
+                  <w:sz w:val="16"/>
+                  <w:u w:val="single"/>
+                </w:rPr>
+                <w:t>10.3390/electronics15173994</w:t>
+              </w:r>
+            </w:hyperlink>
+          </w:p>
+        </w:tc>
+      </w:tr>
+      <w:tr>
+        <w:tc>
+          <w:tcPr>
+            <w:tcW w:type="dxa" w:w="1680"/>
+          </w:tcPr>
+          <w:p>
+            <w:pPr>
+              <w:jc w:val="left"/>
+            </w:pPr>
+            <w:r/>
+            <w:hyperlink r:id="rId199">
+              <w:r>
+                <w:rPr>
+                  <w:color w:val="0B4F9E"/>
+                  <w:sz w:val="16"/>
+                  <w:u w:val="single"/>
+                </w:rPr>
+                <w:t>Evaluating Sequence Foundation Models for Insect Olfactory Gene Discovery: Failure Modes, Evidence Standards, and a Benc</w:t>
+              </w:r>
+            </w:hyperlink>
+          </w:p>
+        </w:tc>
+        <w:tc>
+          <w:tcPr>
+            <w:tcW w:type="dxa" w:w="1680"/>
+          </w:tcPr>
+          <w:p>
+            <w:pPr>
+              <w:jc w:val="left"/>
+            </w:pPr>
+            <w:r/>
+          </w:p>
+        </w:tc>
+        <w:tc>
+          <w:tcPr>
+            <w:tcW w:type="dxa" w:w="1680"/>
+          </w:tcPr>
+          <w:p>
+            <w:pPr>
+              <w:jc w:val="left"/>
+            </w:pPr>
+            <w:r/>
+          </w:p>
+        </w:tc>
+        <w:tc>
+          <w:tcPr>
+            <w:tcW w:type="dxa" w:w="1680"/>
+          </w:tcPr>
+          <w:p>
+            <w:pPr>
+              <w:jc w:val="left"/>
+            </w:pPr>
+            <w:r/>
+            <w:r>
+              <w:rPr>
+                <w:sz w:val="16"/>
+              </w:rPr>
+              <w:t>MLIP</w:t>
+            </w:r>
+          </w:p>
+        </w:tc>
+        <w:tc>
+          <w:tcPr>
+            <w:tcW w:type="dxa" w:w="1680"/>
+          </w:tcPr>
+          <w:p>
+            <w:pPr>
+              <w:jc w:val="left"/>
+            </w:pPr>
+            <w:r/>
+            <w:r>
+              <w:rPr>
+                <w:sz w:val="16"/>
+              </w:rPr>
+              <w:t>2026-09-04</w:t>
+            </w:r>
+          </w:p>
+        </w:tc>
+        <w:tc>
+          <w:tcPr>
+            <w:tcW w:type="dxa" w:w="1680"/>
+          </w:tcPr>
+          <w:p>
+            <w:pPr>
+              <w:jc w:val="left"/>
+            </w:pPr>
+            <w:r/>
+            <w:hyperlink r:id="rId199">
+              <w:r>
+                <w:rPr>
+                  <w:color w:val="0B4F9E"/>
+                  <w:sz w:val="16"/>
+                  <w:u w:val="single"/>
+                </w:rPr>
+                <w:t>10.3390/insects17090928</w:t>
+              </w:r>
+            </w:hyperlink>
+          </w:p>
+        </w:tc>
+      </w:tr>
+      <w:tr>
+        <w:tc>
+          <w:tcPr>
+            <w:tcW w:type="dxa" w:w="1680"/>
+          </w:tcPr>
+          <w:p>
+            <w:pPr>
+              <w:jc w:val="left"/>
+            </w:pPr>
+            <w:r/>
+            <w:hyperlink r:id="rId200">
+              <w:r>
+                <w:rPr>
+                  <w:color w:val="0B4F9E"/>
+                  <w:sz w:val="16"/>
+                  <w:u w:val="single"/>
+                </w:rPr>
+                <w:t>UniTG: A Unified System for Efficient and Seamless Textual Graph Learning</w:t>
+              </w:r>
+            </w:hyperlink>
+          </w:p>
+        </w:tc>
+        <w:tc>
+          <w:tcPr>
+            <w:tcW w:type="dxa" w:w="1680"/>
+          </w:tcPr>
+          <w:p>
+            <w:pPr>
+              <w:jc w:val="left"/>
+            </w:pPr>
+            <w:r/>
+          </w:p>
+        </w:tc>
+        <w:tc>
+          <w:tcPr>
+            <w:tcW w:type="dxa" w:w="1680"/>
+          </w:tcPr>
+          <w:p>
+            <w:pPr>
+              <w:jc w:val="left"/>
+            </w:pPr>
+            <w:r/>
+          </w:p>
+        </w:tc>
+        <w:tc>
+          <w:tcPr>
+            <w:tcW w:type="dxa" w:w="1680"/>
+          </w:tcPr>
+          <w:p>
+            <w:pPr>
+              <w:jc w:val="left"/>
+            </w:pPr>
+            <w:r/>
+          </w:p>
+        </w:tc>
+        <w:tc>
+          <w:tcPr>
+            <w:tcW w:type="dxa" w:w="1680"/>
+          </w:tcPr>
+          <w:p>
+            <w:pPr>
+              <w:jc w:val="left"/>
+            </w:pPr>
+            <w:r/>
+            <w:r>
+              <w:rPr>
+                <w:sz w:val="16"/>
+              </w:rPr>
+              <w:t>2026-09-04</w:t>
+            </w:r>
+          </w:p>
+        </w:tc>
+        <w:tc>
+          <w:tcPr>
+            <w:tcW w:type="dxa" w:w="1680"/>
+          </w:tcPr>
+          <w:p>
+            <w:pPr>
+              <w:jc w:val="left"/>
+            </w:pPr>
+            <w:r/>
+            <w:hyperlink r:id="rId200">
+              <w:r>
+                <w:rPr>
+                  <w:color w:val="0B4F9E"/>
+                  <w:sz w:val="16"/>
+                  <w:u w:val="single"/>
+                </w:rPr>
+                <w:t>10.14778/3836663.3836688</w:t>
+              </w:r>
+            </w:hyperlink>
+          </w:p>
+        </w:tc>
+      </w:tr>
+      <w:tr>
+        <w:tc>
+          <w:tcPr>
+            <w:tcW w:type="dxa" w:w="1680"/>
+          </w:tcPr>
+          <w:p>
+            <w:pPr>
+              <w:jc w:val="left"/>
+            </w:pPr>
+            <w:r/>
+            <w:hyperlink r:id="rId201">
+              <w:r>
+                <w:rPr>
+                  <w:color w:val="0B4F9E"/>
+                  <w:sz w:val="16"/>
+                  <w:u w:val="single"/>
+                </w:rPr>
+                <w:t>Visible-infrared spectrum tunable aperiodic Ge 2 Sb 2 Te 5 photonic crystals</w:t>
+              </w:r>
+            </w:hyperlink>
+          </w:p>
+        </w:tc>
+        <w:tc>
+          <w:tcPr>
+            <w:tcW w:type="dxa" w:w="1680"/>
+          </w:tcPr>
+          <w:p>
+            <w:pPr>
+              <w:jc w:val="left"/>
+            </w:pPr>
+            <w:r/>
+          </w:p>
+        </w:tc>
+        <w:tc>
+          <w:tcPr>
+            <w:tcW w:type="dxa" w:w="1680"/>
+          </w:tcPr>
+          <w:p>
+            <w:pPr>
+              <w:jc w:val="left"/>
+            </w:pPr>
+            <w:r/>
+          </w:p>
+        </w:tc>
+        <w:tc>
+          <w:tcPr>
+            <w:tcW w:type="dxa" w:w="1680"/>
+          </w:tcPr>
+          <w:p>
+            <w:pPr>
+              <w:jc w:val="left"/>
+            </w:pPr>
+            <w:r/>
+          </w:p>
+        </w:tc>
+        <w:tc>
+          <w:tcPr>
+            <w:tcW w:type="dxa" w:w="1680"/>
+          </w:tcPr>
+          <w:p>
+            <w:pPr>
+              <w:jc w:val="left"/>
+            </w:pPr>
+            <w:r/>
+            <w:r>
+              <w:rPr>
+                <w:sz w:val="16"/>
+              </w:rPr>
+              <w:t>2026-09-04</w:t>
+            </w:r>
+          </w:p>
+        </w:tc>
+        <w:tc>
+          <w:tcPr>
+            <w:tcW w:type="dxa" w:w="1680"/>
+          </w:tcPr>
+          <w:p>
+            <w:pPr>
+              <w:jc w:val="left"/>
+            </w:pPr>
+            <w:r/>
+            <w:hyperlink r:id="rId201">
+              <w:r>
+                <w:rPr>
+                  <w:color w:val="0B4F9E"/>
+                  <w:sz w:val="16"/>
+                  <w:u w:val="single"/>
+                </w:rPr>
+                <w:t>10.1039/d6tc01283c</w:t>
+              </w:r>
+            </w:hyperlink>
+          </w:p>
+        </w:tc>
+      </w:tr>
+      <w:tr>
+        <w:tc>
+          <w:tcPr>
+            <w:tcW w:type="dxa" w:w="1680"/>
+          </w:tcPr>
+          <w:p>
+            <w:pPr>
+              <w:jc w:val="left"/>
+            </w:pPr>
+            <w:r/>
+            <w:hyperlink r:id="rId202">
+              <w:r>
+                <w:rPr>
+                  <w:color w:val="0B4F9E"/>
+                  <w:sz w:val="16"/>
+                  <w:u w:val="single"/>
+                </w:rPr>
+                <w:t>Reaction - diffusion model of multicomponent myocardial injury based on Dirichlet concentration parameters</w:t>
+              </w:r>
+            </w:hyperlink>
+          </w:p>
+        </w:tc>
+        <w:tc>
+          <w:tcPr>
+            <w:tcW w:type="dxa" w:w="1680"/>
+          </w:tcPr>
+          <w:p>
+            <w:pPr>
+              <w:jc w:val="left"/>
+            </w:pPr>
+            <w:r/>
+          </w:p>
+        </w:tc>
+        <w:tc>
+          <w:tcPr>
+            <w:tcW w:type="dxa" w:w="1680"/>
+          </w:tcPr>
+          <w:p>
+            <w:pPr>
+              <w:jc w:val="left"/>
+            </w:pPr>
+            <w:r/>
+          </w:p>
+        </w:tc>
+        <w:tc>
+          <w:tcPr>
+            <w:tcW w:type="dxa" w:w="1680"/>
+          </w:tcPr>
+          <w:p>
+            <w:pPr>
+              <w:jc w:val="left"/>
+            </w:pPr>
+            <w:r/>
+          </w:p>
+        </w:tc>
+        <w:tc>
+          <w:tcPr>
+            <w:tcW w:type="dxa" w:w="1680"/>
+          </w:tcPr>
+          <w:p>
+            <w:pPr>
+              <w:jc w:val="left"/>
+            </w:pPr>
+            <w:r/>
+            <w:r>
+              <w:rPr>
+                <w:sz w:val="16"/>
+              </w:rPr>
+              <w:t>2026-09-04</w:t>
+            </w:r>
+          </w:p>
+        </w:tc>
+        <w:tc>
+          <w:tcPr>
+            <w:tcW w:type="dxa" w:w="1680"/>
+          </w:tcPr>
+          <w:p>
+            <w:pPr>
+              <w:jc w:val="left"/>
+            </w:pPr>
+            <w:r/>
+            <w:hyperlink r:id="rId202">
+              <w:r>
+                <w:rPr>
+                  <w:color w:val="0B4F9E"/>
+                  <w:sz w:val="16"/>
+                  <w:u w:val="single"/>
+                </w:rPr>
+                <w:t>10.20537/2076-7633-2026-18-4-929-972</w:t>
               </w:r>
             </w:hyperlink>
           </w:p>
@@ -17069,7 +18145,7 @@
         <w:rPr>
           <w:b/>
         </w:rPr>
-        <w:t>131</w:t>
+        <w:t>145</w:t>
       </w:r>
     </w:p>
     <w:p>
@@ -17083,7 +18159,7 @@
         <w:rPr>
           <w:b/>
         </w:rPr>
-        <w:t>64</w:t>
+        <w:t>74</w:t>
       </w:r>
     </w:p>
     <w:p>
@@ -17097,7 +18173,7 @@
         <w:rPr>
           <w:b/>
         </w:rPr>
-        <w:t>153</w:t>
+        <w:t>164</w:t>
       </w:r>
     </w:p>
     <w:p>

</xml_diff>

<commit_message>
Digest + summary: 2026-09-06
</commit_message>
<xml_diff>
--- a/NEEDS_DATA.docx
+++ b/NEEDS_DATA.docx
@@ -17,7 +17,7 @@
     </w:p>
     <w:p>
       <w:r>
-        <w:t xml:space="preserve">Generated 2026-09-05. Every field below was blank in the automated sources. Fill any of them in </w:t>
+        <w:t xml:space="preserve">Generated 2026-09-06. Every field below was blank in the automated sources. Fill any of them in </w:t>
       </w:r>
       <w:r>
         <w:rPr>
@@ -1387,7 +1387,7 @@
         <w:pStyle w:val="Heading2"/>
       </w:pPr>
       <w:r>
-        <w:t>Studies with no numeric performance figure (173 of 182)</w:t>
+        <w:t>Studies with no numeric performance figure (182 of 191)</w:t>
       </w:r>
     </w:p>
     <w:p>
@@ -1809,7 +1809,7 @@
               <w:rPr>
                 <w:sz w:val="16"/>
               </w:rPr>
-              <w:t>MEGNet, ALIGNN, CGCNN</w:t>
+              <w:t>ALIGNN, MEGNet, CGCNN</w:t>
             </w:r>
           </w:p>
         </w:tc>
@@ -2587,7 +2587,7 @@
               <w:rPr>
                 <w:sz w:val="16"/>
               </w:rPr>
-              <w:t>SevenNet-0, MatterSim, MACE-MP-0, CHGNet</w:t>
+              <w:t>SevenNet-0, MACE-MP-0, MatterSim, CHGNet</w:t>
             </w:r>
           </w:p>
         </w:tc>
@@ -2805,7 +2805,7 @@
               <w:rPr>
                 <w:sz w:val="16"/>
               </w:rPr>
-              <w:t>GRACE-1L-OAM, SevenNet-0, MatterSim, MACE-MP-0</w:t>
+              <w:t>GRACE-1L-OAM, SevenNet-0, MACE-MP-0, MatterSim</w:t>
             </w:r>
           </w:p>
         </w:tc>
@@ -3647,7 +3647,7 @@
               <w:rPr>
                 <w:sz w:val="16"/>
               </w:rPr>
-              <w:t>MatterSim, MatterGen</w:t>
+              <w:t>MatterGen, MatterSim</w:t>
             </w:r>
           </w:p>
         </w:tc>
@@ -11517,6 +11517,306 @@
                   <w:sz w:val="16"/>
                   <w:u w:val="single"/>
                 </w:rPr>
+                <w:t xml:space="preserve">Interpretable Physically Constrained Framework for Anisotropic Constitutive Model of CoCrNi Plasticity over Wide Strain </w:t>
+              </w:r>
+            </w:hyperlink>
+          </w:p>
+        </w:tc>
+        <w:tc>
+          <w:tcPr>
+            <w:tcW w:type="dxa" w:w="1680"/>
+          </w:tcPr>
+          <w:p>
+            <w:pPr>
+              <w:jc w:val="left"/>
+            </w:pPr>
+            <w:r/>
+          </w:p>
+        </w:tc>
+        <w:tc>
+          <w:tcPr>
+            <w:tcW w:type="dxa" w:w="1680"/>
+          </w:tcPr>
+          <w:p>
+            <w:pPr>
+              <w:jc w:val="left"/>
+            </w:pPr>
+            <w:r/>
+            <w:r>
+              <w:rPr>
+                <w:sz w:val="16"/>
+              </w:rPr>
+              <w:t>alloy</w:t>
+            </w:r>
+          </w:p>
+        </w:tc>
+        <w:tc>
+          <w:tcPr>
+            <w:tcW w:type="dxa" w:w="1680"/>
+          </w:tcPr>
+          <w:p>
+            <w:pPr>
+              <w:jc w:val="left"/>
+            </w:pPr>
+            <w:r/>
+          </w:p>
+        </w:tc>
+        <w:tc>
+          <w:tcPr>
+            <w:tcW w:type="dxa" w:w="1680"/>
+          </w:tcPr>
+          <w:p>
+            <w:pPr>
+              <w:jc w:val="left"/>
+            </w:pPr>
+            <w:r/>
+            <w:r>
+              <w:rPr>
+                <w:sz w:val="16"/>
+              </w:rPr>
+              <w:t>2026-09-06</w:t>
+            </w:r>
+          </w:p>
+        </w:tc>
+        <w:tc>
+          <w:tcPr>
+            <w:tcW w:type="dxa" w:w="1680"/>
+          </w:tcPr>
+          <w:p>
+            <w:pPr>
+              <w:jc w:val="left"/>
+            </w:pPr>
+            <w:r/>
+            <w:hyperlink r:id="rId133">
+              <w:r>
+                <w:rPr>
+                  <w:color w:val="0B4F9E"/>
+                  <w:sz w:val="16"/>
+                  <w:u w:val="single"/>
+                </w:rPr>
+                <w:t>10.2139/ssrn.7422739</w:t>
+              </w:r>
+            </w:hyperlink>
+          </w:p>
+        </w:tc>
+      </w:tr>
+      <w:tr>
+        <w:tc>
+          <w:tcPr>
+            <w:tcW w:type="dxa" w:w="1680"/>
+          </w:tcPr>
+          <w:p>
+            <w:pPr>
+              <w:jc w:val="left"/>
+            </w:pPr>
+            <w:r/>
+            <w:hyperlink r:id="rId134">
+              <w:r>
+                <w:rPr>
+                  <w:color w:val="0B4F9E"/>
+                  <w:sz w:val="16"/>
+                  <w:u w:val="single"/>
+                </w:rPr>
+                <w:t>Complex crystal structure prediction using ML-enhanced multi-minima iterative genetic algorithm</w:t>
+              </w:r>
+            </w:hyperlink>
+          </w:p>
+        </w:tc>
+        <w:tc>
+          <w:tcPr>
+            <w:tcW w:type="dxa" w:w="1680"/>
+          </w:tcPr>
+          <w:p>
+            <w:pPr>
+              <w:jc w:val="left"/>
+            </w:pPr>
+            <w:r/>
+          </w:p>
+        </w:tc>
+        <w:tc>
+          <w:tcPr>
+            <w:tcW w:type="dxa" w:w="1680"/>
+          </w:tcPr>
+          <w:p>
+            <w:pPr>
+              <w:jc w:val="left"/>
+            </w:pPr>
+            <w:r/>
+            <w:r>
+              <w:rPr>
+                <w:sz w:val="16"/>
+              </w:rPr>
+              <w:t>magnetic material, La4Co4Pb, La5CoPb2, La3CoPb</w:t>
+            </w:r>
+          </w:p>
+        </w:tc>
+        <w:tc>
+          <w:tcPr>
+            <w:tcW w:type="dxa" w:w="1680"/>
+          </w:tcPr>
+          <w:p>
+            <w:pPr>
+              <w:jc w:val="left"/>
+            </w:pPr>
+            <w:r/>
+          </w:p>
+        </w:tc>
+        <w:tc>
+          <w:tcPr>
+            <w:tcW w:type="dxa" w:w="1680"/>
+          </w:tcPr>
+          <w:p>
+            <w:pPr>
+              <w:jc w:val="left"/>
+            </w:pPr>
+            <w:r/>
+            <w:r>
+              <w:rPr>
+                <w:sz w:val="16"/>
+              </w:rPr>
+              <w:t>2026-09-06</w:t>
+            </w:r>
+          </w:p>
+        </w:tc>
+        <w:tc>
+          <w:tcPr>
+            <w:tcW w:type="dxa" w:w="1680"/>
+          </w:tcPr>
+          <w:p>
+            <w:pPr>
+              <w:jc w:val="left"/>
+            </w:pPr>
+            <w:r/>
+            <w:hyperlink r:id="rId134">
+              <w:r>
+                <w:rPr>
+                  <w:color w:val="0B4F9E"/>
+                  <w:sz w:val="16"/>
+                  <w:u w:val="single"/>
+                </w:rPr>
+                <w:t>10.2139/ssrn.7422744</w:t>
+              </w:r>
+            </w:hyperlink>
+          </w:p>
+        </w:tc>
+      </w:tr>
+      <w:tr>
+        <w:tc>
+          <w:tcPr>
+            <w:tcW w:type="dxa" w:w="1680"/>
+          </w:tcPr>
+          <w:p>
+            <w:pPr>
+              <w:jc w:val="left"/>
+            </w:pPr>
+            <w:r/>
+            <w:hyperlink r:id="rId135">
+              <w:r>
+                <w:rPr>
+                  <w:color w:val="0B4F9E"/>
+                  <w:sz w:val="16"/>
+                  <w:u w:val="single"/>
+                </w:rPr>
+                <w:t>Prediction and experimental study on hydrogen storage performance of Ti-Fe-Zr-Mn-V-based high-entropy alloys based on ma</w:t>
+              </w:r>
+            </w:hyperlink>
+          </w:p>
+        </w:tc>
+        <w:tc>
+          <w:tcPr>
+            <w:tcW w:type="dxa" w:w="1680"/>
+          </w:tcPr>
+          <w:p>
+            <w:pPr>
+              <w:jc w:val="left"/>
+            </w:pPr>
+            <w:r/>
+          </w:p>
+        </w:tc>
+        <w:tc>
+          <w:tcPr>
+            <w:tcW w:type="dxa" w:w="1680"/>
+          </w:tcPr>
+          <w:p>
+            <w:pPr>
+              <w:jc w:val="left"/>
+            </w:pPr>
+            <w:r/>
+            <w:r>
+              <w:rPr>
+                <w:sz w:val="16"/>
+              </w:rPr>
+              <w:t>alloy</w:t>
+            </w:r>
+          </w:p>
+        </w:tc>
+        <w:tc>
+          <w:tcPr>
+            <w:tcW w:type="dxa" w:w="1680"/>
+          </w:tcPr>
+          <w:p>
+            <w:pPr>
+              <w:jc w:val="left"/>
+            </w:pPr>
+            <w:r/>
+          </w:p>
+        </w:tc>
+        <w:tc>
+          <w:tcPr>
+            <w:tcW w:type="dxa" w:w="1680"/>
+          </w:tcPr>
+          <w:p>
+            <w:pPr>
+              <w:jc w:val="left"/>
+            </w:pPr>
+            <w:r/>
+            <w:r>
+              <w:rPr>
+                <w:sz w:val="16"/>
+              </w:rPr>
+              <w:t>2026-09-06</w:t>
+            </w:r>
+          </w:p>
+        </w:tc>
+        <w:tc>
+          <w:tcPr>
+            <w:tcW w:type="dxa" w:w="1680"/>
+          </w:tcPr>
+          <w:p>
+            <w:pPr>
+              <w:jc w:val="left"/>
+            </w:pPr>
+            <w:r/>
+            <w:hyperlink r:id="rId135">
+              <w:r>
+                <w:rPr>
+                  <w:color w:val="0B4F9E"/>
+                  <w:sz w:val="16"/>
+                  <w:u w:val="single"/>
+                </w:rPr>
+                <w:t>10.1016/j.ijhydene.2026.157414</w:t>
+              </w:r>
+            </w:hyperlink>
+          </w:p>
+        </w:tc>
+      </w:tr>
+      <w:tr>
+        <w:tc>
+          <w:tcPr>
+            <w:tcW w:type="dxa" w:w="1680"/>
+          </w:tcPr>
+          <w:p>
+            <w:pPr>
+              <w:jc w:val="left"/>
+            </w:pPr>
+            <w:r/>
+            <w:hyperlink r:id="rId136">
+              <w:r>
+                <w:rPr>
+                  <w:color w:val="0B4F9E"/>
+                  <w:sz w:val="16"/>
+                  <w:u w:val="single"/>
+                </w:rPr>
                 <w:t>From Empirical Design To Autonomous Ecosystems: AI-Driven Advances, Challenges, And Future Directions In Precision Nanom</w:t>
               </w:r>
             </w:hyperlink>
@@ -11581,7 +11881,7 @@
               <w:jc w:val="left"/>
             </w:pPr>
             <w:r/>
-            <w:hyperlink r:id="rId133">
+            <w:hyperlink r:id="rId136">
               <w:r>
                 <w:rPr>
                   <w:color w:val="0B4F9E"/>
@@ -11604,7 +11904,7 @@
               <w:jc w:val="left"/>
             </w:pPr>
             <w:r/>
-            <w:hyperlink r:id="rId134">
+            <w:hyperlink r:id="rId137">
               <w:r>
                 <w:rPr>
                   <w:color w:val="0B4F9E"/>
@@ -11669,306 +11969,6 @@
                 <w:sz w:val="16"/>
               </w:rPr>
               <w:t>2026-08-14</w:t>
-            </w:r>
-          </w:p>
-        </w:tc>
-        <w:tc>
-          <w:tcPr>
-            <w:tcW w:type="dxa" w:w="1680"/>
-          </w:tcPr>
-          <w:p>
-            <w:pPr>
-              <w:jc w:val="left"/>
-            </w:pPr>
-            <w:r/>
-            <w:hyperlink r:id="rId134">
-              <w:r>
-                <w:rPr>
-                  <w:color w:val="0B4F9E"/>
-                  <w:sz w:val="16"/>
-                  <w:u w:val="single"/>
-                </w:rPr>
-                <w:t>link</w:t>
-              </w:r>
-            </w:hyperlink>
-          </w:p>
-        </w:tc>
-      </w:tr>
-      <w:tr>
-        <w:tc>
-          <w:tcPr>
-            <w:tcW w:type="dxa" w:w="1680"/>
-          </w:tcPr>
-          <w:p>
-            <w:pPr>
-              <w:jc w:val="left"/>
-            </w:pPr>
-            <w:r/>
-            <w:hyperlink r:id="rId135">
-              <w:r>
-                <w:rPr>
-                  <w:color w:val="0B4F9E"/>
-                  <w:sz w:val="16"/>
-                  <w:u w:val="single"/>
-                </w:rPr>
-                <w:t>The Past and Future of AI Scientists</w:t>
-              </w:r>
-            </w:hyperlink>
-          </w:p>
-        </w:tc>
-        <w:tc>
-          <w:tcPr>
-            <w:tcW w:type="dxa" w:w="1680"/>
-          </w:tcPr>
-          <w:p>
-            <w:pPr>
-              <w:jc w:val="left"/>
-            </w:pPr>
-            <w:r/>
-          </w:p>
-        </w:tc>
-        <w:tc>
-          <w:tcPr>
-            <w:tcW w:type="dxa" w:w="1680"/>
-          </w:tcPr>
-          <w:p>
-            <w:pPr>
-              <w:jc w:val="left"/>
-            </w:pPr>
-            <w:r/>
-          </w:p>
-        </w:tc>
-        <w:tc>
-          <w:tcPr>
-            <w:tcW w:type="dxa" w:w="1680"/>
-          </w:tcPr>
-          <w:p>
-            <w:pPr>
-              <w:jc w:val="left"/>
-            </w:pPr>
-            <w:r/>
-            <w:r>
-              <w:rPr>
-                <w:sz w:val="16"/>
-              </w:rPr>
-              <w:t>MLIP</w:t>
-            </w:r>
-          </w:p>
-        </w:tc>
-        <w:tc>
-          <w:tcPr>
-            <w:tcW w:type="dxa" w:w="1680"/>
-          </w:tcPr>
-          <w:p>
-            <w:pPr>
-              <w:jc w:val="left"/>
-            </w:pPr>
-            <w:r/>
-            <w:r>
-              <w:rPr>
-                <w:sz w:val="16"/>
-              </w:rPr>
-              <w:t>2026-08-14</w:t>
-            </w:r>
-          </w:p>
-        </w:tc>
-        <w:tc>
-          <w:tcPr>
-            <w:tcW w:type="dxa" w:w="1680"/>
-          </w:tcPr>
-          <w:p>
-            <w:pPr>
-              <w:jc w:val="left"/>
-            </w:pPr>
-            <w:r/>
-            <w:hyperlink r:id="rId135">
-              <w:r>
-                <w:rPr>
-                  <w:color w:val="0B4F9E"/>
-                  <w:sz w:val="16"/>
-                  <w:u w:val="single"/>
-                </w:rPr>
-                <w:t>link</w:t>
-              </w:r>
-            </w:hyperlink>
-          </w:p>
-        </w:tc>
-      </w:tr>
-      <w:tr>
-        <w:tc>
-          <w:tcPr>
-            <w:tcW w:type="dxa" w:w="1680"/>
-          </w:tcPr>
-          <w:p>
-            <w:pPr>
-              <w:jc w:val="left"/>
-            </w:pPr>
-            <w:r/>
-            <w:hyperlink r:id="rId136">
-              <w:r>
-                <w:rPr>
-                  <w:color w:val="0B4F9E"/>
-                  <w:sz w:val="16"/>
-                  <w:u w:val="single"/>
-                </w:rPr>
-                <w:t>Graph neural network prediction of temperature-dependent hydrogen diffusion and thermal conductivity tensors of tungsten</w:t>
-              </w:r>
-            </w:hyperlink>
-          </w:p>
-        </w:tc>
-        <w:tc>
-          <w:tcPr>
-            <w:tcW w:type="dxa" w:w="1680"/>
-          </w:tcPr>
-          <w:p>
-            <w:pPr>
-              <w:jc w:val="left"/>
-            </w:pPr>
-            <w:r/>
-          </w:p>
-        </w:tc>
-        <w:tc>
-          <w:tcPr>
-            <w:tcW w:type="dxa" w:w="1680"/>
-          </w:tcPr>
-          <w:p>
-            <w:pPr>
-              <w:jc w:val="left"/>
-            </w:pPr>
-            <w:r/>
-          </w:p>
-        </w:tc>
-        <w:tc>
-          <w:tcPr>
-            <w:tcW w:type="dxa" w:w="1680"/>
-          </w:tcPr>
-          <w:p>
-            <w:pPr>
-              <w:jc w:val="left"/>
-            </w:pPr>
-            <w:r/>
-            <w:r>
-              <w:rPr>
-                <w:sz w:val="16"/>
-              </w:rPr>
-              <w:t>MD</w:t>
-            </w:r>
-          </w:p>
-        </w:tc>
-        <w:tc>
-          <w:tcPr>
-            <w:tcW w:type="dxa" w:w="1680"/>
-          </w:tcPr>
-          <w:p>
-            <w:pPr>
-              <w:jc w:val="left"/>
-            </w:pPr>
-            <w:r/>
-            <w:r>
-              <w:rPr>
-                <w:sz w:val="16"/>
-              </w:rPr>
-              <w:t>2026-08-16</w:t>
-            </w:r>
-          </w:p>
-        </w:tc>
-        <w:tc>
-          <w:tcPr>
-            <w:tcW w:type="dxa" w:w="1680"/>
-          </w:tcPr>
-          <w:p>
-            <w:pPr>
-              <w:jc w:val="left"/>
-            </w:pPr>
-            <w:r/>
-            <w:hyperlink r:id="rId136">
-              <w:r>
-                <w:rPr>
-                  <w:color w:val="0B4F9E"/>
-                  <w:sz w:val="16"/>
-                  <w:u w:val="single"/>
-                </w:rPr>
-                <w:t>link</w:t>
-              </w:r>
-            </w:hyperlink>
-          </w:p>
-        </w:tc>
-      </w:tr>
-      <w:tr>
-        <w:tc>
-          <w:tcPr>
-            <w:tcW w:type="dxa" w:w="1680"/>
-          </w:tcPr>
-          <w:p>
-            <w:pPr>
-              <w:jc w:val="left"/>
-            </w:pPr>
-            <w:r/>
-            <w:hyperlink r:id="rId137">
-              <w:r>
-                <w:rPr>
-                  <w:color w:val="0B4F9E"/>
-                  <w:sz w:val="16"/>
-                  <w:u w:val="single"/>
-                </w:rPr>
-                <w:t>Machine Learning-Accelerated Band-Edge Engineering of Pnictogen Chalcohalide Solid Solutions for Solar Energy Technologi</w:t>
-              </w:r>
-            </w:hyperlink>
-          </w:p>
-        </w:tc>
-        <w:tc>
-          <w:tcPr>
-            <w:tcW w:type="dxa" w:w="1680"/>
-          </w:tcPr>
-          <w:p>
-            <w:pPr>
-              <w:jc w:val="left"/>
-            </w:pPr>
-            <w:r/>
-          </w:p>
-        </w:tc>
-        <w:tc>
-          <w:tcPr>
-            <w:tcW w:type="dxa" w:w="1680"/>
-          </w:tcPr>
-          <w:p>
-            <w:pPr>
-              <w:jc w:val="left"/>
-            </w:pPr>
-            <w:r/>
-          </w:p>
-        </w:tc>
-        <w:tc>
-          <w:tcPr>
-            <w:tcW w:type="dxa" w:w="1680"/>
-          </w:tcPr>
-          <w:p>
-            <w:pPr>
-              <w:jc w:val="left"/>
-            </w:pPr>
-            <w:r/>
-            <w:r>
-              <w:rPr>
-                <w:sz w:val="16"/>
-              </w:rPr>
-              <w:t>DFT</w:t>
-            </w:r>
-          </w:p>
-        </w:tc>
-        <w:tc>
-          <w:tcPr>
-            <w:tcW w:type="dxa" w:w="1680"/>
-          </w:tcPr>
-          <w:p>
-            <w:pPr>
-              <w:jc w:val="left"/>
-            </w:pPr>
-            <w:r/>
-            <w:r>
-              <w:rPr>
-                <w:sz w:val="16"/>
-              </w:rPr>
-              <w:t>2026-08-17</w:t>
             </w:r>
           </w:p>
         </w:tc>
@@ -12011,20 +12011,9 @@
                   <w:sz w:val="16"/>
                   <w:u w:val="single"/>
                 </w:rPr>
-                <w:t xml:space="preserve">Extracting a nitrile-centered, ether-assisted motif hierarchy for lithium-battery electrolyte design from billion-scale </w:t>
+                <w:t>The Past and Future of AI Scientists</w:t>
               </w:r>
             </w:hyperlink>
-          </w:p>
-        </w:tc>
-        <w:tc>
-          <w:tcPr>
-            <w:tcW w:type="dxa" w:w="1680"/>
-          </w:tcPr>
-          <w:p>
-            <w:pPr>
-              <w:jc w:val="left"/>
-            </w:pPr>
-            <w:r/>
           </w:p>
         </w:tc>
         <w:tc>
@@ -12062,7 +12051,24 @@
               <w:rPr>
                 <w:sz w:val="16"/>
               </w:rPr>
-              <w:t>2026-08-17</w:t>
+              <w:t>MLIP</w:t>
+            </w:r>
+          </w:p>
+        </w:tc>
+        <w:tc>
+          <w:tcPr>
+            <w:tcW w:type="dxa" w:w="1680"/>
+          </w:tcPr>
+          <w:p>
+            <w:pPr>
+              <w:jc w:val="left"/>
+            </w:pPr>
+            <w:r/>
+            <w:r>
+              <w:rPr>
+                <w:sz w:val="16"/>
+              </w:rPr>
+              <w:t>2026-08-14</w:t>
             </w:r>
           </w:p>
         </w:tc>
@@ -12105,7 +12111,7 @@
                   <w:sz w:val="16"/>
                   <w:u w:val="single"/>
                 </w:rPr>
-                <w:t>Discovery of novel magnetic Y-Mn-B compounds via advanced machine learning guided framework</w:t>
+                <w:t>Graph neural network prediction of temperature-dependent hydrogen diffusion and thermal conductivity tensors of tungsten</w:t>
               </w:r>
             </w:hyperlink>
           </w:p>
@@ -12145,7 +12151,7 @@
               <w:rPr>
                 <w:sz w:val="16"/>
               </w:rPr>
-              <w:t>DFT</w:t>
+              <w:t>MD</w:t>
             </w:r>
           </w:p>
         </w:tc>
@@ -12162,7 +12168,7 @@
               <w:rPr>
                 <w:sz w:val="16"/>
               </w:rPr>
-              <w:t>2026-08-17</w:t>
+              <w:t>2026-08-16</w:t>
             </w:r>
           </w:p>
         </w:tc>
@@ -12205,7 +12211,7 @@
                   <w:sz w:val="16"/>
                   <w:u w:val="single"/>
                 </w:rPr>
-                <w:t>Unlocking Multi-Component Bulk-Materials Molecular Dynamics with a Small-Footprint Machine Learning Interatomic Potentia</w:t>
+                <w:t>Machine Learning-Accelerated Band-Edge Engineering of Pnictogen Chalcohalide Solid Solutions for Solar Energy Technologi</w:t>
               </w:r>
             </w:hyperlink>
           </w:p>
@@ -12245,7 +12251,7 @@
               <w:rPr>
                 <w:sz w:val="16"/>
               </w:rPr>
-              <w:t>MD, MLIP</w:t>
+              <w:t>DFT</w:t>
             </w:r>
           </w:p>
         </w:tc>
@@ -12305,7 +12311,7 @@
                   <w:sz w:val="16"/>
                   <w:u w:val="single"/>
                 </w:rPr>
-                <w:t>ChemReporter: A Framework for Curating and Exporting Large-Scale Chemical Datasets for MLIP Training</w:t>
+                <w:t xml:space="preserve">Extracting a nitrile-centered, ether-assisted motif hierarchy for lithium-battery electrolyte design from billion-scale </w:t>
               </w:r>
             </w:hyperlink>
           </w:p>
@@ -12341,12 +12347,6 @@
               <w:jc w:val="left"/>
             </w:pPr>
             <w:r/>
-            <w:r>
-              <w:rPr>
-                <w:sz w:val="16"/>
-              </w:rPr>
-              <w:t>MLIP</w:t>
-            </w:r>
           </w:p>
         </w:tc>
         <w:tc>
@@ -12405,20 +12405,9 @@
                   <w:sz w:val="16"/>
                   <w:u w:val="single"/>
                 </w:rPr>
-                <w:t>Active learning molecular beam epitaxy of complex quantum materials</w:t>
+                <w:t>Discovery of novel magnetic Y-Mn-B compounds via advanced machine learning guided framework</w:t>
               </w:r>
             </w:hyperlink>
-          </w:p>
-        </w:tc>
-        <w:tc>
-          <w:tcPr>
-            <w:tcW w:type="dxa" w:w="1680"/>
-          </w:tcPr>
-          <w:p>
-            <w:pPr>
-              <w:jc w:val="left"/>
-            </w:pPr>
-            <w:r/>
           </w:p>
         </w:tc>
         <w:tc>
@@ -12456,7 +12445,24 @@
               <w:rPr>
                 <w:sz w:val="16"/>
               </w:rPr>
-              <w:t>2026-08-18</w:t>
+              <w:t>DFT</w:t>
+            </w:r>
+          </w:p>
+        </w:tc>
+        <w:tc>
+          <w:tcPr>
+            <w:tcW w:type="dxa" w:w="1680"/>
+          </w:tcPr>
+          <w:p>
+            <w:pPr>
+              <w:jc w:val="left"/>
+            </w:pPr>
+            <w:r/>
+            <w:r>
+              <w:rPr>
+                <w:sz w:val="16"/>
+              </w:rPr>
+              <w:t>2026-08-17</w:t>
             </w:r>
           </w:p>
         </w:tc>
@@ -12499,7 +12505,7 @@
                   <w:sz w:val="16"/>
                   <w:u w:val="single"/>
                 </w:rPr>
-                <w:t>PyAPX: python toolkit for atomic configuration pattern exploration</w:t>
+                <w:t>Unlocking Multi-Component Bulk-Materials Molecular Dynamics with a Small-Footprint Machine Learning Interatomic Potentia</w:t>
               </w:r>
             </w:hyperlink>
           </w:p>
@@ -12539,7 +12545,7 @@
               <w:rPr>
                 <w:sz w:val="16"/>
               </w:rPr>
-              <w:t>DFT, MLIP</w:t>
+              <w:t>MD, MLIP</w:t>
             </w:r>
           </w:p>
         </w:tc>
@@ -12556,7 +12562,7 @@
               <w:rPr>
                 <w:sz w:val="16"/>
               </w:rPr>
-              <w:t>2026-08-19</w:t>
+              <w:t>2026-08-17</w:t>
             </w:r>
           </w:p>
         </w:tc>
@@ -12576,7 +12582,7 @@
                   <w:sz w:val="16"/>
                   <w:u w:val="single"/>
                 </w:rPr>
-                <w:t>10.1038/s41598-026-66072-5</w:t>
+                <w:t>link</w:t>
               </w:r>
             </w:hyperlink>
           </w:p>
@@ -12599,7 +12605,7 @@
                   <w:sz w:val="16"/>
                   <w:u w:val="single"/>
                 </w:rPr>
-                <w:t>A single design choice determines whether machine learning models of materials make physically impossible predictions</w:t>
+                <w:t>ChemReporter: A Framework for Curating and Exporting Large-Scale Chemical Datasets for MLIP Training</w:t>
               </w:r>
             </w:hyperlink>
           </w:p>
@@ -12639,7 +12645,7 @@
               <w:rPr>
                 <w:sz w:val="16"/>
               </w:rPr>
-              <w:t>DFT</w:t>
+              <w:t>MLIP</w:t>
             </w:r>
           </w:p>
         </w:tc>
@@ -12656,7 +12662,7 @@
               <w:rPr>
                 <w:sz w:val="16"/>
               </w:rPr>
-              <w:t>2026-08-19</w:t>
+              <w:t>2026-08-17</w:t>
             </w:r>
           </w:p>
         </w:tc>
@@ -12699,9 +12705,20 @@
                   <w:sz w:val="16"/>
                   <w:u w:val="single"/>
                 </w:rPr>
-                <w:t>Dynamic Ensembles of Phosphine-Stabilized Gold Nanoclusters</w:t>
+                <w:t>Active learning molecular beam epitaxy of complex quantum materials</w:t>
               </w:r>
             </w:hyperlink>
+          </w:p>
+        </w:tc>
+        <w:tc>
+          <w:tcPr>
+            <w:tcW w:type="dxa" w:w="1680"/>
+          </w:tcPr>
+          <w:p>
+            <w:pPr>
+              <w:jc w:val="left"/>
+            </w:pPr>
+            <w:r/>
           </w:p>
         </w:tc>
         <w:tc>
@@ -12739,24 +12756,7 @@
               <w:rPr>
                 <w:sz w:val="16"/>
               </w:rPr>
-              <w:t>MD, MLIP</w:t>
-            </w:r>
-          </w:p>
-        </w:tc>
-        <w:tc>
-          <w:tcPr>
-            <w:tcW w:type="dxa" w:w="1680"/>
-          </w:tcPr>
-          <w:p>
-            <w:pPr>
-              <w:jc w:val="left"/>
-            </w:pPr>
-            <w:r/>
-            <w:r>
-              <w:rPr>
-                <w:sz w:val="16"/>
-              </w:rPr>
-              <w:t>2026-08-19</w:t>
+              <w:t>2026-08-18</w:t>
             </w:r>
           </w:p>
         </w:tc>
@@ -12799,20 +12799,9 @@
                   <w:sz w:val="16"/>
                   <w:u w:val="single"/>
                 </w:rPr>
-                <w:t>Generative AI and Emerging Technologies: Transforming Engineering, Innovation and Entrepreneurship</w:t>
+                <w:t>PyAPX: python toolkit for atomic configuration pattern exploration</w:t>
               </w:r>
             </w:hyperlink>
-          </w:p>
-        </w:tc>
-        <w:tc>
-          <w:tcPr>
-            <w:tcW w:type="dxa" w:w="1680"/>
-          </w:tcPr>
-          <w:p>
-            <w:pPr>
-              <w:jc w:val="left"/>
-            </w:pPr>
-            <w:r/>
           </w:p>
         </w:tc>
         <w:tc>
@@ -12850,7 +12839,24 @@
               <w:rPr>
                 <w:sz w:val="16"/>
               </w:rPr>
-              <w:t>2026-08-20</w:t>
+              <w:t>DFT, MLIP</w:t>
+            </w:r>
+          </w:p>
+        </w:tc>
+        <w:tc>
+          <w:tcPr>
+            <w:tcW w:type="dxa" w:w="1680"/>
+          </w:tcPr>
+          <w:p>
+            <w:pPr>
+              <w:jc w:val="left"/>
+            </w:pPr>
+            <w:r/>
+            <w:r>
+              <w:rPr>
+                <w:sz w:val="16"/>
+              </w:rPr>
+              <w:t>2026-08-19</w:t>
             </w:r>
           </w:p>
         </w:tc>
@@ -12870,7 +12876,7 @@
                   <w:sz w:val="16"/>
                   <w:u w:val="single"/>
                 </w:rPr>
-                <w:t>10.5281/zenodo.22025110</w:t>
+                <w:t>10.1038/s41598-026-66072-5</w:t>
               </w:r>
             </w:hyperlink>
           </w:p>
@@ -12893,7 +12899,7 @@
                   <w:sz w:val="16"/>
                   <w:u w:val="single"/>
                 </w:rPr>
-                <w:t>Machine Learning to Foundation Models: Artificial Intelligence for Nanophotonic Modeling and Scientific Discovery</w:t>
+                <w:t>A single design choice determines whether machine learning models of materials make physically impossible predictions</w:t>
               </w:r>
             </w:hyperlink>
           </w:p>
@@ -12933,7 +12939,7 @@
               <w:rPr>
                 <w:sz w:val="16"/>
               </w:rPr>
-              <w:t>MLIP</w:t>
+              <w:t>DFT</w:t>
             </w:r>
           </w:p>
         </w:tc>
@@ -12950,7 +12956,7 @@
               <w:rPr>
                 <w:sz w:val="16"/>
               </w:rPr>
-              <w:t>2026-08-21</w:t>
+              <w:t>2026-08-19</w:t>
             </w:r>
           </w:p>
         </w:tc>
@@ -12970,7 +12976,7 @@
                   <w:sz w:val="16"/>
                   <w:u w:val="single"/>
                 </w:rPr>
-                <w:t>10.48550/arxiv.2608.21612</w:t>
+                <w:t>link</w:t>
               </w:r>
             </w:hyperlink>
           </w:p>
@@ -12993,20 +12999,9 @@
                   <w:sz w:val="16"/>
                   <w:u w:val="single"/>
                 </w:rPr>
-                <w:t>Diagnosing and narrowing the simulation-to-real gap in powder X-ray diffraction with a wet-dry agentic loop</w:t>
+                <w:t>Dynamic Ensembles of Phosphine-Stabilized Gold Nanoclusters</w:t>
               </w:r>
             </w:hyperlink>
-          </w:p>
-        </w:tc>
-        <w:tc>
-          <w:tcPr>
-            <w:tcW w:type="dxa" w:w="1680"/>
-          </w:tcPr>
-          <w:p>
-            <w:pPr>
-              <w:jc w:val="left"/>
-            </w:pPr>
-            <w:r/>
           </w:p>
         </w:tc>
         <w:tc>
@@ -13044,7 +13039,24 @@
               <w:rPr>
                 <w:sz w:val="16"/>
               </w:rPr>
-              <w:t>2026-08-23</w:t>
+              <w:t>MD, MLIP</w:t>
+            </w:r>
+          </w:p>
+        </w:tc>
+        <w:tc>
+          <w:tcPr>
+            <w:tcW w:type="dxa" w:w="1680"/>
+          </w:tcPr>
+          <w:p>
+            <w:pPr>
+              <w:jc w:val="left"/>
+            </w:pPr>
+            <w:r/>
+            <w:r>
+              <w:rPr>
+                <w:sz w:val="16"/>
+              </w:rPr>
+              <w:t>2026-08-19</w:t>
             </w:r>
           </w:p>
         </w:tc>
@@ -13087,6 +13099,294 @@
                   <w:sz w:val="16"/>
                   <w:u w:val="single"/>
                 </w:rPr>
+                <w:t>Generative AI and Emerging Technologies: Transforming Engineering, Innovation and Entrepreneurship</w:t>
+              </w:r>
+            </w:hyperlink>
+          </w:p>
+        </w:tc>
+        <w:tc>
+          <w:tcPr>
+            <w:tcW w:type="dxa" w:w="1680"/>
+          </w:tcPr>
+          <w:p>
+            <w:pPr>
+              <w:jc w:val="left"/>
+            </w:pPr>
+            <w:r/>
+          </w:p>
+        </w:tc>
+        <w:tc>
+          <w:tcPr>
+            <w:tcW w:type="dxa" w:w="1680"/>
+          </w:tcPr>
+          <w:p>
+            <w:pPr>
+              <w:jc w:val="left"/>
+            </w:pPr>
+            <w:r/>
+          </w:p>
+        </w:tc>
+        <w:tc>
+          <w:tcPr>
+            <w:tcW w:type="dxa" w:w="1680"/>
+          </w:tcPr>
+          <w:p>
+            <w:pPr>
+              <w:jc w:val="left"/>
+            </w:pPr>
+            <w:r/>
+          </w:p>
+        </w:tc>
+        <w:tc>
+          <w:tcPr>
+            <w:tcW w:type="dxa" w:w="1680"/>
+          </w:tcPr>
+          <w:p>
+            <w:pPr>
+              <w:jc w:val="left"/>
+            </w:pPr>
+            <w:r/>
+            <w:r>
+              <w:rPr>
+                <w:sz w:val="16"/>
+              </w:rPr>
+              <w:t>2026-08-20</w:t>
+            </w:r>
+          </w:p>
+        </w:tc>
+        <w:tc>
+          <w:tcPr>
+            <w:tcW w:type="dxa" w:w="1680"/>
+          </w:tcPr>
+          <w:p>
+            <w:pPr>
+              <w:jc w:val="left"/>
+            </w:pPr>
+            <w:r/>
+            <w:hyperlink r:id="rId149">
+              <w:r>
+                <w:rPr>
+                  <w:color w:val="0B4F9E"/>
+                  <w:sz w:val="16"/>
+                  <w:u w:val="single"/>
+                </w:rPr>
+                <w:t>10.5281/zenodo.22025110</w:t>
+              </w:r>
+            </w:hyperlink>
+          </w:p>
+        </w:tc>
+      </w:tr>
+      <w:tr>
+        <w:tc>
+          <w:tcPr>
+            <w:tcW w:type="dxa" w:w="1680"/>
+          </w:tcPr>
+          <w:p>
+            <w:pPr>
+              <w:jc w:val="left"/>
+            </w:pPr>
+            <w:r/>
+            <w:hyperlink r:id="rId150">
+              <w:r>
+                <w:rPr>
+                  <w:color w:val="0B4F9E"/>
+                  <w:sz w:val="16"/>
+                  <w:u w:val="single"/>
+                </w:rPr>
+                <w:t>Machine Learning to Foundation Models: Artificial Intelligence for Nanophotonic Modeling and Scientific Discovery</w:t>
+              </w:r>
+            </w:hyperlink>
+          </w:p>
+        </w:tc>
+        <w:tc>
+          <w:tcPr>
+            <w:tcW w:type="dxa" w:w="1680"/>
+          </w:tcPr>
+          <w:p>
+            <w:pPr>
+              <w:jc w:val="left"/>
+            </w:pPr>
+            <w:r/>
+          </w:p>
+        </w:tc>
+        <w:tc>
+          <w:tcPr>
+            <w:tcW w:type="dxa" w:w="1680"/>
+          </w:tcPr>
+          <w:p>
+            <w:pPr>
+              <w:jc w:val="left"/>
+            </w:pPr>
+            <w:r/>
+          </w:p>
+        </w:tc>
+        <w:tc>
+          <w:tcPr>
+            <w:tcW w:type="dxa" w:w="1680"/>
+          </w:tcPr>
+          <w:p>
+            <w:pPr>
+              <w:jc w:val="left"/>
+            </w:pPr>
+            <w:r/>
+            <w:r>
+              <w:rPr>
+                <w:sz w:val="16"/>
+              </w:rPr>
+              <w:t>MLIP</w:t>
+            </w:r>
+          </w:p>
+        </w:tc>
+        <w:tc>
+          <w:tcPr>
+            <w:tcW w:type="dxa" w:w="1680"/>
+          </w:tcPr>
+          <w:p>
+            <w:pPr>
+              <w:jc w:val="left"/>
+            </w:pPr>
+            <w:r/>
+            <w:r>
+              <w:rPr>
+                <w:sz w:val="16"/>
+              </w:rPr>
+              <w:t>2026-08-21</w:t>
+            </w:r>
+          </w:p>
+        </w:tc>
+        <w:tc>
+          <w:tcPr>
+            <w:tcW w:type="dxa" w:w="1680"/>
+          </w:tcPr>
+          <w:p>
+            <w:pPr>
+              <w:jc w:val="left"/>
+            </w:pPr>
+            <w:r/>
+            <w:hyperlink r:id="rId150">
+              <w:r>
+                <w:rPr>
+                  <w:color w:val="0B4F9E"/>
+                  <w:sz w:val="16"/>
+                  <w:u w:val="single"/>
+                </w:rPr>
+                <w:t>10.48550/arxiv.2608.21612</w:t>
+              </w:r>
+            </w:hyperlink>
+          </w:p>
+        </w:tc>
+      </w:tr>
+      <w:tr>
+        <w:tc>
+          <w:tcPr>
+            <w:tcW w:type="dxa" w:w="1680"/>
+          </w:tcPr>
+          <w:p>
+            <w:pPr>
+              <w:jc w:val="left"/>
+            </w:pPr>
+            <w:r/>
+            <w:hyperlink r:id="rId151">
+              <w:r>
+                <w:rPr>
+                  <w:color w:val="0B4F9E"/>
+                  <w:sz w:val="16"/>
+                  <w:u w:val="single"/>
+                </w:rPr>
+                <w:t>Diagnosing and narrowing the simulation-to-real gap in powder X-ray diffraction with a wet-dry agentic loop</w:t>
+              </w:r>
+            </w:hyperlink>
+          </w:p>
+        </w:tc>
+        <w:tc>
+          <w:tcPr>
+            <w:tcW w:type="dxa" w:w="1680"/>
+          </w:tcPr>
+          <w:p>
+            <w:pPr>
+              <w:jc w:val="left"/>
+            </w:pPr>
+            <w:r/>
+          </w:p>
+        </w:tc>
+        <w:tc>
+          <w:tcPr>
+            <w:tcW w:type="dxa" w:w="1680"/>
+          </w:tcPr>
+          <w:p>
+            <w:pPr>
+              <w:jc w:val="left"/>
+            </w:pPr>
+            <w:r/>
+          </w:p>
+        </w:tc>
+        <w:tc>
+          <w:tcPr>
+            <w:tcW w:type="dxa" w:w="1680"/>
+          </w:tcPr>
+          <w:p>
+            <w:pPr>
+              <w:jc w:val="left"/>
+            </w:pPr>
+            <w:r/>
+          </w:p>
+        </w:tc>
+        <w:tc>
+          <w:tcPr>
+            <w:tcW w:type="dxa" w:w="1680"/>
+          </w:tcPr>
+          <w:p>
+            <w:pPr>
+              <w:jc w:val="left"/>
+            </w:pPr>
+            <w:r/>
+            <w:r>
+              <w:rPr>
+                <w:sz w:val="16"/>
+              </w:rPr>
+              <w:t>2026-08-23</w:t>
+            </w:r>
+          </w:p>
+        </w:tc>
+        <w:tc>
+          <w:tcPr>
+            <w:tcW w:type="dxa" w:w="1680"/>
+          </w:tcPr>
+          <w:p>
+            <w:pPr>
+              <w:jc w:val="left"/>
+            </w:pPr>
+            <w:r/>
+            <w:hyperlink r:id="rId151">
+              <w:r>
+                <w:rPr>
+                  <w:color w:val="0B4F9E"/>
+                  <w:sz w:val="16"/>
+                  <w:u w:val="single"/>
+                </w:rPr>
+                <w:t>link</w:t>
+              </w:r>
+            </w:hyperlink>
+          </w:p>
+        </w:tc>
+      </w:tr>
+      <w:tr>
+        <w:tc>
+          <w:tcPr>
+            <w:tcW w:type="dxa" w:w="1680"/>
+          </w:tcPr>
+          <w:p>
+            <w:pPr>
+              <w:jc w:val="left"/>
+            </w:pPr>
+            <w:r/>
+            <w:hyperlink r:id="rId152">
+              <w:r>
+                <w:rPr>
+                  <w:color w:val="0B4F9E"/>
+                  <w:sz w:val="16"/>
+                  <w:u w:val="single"/>
+                </w:rPr>
                 <w:t xml:space="preserve">Dataset for the publication- A cylindrical sintering method for more realistic grain boundaries in nanocrystalline thin </w:t>
               </w:r>
             </w:hyperlink>
@@ -13151,7 +13451,7 @@
               <w:jc w:val="left"/>
             </w:pPr>
             <w:r/>
-            <w:hyperlink r:id="rId149">
+            <w:hyperlink r:id="rId152">
               <w:r>
                 <w:rPr>
                   <w:color w:val="0B4F9E"/>
@@ -13174,7 +13474,7 @@
               <w:jc w:val="left"/>
             </w:pPr>
             <w:r/>
-            <w:hyperlink r:id="rId150">
+            <w:hyperlink r:id="rId153">
               <w:r>
                 <w:rPr>
                   <w:color w:val="0B4F9E"/>
@@ -13251,7 +13551,7 @@
               <w:jc w:val="left"/>
             </w:pPr>
             <w:r/>
-            <w:hyperlink r:id="rId150">
+            <w:hyperlink r:id="rId153">
               <w:r>
                 <w:rPr>
                   <w:color w:val="0B4F9E"/>
@@ -13274,7 +13574,7 @@
               <w:jc w:val="left"/>
             </w:pPr>
             <w:r/>
-            <w:hyperlink r:id="rId151">
+            <w:hyperlink r:id="rId154">
               <w:r>
                 <w:rPr>
                   <w:color w:val="0B4F9E"/>
@@ -13351,7 +13651,7 @@
               <w:jc w:val="left"/>
             </w:pPr>
             <w:r/>
-            <w:hyperlink r:id="rId151">
+            <w:hyperlink r:id="rId154">
               <w:r>
                 <w:rPr>
                   <w:color w:val="0B4F9E"/>
@@ -13374,7 +13674,7 @@
               <w:jc w:val="left"/>
             </w:pPr>
             <w:r/>
-            <w:hyperlink r:id="rId152">
+            <w:hyperlink r:id="rId155">
               <w:r>
                 <w:rPr>
                   <w:color w:val="0B4F9E"/>
@@ -13445,7 +13745,7 @@
               <w:jc w:val="left"/>
             </w:pPr>
             <w:r/>
-            <w:hyperlink r:id="rId152">
+            <w:hyperlink r:id="rId155">
               <w:r>
                 <w:rPr>
                   <w:color w:val="0B4F9E"/>
@@ -13468,7 +13768,7 @@
               <w:jc w:val="left"/>
             </w:pPr>
             <w:r/>
-            <w:hyperlink r:id="rId153">
+            <w:hyperlink r:id="rId156">
               <w:r>
                 <w:rPr>
                   <w:color w:val="0B4F9E"/>
@@ -13545,7 +13845,7 @@
               <w:jc w:val="left"/>
             </w:pPr>
             <w:r/>
-            <w:hyperlink r:id="rId153">
+            <w:hyperlink r:id="rId156">
               <w:r>
                 <w:rPr>
                   <w:color w:val="0B4F9E"/>
@@ -13568,7 +13868,7 @@
               <w:jc w:val="left"/>
             </w:pPr>
             <w:r/>
-            <w:hyperlink r:id="rId154">
+            <w:hyperlink r:id="rId157">
               <w:r>
                 <w:rPr>
                   <w:color w:val="0B4F9E"/>
@@ -13639,7 +13939,7 @@
               <w:jc w:val="left"/>
             </w:pPr>
             <w:r/>
-            <w:hyperlink r:id="rId154">
+            <w:hyperlink r:id="rId157">
               <w:r>
                 <w:rPr>
                   <w:color w:val="0B4F9E"/>
@@ -13662,7 +13962,7 @@
               <w:jc w:val="left"/>
             </w:pPr>
             <w:r/>
-            <w:hyperlink r:id="rId155">
+            <w:hyperlink r:id="rId158">
               <w:r>
                 <w:rPr>
                   <w:color w:val="0B4F9E"/>
@@ -13733,7 +14033,7 @@
               <w:jc w:val="left"/>
             </w:pPr>
             <w:r/>
-            <w:hyperlink r:id="rId156">
+            <w:hyperlink r:id="rId159">
               <w:r>
                 <w:rPr>
                   <w:color w:val="0B4F9E"/>
@@ -13756,7 +14056,7 @@
               <w:jc w:val="left"/>
             </w:pPr>
             <w:r/>
-            <w:hyperlink r:id="rId157">
+            <w:hyperlink r:id="rId160">
               <w:r>
                 <w:rPr>
                   <w:color w:val="0B4F9E"/>
@@ -13827,7 +14127,7 @@
               <w:jc w:val="left"/>
             </w:pPr>
             <w:r/>
-            <w:hyperlink r:id="rId157">
+            <w:hyperlink r:id="rId160">
               <w:r>
                 <w:rPr>
                   <w:color w:val="0B4F9E"/>
@@ -13850,7 +14150,7 @@
               <w:jc w:val="left"/>
             </w:pPr>
             <w:r/>
-            <w:hyperlink r:id="rId158">
+            <w:hyperlink r:id="rId161">
               <w:r>
                 <w:rPr>
                   <w:color w:val="0B4F9E"/>
@@ -13927,7 +14227,7 @@
               <w:jc w:val="left"/>
             </w:pPr>
             <w:r/>
-            <w:hyperlink r:id="rId158">
+            <w:hyperlink r:id="rId161">
               <w:r>
                 <w:rPr>
                   <w:color w:val="0B4F9E"/>
@@ -13950,7 +14250,7 @@
               <w:jc w:val="left"/>
             </w:pPr>
             <w:r/>
-            <w:hyperlink r:id="rId159">
+            <w:hyperlink r:id="rId162">
               <w:r>
                 <w:rPr>
                   <w:color w:val="0B4F9E"/>
@@ -14027,7 +14327,7 @@
               <w:jc w:val="left"/>
             </w:pPr>
             <w:r/>
-            <w:hyperlink r:id="rId159">
+            <w:hyperlink r:id="rId162">
               <w:r>
                 <w:rPr>
                   <w:color w:val="0B4F9E"/>
@@ -14050,7 +14350,7 @@
               <w:jc w:val="left"/>
             </w:pPr>
             <w:r/>
-            <w:hyperlink r:id="rId160">
+            <w:hyperlink r:id="rId163">
               <w:r>
                 <w:rPr>
                   <w:color w:val="0B4F9E"/>
@@ -14127,7 +14427,7 @@
               <w:jc w:val="left"/>
             </w:pPr>
             <w:r/>
-            <w:hyperlink r:id="rId160">
+            <w:hyperlink r:id="rId163">
               <w:r>
                 <w:rPr>
                   <w:color w:val="0B4F9E"/>
@@ -14150,7 +14450,7 @@
               <w:jc w:val="left"/>
             </w:pPr>
             <w:r/>
-            <w:hyperlink r:id="rId161">
+            <w:hyperlink r:id="rId164">
               <w:r>
                 <w:rPr>
                   <w:color w:val="0B4F9E"/>
@@ -14227,7 +14527,7 @@
               <w:jc w:val="left"/>
             </w:pPr>
             <w:r/>
-            <w:hyperlink r:id="rId161">
+            <w:hyperlink r:id="rId164">
               <w:r>
                 <w:rPr>
                   <w:color w:val="0B4F9E"/>
@@ -14250,7 +14550,7 @@
               <w:jc w:val="left"/>
             </w:pPr>
             <w:r/>
-            <w:hyperlink r:id="rId162">
+            <w:hyperlink r:id="rId165">
               <w:r>
                 <w:rPr>
                   <w:color w:val="0B4F9E"/>
@@ -14321,7 +14621,7 @@
               <w:jc w:val="left"/>
             </w:pPr>
             <w:r/>
-            <w:hyperlink r:id="rId162">
+            <w:hyperlink r:id="rId165">
               <w:r>
                 <w:rPr>
                   <w:color w:val="0B4F9E"/>
@@ -14344,7 +14644,7 @@
               <w:jc w:val="left"/>
             </w:pPr>
             <w:r/>
-            <w:hyperlink r:id="rId163">
+            <w:hyperlink r:id="rId166">
               <w:r>
                 <w:rPr>
                   <w:color w:val="0B4F9E"/>
@@ -14415,7 +14715,7 @@
               <w:jc w:val="left"/>
             </w:pPr>
             <w:r/>
-            <w:hyperlink r:id="rId163">
+            <w:hyperlink r:id="rId166">
               <w:r>
                 <w:rPr>
                   <w:color w:val="0B4F9E"/>
@@ -14438,7 +14738,7 @@
               <w:jc w:val="left"/>
             </w:pPr>
             <w:r/>
-            <w:hyperlink r:id="rId164">
+            <w:hyperlink r:id="rId167">
               <w:r>
                 <w:rPr>
                   <w:color w:val="0B4F9E"/>
@@ -14509,7 +14809,7 @@
               <w:jc w:val="left"/>
             </w:pPr>
             <w:r/>
-            <w:hyperlink r:id="rId164">
+            <w:hyperlink r:id="rId167">
               <w:r>
                 <w:rPr>
                   <w:color w:val="0B4F9E"/>
@@ -14532,7 +14832,7 @@
               <w:jc w:val="left"/>
             </w:pPr>
             <w:r/>
-            <w:hyperlink r:id="rId165">
+            <w:hyperlink r:id="rId168">
               <w:r>
                 <w:rPr>
                   <w:color w:val="0B4F9E"/>
@@ -14603,7 +14903,7 @@
               <w:jc w:val="left"/>
             </w:pPr>
             <w:r/>
-            <w:hyperlink r:id="rId165">
+            <w:hyperlink r:id="rId168">
               <w:r>
                 <w:rPr>
                   <w:color w:val="0B4F9E"/>
@@ -14626,7 +14926,7 @@
               <w:jc w:val="left"/>
             </w:pPr>
             <w:r/>
-            <w:hyperlink r:id="rId166">
+            <w:hyperlink r:id="rId169">
               <w:r>
                 <w:rPr>
                   <w:color w:val="0B4F9E"/>
@@ -14703,7 +15003,7 @@
               <w:jc w:val="left"/>
             </w:pPr>
             <w:r/>
-            <w:hyperlink r:id="rId166">
+            <w:hyperlink r:id="rId169">
               <w:r>
                 <w:rPr>
                   <w:color w:val="0B4F9E"/>
@@ -14726,7 +15026,7 @@
               <w:jc w:val="left"/>
             </w:pPr>
             <w:r/>
-            <w:hyperlink r:id="rId167">
+            <w:hyperlink r:id="rId170">
               <w:r>
                 <w:rPr>
                   <w:color w:val="0B4F9E"/>
@@ -14797,7 +15097,7 @@
               <w:jc w:val="left"/>
             </w:pPr>
             <w:r/>
-            <w:hyperlink r:id="rId168">
+            <w:hyperlink r:id="rId171">
               <w:r>
                 <w:rPr>
                   <w:color w:val="0B4F9E"/>
@@ -14820,7 +15120,7 @@
               <w:jc w:val="left"/>
             </w:pPr>
             <w:r/>
-            <w:hyperlink r:id="rId169">
+            <w:hyperlink r:id="rId172">
               <w:r>
                 <w:rPr>
                   <w:color w:val="0B4F9E"/>
@@ -14897,7 +15197,7 @@
               <w:jc w:val="left"/>
             </w:pPr>
             <w:r/>
-            <w:hyperlink r:id="rId169">
+            <w:hyperlink r:id="rId172">
               <w:r>
                 <w:rPr>
                   <w:color w:val="0B4F9E"/>
@@ -14920,7 +15220,7 @@
               <w:jc w:val="left"/>
             </w:pPr>
             <w:r/>
-            <w:hyperlink r:id="rId170">
+            <w:hyperlink r:id="rId173">
               <w:r>
                 <w:rPr>
                   <w:color w:val="0B4F9E"/>
@@ -14997,7 +15297,7 @@
               <w:jc w:val="left"/>
             </w:pPr>
             <w:r/>
-            <w:hyperlink r:id="rId170">
+            <w:hyperlink r:id="rId173">
               <w:r>
                 <w:rPr>
                   <w:color w:val="0B4F9E"/>
@@ -15020,7 +15320,7 @@
               <w:jc w:val="left"/>
             </w:pPr>
             <w:r/>
-            <w:hyperlink r:id="rId171">
+            <w:hyperlink r:id="rId174">
               <w:r>
                 <w:rPr>
                   <w:color w:val="0B4F9E"/>
@@ -15091,7 +15391,7 @@
               <w:jc w:val="left"/>
             </w:pPr>
             <w:r/>
-            <w:hyperlink r:id="rId171">
+            <w:hyperlink r:id="rId174">
               <w:r>
                 <w:rPr>
                   <w:color w:val="0B4F9E"/>
@@ -15114,7 +15414,7 @@
               <w:jc w:val="left"/>
             </w:pPr>
             <w:r/>
-            <w:hyperlink r:id="rId172">
+            <w:hyperlink r:id="rId175">
               <w:r>
                 <w:rPr>
                   <w:color w:val="0B4F9E"/>
@@ -15191,7 +15491,7 @@
               <w:jc w:val="left"/>
             </w:pPr>
             <w:r/>
-            <w:hyperlink r:id="rId172">
+            <w:hyperlink r:id="rId175">
               <w:r>
                 <w:rPr>
                   <w:color w:val="0B4F9E"/>
@@ -15214,7 +15514,7 @@
               <w:jc w:val="left"/>
             </w:pPr>
             <w:r/>
-            <w:hyperlink r:id="rId173">
+            <w:hyperlink r:id="rId176">
               <w:r>
                 <w:rPr>
                   <w:color w:val="0B4F9E"/>
@@ -15285,7 +15585,7 @@
               <w:jc w:val="left"/>
             </w:pPr>
             <w:r/>
-            <w:hyperlink r:id="rId173">
+            <w:hyperlink r:id="rId176">
               <w:r>
                 <w:rPr>
                   <w:color w:val="0B4F9E"/>
@@ -15308,7 +15608,7 @@
               <w:jc w:val="left"/>
             </w:pPr>
             <w:r/>
-            <w:hyperlink r:id="rId174">
+            <w:hyperlink r:id="rId177">
               <w:r>
                 <w:rPr>
                   <w:color w:val="0B4F9E"/>
@@ -15379,7 +15679,7 @@
               <w:jc w:val="left"/>
             </w:pPr>
             <w:r/>
-            <w:hyperlink r:id="rId174">
+            <w:hyperlink r:id="rId177">
               <w:r>
                 <w:rPr>
                   <w:color w:val="0B4F9E"/>
@@ -15402,7 +15702,7 @@
               <w:jc w:val="left"/>
             </w:pPr>
             <w:r/>
-            <w:hyperlink r:id="rId175">
+            <w:hyperlink r:id="rId178">
               <w:r>
                 <w:rPr>
                   <w:color w:val="0B4F9E"/>
@@ -15473,7 +15773,7 @@
               <w:jc w:val="left"/>
             </w:pPr>
             <w:r/>
-            <w:hyperlink r:id="rId175">
+            <w:hyperlink r:id="rId178">
               <w:r>
                 <w:rPr>
                   <w:color w:val="0B4F9E"/>
@@ -15496,7 +15796,7 @@
               <w:jc w:val="left"/>
             </w:pPr>
             <w:r/>
-            <w:hyperlink r:id="rId176">
+            <w:hyperlink r:id="rId179">
               <w:r>
                 <w:rPr>
                   <w:color w:val="0B4F9E"/>
@@ -15573,7 +15873,7 @@
               <w:jc w:val="left"/>
             </w:pPr>
             <w:r/>
-            <w:hyperlink r:id="rId176">
+            <w:hyperlink r:id="rId179">
               <w:r>
                 <w:rPr>
                   <w:color w:val="0B4F9E"/>
@@ -15596,7 +15896,7 @@
               <w:jc w:val="left"/>
             </w:pPr>
             <w:r/>
-            <w:hyperlink r:id="rId177">
+            <w:hyperlink r:id="rId180">
               <w:r>
                 <w:rPr>
                   <w:color w:val="0B4F9E"/>
@@ -15673,7 +15973,7 @@
               <w:jc w:val="left"/>
             </w:pPr>
             <w:r/>
-            <w:hyperlink r:id="rId177">
+            <w:hyperlink r:id="rId180">
               <w:r>
                 <w:rPr>
                   <w:color w:val="0B4F9E"/>
@@ -15696,7 +15996,7 @@
               <w:jc w:val="left"/>
             </w:pPr>
             <w:r/>
-            <w:hyperlink r:id="rId178">
+            <w:hyperlink r:id="rId181">
               <w:r>
                 <w:rPr>
                   <w:color w:val="0B4F9E"/>
@@ -15773,7 +16073,7 @@
               <w:jc w:val="left"/>
             </w:pPr>
             <w:r/>
-            <w:hyperlink r:id="rId178">
+            <w:hyperlink r:id="rId181">
               <w:r>
                 <w:rPr>
                   <w:color w:val="0B4F9E"/>
@@ -15796,7 +16096,7 @@
               <w:jc w:val="left"/>
             </w:pPr>
             <w:r/>
-            <w:hyperlink r:id="rId179">
+            <w:hyperlink r:id="rId182">
               <w:r>
                 <w:rPr>
                   <w:color w:val="0B4F9E"/>
@@ -15873,7 +16173,7 @@
               <w:jc w:val="left"/>
             </w:pPr>
             <w:r/>
-            <w:hyperlink r:id="rId179">
+            <w:hyperlink r:id="rId182">
               <w:r>
                 <w:rPr>
                   <w:color w:val="0B4F9E"/>
@@ -15896,7 +16196,7 @@
               <w:jc w:val="left"/>
             </w:pPr>
             <w:r/>
-            <w:hyperlink r:id="rId180">
+            <w:hyperlink r:id="rId183">
               <w:r>
                 <w:rPr>
                   <w:color w:val="0B4F9E"/>
@@ -15973,7 +16273,7 @@
               <w:jc w:val="left"/>
             </w:pPr>
             <w:r/>
-            <w:hyperlink r:id="rId180">
+            <w:hyperlink r:id="rId183">
               <w:r>
                 <w:rPr>
                   <w:color w:val="0B4F9E"/>
@@ -15996,7 +16296,7 @@
               <w:jc w:val="left"/>
             </w:pPr>
             <w:r/>
-            <w:hyperlink r:id="rId181">
+            <w:hyperlink r:id="rId184">
               <w:r>
                 <w:rPr>
                   <w:color w:val="0B4F9E"/>
@@ -16067,7 +16367,7 @@
               <w:jc w:val="left"/>
             </w:pPr>
             <w:r/>
-            <w:hyperlink r:id="rId181">
+            <w:hyperlink r:id="rId184">
               <w:r>
                 <w:rPr>
                   <w:color w:val="0B4F9E"/>
@@ -16090,7 +16390,7 @@
               <w:jc w:val="left"/>
             </w:pPr>
             <w:r/>
-            <w:hyperlink r:id="rId182">
+            <w:hyperlink r:id="rId185">
               <w:r>
                 <w:rPr>
                   <w:color w:val="0B4F9E"/>
@@ -16161,7 +16461,7 @@
               <w:jc w:val="left"/>
             </w:pPr>
             <w:r/>
-            <w:hyperlink r:id="rId182">
+            <w:hyperlink r:id="rId185">
               <w:r>
                 <w:rPr>
                   <w:color w:val="0B4F9E"/>
@@ -16184,7 +16484,7 @@
               <w:jc w:val="left"/>
             </w:pPr>
             <w:r/>
-            <w:hyperlink r:id="rId183">
+            <w:hyperlink r:id="rId186">
               <w:r>
                 <w:rPr>
                   <w:color w:val="0B4F9E"/>
@@ -16261,7 +16561,7 @@
               <w:jc w:val="left"/>
             </w:pPr>
             <w:r/>
-            <w:hyperlink r:id="rId183">
+            <w:hyperlink r:id="rId186">
               <w:r>
                 <w:rPr>
                   <w:color w:val="0B4F9E"/>
@@ -16284,7 +16584,7 @@
               <w:jc w:val="left"/>
             </w:pPr>
             <w:r/>
-            <w:hyperlink r:id="rId184">
+            <w:hyperlink r:id="rId187">
               <w:r>
                 <w:rPr>
                   <w:color w:val="0B4F9E"/>
@@ -16355,7 +16655,7 @@
               <w:jc w:val="left"/>
             </w:pPr>
             <w:r/>
-            <w:hyperlink r:id="rId184">
+            <w:hyperlink r:id="rId187">
               <w:r>
                 <w:rPr>
                   <w:color w:val="0B4F9E"/>
@@ -16378,7 +16678,7 @@
               <w:jc w:val="left"/>
             </w:pPr>
             <w:r/>
-            <w:hyperlink r:id="rId185">
+            <w:hyperlink r:id="rId188">
               <w:r>
                 <w:rPr>
                   <w:color w:val="0B4F9E"/>
@@ -16455,7 +16755,7 @@
               <w:jc w:val="left"/>
             </w:pPr>
             <w:r/>
-            <w:hyperlink r:id="rId185">
+            <w:hyperlink r:id="rId188">
               <w:r>
                 <w:rPr>
                   <w:color w:val="0B4F9E"/>
@@ -16478,7 +16778,7 @@
               <w:jc w:val="left"/>
             </w:pPr>
             <w:r/>
-            <w:hyperlink r:id="rId186">
+            <w:hyperlink r:id="rId189">
               <w:r>
                 <w:rPr>
                   <w:color w:val="0B4F9E"/>
@@ -16555,7 +16855,7 @@
               <w:jc w:val="left"/>
             </w:pPr>
             <w:r/>
-            <w:hyperlink r:id="rId186">
+            <w:hyperlink r:id="rId189">
               <w:r>
                 <w:rPr>
                   <w:color w:val="0B4F9E"/>
@@ -16578,7 +16878,7 @@
               <w:jc w:val="left"/>
             </w:pPr>
             <w:r/>
-            <w:hyperlink r:id="rId187">
+            <w:hyperlink r:id="rId190">
               <w:r>
                 <w:rPr>
                   <w:color w:val="0B4F9E"/>
@@ -16655,7 +16955,7 @@
               <w:jc w:val="left"/>
             </w:pPr>
             <w:r/>
-            <w:hyperlink r:id="rId187">
+            <w:hyperlink r:id="rId190">
               <w:r>
                 <w:rPr>
                   <w:color w:val="0B4F9E"/>
@@ -16678,7 +16978,7 @@
               <w:jc w:val="left"/>
             </w:pPr>
             <w:r/>
-            <w:hyperlink r:id="rId188">
+            <w:hyperlink r:id="rId191">
               <w:r>
                 <w:rPr>
                   <w:color w:val="0B4F9E"/>
@@ -16749,7 +17049,7 @@
               <w:jc w:val="left"/>
             </w:pPr>
             <w:r/>
-            <w:hyperlink r:id="rId188">
+            <w:hyperlink r:id="rId191">
               <w:r>
                 <w:rPr>
                   <w:color w:val="0B4F9E"/>
@@ -16772,7 +17072,7 @@
               <w:jc w:val="left"/>
             </w:pPr>
             <w:r/>
-            <w:hyperlink r:id="rId189">
+            <w:hyperlink r:id="rId192">
               <w:r>
                 <w:rPr>
                   <w:color w:val="0B4F9E"/>
@@ -16849,7 +17149,7 @@
               <w:jc w:val="left"/>
             </w:pPr>
             <w:r/>
-            <w:hyperlink r:id="rId189">
+            <w:hyperlink r:id="rId192">
               <w:r>
                 <w:rPr>
                   <w:color w:val="0B4F9E"/>
@@ -16872,7 +17172,7 @@
               <w:jc w:val="left"/>
             </w:pPr>
             <w:r/>
-            <w:hyperlink r:id="rId190">
+            <w:hyperlink r:id="rId193">
               <w:r>
                 <w:rPr>
                   <w:color w:val="0B4F9E"/>
@@ -16943,7 +17243,7 @@
               <w:jc w:val="left"/>
             </w:pPr>
             <w:r/>
-            <w:hyperlink r:id="rId190">
+            <w:hyperlink r:id="rId193">
               <w:r>
                 <w:rPr>
                   <w:color w:val="0B4F9E"/>
@@ -16966,7 +17266,7 @@
               <w:jc w:val="left"/>
             </w:pPr>
             <w:r/>
-            <w:hyperlink r:id="rId191">
+            <w:hyperlink r:id="rId194">
               <w:r>
                 <w:rPr>
                   <w:color w:val="0B4F9E"/>
@@ -17037,7 +17337,7 @@
               <w:jc w:val="left"/>
             </w:pPr>
             <w:r/>
-            <w:hyperlink r:id="rId191">
+            <w:hyperlink r:id="rId194">
               <w:r>
                 <w:rPr>
                   <w:color w:val="0B4F9E"/>
@@ -17060,7 +17360,7 @@
               <w:jc w:val="left"/>
             </w:pPr>
             <w:r/>
-            <w:hyperlink r:id="rId192">
+            <w:hyperlink r:id="rId195">
               <w:r>
                 <w:rPr>
                   <w:color w:val="0B4F9E"/>
@@ -17131,7 +17431,7 @@
               <w:jc w:val="left"/>
             </w:pPr>
             <w:r/>
-            <w:hyperlink r:id="rId192">
+            <w:hyperlink r:id="rId195">
               <w:r>
                 <w:rPr>
                   <w:color w:val="0B4F9E"/>
@@ -17154,7 +17454,7 @@
               <w:jc w:val="left"/>
             </w:pPr>
             <w:r/>
-            <w:hyperlink r:id="rId193">
+            <w:hyperlink r:id="rId196">
               <w:r>
                 <w:rPr>
                   <w:color w:val="0B4F9E"/>
@@ -17203,288 +17503,6 @@
               </w:rPr>
               <w:t>DFT, MD</w:t>
             </w:r>
-          </w:p>
-        </w:tc>
-        <w:tc>
-          <w:tcPr>
-            <w:tcW w:type="dxa" w:w="1680"/>
-          </w:tcPr>
-          <w:p>
-            <w:pPr>
-              <w:jc w:val="left"/>
-            </w:pPr>
-            <w:r/>
-            <w:r>
-              <w:rPr>
-                <w:sz w:val="16"/>
-              </w:rPr>
-              <w:t>2026-09-01</w:t>
-            </w:r>
-          </w:p>
-        </w:tc>
-        <w:tc>
-          <w:tcPr>
-            <w:tcW w:type="dxa" w:w="1680"/>
-          </w:tcPr>
-          <w:p>
-            <w:pPr>
-              <w:jc w:val="left"/>
-            </w:pPr>
-            <w:r/>
-            <w:hyperlink r:id="rId193">
-              <w:r>
-                <w:rPr>
-                  <w:color w:val="0B4F9E"/>
-                  <w:sz w:val="16"/>
-                  <w:u w:val="single"/>
-                </w:rPr>
-                <w:t>link</w:t>
-              </w:r>
-            </w:hyperlink>
-          </w:p>
-        </w:tc>
-      </w:tr>
-      <w:tr>
-        <w:tc>
-          <w:tcPr>
-            <w:tcW w:type="dxa" w:w="1680"/>
-          </w:tcPr>
-          <w:p>
-            <w:pPr>
-              <w:jc w:val="left"/>
-            </w:pPr>
-            <w:r/>
-            <w:hyperlink r:id="rId194">
-              <w:r>
-                <w:rPr>
-                  <w:color w:val="0B4F9E"/>
-                  <w:sz w:val="16"/>
-                  <w:u w:val="single"/>
-                </w:rPr>
-                <w:t>Why Multi-Layer Message Passing Works: Completeness Theory for Graph Neural Network Interatomic Potentials</w:t>
-              </w:r>
-            </w:hyperlink>
-          </w:p>
-        </w:tc>
-        <w:tc>
-          <w:tcPr>
-            <w:tcW w:type="dxa" w:w="1680"/>
-          </w:tcPr>
-          <w:p>
-            <w:pPr>
-              <w:jc w:val="left"/>
-            </w:pPr>
-            <w:r/>
-          </w:p>
-        </w:tc>
-        <w:tc>
-          <w:tcPr>
-            <w:tcW w:type="dxa" w:w="1680"/>
-          </w:tcPr>
-          <w:p>
-            <w:pPr>
-              <w:jc w:val="left"/>
-            </w:pPr>
-            <w:r/>
-          </w:p>
-        </w:tc>
-        <w:tc>
-          <w:tcPr>
-            <w:tcW w:type="dxa" w:w="1680"/>
-          </w:tcPr>
-          <w:p>
-            <w:pPr>
-              <w:jc w:val="left"/>
-            </w:pPr>
-            <w:r/>
-          </w:p>
-        </w:tc>
-        <w:tc>
-          <w:tcPr>
-            <w:tcW w:type="dxa" w:w="1680"/>
-          </w:tcPr>
-          <w:p>
-            <w:pPr>
-              <w:jc w:val="left"/>
-            </w:pPr>
-            <w:r/>
-            <w:r>
-              <w:rPr>
-                <w:sz w:val="16"/>
-              </w:rPr>
-              <w:t>2026-09-01</w:t>
-            </w:r>
-          </w:p>
-        </w:tc>
-        <w:tc>
-          <w:tcPr>
-            <w:tcW w:type="dxa" w:w="1680"/>
-          </w:tcPr>
-          <w:p>
-            <w:pPr>
-              <w:jc w:val="left"/>
-            </w:pPr>
-            <w:r/>
-            <w:hyperlink r:id="rId194">
-              <w:r>
-                <w:rPr>
-                  <w:color w:val="0B4F9E"/>
-                  <w:sz w:val="16"/>
-                  <w:u w:val="single"/>
-                </w:rPr>
-                <w:t>link</w:t>
-              </w:r>
-            </w:hyperlink>
-          </w:p>
-        </w:tc>
-      </w:tr>
-      <w:tr>
-        <w:tc>
-          <w:tcPr>
-            <w:tcW w:type="dxa" w:w="1680"/>
-          </w:tcPr>
-          <w:p>
-            <w:pPr>
-              <w:jc w:val="left"/>
-            </w:pPr>
-            <w:r/>
-            <w:hyperlink r:id="rId195">
-              <w:r>
-                <w:rPr>
-                  <w:color w:val="0B4F9E"/>
-                  <w:sz w:val="16"/>
-                  <w:u w:val="single"/>
-                </w:rPr>
-                <w:t>Element priors and target support shape chemical transfer in materials graph networks</w:t>
-              </w:r>
-            </w:hyperlink>
-          </w:p>
-        </w:tc>
-        <w:tc>
-          <w:tcPr>
-            <w:tcW w:type="dxa" w:w="1680"/>
-          </w:tcPr>
-          <w:p>
-            <w:pPr>
-              <w:jc w:val="left"/>
-            </w:pPr>
-            <w:r/>
-          </w:p>
-        </w:tc>
-        <w:tc>
-          <w:tcPr>
-            <w:tcW w:type="dxa" w:w="1680"/>
-          </w:tcPr>
-          <w:p>
-            <w:pPr>
-              <w:jc w:val="left"/>
-            </w:pPr>
-            <w:r/>
-          </w:p>
-        </w:tc>
-        <w:tc>
-          <w:tcPr>
-            <w:tcW w:type="dxa" w:w="1680"/>
-          </w:tcPr>
-          <w:p>
-            <w:pPr>
-              <w:jc w:val="left"/>
-            </w:pPr>
-            <w:r/>
-          </w:p>
-        </w:tc>
-        <w:tc>
-          <w:tcPr>
-            <w:tcW w:type="dxa" w:w="1680"/>
-          </w:tcPr>
-          <w:p>
-            <w:pPr>
-              <w:jc w:val="left"/>
-            </w:pPr>
-            <w:r/>
-            <w:r>
-              <w:rPr>
-                <w:sz w:val="16"/>
-              </w:rPr>
-              <w:t>2026-09-01</w:t>
-            </w:r>
-          </w:p>
-        </w:tc>
-        <w:tc>
-          <w:tcPr>
-            <w:tcW w:type="dxa" w:w="1680"/>
-          </w:tcPr>
-          <w:p>
-            <w:pPr>
-              <w:jc w:val="left"/>
-            </w:pPr>
-            <w:r/>
-            <w:hyperlink r:id="rId195">
-              <w:r>
-                <w:rPr>
-                  <w:color w:val="0B4F9E"/>
-                  <w:sz w:val="16"/>
-                  <w:u w:val="single"/>
-                </w:rPr>
-                <w:t>link</w:t>
-              </w:r>
-            </w:hyperlink>
-          </w:p>
-        </w:tc>
-      </w:tr>
-      <w:tr>
-        <w:tc>
-          <w:tcPr>
-            <w:tcW w:type="dxa" w:w="1680"/>
-          </w:tcPr>
-          <w:p>
-            <w:pPr>
-              <w:jc w:val="left"/>
-            </w:pPr>
-            <w:r/>
-            <w:hyperlink r:id="rId196">
-              <w:r>
-                <w:rPr>
-                  <w:color w:val="0B4F9E"/>
-                  <w:sz w:val="16"/>
-                  <w:u w:val="single"/>
-                </w:rPr>
-                <w:t>Text-guided flow matching enables sample-efficient crystal structure generation</w:t>
-              </w:r>
-            </w:hyperlink>
-          </w:p>
-        </w:tc>
-        <w:tc>
-          <w:tcPr>
-            <w:tcW w:type="dxa" w:w="1680"/>
-          </w:tcPr>
-          <w:p>
-            <w:pPr>
-              <w:jc w:val="left"/>
-            </w:pPr>
-            <w:r/>
-          </w:p>
-        </w:tc>
-        <w:tc>
-          <w:tcPr>
-            <w:tcW w:type="dxa" w:w="1680"/>
-          </w:tcPr>
-          <w:p>
-            <w:pPr>
-              <w:jc w:val="left"/>
-            </w:pPr>
-            <w:r/>
-          </w:p>
-        </w:tc>
-        <w:tc>
-          <w:tcPr>
-            <w:tcW w:type="dxa" w:w="1680"/>
-          </w:tcPr>
-          <w:p>
-            <w:pPr>
-              <w:jc w:val="left"/>
-            </w:pPr>
-            <w:r/>
           </w:p>
         </w:tc>
         <w:tc>
@@ -17543,7 +17561,7 @@
                   <w:sz w:val="16"/>
                   <w:u w:val="single"/>
                 </w:rPr>
-                <w:t>Machine Learning Local Potentials for Accelerated Electron-Phonon Interactions Calculations within the Projector Augment</w:t>
+                <w:t>Why Multi-Layer Message Passing Works: Completeness Theory for Graph Neural Network Interatomic Potentials</w:t>
               </w:r>
             </w:hyperlink>
           </w:p>
@@ -17579,12 +17597,6 @@
               <w:jc w:val="left"/>
             </w:pPr>
             <w:r/>
-            <w:r>
-              <w:rPr>
-                <w:sz w:val="16"/>
-              </w:rPr>
-              <w:t>phonons</w:t>
-            </w:r>
           </w:p>
         </w:tc>
         <w:tc>
@@ -17643,6 +17655,294 @@
                   <w:sz w:val="16"/>
                   <w:u w:val="single"/>
                 </w:rPr>
+                <w:t>Element priors and target support shape chemical transfer in materials graph networks</w:t>
+              </w:r>
+            </w:hyperlink>
+          </w:p>
+        </w:tc>
+        <w:tc>
+          <w:tcPr>
+            <w:tcW w:type="dxa" w:w="1680"/>
+          </w:tcPr>
+          <w:p>
+            <w:pPr>
+              <w:jc w:val="left"/>
+            </w:pPr>
+            <w:r/>
+          </w:p>
+        </w:tc>
+        <w:tc>
+          <w:tcPr>
+            <w:tcW w:type="dxa" w:w="1680"/>
+          </w:tcPr>
+          <w:p>
+            <w:pPr>
+              <w:jc w:val="left"/>
+            </w:pPr>
+            <w:r/>
+          </w:p>
+        </w:tc>
+        <w:tc>
+          <w:tcPr>
+            <w:tcW w:type="dxa" w:w="1680"/>
+          </w:tcPr>
+          <w:p>
+            <w:pPr>
+              <w:jc w:val="left"/>
+            </w:pPr>
+            <w:r/>
+          </w:p>
+        </w:tc>
+        <w:tc>
+          <w:tcPr>
+            <w:tcW w:type="dxa" w:w="1680"/>
+          </w:tcPr>
+          <w:p>
+            <w:pPr>
+              <w:jc w:val="left"/>
+            </w:pPr>
+            <w:r/>
+            <w:r>
+              <w:rPr>
+                <w:sz w:val="16"/>
+              </w:rPr>
+              <w:t>2026-09-01</w:t>
+            </w:r>
+          </w:p>
+        </w:tc>
+        <w:tc>
+          <w:tcPr>
+            <w:tcW w:type="dxa" w:w="1680"/>
+          </w:tcPr>
+          <w:p>
+            <w:pPr>
+              <w:jc w:val="left"/>
+            </w:pPr>
+            <w:r/>
+            <w:hyperlink r:id="rId198">
+              <w:r>
+                <w:rPr>
+                  <w:color w:val="0B4F9E"/>
+                  <w:sz w:val="16"/>
+                  <w:u w:val="single"/>
+                </w:rPr>
+                <w:t>link</w:t>
+              </w:r>
+            </w:hyperlink>
+          </w:p>
+        </w:tc>
+      </w:tr>
+      <w:tr>
+        <w:tc>
+          <w:tcPr>
+            <w:tcW w:type="dxa" w:w="1680"/>
+          </w:tcPr>
+          <w:p>
+            <w:pPr>
+              <w:jc w:val="left"/>
+            </w:pPr>
+            <w:r/>
+            <w:hyperlink r:id="rId199">
+              <w:r>
+                <w:rPr>
+                  <w:color w:val="0B4F9E"/>
+                  <w:sz w:val="16"/>
+                  <w:u w:val="single"/>
+                </w:rPr>
+                <w:t>Text-guided flow matching enables sample-efficient crystal structure generation</w:t>
+              </w:r>
+            </w:hyperlink>
+          </w:p>
+        </w:tc>
+        <w:tc>
+          <w:tcPr>
+            <w:tcW w:type="dxa" w:w="1680"/>
+          </w:tcPr>
+          <w:p>
+            <w:pPr>
+              <w:jc w:val="left"/>
+            </w:pPr>
+            <w:r/>
+          </w:p>
+        </w:tc>
+        <w:tc>
+          <w:tcPr>
+            <w:tcW w:type="dxa" w:w="1680"/>
+          </w:tcPr>
+          <w:p>
+            <w:pPr>
+              <w:jc w:val="left"/>
+            </w:pPr>
+            <w:r/>
+          </w:p>
+        </w:tc>
+        <w:tc>
+          <w:tcPr>
+            <w:tcW w:type="dxa" w:w="1680"/>
+          </w:tcPr>
+          <w:p>
+            <w:pPr>
+              <w:jc w:val="left"/>
+            </w:pPr>
+            <w:r/>
+          </w:p>
+        </w:tc>
+        <w:tc>
+          <w:tcPr>
+            <w:tcW w:type="dxa" w:w="1680"/>
+          </w:tcPr>
+          <w:p>
+            <w:pPr>
+              <w:jc w:val="left"/>
+            </w:pPr>
+            <w:r/>
+            <w:r>
+              <w:rPr>
+                <w:sz w:val="16"/>
+              </w:rPr>
+              <w:t>2026-09-01</w:t>
+            </w:r>
+          </w:p>
+        </w:tc>
+        <w:tc>
+          <w:tcPr>
+            <w:tcW w:type="dxa" w:w="1680"/>
+          </w:tcPr>
+          <w:p>
+            <w:pPr>
+              <w:jc w:val="left"/>
+            </w:pPr>
+            <w:r/>
+            <w:hyperlink r:id="rId199">
+              <w:r>
+                <w:rPr>
+                  <w:color w:val="0B4F9E"/>
+                  <w:sz w:val="16"/>
+                  <w:u w:val="single"/>
+                </w:rPr>
+                <w:t>link</w:t>
+              </w:r>
+            </w:hyperlink>
+          </w:p>
+        </w:tc>
+      </w:tr>
+      <w:tr>
+        <w:tc>
+          <w:tcPr>
+            <w:tcW w:type="dxa" w:w="1680"/>
+          </w:tcPr>
+          <w:p>
+            <w:pPr>
+              <w:jc w:val="left"/>
+            </w:pPr>
+            <w:r/>
+            <w:hyperlink r:id="rId200">
+              <w:r>
+                <w:rPr>
+                  <w:color w:val="0B4F9E"/>
+                  <w:sz w:val="16"/>
+                  <w:u w:val="single"/>
+                </w:rPr>
+                <w:t>Machine Learning Local Potentials for Accelerated Electron-Phonon Interactions Calculations within the Projector Augment</w:t>
+              </w:r>
+            </w:hyperlink>
+          </w:p>
+        </w:tc>
+        <w:tc>
+          <w:tcPr>
+            <w:tcW w:type="dxa" w:w="1680"/>
+          </w:tcPr>
+          <w:p>
+            <w:pPr>
+              <w:jc w:val="left"/>
+            </w:pPr>
+            <w:r/>
+          </w:p>
+        </w:tc>
+        <w:tc>
+          <w:tcPr>
+            <w:tcW w:type="dxa" w:w="1680"/>
+          </w:tcPr>
+          <w:p>
+            <w:pPr>
+              <w:jc w:val="left"/>
+            </w:pPr>
+            <w:r/>
+          </w:p>
+        </w:tc>
+        <w:tc>
+          <w:tcPr>
+            <w:tcW w:type="dxa" w:w="1680"/>
+          </w:tcPr>
+          <w:p>
+            <w:pPr>
+              <w:jc w:val="left"/>
+            </w:pPr>
+            <w:r/>
+            <w:r>
+              <w:rPr>
+                <w:sz w:val="16"/>
+              </w:rPr>
+              <w:t>phonons</w:t>
+            </w:r>
+          </w:p>
+        </w:tc>
+        <w:tc>
+          <w:tcPr>
+            <w:tcW w:type="dxa" w:w="1680"/>
+          </w:tcPr>
+          <w:p>
+            <w:pPr>
+              <w:jc w:val="left"/>
+            </w:pPr>
+            <w:r/>
+            <w:r>
+              <w:rPr>
+                <w:sz w:val="16"/>
+              </w:rPr>
+              <w:t>2026-09-01</w:t>
+            </w:r>
+          </w:p>
+        </w:tc>
+        <w:tc>
+          <w:tcPr>
+            <w:tcW w:type="dxa" w:w="1680"/>
+          </w:tcPr>
+          <w:p>
+            <w:pPr>
+              <w:jc w:val="left"/>
+            </w:pPr>
+            <w:r/>
+            <w:hyperlink r:id="rId200">
+              <w:r>
+                <w:rPr>
+                  <w:color w:val="0B4F9E"/>
+                  <w:sz w:val="16"/>
+                  <w:u w:val="single"/>
+                </w:rPr>
+                <w:t>link</w:t>
+              </w:r>
+            </w:hyperlink>
+          </w:p>
+        </w:tc>
+      </w:tr>
+      <w:tr>
+        <w:tc>
+          <w:tcPr>
+            <w:tcW w:type="dxa" w:w="1680"/>
+          </w:tcPr>
+          <w:p>
+            <w:pPr>
+              <w:jc w:val="left"/>
+            </w:pPr>
+            <w:r/>
+            <w:hyperlink r:id="rId201">
+              <w:r>
+                <w:rPr>
+                  <w:color w:val="0B4F9E"/>
+                  <w:sz w:val="16"/>
+                  <w:u w:val="single"/>
+                </w:rPr>
                 <w:t>A Machine Learning–Based Surrogate Model for the Assessment of Geological Fault Reactivation</w:t>
               </w:r>
             </w:hyperlink>
@@ -17707,7 +18007,7 @@
               <w:jc w:val="left"/>
             </w:pPr>
             <w:r/>
-            <w:hyperlink r:id="rId198">
+            <w:hyperlink r:id="rId201">
               <w:r>
                 <w:rPr>
                   <w:color w:val="0B4F9E"/>
@@ -17730,7 +18030,7 @@
               <w:jc w:val="left"/>
             </w:pPr>
             <w:r/>
-            <w:hyperlink r:id="rId199">
+            <w:hyperlink r:id="rId202">
               <w:r>
                 <w:rPr>
                   <w:color w:val="0B4F9E"/>
@@ -17801,7 +18101,7 @@
               <w:jc w:val="left"/>
             </w:pPr>
             <w:r/>
-            <w:hyperlink r:id="rId199">
+            <w:hyperlink r:id="rId202">
               <w:r>
                 <w:rPr>
                   <w:color w:val="0B4F9E"/>
@@ -17824,7 +18124,7 @@
               <w:jc w:val="left"/>
             </w:pPr>
             <w:r/>
-            <w:hyperlink r:id="rId200">
+            <w:hyperlink r:id="rId203">
               <w:r>
                 <w:rPr>
                   <w:color w:val="0B4F9E"/>
@@ -17895,7 +18195,7 @@
               <w:jc w:val="left"/>
             </w:pPr>
             <w:r/>
-            <w:hyperlink r:id="rId200">
+            <w:hyperlink r:id="rId203">
               <w:r>
                 <w:rPr>
                   <w:color w:val="0B4F9E"/>
@@ -17918,7 +18218,7 @@
               <w:jc w:val="left"/>
             </w:pPr>
             <w:r/>
-            <w:hyperlink r:id="rId201">
+            <w:hyperlink r:id="rId204">
               <w:r>
                 <w:rPr>
                   <w:color w:val="0B4F9E"/>
@@ -17989,7 +18289,7 @@
               <w:jc w:val="left"/>
             </w:pPr>
             <w:r/>
-            <w:hyperlink r:id="rId201">
+            <w:hyperlink r:id="rId204">
               <w:r>
                 <w:rPr>
                   <w:color w:val="0B4F9E"/>
@@ -18012,7 +18312,7 @@
               <w:jc w:val="left"/>
             </w:pPr>
             <w:r/>
-            <w:hyperlink r:id="rId202">
+            <w:hyperlink r:id="rId205">
               <w:r>
                 <w:rPr>
                   <w:color w:val="0B4F9E"/>
@@ -18083,7 +18383,7 @@
               <w:jc w:val="left"/>
             </w:pPr>
             <w:r/>
-            <w:hyperlink r:id="rId202">
+            <w:hyperlink r:id="rId205">
               <w:r>
                 <w:rPr>
                   <w:color w:val="0B4F9E"/>
@@ -18106,7 +18406,7 @@
               <w:jc w:val="left"/>
             </w:pPr>
             <w:r/>
-            <w:hyperlink r:id="rId203">
+            <w:hyperlink r:id="rId206">
               <w:r>
                 <w:rPr>
                   <w:color w:val="0B4F9E"/>
@@ -18177,7 +18477,7 @@
               <w:jc w:val="left"/>
             </w:pPr>
             <w:r/>
-            <w:hyperlink r:id="rId203">
+            <w:hyperlink r:id="rId206">
               <w:r>
                 <w:rPr>
                   <w:color w:val="0B4F9E"/>
@@ -18200,7 +18500,7 @@
               <w:jc w:val="left"/>
             </w:pPr>
             <w:r/>
-            <w:hyperlink r:id="rId204">
+            <w:hyperlink r:id="rId207">
               <w:r>
                 <w:rPr>
                   <w:color w:val="0B4F9E"/>
@@ -18271,7 +18571,7 @@
               <w:jc w:val="left"/>
             </w:pPr>
             <w:r/>
-            <w:hyperlink r:id="rId204">
+            <w:hyperlink r:id="rId207">
               <w:r>
                 <w:rPr>
                   <w:color w:val="0B4F9E"/>
@@ -18294,7 +18594,7 @@
               <w:jc w:val="left"/>
             </w:pPr>
             <w:r/>
-            <w:hyperlink r:id="rId205">
+            <w:hyperlink r:id="rId208">
               <w:r>
                 <w:rPr>
                   <w:color w:val="0B4F9E"/>
@@ -18365,7 +18665,7 @@
               <w:jc w:val="left"/>
             </w:pPr>
             <w:r/>
-            <w:hyperlink r:id="rId205">
+            <w:hyperlink r:id="rId208">
               <w:r>
                 <w:rPr>
                   <w:color w:val="0B4F9E"/>
@@ -18388,7 +18688,7 @@
               <w:jc w:val="left"/>
             </w:pPr>
             <w:r/>
-            <w:hyperlink r:id="rId206">
+            <w:hyperlink r:id="rId209">
               <w:r>
                 <w:rPr>
                   <w:color w:val="0B4F9E"/>
@@ -18459,7 +18759,7 @@
               <w:jc w:val="left"/>
             </w:pPr>
             <w:r/>
-            <w:hyperlink r:id="rId206">
+            <w:hyperlink r:id="rId209">
               <w:r>
                 <w:rPr>
                   <w:color w:val="0B4F9E"/>
@@ -18482,7 +18782,7 @@
               <w:jc w:val="left"/>
             </w:pPr>
             <w:r/>
-            <w:hyperlink r:id="rId207">
+            <w:hyperlink r:id="rId210">
               <w:r>
                 <w:rPr>
                   <w:color w:val="0B4F9E"/>
@@ -18559,7 +18859,7 @@
               <w:jc w:val="left"/>
             </w:pPr>
             <w:r/>
-            <w:hyperlink r:id="rId207">
+            <w:hyperlink r:id="rId210">
               <w:r>
                 <w:rPr>
                   <w:color w:val="0B4F9E"/>
@@ -18582,7 +18882,7 @@
               <w:jc w:val="left"/>
             </w:pPr>
             <w:r/>
-            <w:hyperlink r:id="rId208">
+            <w:hyperlink r:id="rId211">
               <w:r>
                 <w:rPr>
                   <w:color w:val="0B4F9E"/>
@@ -18659,7 +18959,7 @@
               <w:jc w:val="left"/>
             </w:pPr>
             <w:r/>
-            <w:hyperlink r:id="rId208">
+            <w:hyperlink r:id="rId211">
               <w:r>
                 <w:rPr>
                   <w:color w:val="0B4F9E"/>
@@ -18682,7 +18982,7 @@
               <w:jc w:val="left"/>
             </w:pPr>
             <w:r/>
-            <w:hyperlink r:id="rId209">
+            <w:hyperlink r:id="rId212">
               <w:r>
                 <w:rPr>
                   <w:color w:val="0B4F9E"/>
@@ -18753,7 +19053,7 @@
               <w:jc w:val="left"/>
             </w:pPr>
             <w:r/>
-            <w:hyperlink r:id="rId209">
+            <w:hyperlink r:id="rId212">
               <w:r>
                 <w:rPr>
                   <w:color w:val="0B4F9E"/>
@@ -18776,7 +19076,7 @@
               <w:jc w:val="left"/>
             </w:pPr>
             <w:r/>
-            <w:hyperlink r:id="rId210">
+            <w:hyperlink r:id="rId213">
               <w:r>
                 <w:rPr>
                   <w:color w:val="0B4F9E"/>
@@ -18847,7 +19147,7 @@
               <w:jc w:val="left"/>
             </w:pPr>
             <w:r/>
-            <w:hyperlink r:id="rId210">
+            <w:hyperlink r:id="rId213">
               <w:r>
                 <w:rPr>
                   <w:color w:val="0B4F9E"/>
@@ -18870,7 +19170,7 @@
               <w:jc w:val="left"/>
             </w:pPr>
             <w:r/>
-            <w:hyperlink r:id="rId211">
+            <w:hyperlink r:id="rId214">
               <w:r>
                 <w:rPr>
                   <w:color w:val="0B4F9E"/>
@@ -18941,7 +19241,7 @@
               <w:jc w:val="left"/>
             </w:pPr>
             <w:r/>
-            <w:hyperlink r:id="rId211">
+            <w:hyperlink r:id="rId214">
               <w:r>
                 <w:rPr>
                   <w:color w:val="0B4F9E"/>
@@ -18964,7 +19264,7 @@
               <w:jc w:val="left"/>
             </w:pPr>
             <w:r/>
-            <w:hyperlink r:id="rId212">
+            <w:hyperlink r:id="rId215">
               <w:r>
                 <w:rPr>
                   <w:color w:val="0B4F9E"/>
@@ -19035,7 +19335,7 @@
               <w:jc w:val="left"/>
             </w:pPr>
             <w:r/>
-            <w:hyperlink r:id="rId212">
+            <w:hyperlink r:id="rId215">
               <w:r>
                 <w:rPr>
                   <w:color w:val="0B4F9E"/>
@@ -19043,6 +19343,570 @@
                   <w:u w:val="single"/>
                 </w:rPr>
                 <w:t>10.1007/s40753-026-00315-8</w:t>
+              </w:r>
+            </w:hyperlink>
+          </w:p>
+        </w:tc>
+      </w:tr>
+      <w:tr>
+        <w:tc>
+          <w:tcPr>
+            <w:tcW w:type="dxa" w:w="1680"/>
+          </w:tcPr>
+          <w:p>
+            <w:pPr>
+              <w:jc w:val="left"/>
+            </w:pPr>
+            <w:r/>
+            <w:hyperlink r:id="rId216">
+              <w:r>
+                <w:rPr>
+                  <w:color w:val="0B4F9E"/>
+                  <w:sz w:val="16"/>
+                  <w:u w:val="single"/>
+                </w:rPr>
+                <w:t>The Effect of Wayang Huruf Interactive Learning Media on Letter Recognition Skills in Children Aged 4–5 Years</w:t>
+              </w:r>
+            </w:hyperlink>
+          </w:p>
+        </w:tc>
+        <w:tc>
+          <w:tcPr>
+            <w:tcW w:type="dxa" w:w="1680"/>
+          </w:tcPr>
+          <w:p>
+            <w:pPr>
+              <w:jc w:val="left"/>
+            </w:pPr>
+            <w:r/>
+          </w:p>
+        </w:tc>
+        <w:tc>
+          <w:tcPr>
+            <w:tcW w:type="dxa" w:w="1680"/>
+          </w:tcPr>
+          <w:p>
+            <w:pPr>
+              <w:jc w:val="left"/>
+            </w:pPr>
+            <w:r/>
+          </w:p>
+        </w:tc>
+        <w:tc>
+          <w:tcPr>
+            <w:tcW w:type="dxa" w:w="1680"/>
+          </w:tcPr>
+          <w:p>
+            <w:pPr>
+              <w:jc w:val="left"/>
+            </w:pPr>
+            <w:r/>
+          </w:p>
+        </w:tc>
+        <w:tc>
+          <w:tcPr>
+            <w:tcW w:type="dxa" w:w="1680"/>
+          </w:tcPr>
+          <w:p>
+            <w:pPr>
+              <w:jc w:val="left"/>
+            </w:pPr>
+            <w:r/>
+            <w:r>
+              <w:rPr>
+                <w:sz w:val="16"/>
+              </w:rPr>
+              <w:t>2026-09-06</w:t>
+            </w:r>
+          </w:p>
+        </w:tc>
+        <w:tc>
+          <w:tcPr>
+            <w:tcW w:type="dxa" w:w="1680"/>
+          </w:tcPr>
+          <w:p>
+            <w:pPr>
+              <w:jc w:val="left"/>
+            </w:pPr>
+            <w:r/>
+            <w:hyperlink r:id="rId216">
+              <w:r>
+                <w:rPr>
+                  <w:color w:val="0B4F9E"/>
+                  <w:sz w:val="16"/>
+                  <w:u w:val="single"/>
+                </w:rPr>
+                <w:t>10.25273/jcare.v14i1.23550</w:t>
+              </w:r>
+            </w:hyperlink>
+          </w:p>
+        </w:tc>
+      </w:tr>
+      <w:tr>
+        <w:tc>
+          <w:tcPr>
+            <w:tcW w:type="dxa" w:w="1680"/>
+          </w:tcPr>
+          <w:p>
+            <w:pPr>
+              <w:jc w:val="left"/>
+            </w:pPr>
+            <w:r/>
+            <w:hyperlink r:id="rId217">
+              <w:r>
+                <w:rPr>
+                  <w:color w:val="0B4F9E"/>
+                  <w:sz w:val="16"/>
+                  <w:u w:val="single"/>
+                </w:rPr>
+                <w:t>LOGIN: A Large Language Model Consulted Graph Neural Network Training Framework</w:t>
+              </w:r>
+            </w:hyperlink>
+          </w:p>
+        </w:tc>
+        <w:tc>
+          <w:tcPr>
+            <w:tcW w:type="dxa" w:w="1680"/>
+          </w:tcPr>
+          <w:p>
+            <w:pPr>
+              <w:jc w:val="left"/>
+            </w:pPr>
+            <w:r/>
+          </w:p>
+        </w:tc>
+        <w:tc>
+          <w:tcPr>
+            <w:tcW w:type="dxa" w:w="1680"/>
+          </w:tcPr>
+          <w:p>
+            <w:pPr>
+              <w:jc w:val="left"/>
+            </w:pPr>
+            <w:r/>
+          </w:p>
+        </w:tc>
+        <w:tc>
+          <w:tcPr>
+            <w:tcW w:type="dxa" w:w="1680"/>
+          </w:tcPr>
+          <w:p>
+            <w:pPr>
+              <w:jc w:val="left"/>
+            </w:pPr>
+            <w:r/>
+          </w:p>
+        </w:tc>
+        <w:tc>
+          <w:tcPr>
+            <w:tcW w:type="dxa" w:w="1680"/>
+          </w:tcPr>
+          <w:p>
+            <w:pPr>
+              <w:jc w:val="left"/>
+            </w:pPr>
+            <w:r/>
+            <w:r>
+              <w:rPr>
+                <w:sz w:val="16"/>
+              </w:rPr>
+              <w:t>2026-09-06</w:t>
+            </w:r>
+          </w:p>
+        </w:tc>
+        <w:tc>
+          <w:tcPr>
+            <w:tcW w:type="dxa" w:w="1680"/>
+          </w:tcPr>
+          <w:p>
+            <w:pPr>
+              <w:jc w:val="left"/>
+            </w:pPr>
+            <w:r/>
+            <w:hyperlink r:id="rId217">
+              <w:r>
+                <w:rPr>
+                  <w:color w:val="0B4F9E"/>
+                  <w:sz w:val="16"/>
+                  <w:u w:val="single"/>
+                </w:rPr>
+                <w:t>10.1145/3845996</w:t>
+              </w:r>
+            </w:hyperlink>
+          </w:p>
+        </w:tc>
+      </w:tr>
+      <w:tr>
+        <w:tc>
+          <w:tcPr>
+            <w:tcW w:type="dxa" w:w="1680"/>
+          </w:tcPr>
+          <w:p>
+            <w:pPr>
+              <w:jc w:val="left"/>
+            </w:pPr>
+            <w:r/>
+            <w:hyperlink r:id="rId218">
+              <w:r>
+                <w:rPr>
+                  <w:color w:val="0B4F9E"/>
+                  <w:sz w:val="16"/>
+                  <w:u w:val="single"/>
+                </w:rPr>
+                <w:t>Process-Driven Property Variability in PEGDA-Based Photopolymers: Multiscale Characterization and Implications for Data-</w:t>
+              </w:r>
+            </w:hyperlink>
+          </w:p>
+        </w:tc>
+        <w:tc>
+          <w:tcPr>
+            <w:tcW w:type="dxa" w:w="1680"/>
+          </w:tcPr>
+          <w:p>
+            <w:pPr>
+              <w:jc w:val="left"/>
+            </w:pPr>
+            <w:r/>
+          </w:p>
+        </w:tc>
+        <w:tc>
+          <w:tcPr>
+            <w:tcW w:type="dxa" w:w="1680"/>
+          </w:tcPr>
+          <w:p>
+            <w:pPr>
+              <w:jc w:val="left"/>
+            </w:pPr>
+            <w:r/>
+          </w:p>
+        </w:tc>
+        <w:tc>
+          <w:tcPr>
+            <w:tcW w:type="dxa" w:w="1680"/>
+          </w:tcPr>
+          <w:p>
+            <w:pPr>
+              <w:jc w:val="left"/>
+            </w:pPr>
+            <w:r/>
+          </w:p>
+        </w:tc>
+        <w:tc>
+          <w:tcPr>
+            <w:tcW w:type="dxa" w:w="1680"/>
+          </w:tcPr>
+          <w:p>
+            <w:pPr>
+              <w:jc w:val="left"/>
+            </w:pPr>
+            <w:r/>
+            <w:r>
+              <w:rPr>
+                <w:sz w:val="16"/>
+              </w:rPr>
+              <w:t>2026-09-06</w:t>
+            </w:r>
+          </w:p>
+        </w:tc>
+        <w:tc>
+          <w:tcPr>
+            <w:tcW w:type="dxa" w:w="1680"/>
+          </w:tcPr>
+          <w:p>
+            <w:pPr>
+              <w:jc w:val="left"/>
+            </w:pPr>
+            <w:r/>
+            <w:hyperlink r:id="rId218">
+              <w:r>
+                <w:rPr>
+                  <w:color w:val="0B4F9E"/>
+                  <w:sz w:val="16"/>
+                  <w:u w:val="single"/>
+                </w:rPr>
+                <w:t>10.2139/ssrn.7422818</w:t>
+              </w:r>
+            </w:hyperlink>
+          </w:p>
+        </w:tc>
+      </w:tr>
+      <w:tr>
+        <w:tc>
+          <w:tcPr>
+            <w:tcW w:type="dxa" w:w="1680"/>
+          </w:tcPr>
+          <w:p>
+            <w:pPr>
+              <w:jc w:val="left"/>
+            </w:pPr>
+            <w:r/>
+            <w:hyperlink r:id="rId219">
+              <w:r>
+                <w:rPr>
+                  <w:color w:val="0B4F9E"/>
+                  <w:sz w:val="16"/>
+                  <w:u w:val="single"/>
+                </w:rPr>
+                <w:t>Implementasi Gamifikasi Berbasis Canva AI dalam Pembelajaran Bahasa Inggris di Sekolah Dasar: Pendekatan Technology Acce</w:t>
+              </w:r>
+            </w:hyperlink>
+          </w:p>
+        </w:tc>
+        <w:tc>
+          <w:tcPr>
+            <w:tcW w:type="dxa" w:w="1680"/>
+          </w:tcPr>
+          <w:p>
+            <w:pPr>
+              <w:jc w:val="left"/>
+            </w:pPr>
+            <w:r/>
+          </w:p>
+        </w:tc>
+        <w:tc>
+          <w:tcPr>
+            <w:tcW w:type="dxa" w:w="1680"/>
+          </w:tcPr>
+          <w:p>
+            <w:pPr>
+              <w:jc w:val="left"/>
+            </w:pPr>
+            <w:r/>
+          </w:p>
+        </w:tc>
+        <w:tc>
+          <w:tcPr>
+            <w:tcW w:type="dxa" w:w="1680"/>
+          </w:tcPr>
+          <w:p>
+            <w:pPr>
+              <w:jc w:val="left"/>
+            </w:pPr>
+            <w:r/>
+          </w:p>
+        </w:tc>
+        <w:tc>
+          <w:tcPr>
+            <w:tcW w:type="dxa" w:w="1680"/>
+          </w:tcPr>
+          <w:p>
+            <w:pPr>
+              <w:jc w:val="left"/>
+            </w:pPr>
+            <w:r/>
+            <w:r>
+              <w:rPr>
+                <w:sz w:val="16"/>
+              </w:rPr>
+              <w:t>2026-09-06</w:t>
+            </w:r>
+          </w:p>
+        </w:tc>
+        <w:tc>
+          <w:tcPr>
+            <w:tcW w:type="dxa" w:w="1680"/>
+          </w:tcPr>
+          <w:p>
+            <w:pPr>
+              <w:jc w:val="left"/>
+            </w:pPr>
+            <w:r/>
+            <w:hyperlink r:id="rId219">
+              <w:r>
+                <w:rPr>
+                  <w:color w:val="0B4F9E"/>
+                  <w:sz w:val="16"/>
+                  <w:u w:val="single"/>
+                </w:rPr>
+                <w:t>10.63447/jimik.v7i3.2011</w:t>
+              </w:r>
+            </w:hyperlink>
+          </w:p>
+        </w:tc>
+      </w:tr>
+      <w:tr>
+        <w:tc>
+          <w:tcPr>
+            <w:tcW w:type="dxa" w:w="1680"/>
+          </w:tcPr>
+          <w:p>
+            <w:pPr>
+              <w:jc w:val="left"/>
+            </w:pPr>
+            <w:r/>
+            <w:hyperlink r:id="rId220">
+              <w:r>
+                <w:rPr>
+                  <w:color w:val="0B4F9E"/>
+                  <w:sz w:val="16"/>
+                  <w:u w:val="single"/>
+                </w:rPr>
+                <w:t>Interactive Learning Media On Dynamic Electrical Materials For Concept-Based High School Students</w:t>
+              </w:r>
+            </w:hyperlink>
+          </w:p>
+        </w:tc>
+        <w:tc>
+          <w:tcPr>
+            <w:tcW w:type="dxa" w:w="1680"/>
+          </w:tcPr>
+          <w:p>
+            <w:pPr>
+              <w:jc w:val="left"/>
+            </w:pPr>
+            <w:r/>
+          </w:p>
+        </w:tc>
+        <w:tc>
+          <w:tcPr>
+            <w:tcW w:type="dxa" w:w="1680"/>
+          </w:tcPr>
+          <w:p>
+            <w:pPr>
+              <w:jc w:val="left"/>
+            </w:pPr>
+            <w:r/>
+          </w:p>
+        </w:tc>
+        <w:tc>
+          <w:tcPr>
+            <w:tcW w:type="dxa" w:w="1680"/>
+          </w:tcPr>
+          <w:p>
+            <w:pPr>
+              <w:jc w:val="left"/>
+            </w:pPr>
+            <w:r/>
+          </w:p>
+        </w:tc>
+        <w:tc>
+          <w:tcPr>
+            <w:tcW w:type="dxa" w:w="1680"/>
+          </w:tcPr>
+          <w:p>
+            <w:pPr>
+              <w:jc w:val="left"/>
+            </w:pPr>
+            <w:r/>
+            <w:r>
+              <w:rPr>
+                <w:sz w:val="16"/>
+              </w:rPr>
+              <w:t>2026-09-06</w:t>
+            </w:r>
+          </w:p>
+        </w:tc>
+        <w:tc>
+          <w:tcPr>
+            <w:tcW w:type="dxa" w:w="1680"/>
+          </w:tcPr>
+          <w:p>
+            <w:pPr>
+              <w:jc w:val="left"/>
+            </w:pPr>
+            <w:r/>
+            <w:hyperlink r:id="rId220">
+              <w:r>
+                <w:rPr>
+                  <w:color w:val="0B4F9E"/>
+                  <w:sz w:val="16"/>
+                  <w:u w:val="single"/>
+                </w:rPr>
+                <w:t>10.32764/20yhc152</w:t>
+              </w:r>
+            </w:hyperlink>
+          </w:p>
+        </w:tc>
+      </w:tr>
+      <w:tr>
+        <w:tc>
+          <w:tcPr>
+            <w:tcW w:type="dxa" w:w="1680"/>
+          </w:tcPr>
+          <w:p>
+            <w:pPr>
+              <w:jc w:val="left"/>
+            </w:pPr>
+            <w:r/>
+            <w:hyperlink r:id="rId221">
+              <w:r>
+                <w:rPr>
+                  <w:color w:val="0B4F9E"/>
+                  <w:sz w:val="16"/>
+                  <w:u w:val="single"/>
+                </w:rPr>
+                <w:t>Inverse Design of a Wide-Angle Wideband Programmable THz Reflectarray Through Generative Adversarial Networks</w:t>
+              </w:r>
+            </w:hyperlink>
+          </w:p>
+        </w:tc>
+        <w:tc>
+          <w:tcPr>
+            <w:tcW w:type="dxa" w:w="1680"/>
+          </w:tcPr>
+          <w:p>
+            <w:pPr>
+              <w:jc w:val="left"/>
+            </w:pPr>
+            <w:r/>
+          </w:p>
+        </w:tc>
+        <w:tc>
+          <w:tcPr>
+            <w:tcW w:type="dxa" w:w="1680"/>
+          </w:tcPr>
+          <w:p>
+            <w:pPr>
+              <w:jc w:val="left"/>
+            </w:pPr>
+            <w:r/>
+          </w:p>
+        </w:tc>
+        <w:tc>
+          <w:tcPr>
+            <w:tcW w:type="dxa" w:w="1680"/>
+          </w:tcPr>
+          <w:p>
+            <w:pPr>
+              <w:jc w:val="left"/>
+            </w:pPr>
+            <w:r/>
+          </w:p>
+        </w:tc>
+        <w:tc>
+          <w:tcPr>
+            <w:tcW w:type="dxa" w:w="1680"/>
+          </w:tcPr>
+          <w:p>
+            <w:pPr>
+              <w:jc w:val="left"/>
+            </w:pPr>
+            <w:r/>
+            <w:r>
+              <w:rPr>
+                <w:sz w:val="16"/>
+              </w:rPr>
+              <w:t>2026-09-06</w:t>
+            </w:r>
+          </w:p>
+        </w:tc>
+        <w:tc>
+          <w:tcPr>
+            <w:tcW w:type="dxa" w:w="1680"/>
+          </w:tcPr>
+          <w:p>
+            <w:pPr>
+              <w:jc w:val="left"/>
+            </w:pPr>
+            <w:r/>
+            <w:hyperlink r:id="rId221">
+              <w:r>
+                <w:rPr>
+                  <w:color w:val="0B4F9E"/>
+                  <w:sz w:val="16"/>
+                  <w:u w:val="single"/>
+                </w:rPr>
+                <w:t>10.66224/itrc.17.3.1</w:t>
               </w:r>
             </w:hyperlink>
           </w:p>
@@ -19069,7 +19933,7 @@
         <w:rPr>
           <w:b/>
         </w:rPr>
-        <w:t>154</w:t>
+        <w:t>163</w:t>
       </w:r>
     </w:p>
     <w:p>
@@ -19083,7 +19947,7 @@
         <w:rPr>
           <w:b/>
         </w:rPr>
-        <w:t>77</w:t>
+        <w:t>86</w:t>
       </w:r>
     </w:p>
     <w:p>
@@ -19097,7 +19961,7 @@
         <w:rPr>
           <w:b/>
         </w:rPr>
-        <w:t>173</w:t>
+        <w:t>182</w:t>
       </w:r>
     </w:p>
     <w:p>

</xml_diff>

<commit_message>
Digest + summary: 2026-09-08
</commit_message>
<xml_diff>
--- a/NEEDS_DATA.docx
+++ b/NEEDS_DATA.docx
@@ -17,7 +17,7 @@
     </w:p>
     <w:p>
       <w:r>
-        <w:t xml:space="preserve">Generated 2026-09-07. Every field below was blank in the automated sources. Fill any of them in </w:t>
+        <w:t xml:space="preserve">Generated 2026-09-08. Every field below was blank in the automated sources. Fill any of them in </w:t>
       </w:r>
       <w:r>
         <w:rPr>
@@ -1387,7 +1387,7 @@
         <w:pStyle w:val="Heading2"/>
       </w:pPr>
       <w:r>
-        <w:t>Studies with no numeric performance figure (192 of 201)</w:t>
+        <w:t>Studies with no numeric performance figure (201 of 213)</w:t>
       </w:r>
     </w:p>
     <w:p>
@@ -1809,7 +1809,7 @@
               <w:rPr>
                 <w:sz w:val="16"/>
               </w:rPr>
-              <w:t>ALIGNN, MEGNet, CGCNN</w:t>
+              <w:t>MEGNet, ALIGNN, CGCNN</w:t>
             </w:r>
           </w:p>
         </w:tc>
@@ -2127,118 +2127,6 @@
                   <w:sz w:val="16"/>
                   <w:u w:val="single"/>
                 </w:rPr>
-                <w:t>A computed thermoelectric feature database for 50,992 GNoME materials</w:t>
-              </w:r>
-            </w:hyperlink>
-          </w:p>
-        </w:tc>
-        <w:tc>
-          <w:tcPr>
-            <w:tcW w:type="dxa" w:w="1680"/>
-          </w:tcPr>
-          <w:p>
-            <w:pPr>
-              <w:jc w:val="left"/>
-            </w:pPr>
-            <w:r/>
-            <w:r>
-              <w:rPr>
-                <w:sz w:val="16"/>
-              </w:rPr>
-              <w:t>CHGNet, GNoME</w:t>
-            </w:r>
-          </w:p>
-        </w:tc>
-        <w:tc>
-          <w:tcPr>
-            <w:tcW w:type="dxa" w:w="1680"/>
-          </w:tcPr>
-          <w:p>
-            <w:pPr>
-              <w:jc w:val="left"/>
-            </w:pPr>
-            <w:r/>
-            <w:r>
-              <w:rPr>
-                <w:sz w:val="16"/>
-              </w:rPr>
-              <w:t>thermoelectric</w:t>
-            </w:r>
-          </w:p>
-        </w:tc>
-        <w:tc>
-          <w:tcPr>
-            <w:tcW w:type="dxa" w:w="1680"/>
-          </w:tcPr>
-          <w:p>
-            <w:pPr>
-              <w:jc w:val="left"/>
-            </w:pPr>
-            <w:r/>
-            <w:r>
-              <w:rPr>
-                <w:sz w:val="16"/>
-              </w:rPr>
-              <w:t>DFT, MLIP</w:t>
-            </w:r>
-          </w:p>
-        </w:tc>
-        <w:tc>
-          <w:tcPr>
-            <w:tcW w:type="dxa" w:w="1680"/>
-          </w:tcPr>
-          <w:p>
-            <w:pPr>
-              <w:jc w:val="left"/>
-            </w:pPr>
-            <w:r/>
-            <w:r>
-              <w:rPr>
-                <w:sz w:val="16"/>
-              </w:rPr>
-              <w:t>2026-08-26</w:t>
-            </w:r>
-          </w:p>
-        </w:tc>
-        <w:tc>
-          <w:tcPr>
-            <w:tcW w:type="dxa" w:w="1680"/>
-          </w:tcPr>
-          <w:p>
-            <w:pPr>
-              <w:jc w:val="left"/>
-            </w:pPr>
-            <w:r/>
-            <w:hyperlink r:id="rId39">
-              <w:r>
-                <w:rPr>
-                  <w:color w:val="0B4F9E"/>
-                  <w:sz w:val="16"/>
-                  <w:u w:val="single"/>
-                </w:rPr>
-                <w:t>10.26434/chemrxiv.15007873/v1</w:t>
-              </w:r>
-            </w:hyperlink>
-          </w:p>
-        </w:tc>
-      </w:tr>
-      <w:tr>
-        <w:tc>
-          <w:tcPr>
-            <w:tcW w:type="dxa" w:w="1680"/>
-          </w:tcPr>
-          <w:p>
-            <w:pPr>
-              <w:jc w:val="left"/>
-            </w:pPr>
-            <w:r/>
-            <w:hyperlink r:id="rId40">
-              <w:r>
-                <w:rPr>
-                  <w:color w:val="0B4F9E"/>
-                  <w:sz w:val="16"/>
-                  <w:u w:val="single"/>
-                </w:rPr>
                 <w:t>Cross-Scale Assessment of MACE Foundation Models and from Scratch Trained Potentials for Bi-Pt Systems</w:t>
               </w:r>
             </w:hyperlink>
@@ -2321,7 +2209,7 @@
               <w:jc w:val="left"/>
             </w:pPr>
             <w:r/>
-            <w:hyperlink r:id="rId40">
+            <w:hyperlink r:id="rId39">
               <w:r>
                 <w:rPr>
                   <w:color w:val="0B4F9E"/>
@@ -2344,7 +2232,7 @@
               <w:jc w:val="left"/>
             </w:pPr>
             <w:r/>
-            <w:hyperlink r:id="rId41">
+            <w:hyperlink r:id="rId40">
               <w:r>
                 <w:rPr>
                   <w:color w:val="0B4F9E"/>
@@ -2427,7 +2315,7 @@
               <w:jc w:val="left"/>
             </w:pPr>
             <w:r/>
-            <w:hyperlink r:id="rId41">
+            <w:hyperlink r:id="rId40">
               <w:r>
                 <w:rPr>
                   <w:color w:val="0B4F9E"/>
@@ -2450,7 +2338,7 @@
               <w:jc w:val="left"/>
             </w:pPr>
             <w:r/>
-            <w:hyperlink r:id="rId42">
+            <w:hyperlink r:id="rId41">
               <w:r>
                 <w:rPr>
                   <w:color w:val="0B4F9E"/>
@@ -2539,7 +2427,7 @@
               <w:jc w:val="left"/>
             </w:pPr>
             <w:r/>
-            <w:hyperlink r:id="rId42">
+            <w:hyperlink r:id="rId41">
               <w:r>
                 <w:rPr>
                   <w:color w:val="0B4F9E"/>
@@ -2562,7 +2450,7 @@
               <w:jc w:val="left"/>
             </w:pPr>
             <w:r/>
-            <w:hyperlink r:id="rId43">
+            <w:hyperlink r:id="rId42">
               <w:r>
                 <w:rPr>
                   <w:color w:val="0B4F9E"/>
@@ -2651,6 +2539,29 @@
               <w:jc w:val="left"/>
             </w:pPr>
             <w:r/>
+            <w:hyperlink r:id="rId42">
+              <w:r>
+                <w:rPr>
+                  <w:color w:val="0B4F9E"/>
+                  <w:sz w:val="16"/>
+                  <w:u w:val="single"/>
+                </w:rPr>
+                <w:t>10.26434/chemrxiv.15008248/v1</w:t>
+              </w:r>
+            </w:hyperlink>
+          </w:p>
+        </w:tc>
+      </w:tr>
+      <w:tr>
+        <w:tc>
+          <w:tcPr>
+            <w:tcW w:type="dxa" w:w="1680"/>
+          </w:tcPr>
+          <w:p>
+            <w:pPr>
+              <w:jc w:val="left"/>
+            </w:pPr>
+            <w:r/>
             <w:hyperlink r:id="rId43">
               <w:r>
                 <w:rPr>
@@ -2658,7 +2569,96 @@
                   <w:sz w:val="16"/>
                   <w:u w:val="single"/>
                 </w:rPr>
-                <w:t>10.26434/chemrxiv.15008248/v1</w:t>
+                <w:t>A computed thermoelectric feature database for 50,992 GNoME materials</w:t>
+              </w:r>
+            </w:hyperlink>
+          </w:p>
+        </w:tc>
+        <w:tc>
+          <w:tcPr>
+            <w:tcW w:type="dxa" w:w="1680"/>
+          </w:tcPr>
+          <w:p>
+            <w:pPr>
+              <w:jc w:val="left"/>
+            </w:pPr>
+            <w:r/>
+            <w:r>
+              <w:rPr>
+                <w:sz w:val="16"/>
+              </w:rPr>
+              <w:t>CHGNet, GNoME</w:t>
+            </w:r>
+          </w:p>
+        </w:tc>
+        <w:tc>
+          <w:tcPr>
+            <w:tcW w:type="dxa" w:w="1680"/>
+          </w:tcPr>
+          <w:p>
+            <w:pPr>
+              <w:jc w:val="left"/>
+            </w:pPr>
+            <w:r/>
+            <w:r>
+              <w:rPr>
+                <w:sz w:val="16"/>
+              </w:rPr>
+              <w:t>thermoelectric</w:t>
+            </w:r>
+          </w:p>
+        </w:tc>
+        <w:tc>
+          <w:tcPr>
+            <w:tcW w:type="dxa" w:w="1680"/>
+          </w:tcPr>
+          <w:p>
+            <w:pPr>
+              <w:jc w:val="left"/>
+            </w:pPr>
+            <w:r/>
+            <w:r>
+              <w:rPr>
+                <w:sz w:val="16"/>
+              </w:rPr>
+              <w:t>DFT, MLIP</w:t>
+            </w:r>
+          </w:p>
+        </w:tc>
+        <w:tc>
+          <w:tcPr>
+            <w:tcW w:type="dxa" w:w="1680"/>
+          </w:tcPr>
+          <w:p>
+            <w:pPr>
+              <w:jc w:val="left"/>
+            </w:pPr>
+            <w:r/>
+            <w:r>
+              <w:rPr>
+                <w:sz w:val="16"/>
+              </w:rPr>
+              <w:t>2026-09-08</w:t>
+            </w:r>
+          </w:p>
+        </w:tc>
+        <w:tc>
+          <w:tcPr>
+            <w:tcW w:type="dxa" w:w="1680"/>
+          </w:tcPr>
+          <w:p>
+            <w:pPr>
+              <w:jc w:val="left"/>
+            </w:pPr>
+            <w:r/>
+            <w:hyperlink r:id="rId43">
+              <w:r>
+                <w:rPr>
+                  <w:color w:val="0B4F9E"/>
+                  <w:sz w:val="16"/>
+                  <w:u w:val="single"/>
+                </w:rPr>
+                <w:t>10.26434/chemrxiv.15007873/v2</w:t>
               </w:r>
             </w:hyperlink>
           </w:p>
@@ -3541,7 +3541,7 @@
               <w:rPr>
                 <w:sz w:val="16"/>
               </w:rPr>
-              <w:t>ALIGNN, CHGNet</w:t>
+              <w:t>CHGNet, ALIGNN</w:t>
             </w:r>
           </w:p>
         </w:tc>
@@ -3647,7 +3647,7 @@
               <w:rPr>
                 <w:sz w:val="16"/>
               </w:rPr>
-              <w:t>MatterSim, MatterGen</w:t>
+              <w:t>MatterGen, MatterSim</w:t>
             </w:r>
           </w:p>
         </w:tc>
@@ -12023,6 +12023,218 @@
                   <w:sz w:val="16"/>
                   <w:u w:val="single"/>
                 </w:rPr>
+                <w:t>High-throughput determination of threshold displacement energies in AlGaN alloys</w:t>
+              </w:r>
+            </w:hyperlink>
+          </w:p>
+        </w:tc>
+        <w:tc>
+          <w:tcPr>
+            <w:tcW w:type="dxa" w:w="1680"/>
+          </w:tcPr>
+          <w:p>
+            <w:pPr>
+              <w:jc w:val="left"/>
+            </w:pPr>
+            <w:r/>
+          </w:p>
+        </w:tc>
+        <w:tc>
+          <w:tcPr>
+            <w:tcW w:type="dxa" w:w="1680"/>
+          </w:tcPr>
+          <w:p>
+            <w:pPr>
+              <w:jc w:val="left"/>
+            </w:pPr>
+            <w:r/>
+            <w:r>
+              <w:rPr>
+                <w:sz w:val="16"/>
+              </w:rPr>
+              <w:t>alloy, semiconductor, nitride</w:t>
+            </w:r>
+          </w:p>
+        </w:tc>
+        <w:tc>
+          <w:tcPr>
+            <w:tcW w:type="dxa" w:w="1680"/>
+          </w:tcPr>
+          <w:p>
+            <w:pPr>
+              <w:jc w:val="left"/>
+            </w:pPr>
+            <w:r/>
+            <w:r>
+              <w:rPr>
+                <w:sz w:val="16"/>
+              </w:rPr>
+              <w:t>DFT, MD, MLIP</w:t>
+            </w:r>
+          </w:p>
+        </w:tc>
+        <w:tc>
+          <w:tcPr>
+            <w:tcW w:type="dxa" w:w="1680"/>
+          </w:tcPr>
+          <w:p>
+            <w:pPr>
+              <w:jc w:val="left"/>
+            </w:pPr>
+            <w:r/>
+            <w:r>
+              <w:rPr>
+                <w:sz w:val="16"/>
+              </w:rPr>
+              <w:t>2026-09-07</w:t>
+            </w:r>
+          </w:p>
+        </w:tc>
+        <w:tc>
+          <w:tcPr>
+            <w:tcW w:type="dxa" w:w="1680"/>
+          </w:tcPr>
+          <w:p>
+            <w:pPr>
+              <w:jc w:val="left"/>
+            </w:pPr>
+            <w:r/>
+            <w:hyperlink r:id="rId139">
+              <w:r>
+                <w:rPr>
+                  <w:color w:val="0B4F9E"/>
+                  <w:sz w:val="16"/>
+                  <w:u w:val="single"/>
+                </w:rPr>
+                <w:t>10.12688/nuclscitechnolopenres.17814.1</w:t>
+              </w:r>
+            </w:hyperlink>
+          </w:p>
+        </w:tc>
+      </w:tr>
+      <w:tr>
+        <w:tc>
+          <w:tcPr>
+            <w:tcW w:type="dxa" w:w="1680"/>
+          </w:tcPr>
+          <w:p>
+            <w:pPr>
+              <w:jc w:val="left"/>
+            </w:pPr>
+            <w:r/>
+            <w:hyperlink r:id="rId140">
+              <w:r>
+                <w:rPr>
+                  <w:color w:val="0B4F9E"/>
+                  <w:sz w:val="16"/>
+                  <w:u w:val="single"/>
+                </w:rPr>
+                <w:t>Dataset for High Throughput Screening of Heusler Alloy for electrochemical NRR</w:t>
+              </w:r>
+            </w:hyperlink>
+          </w:p>
+        </w:tc>
+        <w:tc>
+          <w:tcPr>
+            <w:tcW w:type="dxa" w:w="1680"/>
+          </w:tcPr>
+          <w:p>
+            <w:pPr>
+              <w:jc w:val="left"/>
+            </w:pPr>
+            <w:r/>
+          </w:p>
+        </w:tc>
+        <w:tc>
+          <w:tcPr>
+            <w:tcW w:type="dxa" w:w="1680"/>
+          </w:tcPr>
+          <w:p>
+            <w:pPr>
+              <w:jc w:val="left"/>
+            </w:pPr>
+            <w:r/>
+            <w:r>
+              <w:rPr>
+                <w:sz w:val="16"/>
+              </w:rPr>
+              <w:t>catalyst, alloy</w:t>
+            </w:r>
+          </w:p>
+        </w:tc>
+        <w:tc>
+          <w:tcPr>
+            <w:tcW w:type="dxa" w:w="1680"/>
+          </w:tcPr>
+          <w:p>
+            <w:pPr>
+              <w:jc w:val="left"/>
+            </w:pPr>
+            <w:r/>
+            <w:r>
+              <w:rPr>
+                <w:sz w:val="16"/>
+              </w:rPr>
+              <w:t>MLIP, free energy</w:t>
+            </w:r>
+          </w:p>
+        </w:tc>
+        <w:tc>
+          <w:tcPr>
+            <w:tcW w:type="dxa" w:w="1680"/>
+          </w:tcPr>
+          <w:p>
+            <w:pPr>
+              <w:jc w:val="left"/>
+            </w:pPr>
+            <w:r/>
+            <w:r>
+              <w:rPr>
+                <w:sz w:val="16"/>
+              </w:rPr>
+              <w:t>2026-09-07</w:t>
+            </w:r>
+          </w:p>
+        </w:tc>
+        <w:tc>
+          <w:tcPr>
+            <w:tcW w:type="dxa" w:w="1680"/>
+          </w:tcPr>
+          <w:p>
+            <w:pPr>
+              <w:jc w:val="left"/>
+            </w:pPr>
+            <w:r/>
+            <w:hyperlink r:id="rId140">
+              <w:r>
+                <w:rPr>
+                  <w:color w:val="0B4F9E"/>
+                  <w:sz w:val="16"/>
+                  <w:u w:val="single"/>
+                </w:rPr>
+                <w:t>10.6084/m9.figshare.33456433</w:t>
+              </w:r>
+            </w:hyperlink>
+          </w:p>
+        </w:tc>
+      </w:tr>
+      <w:tr>
+        <w:tc>
+          <w:tcPr>
+            <w:tcW w:type="dxa" w:w="1680"/>
+          </w:tcPr>
+          <w:p>
+            <w:pPr>
+              <w:jc w:val="left"/>
+            </w:pPr>
+            <w:r/>
+            <w:hyperlink r:id="rId141">
+              <w:r>
+                <w:rPr>
+                  <w:color w:val="0B4F9E"/>
+                  <w:sz w:val="16"/>
+                  <w:u w:val="single"/>
+                </w:rPr>
                 <w:t>Integrating Theory–Experiment Active Learning and Mechanistic Insights for High-Entropy Alloy Design Toward Efficient Al</w:t>
               </w:r>
             </w:hyperlink>
@@ -12099,7 +12311,7 @@
               <w:jc w:val="left"/>
             </w:pPr>
             <w:r/>
-            <w:hyperlink r:id="rId139">
+            <w:hyperlink r:id="rId141">
               <w:r>
                 <w:rPr>
                   <w:color w:val="0B4F9E"/>
@@ -12122,7 +12334,7 @@
               <w:jc w:val="left"/>
             </w:pPr>
             <w:r/>
-            <w:hyperlink r:id="rId140">
+            <w:hyperlink r:id="rId142">
               <w:r>
                 <w:rPr>
                   <w:color w:val="0B4F9E"/>
@@ -12205,7 +12417,7 @@
               <w:jc w:val="left"/>
             </w:pPr>
             <w:r/>
-            <w:hyperlink r:id="rId140">
+            <w:hyperlink r:id="rId142">
               <w:r>
                 <w:rPr>
                   <w:color w:val="0B4F9E"/>
@@ -12228,7 +12440,313 @@
               <w:jc w:val="left"/>
             </w:pPr>
             <w:r/>
-            <w:hyperlink r:id="rId141">
+            <w:hyperlink r:id="rId143">
+              <w:r>
+                <w:rPr>
+                  <w:color w:val="0B4F9E"/>
+                  <w:sz w:val="16"/>
+                  <w:u w:val="single"/>
+                </w:rPr>
+                <w:t>Cross-Scale Machine Learning for Polymer Materials: Linking Molecular Structure, Mesoscale Organization, Processing Hist</w:t>
+              </w:r>
+            </w:hyperlink>
+          </w:p>
+        </w:tc>
+        <w:tc>
+          <w:tcPr>
+            <w:tcW w:type="dxa" w:w="1680"/>
+          </w:tcPr>
+          <w:p>
+            <w:pPr>
+              <w:jc w:val="left"/>
+            </w:pPr>
+            <w:r/>
+          </w:p>
+        </w:tc>
+        <w:tc>
+          <w:tcPr>
+            <w:tcW w:type="dxa" w:w="1680"/>
+          </w:tcPr>
+          <w:p>
+            <w:pPr>
+              <w:jc w:val="left"/>
+            </w:pPr>
+            <w:r/>
+            <w:r>
+              <w:rPr>
+                <w:sz w:val="16"/>
+              </w:rPr>
+              <w:t>polymer</w:t>
+            </w:r>
+          </w:p>
+        </w:tc>
+        <w:tc>
+          <w:tcPr>
+            <w:tcW w:type="dxa" w:w="1680"/>
+          </w:tcPr>
+          <w:p>
+            <w:pPr>
+              <w:jc w:val="left"/>
+            </w:pPr>
+            <w:r/>
+          </w:p>
+        </w:tc>
+        <w:tc>
+          <w:tcPr>
+            <w:tcW w:type="dxa" w:w="1680"/>
+          </w:tcPr>
+          <w:p>
+            <w:pPr>
+              <w:jc w:val="left"/>
+            </w:pPr>
+            <w:r/>
+            <w:r>
+              <w:rPr>
+                <w:sz w:val="16"/>
+              </w:rPr>
+              <w:t>2026-09-08</w:t>
+            </w:r>
+          </w:p>
+        </w:tc>
+        <w:tc>
+          <w:tcPr>
+            <w:tcW w:type="dxa" w:w="1680"/>
+          </w:tcPr>
+          <w:p>
+            <w:pPr>
+              <w:jc w:val="left"/>
+            </w:pPr>
+            <w:r/>
+            <w:hyperlink r:id="rId143">
+              <w:r>
+                <w:rPr>
+                  <w:color w:val="0B4F9E"/>
+                  <w:sz w:val="16"/>
+                  <w:u w:val="single"/>
+                </w:rPr>
+                <w:t>10.1021/acsapm.6c02610</w:t>
+              </w:r>
+            </w:hyperlink>
+          </w:p>
+        </w:tc>
+      </w:tr>
+      <w:tr>
+        <w:tc>
+          <w:tcPr>
+            <w:tcW w:type="dxa" w:w="1680"/>
+          </w:tcPr>
+          <w:p>
+            <w:pPr>
+              <w:jc w:val="left"/>
+            </w:pPr>
+            <w:r/>
+            <w:hyperlink r:id="rId144">
+              <w:r>
+                <w:rPr>
+                  <w:color w:val="0B4F9E"/>
+                  <w:sz w:val="16"/>
+                  <w:u w:val="single"/>
+                </w:rPr>
+                <w:t>Cation Engineering of Cubic AGaBr3 (A = Na, K) Halide Perovskites: A First-Principles and Machine Learning Study</w:t>
+              </w:r>
+            </w:hyperlink>
+          </w:p>
+        </w:tc>
+        <w:tc>
+          <w:tcPr>
+            <w:tcW w:type="dxa" w:w="1680"/>
+          </w:tcPr>
+          <w:p>
+            <w:pPr>
+              <w:jc w:val="left"/>
+            </w:pPr>
+            <w:r/>
+          </w:p>
+        </w:tc>
+        <w:tc>
+          <w:tcPr>
+            <w:tcW w:type="dxa" w:w="1680"/>
+          </w:tcPr>
+          <w:p>
+            <w:pPr>
+              <w:jc w:val="left"/>
+            </w:pPr>
+            <w:r/>
+            <w:r>
+              <w:rPr>
+                <w:sz w:val="16"/>
+              </w:rPr>
+              <w:t>perovskite, halide perovskite</w:t>
+            </w:r>
+          </w:p>
+        </w:tc>
+        <w:tc>
+          <w:tcPr>
+            <w:tcW w:type="dxa" w:w="1680"/>
+          </w:tcPr>
+          <w:p>
+            <w:pPr>
+              <w:jc w:val="left"/>
+            </w:pPr>
+            <w:r/>
+            <w:r>
+              <w:rPr>
+                <w:sz w:val="16"/>
+              </w:rPr>
+              <w:t>DFT</w:t>
+            </w:r>
+          </w:p>
+        </w:tc>
+        <w:tc>
+          <w:tcPr>
+            <w:tcW w:type="dxa" w:w="1680"/>
+          </w:tcPr>
+          <w:p>
+            <w:pPr>
+              <w:jc w:val="left"/>
+            </w:pPr>
+            <w:r/>
+            <w:r>
+              <w:rPr>
+                <w:sz w:val="16"/>
+              </w:rPr>
+              <w:t>2026-09-08</w:t>
+            </w:r>
+          </w:p>
+        </w:tc>
+        <w:tc>
+          <w:tcPr>
+            <w:tcW w:type="dxa" w:w="1680"/>
+          </w:tcPr>
+          <w:p>
+            <w:pPr>
+              <w:jc w:val="left"/>
+            </w:pPr>
+            <w:r/>
+            <w:hyperlink r:id="rId144">
+              <w:r>
+                <w:rPr>
+                  <w:color w:val="0B4F9E"/>
+                  <w:sz w:val="16"/>
+                  <w:u w:val="single"/>
+                </w:rPr>
+                <w:t>10.1016/j.physb.2026.419329</w:t>
+              </w:r>
+            </w:hyperlink>
+          </w:p>
+        </w:tc>
+      </w:tr>
+      <w:tr>
+        <w:tc>
+          <w:tcPr>
+            <w:tcW w:type="dxa" w:w="1680"/>
+          </w:tcPr>
+          <w:p>
+            <w:pPr>
+              <w:jc w:val="left"/>
+            </w:pPr>
+            <w:r/>
+            <w:hyperlink r:id="rId145">
+              <w:r>
+                <w:rPr>
+                  <w:color w:val="0B4F9E"/>
+                  <w:sz w:val="16"/>
+                  <w:u w:val="single"/>
+                </w:rPr>
+                <w:t>Statistical and deep learning approaches for predicting degradation of polymeric materials in photovoltaics</w:t>
+              </w:r>
+            </w:hyperlink>
+          </w:p>
+        </w:tc>
+        <w:tc>
+          <w:tcPr>
+            <w:tcW w:type="dxa" w:w="1680"/>
+          </w:tcPr>
+          <w:p>
+            <w:pPr>
+              <w:jc w:val="left"/>
+            </w:pPr>
+            <w:r/>
+          </w:p>
+        </w:tc>
+        <w:tc>
+          <w:tcPr>
+            <w:tcW w:type="dxa" w:w="1680"/>
+          </w:tcPr>
+          <w:p>
+            <w:pPr>
+              <w:jc w:val="left"/>
+            </w:pPr>
+            <w:r/>
+            <w:r>
+              <w:rPr>
+                <w:sz w:val="16"/>
+              </w:rPr>
+              <w:t>photovoltaic</w:t>
+            </w:r>
+          </w:p>
+        </w:tc>
+        <w:tc>
+          <w:tcPr>
+            <w:tcW w:type="dxa" w:w="1680"/>
+          </w:tcPr>
+          <w:p>
+            <w:pPr>
+              <w:jc w:val="left"/>
+            </w:pPr>
+            <w:r/>
+          </w:p>
+        </w:tc>
+        <w:tc>
+          <w:tcPr>
+            <w:tcW w:type="dxa" w:w="1680"/>
+          </w:tcPr>
+          <w:p>
+            <w:pPr>
+              <w:jc w:val="left"/>
+            </w:pPr>
+            <w:r/>
+            <w:r>
+              <w:rPr>
+                <w:sz w:val="16"/>
+              </w:rPr>
+              <w:t>2026-09-08</w:t>
+            </w:r>
+          </w:p>
+        </w:tc>
+        <w:tc>
+          <w:tcPr>
+            <w:tcW w:type="dxa" w:w="1680"/>
+          </w:tcPr>
+          <w:p>
+            <w:pPr>
+              <w:jc w:val="left"/>
+            </w:pPr>
+            <w:r/>
+            <w:hyperlink r:id="rId145">
+              <w:r>
+                <w:rPr>
+                  <w:color w:val="0B4F9E"/>
+                  <w:sz w:val="16"/>
+                  <w:u w:val="single"/>
+                </w:rPr>
+                <w:t>10.1080/00224065.2026.2723885</w:t>
+              </w:r>
+            </w:hyperlink>
+          </w:p>
+        </w:tc>
+      </w:tr>
+      <w:tr>
+        <w:tc>
+          <w:tcPr>
+            <w:tcW w:type="dxa" w:w="1680"/>
+          </w:tcPr>
+          <w:p>
+            <w:pPr>
+              <w:jc w:val="left"/>
+            </w:pPr>
+            <w:r/>
+            <w:hyperlink r:id="rId146">
               <w:r>
                 <w:rPr>
                   <w:color w:val="0B4F9E"/>
@@ -12299,7 +12817,7 @@
               <w:jc w:val="left"/>
             </w:pPr>
             <w:r/>
-            <w:hyperlink r:id="rId141">
+            <w:hyperlink r:id="rId146">
               <w:r>
                 <w:rPr>
                   <w:color w:val="0B4F9E"/>
@@ -12322,7 +12840,7 @@
               <w:jc w:val="left"/>
             </w:pPr>
             <w:r/>
-            <w:hyperlink r:id="rId142">
+            <w:hyperlink r:id="rId147">
               <w:r>
                 <w:rPr>
                   <w:color w:val="0B4F9E"/>
@@ -12387,500 +12905,6 @@
                 <w:sz w:val="16"/>
               </w:rPr>
               <w:t>2026-08-14</w:t>
-            </w:r>
-          </w:p>
-        </w:tc>
-        <w:tc>
-          <w:tcPr>
-            <w:tcW w:type="dxa" w:w="1680"/>
-          </w:tcPr>
-          <w:p>
-            <w:pPr>
-              <w:jc w:val="left"/>
-            </w:pPr>
-            <w:r/>
-            <w:hyperlink r:id="rId142">
-              <w:r>
-                <w:rPr>
-                  <w:color w:val="0B4F9E"/>
-                  <w:sz w:val="16"/>
-                  <w:u w:val="single"/>
-                </w:rPr>
-                <w:t>link</w:t>
-              </w:r>
-            </w:hyperlink>
-          </w:p>
-        </w:tc>
-      </w:tr>
-      <w:tr>
-        <w:tc>
-          <w:tcPr>
-            <w:tcW w:type="dxa" w:w="1680"/>
-          </w:tcPr>
-          <w:p>
-            <w:pPr>
-              <w:jc w:val="left"/>
-            </w:pPr>
-            <w:r/>
-            <w:hyperlink r:id="rId143">
-              <w:r>
-                <w:rPr>
-                  <w:color w:val="0B4F9E"/>
-                  <w:sz w:val="16"/>
-                  <w:u w:val="single"/>
-                </w:rPr>
-                <w:t>The Past and Future of AI Scientists</w:t>
-              </w:r>
-            </w:hyperlink>
-          </w:p>
-        </w:tc>
-        <w:tc>
-          <w:tcPr>
-            <w:tcW w:type="dxa" w:w="1680"/>
-          </w:tcPr>
-          <w:p>
-            <w:pPr>
-              <w:jc w:val="left"/>
-            </w:pPr>
-            <w:r/>
-          </w:p>
-        </w:tc>
-        <w:tc>
-          <w:tcPr>
-            <w:tcW w:type="dxa" w:w="1680"/>
-          </w:tcPr>
-          <w:p>
-            <w:pPr>
-              <w:jc w:val="left"/>
-            </w:pPr>
-            <w:r/>
-          </w:p>
-        </w:tc>
-        <w:tc>
-          <w:tcPr>
-            <w:tcW w:type="dxa" w:w="1680"/>
-          </w:tcPr>
-          <w:p>
-            <w:pPr>
-              <w:jc w:val="left"/>
-            </w:pPr>
-            <w:r/>
-            <w:r>
-              <w:rPr>
-                <w:sz w:val="16"/>
-              </w:rPr>
-              <w:t>MLIP</w:t>
-            </w:r>
-          </w:p>
-        </w:tc>
-        <w:tc>
-          <w:tcPr>
-            <w:tcW w:type="dxa" w:w="1680"/>
-          </w:tcPr>
-          <w:p>
-            <w:pPr>
-              <w:jc w:val="left"/>
-            </w:pPr>
-            <w:r/>
-            <w:r>
-              <w:rPr>
-                <w:sz w:val="16"/>
-              </w:rPr>
-              <w:t>2026-08-14</w:t>
-            </w:r>
-          </w:p>
-        </w:tc>
-        <w:tc>
-          <w:tcPr>
-            <w:tcW w:type="dxa" w:w="1680"/>
-          </w:tcPr>
-          <w:p>
-            <w:pPr>
-              <w:jc w:val="left"/>
-            </w:pPr>
-            <w:r/>
-            <w:hyperlink r:id="rId143">
-              <w:r>
-                <w:rPr>
-                  <w:color w:val="0B4F9E"/>
-                  <w:sz w:val="16"/>
-                  <w:u w:val="single"/>
-                </w:rPr>
-                <w:t>link</w:t>
-              </w:r>
-            </w:hyperlink>
-          </w:p>
-        </w:tc>
-      </w:tr>
-      <w:tr>
-        <w:tc>
-          <w:tcPr>
-            <w:tcW w:type="dxa" w:w="1680"/>
-          </w:tcPr>
-          <w:p>
-            <w:pPr>
-              <w:jc w:val="left"/>
-            </w:pPr>
-            <w:r/>
-            <w:hyperlink r:id="rId144">
-              <w:r>
-                <w:rPr>
-                  <w:color w:val="0B4F9E"/>
-                  <w:sz w:val="16"/>
-                  <w:u w:val="single"/>
-                </w:rPr>
-                <w:t>Graph neural network prediction of temperature-dependent hydrogen diffusion and thermal conductivity tensors of tungsten</w:t>
-              </w:r>
-            </w:hyperlink>
-          </w:p>
-        </w:tc>
-        <w:tc>
-          <w:tcPr>
-            <w:tcW w:type="dxa" w:w="1680"/>
-          </w:tcPr>
-          <w:p>
-            <w:pPr>
-              <w:jc w:val="left"/>
-            </w:pPr>
-            <w:r/>
-          </w:p>
-        </w:tc>
-        <w:tc>
-          <w:tcPr>
-            <w:tcW w:type="dxa" w:w="1680"/>
-          </w:tcPr>
-          <w:p>
-            <w:pPr>
-              <w:jc w:val="left"/>
-            </w:pPr>
-            <w:r/>
-          </w:p>
-        </w:tc>
-        <w:tc>
-          <w:tcPr>
-            <w:tcW w:type="dxa" w:w="1680"/>
-          </w:tcPr>
-          <w:p>
-            <w:pPr>
-              <w:jc w:val="left"/>
-            </w:pPr>
-            <w:r/>
-            <w:r>
-              <w:rPr>
-                <w:sz w:val="16"/>
-              </w:rPr>
-              <w:t>MD</w:t>
-            </w:r>
-          </w:p>
-        </w:tc>
-        <w:tc>
-          <w:tcPr>
-            <w:tcW w:type="dxa" w:w="1680"/>
-          </w:tcPr>
-          <w:p>
-            <w:pPr>
-              <w:jc w:val="left"/>
-            </w:pPr>
-            <w:r/>
-            <w:r>
-              <w:rPr>
-                <w:sz w:val="16"/>
-              </w:rPr>
-              <w:t>2026-08-16</w:t>
-            </w:r>
-          </w:p>
-        </w:tc>
-        <w:tc>
-          <w:tcPr>
-            <w:tcW w:type="dxa" w:w="1680"/>
-          </w:tcPr>
-          <w:p>
-            <w:pPr>
-              <w:jc w:val="left"/>
-            </w:pPr>
-            <w:r/>
-            <w:hyperlink r:id="rId144">
-              <w:r>
-                <w:rPr>
-                  <w:color w:val="0B4F9E"/>
-                  <w:sz w:val="16"/>
-                  <w:u w:val="single"/>
-                </w:rPr>
-                <w:t>link</w:t>
-              </w:r>
-            </w:hyperlink>
-          </w:p>
-        </w:tc>
-      </w:tr>
-      <w:tr>
-        <w:tc>
-          <w:tcPr>
-            <w:tcW w:type="dxa" w:w="1680"/>
-          </w:tcPr>
-          <w:p>
-            <w:pPr>
-              <w:jc w:val="left"/>
-            </w:pPr>
-            <w:r/>
-            <w:hyperlink r:id="rId145">
-              <w:r>
-                <w:rPr>
-                  <w:color w:val="0B4F9E"/>
-                  <w:sz w:val="16"/>
-                  <w:u w:val="single"/>
-                </w:rPr>
-                <w:t>Machine Learning-Accelerated Band-Edge Engineering of Pnictogen Chalcohalide Solid Solutions for Solar Energy Technologi</w:t>
-              </w:r>
-            </w:hyperlink>
-          </w:p>
-        </w:tc>
-        <w:tc>
-          <w:tcPr>
-            <w:tcW w:type="dxa" w:w="1680"/>
-          </w:tcPr>
-          <w:p>
-            <w:pPr>
-              <w:jc w:val="left"/>
-            </w:pPr>
-            <w:r/>
-          </w:p>
-        </w:tc>
-        <w:tc>
-          <w:tcPr>
-            <w:tcW w:type="dxa" w:w="1680"/>
-          </w:tcPr>
-          <w:p>
-            <w:pPr>
-              <w:jc w:val="left"/>
-            </w:pPr>
-            <w:r/>
-          </w:p>
-        </w:tc>
-        <w:tc>
-          <w:tcPr>
-            <w:tcW w:type="dxa" w:w="1680"/>
-          </w:tcPr>
-          <w:p>
-            <w:pPr>
-              <w:jc w:val="left"/>
-            </w:pPr>
-            <w:r/>
-            <w:r>
-              <w:rPr>
-                <w:sz w:val="16"/>
-              </w:rPr>
-              <w:t>DFT</w:t>
-            </w:r>
-          </w:p>
-        </w:tc>
-        <w:tc>
-          <w:tcPr>
-            <w:tcW w:type="dxa" w:w="1680"/>
-          </w:tcPr>
-          <w:p>
-            <w:pPr>
-              <w:jc w:val="left"/>
-            </w:pPr>
-            <w:r/>
-            <w:r>
-              <w:rPr>
-                <w:sz w:val="16"/>
-              </w:rPr>
-              <w:t>2026-08-17</w:t>
-            </w:r>
-          </w:p>
-        </w:tc>
-        <w:tc>
-          <w:tcPr>
-            <w:tcW w:type="dxa" w:w="1680"/>
-          </w:tcPr>
-          <w:p>
-            <w:pPr>
-              <w:jc w:val="left"/>
-            </w:pPr>
-            <w:r/>
-            <w:hyperlink r:id="rId145">
-              <w:r>
-                <w:rPr>
-                  <w:color w:val="0B4F9E"/>
-                  <w:sz w:val="16"/>
-                  <w:u w:val="single"/>
-                </w:rPr>
-                <w:t>link</w:t>
-              </w:r>
-            </w:hyperlink>
-          </w:p>
-        </w:tc>
-      </w:tr>
-      <w:tr>
-        <w:tc>
-          <w:tcPr>
-            <w:tcW w:type="dxa" w:w="1680"/>
-          </w:tcPr>
-          <w:p>
-            <w:pPr>
-              <w:jc w:val="left"/>
-            </w:pPr>
-            <w:r/>
-            <w:hyperlink r:id="rId146">
-              <w:r>
-                <w:rPr>
-                  <w:color w:val="0B4F9E"/>
-                  <w:sz w:val="16"/>
-                  <w:u w:val="single"/>
-                </w:rPr>
-                <w:t xml:space="preserve">Extracting a nitrile-centered, ether-assisted motif hierarchy for lithium-battery electrolyte design from billion-scale </w:t>
-              </w:r>
-            </w:hyperlink>
-          </w:p>
-        </w:tc>
-        <w:tc>
-          <w:tcPr>
-            <w:tcW w:type="dxa" w:w="1680"/>
-          </w:tcPr>
-          <w:p>
-            <w:pPr>
-              <w:jc w:val="left"/>
-            </w:pPr>
-            <w:r/>
-          </w:p>
-        </w:tc>
-        <w:tc>
-          <w:tcPr>
-            <w:tcW w:type="dxa" w:w="1680"/>
-          </w:tcPr>
-          <w:p>
-            <w:pPr>
-              <w:jc w:val="left"/>
-            </w:pPr>
-            <w:r/>
-          </w:p>
-        </w:tc>
-        <w:tc>
-          <w:tcPr>
-            <w:tcW w:type="dxa" w:w="1680"/>
-          </w:tcPr>
-          <w:p>
-            <w:pPr>
-              <w:jc w:val="left"/>
-            </w:pPr>
-            <w:r/>
-          </w:p>
-        </w:tc>
-        <w:tc>
-          <w:tcPr>
-            <w:tcW w:type="dxa" w:w="1680"/>
-          </w:tcPr>
-          <w:p>
-            <w:pPr>
-              <w:jc w:val="left"/>
-            </w:pPr>
-            <w:r/>
-            <w:r>
-              <w:rPr>
-                <w:sz w:val="16"/>
-              </w:rPr>
-              <w:t>2026-08-17</w:t>
-            </w:r>
-          </w:p>
-        </w:tc>
-        <w:tc>
-          <w:tcPr>
-            <w:tcW w:type="dxa" w:w="1680"/>
-          </w:tcPr>
-          <w:p>
-            <w:pPr>
-              <w:jc w:val="left"/>
-            </w:pPr>
-            <w:r/>
-            <w:hyperlink r:id="rId146">
-              <w:r>
-                <w:rPr>
-                  <w:color w:val="0B4F9E"/>
-                  <w:sz w:val="16"/>
-                  <w:u w:val="single"/>
-                </w:rPr>
-                <w:t>link</w:t>
-              </w:r>
-            </w:hyperlink>
-          </w:p>
-        </w:tc>
-      </w:tr>
-      <w:tr>
-        <w:tc>
-          <w:tcPr>
-            <w:tcW w:type="dxa" w:w="1680"/>
-          </w:tcPr>
-          <w:p>
-            <w:pPr>
-              <w:jc w:val="left"/>
-            </w:pPr>
-            <w:r/>
-            <w:hyperlink r:id="rId147">
-              <w:r>
-                <w:rPr>
-                  <w:color w:val="0B4F9E"/>
-                  <w:sz w:val="16"/>
-                  <w:u w:val="single"/>
-                </w:rPr>
-                <w:t>Discovery of novel magnetic Y-Mn-B compounds via advanced machine learning guided framework</w:t>
-              </w:r>
-            </w:hyperlink>
-          </w:p>
-        </w:tc>
-        <w:tc>
-          <w:tcPr>
-            <w:tcW w:type="dxa" w:w="1680"/>
-          </w:tcPr>
-          <w:p>
-            <w:pPr>
-              <w:jc w:val="left"/>
-            </w:pPr>
-            <w:r/>
-          </w:p>
-        </w:tc>
-        <w:tc>
-          <w:tcPr>
-            <w:tcW w:type="dxa" w:w="1680"/>
-          </w:tcPr>
-          <w:p>
-            <w:pPr>
-              <w:jc w:val="left"/>
-            </w:pPr>
-            <w:r/>
-          </w:p>
-        </w:tc>
-        <w:tc>
-          <w:tcPr>
-            <w:tcW w:type="dxa" w:w="1680"/>
-          </w:tcPr>
-          <w:p>
-            <w:pPr>
-              <w:jc w:val="left"/>
-            </w:pPr>
-            <w:r/>
-            <w:r>
-              <w:rPr>
-                <w:sz w:val="16"/>
-              </w:rPr>
-              <w:t>DFT</w:t>
-            </w:r>
-          </w:p>
-        </w:tc>
-        <w:tc>
-          <w:tcPr>
-            <w:tcW w:type="dxa" w:w="1680"/>
-          </w:tcPr>
-          <w:p>
-            <w:pPr>
-              <w:jc w:val="left"/>
-            </w:pPr>
-            <w:r/>
-            <w:r>
-              <w:rPr>
-                <w:sz w:val="16"/>
-              </w:rPr>
-              <w:t>2026-08-17</w:t>
             </w:r>
           </w:p>
         </w:tc>
@@ -12923,7 +12947,7 @@
                   <w:sz w:val="16"/>
                   <w:u w:val="single"/>
                 </w:rPr>
-                <w:t>Unlocking Multi-Component Bulk-Materials Molecular Dynamics with a Small-Footprint Machine Learning Interatomic Potentia</w:t>
+                <w:t>The Past and Future of AI Scientists</w:t>
               </w:r>
             </w:hyperlink>
           </w:p>
@@ -12963,24 +12987,24 @@
               <w:rPr>
                 <w:sz w:val="16"/>
               </w:rPr>
-              <w:t>MD, MLIP</w:t>
-            </w:r>
-          </w:p>
-        </w:tc>
-        <w:tc>
-          <w:tcPr>
-            <w:tcW w:type="dxa" w:w="1680"/>
-          </w:tcPr>
-          <w:p>
-            <w:pPr>
-              <w:jc w:val="left"/>
-            </w:pPr>
-            <w:r/>
-            <w:r>
-              <w:rPr>
-                <w:sz w:val="16"/>
-              </w:rPr>
-              <w:t>2026-08-17</w:t>
+              <w:t>MLIP</w:t>
+            </w:r>
+          </w:p>
+        </w:tc>
+        <w:tc>
+          <w:tcPr>
+            <w:tcW w:type="dxa" w:w="1680"/>
+          </w:tcPr>
+          <w:p>
+            <w:pPr>
+              <w:jc w:val="left"/>
+            </w:pPr>
+            <w:r/>
+            <w:r>
+              <w:rPr>
+                <w:sz w:val="16"/>
+              </w:rPr>
+              <w:t>2026-08-14</w:t>
             </w:r>
           </w:p>
         </w:tc>
@@ -13023,7 +13047,7 @@
                   <w:sz w:val="16"/>
                   <w:u w:val="single"/>
                 </w:rPr>
-                <w:t>ChemReporter: A Framework for Curating and Exporting Large-Scale Chemical Datasets for MLIP Training</w:t>
+                <w:t>Graph neural network prediction of temperature-dependent hydrogen diffusion and thermal conductivity tensors of tungsten</w:t>
               </w:r>
             </w:hyperlink>
           </w:p>
@@ -13063,24 +13087,24 @@
               <w:rPr>
                 <w:sz w:val="16"/>
               </w:rPr>
-              <w:t>MLIP</w:t>
-            </w:r>
-          </w:p>
-        </w:tc>
-        <w:tc>
-          <w:tcPr>
-            <w:tcW w:type="dxa" w:w="1680"/>
-          </w:tcPr>
-          <w:p>
-            <w:pPr>
-              <w:jc w:val="left"/>
-            </w:pPr>
-            <w:r/>
-            <w:r>
-              <w:rPr>
-                <w:sz w:val="16"/>
-              </w:rPr>
-              <w:t>2026-08-17</w:t>
+              <w:t>MD</w:t>
+            </w:r>
+          </w:p>
+        </w:tc>
+        <w:tc>
+          <w:tcPr>
+            <w:tcW w:type="dxa" w:w="1680"/>
+          </w:tcPr>
+          <w:p>
+            <w:pPr>
+              <w:jc w:val="left"/>
+            </w:pPr>
+            <w:r/>
+            <w:r>
+              <w:rPr>
+                <w:sz w:val="16"/>
+              </w:rPr>
+              <w:t>2026-08-16</w:t>
             </w:r>
           </w:p>
         </w:tc>
@@ -13123,7 +13147,7 @@
                   <w:sz w:val="16"/>
                   <w:u w:val="single"/>
                 </w:rPr>
-                <w:t>Active learning molecular beam epitaxy of complex quantum materials</w:t>
+                <w:t>Machine Learning-Accelerated Band-Edge Engineering of Pnictogen Chalcohalide Solid Solutions for Solar Energy Technologi</w:t>
               </w:r>
             </w:hyperlink>
           </w:p>
@@ -13159,22 +13183,28 @@
               <w:jc w:val="left"/>
             </w:pPr>
             <w:r/>
-          </w:p>
-        </w:tc>
-        <w:tc>
-          <w:tcPr>
-            <w:tcW w:type="dxa" w:w="1680"/>
-          </w:tcPr>
-          <w:p>
-            <w:pPr>
-              <w:jc w:val="left"/>
-            </w:pPr>
-            <w:r/>
-            <w:r>
-              <w:rPr>
-                <w:sz w:val="16"/>
-              </w:rPr>
-              <w:t>2026-08-18</w:t>
+            <w:r>
+              <w:rPr>
+                <w:sz w:val="16"/>
+              </w:rPr>
+              <w:t>DFT</w:t>
+            </w:r>
+          </w:p>
+        </w:tc>
+        <w:tc>
+          <w:tcPr>
+            <w:tcW w:type="dxa" w:w="1680"/>
+          </w:tcPr>
+          <w:p>
+            <w:pPr>
+              <w:jc w:val="left"/>
+            </w:pPr>
+            <w:r/>
+            <w:r>
+              <w:rPr>
+                <w:sz w:val="16"/>
+              </w:rPr>
+              <w:t>2026-08-17</w:t>
             </w:r>
           </w:p>
         </w:tc>
@@ -13217,7 +13247,7 @@
                   <w:sz w:val="16"/>
                   <w:u w:val="single"/>
                 </w:rPr>
-                <w:t>PyAPX: python toolkit for atomic configuration pattern exploration</w:t>
+                <w:t xml:space="preserve">Extracting a nitrile-centered, ether-assisted motif hierarchy for lithium-battery electrolyte design from billion-scale </w:t>
               </w:r>
             </w:hyperlink>
           </w:p>
@@ -13253,28 +13283,22 @@
               <w:jc w:val="left"/>
             </w:pPr>
             <w:r/>
-            <w:r>
-              <w:rPr>
-                <w:sz w:val="16"/>
-              </w:rPr>
-              <w:t>DFT, MLIP</w:t>
-            </w:r>
-          </w:p>
-        </w:tc>
-        <w:tc>
-          <w:tcPr>
-            <w:tcW w:type="dxa" w:w="1680"/>
-          </w:tcPr>
-          <w:p>
-            <w:pPr>
-              <w:jc w:val="left"/>
-            </w:pPr>
-            <w:r/>
-            <w:r>
-              <w:rPr>
-                <w:sz w:val="16"/>
-              </w:rPr>
-              <w:t>2026-08-19</w:t>
+          </w:p>
+        </w:tc>
+        <w:tc>
+          <w:tcPr>
+            <w:tcW w:type="dxa" w:w="1680"/>
+          </w:tcPr>
+          <w:p>
+            <w:pPr>
+              <w:jc w:val="left"/>
+            </w:pPr>
+            <w:r/>
+            <w:r>
+              <w:rPr>
+                <w:sz w:val="16"/>
+              </w:rPr>
+              <w:t>2026-08-17</w:t>
             </w:r>
           </w:p>
         </w:tc>
@@ -13294,7 +13318,7 @@
                   <w:sz w:val="16"/>
                   <w:u w:val="single"/>
                 </w:rPr>
-                <w:t>10.1038/s41598-026-66072-5</w:t>
+                <w:t>link</w:t>
               </w:r>
             </w:hyperlink>
           </w:p>
@@ -13317,7 +13341,7 @@
                   <w:sz w:val="16"/>
                   <w:u w:val="single"/>
                 </w:rPr>
-                <w:t>A single design choice determines whether machine learning models of materials make physically impossible predictions</w:t>
+                <w:t>Discovery of novel magnetic Y-Mn-B compounds via advanced machine learning guided framework</w:t>
               </w:r>
             </w:hyperlink>
           </w:p>
@@ -13374,7 +13398,7 @@
               <w:rPr>
                 <w:sz w:val="16"/>
               </w:rPr>
-              <w:t>2026-08-19</w:t>
+              <w:t>2026-08-17</w:t>
             </w:r>
           </w:p>
         </w:tc>
@@ -13417,7 +13441,7 @@
                   <w:sz w:val="16"/>
                   <w:u w:val="single"/>
                 </w:rPr>
-                <w:t>Dynamic Ensembles of Phosphine-Stabilized Gold Nanoclusters</w:t>
+                <w:t>Unlocking Multi-Component Bulk-Materials Molecular Dynamics with a Small-Footprint Machine Learning Interatomic Potentia</w:t>
               </w:r>
             </w:hyperlink>
           </w:p>
@@ -13474,7 +13498,7 @@
               <w:rPr>
                 <w:sz w:val="16"/>
               </w:rPr>
-              <w:t>2026-08-19</w:t>
+              <w:t>2026-08-17</w:t>
             </w:r>
           </w:p>
         </w:tc>
@@ -13517,6 +13541,500 @@
                   <w:sz w:val="16"/>
                   <w:u w:val="single"/>
                 </w:rPr>
+                <w:t>ChemReporter: A Framework for Curating and Exporting Large-Scale Chemical Datasets for MLIP Training</w:t>
+              </w:r>
+            </w:hyperlink>
+          </w:p>
+        </w:tc>
+        <w:tc>
+          <w:tcPr>
+            <w:tcW w:type="dxa" w:w="1680"/>
+          </w:tcPr>
+          <w:p>
+            <w:pPr>
+              <w:jc w:val="left"/>
+            </w:pPr>
+            <w:r/>
+          </w:p>
+        </w:tc>
+        <w:tc>
+          <w:tcPr>
+            <w:tcW w:type="dxa" w:w="1680"/>
+          </w:tcPr>
+          <w:p>
+            <w:pPr>
+              <w:jc w:val="left"/>
+            </w:pPr>
+            <w:r/>
+          </w:p>
+        </w:tc>
+        <w:tc>
+          <w:tcPr>
+            <w:tcW w:type="dxa" w:w="1680"/>
+          </w:tcPr>
+          <w:p>
+            <w:pPr>
+              <w:jc w:val="left"/>
+            </w:pPr>
+            <w:r/>
+            <w:r>
+              <w:rPr>
+                <w:sz w:val="16"/>
+              </w:rPr>
+              <w:t>MLIP</w:t>
+            </w:r>
+          </w:p>
+        </w:tc>
+        <w:tc>
+          <w:tcPr>
+            <w:tcW w:type="dxa" w:w="1680"/>
+          </w:tcPr>
+          <w:p>
+            <w:pPr>
+              <w:jc w:val="left"/>
+            </w:pPr>
+            <w:r/>
+            <w:r>
+              <w:rPr>
+                <w:sz w:val="16"/>
+              </w:rPr>
+              <w:t>2026-08-17</w:t>
+            </w:r>
+          </w:p>
+        </w:tc>
+        <w:tc>
+          <w:tcPr>
+            <w:tcW w:type="dxa" w:w="1680"/>
+          </w:tcPr>
+          <w:p>
+            <w:pPr>
+              <w:jc w:val="left"/>
+            </w:pPr>
+            <w:r/>
+            <w:hyperlink r:id="rId154">
+              <w:r>
+                <w:rPr>
+                  <w:color w:val="0B4F9E"/>
+                  <w:sz w:val="16"/>
+                  <w:u w:val="single"/>
+                </w:rPr>
+                <w:t>link</w:t>
+              </w:r>
+            </w:hyperlink>
+          </w:p>
+        </w:tc>
+      </w:tr>
+      <w:tr>
+        <w:tc>
+          <w:tcPr>
+            <w:tcW w:type="dxa" w:w="1680"/>
+          </w:tcPr>
+          <w:p>
+            <w:pPr>
+              <w:jc w:val="left"/>
+            </w:pPr>
+            <w:r/>
+            <w:hyperlink r:id="rId155">
+              <w:r>
+                <w:rPr>
+                  <w:color w:val="0B4F9E"/>
+                  <w:sz w:val="16"/>
+                  <w:u w:val="single"/>
+                </w:rPr>
+                <w:t>Active learning molecular beam epitaxy of complex quantum materials</w:t>
+              </w:r>
+            </w:hyperlink>
+          </w:p>
+        </w:tc>
+        <w:tc>
+          <w:tcPr>
+            <w:tcW w:type="dxa" w:w="1680"/>
+          </w:tcPr>
+          <w:p>
+            <w:pPr>
+              <w:jc w:val="left"/>
+            </w:pPr>
+            <w:r/>
+          </w:p>
+        </w:tc>
+        <w:tc>
+          <w:tcPr>
+            <w:tcW w:type="dxa" w:w="1680"/>
+          </w:tcPr>
+          <w:p>
+            <w:pPr>
+              <w:jc w:val="left"/>
+            </w:pPr>
+            <w:r/>
+          </w:p>
+        </w:tc>
+        <w:tc>
+          <w:tcPr>
+            <w:tcW w:type="dxa" w:w="1680"/>
+          </w:tcPr>
+          <w:p>
+            <w:pPr>
+              <w:jc w:val="left"/>
+            </w:pPr>
+            <w:r/>
+          </w:p>
+        </w:tc>
+        <w:tc>
+          <w:tcPr>
+            <w:tcW w:type="dxa" w:w="1680"/>
+          </w:tcPr>
+          <w:p>
+            <w:pPr>
+              <w:jc w:val="left"/>
+            </w:pPr>
+            <w:r/>
+            <w:r>
+              <w:rPr>
+                <w:sz w:val="16"/>
+              </w:rPr>
+              <w:t>2026-08-18</w:t>
+            </w:r>
+          </w:p>
+        </w:tc>
+        <w:tc>
+          <w:tcPr>
+            <w:tcW w:type="dxa" w:w="1680"/>
+          </w:tcPr>
+          <w:p>
+            <w:pPr>
+              <w:jc w:val="left"/>
+            </w:pPr>
+            <w:r/>
+            <w:hyperlink r:id="rId155">
+              <w:r>
+                <w:rPr>
+                  <w:color w:val="0B4F9E"/>
+                  <w:sz w:val="16"/>
+                  <w:u w:val="single"/>
+                </w:rPr>
+                <w:t>link</w:t>
+              </w:r>
+            </w:hyperlink>
+          </w:p>
+        </w:tc>
+      </w:tr>
+      <w:tr>
+        <w:tc>
+          <w:tcPr>
+            <w:tcW w:type="dxa" w:w="1680"/>
+          </w:tcPr>
+          <w:p>
+            <w:pPr>
+              <w:jc w:val="left"/>
+            </w:pPr>
+            <w:r/>
+            <w:hyperlink r:id="rId156">
+              <w:r>
+                <w:rPr>
+                  <w:color w:val="0B4F9E"/>
+                  <w:sz w:val="16"/>
+                  <w:u w:val="single"/>
+                </w:rPr>
+                <w:t>PyAPX: python toolkit for atomic configuration pattern exploration</w:t>
+              </w:r>
+            </w:hyperlink>
+          </w:p>
+        </w:tc>
+        <w:tc>
+          <w:tcPr>
+            <w:tcW w:type="dxa" w:w="1680"/>
+          </w:tcPr>
+          <w:p>
+            <w:pPr>
+              <w:jc w:val="left"/>
+            </w:pPr>
+            <w:r/>
+          </w:p>
+        </w:tc>
+        <w:tc>
+          <w:tcPr>
+            <w:tcW w:type="dxa" w:w="1680"/>
+          </w:tcPr>
+          <w:p>
+            <w:pPr>
+              <w:jc w:val="left"/>
+            </w:pPr>
+            <w:r/>
+          </w:p>
+        </w:tc>
+        <w:tc>
+          <w:tcPr>
+            <w:tcW w:type="dxa" w:w="1680"/>
+          </w:tcPr>
+          <w:p>
+            <w:pPr>
+              <w:jc w:val="left"/>
+            </w:pPr>
+            <w:r/>
+            <w:r>
+              <w:rPr>
+                <w:sz w:val="16"/>
+              </w:rPr>
+              <w:t>DFT, MLIP</w:t>
+            </w:r>
+          </w:p>
+        </w:tc>
+        <w:tc>
+          <w:tcPr>
+            <w:tcW w:type="dxa" w:w="1680"/>
+          </w:tcPr>
+          <w:p>
+            <w:pPr>
+              <w:jc w:val="left"/>
+            </w:pPr>
+            <w:r/>
+            <w:r>
+              <w:rPr>
+                <w:sz w:val="16"/>
+              </w:rPr>
+              <w:t>2026-08-19</w:t>
+            </w:r>
+          </w:p>
+        </w:tc>
+        <w:tc>
+          <w:tcPr>
+            <w:tcW w:type="dxa" w:w="1680"/>
+          </w:tcPr>
+          <w:p>
+            <w:pPr>
+              <w:jc w:val="left"/>
+            </w:pPr>
+            <w:r/>
+            <w:hyperlink r:id="rId156">
+              <w:r>
+                <w:rPr>
+                  <w:color w:val="0B4F9E"/>
+                  <w:sz w:val="16"/>
+                  <w:u w:val="single"/>
+                </w:rPr>
+                <w:t>10.1038/s41598-026-66072-5</w:t>
+              </w:r>
+            </w:hyperlink>
+          </w:p>
+        </w:tc>
+      </w:tr>
+      <w:tr>
+        <w:tc>
+          <w:tcPr>
+            <w:tcW w:type="dxa" w:w="1680"/>
+          </w:tcPr>
+          <w:p>
+            <w:pPr>
+              <w:jc w:val="left"/>
+            </w:pPr>
+            <w:r/>
+            <w:hyperlink r:id="rId157">
+              <w:r>
+                <w:rPr>
+                  <w:color w:val="0B4F9E"/>
+                  <w:sz w:val="16"/>
+                  <w:u w:val="single"/>
+                </w:rPr>
+                <w:t>A single design choice determines whether machine learning models of materials make physically impossible predictions</w:t>
+              </w:r>
+            </w:hyperlink>
+          </w:p>
+        </w:tc>
+        <w:tc>
+          <w:tcPr>
+            <w:tcW w:type="dxa" w:w="1680"/>
+          </w:tcPr>
+          <w:p>
+            <w:pPr>
+              <w:jc w:val="left"/>
+            </w:pPr>
+            <w:r/>
+          </w:p>
+        </w:tc>
+        <w:tc>
+          <w:tcPr>
+            <w:tcW w:type="dxa" w:w="1680"/>
+          </w:tcPr>
+          <w:p>
+            <w:pPr>
+              <w:jc w:val="left"/>
+            </w:pPr>
+            <w:r/>
+          </w:p>
+        </w:tc>
+        <w:tc>
+          <w:tcPr>
+            <w:tcW w:type="dxa" w:w="1680"/>
+          </w:tcPr>
+          <w:p>
+            <w:pPr>
+              <w:jc w:val="left"/>
+            </w:pPr>
+            <w:r/>
+            <w:r>
+              <w:rPr>
+                <w:sz w:val="16"/>
+              </w:rPr>
+              <w:t>DFT</w:t>
+            </w:r>
+          </w:p>
+        </w:tc>
+        <w:tc>
+          <w:tcPr>
+            <w:tcW w:type="dxa" w:w="1680"/>
+          </w:tcPr>
+          <w:p>
+            <w:pPr>
+              <w:jc w:val="left"/>
+            </w:pPr>
+            <w:r/>
+            <w:r>
+              <w:rPr>
+                <w:sz w:val="16"/>
+              </w:rPr>
+              <w:t>2026-08-19</w:t>
+            </w:r>
+          </w:p>
+        </w:tc>
+        <w:tc>
+          <w:tcPr>
+            <w:tcW w:type="dxa" w:w="1680"/>
+          </w:tcPr>
+          <w:p>
+            <w:pPr>
+              <w:jc w:val="left"/>
+            </w:pPr>
+            <w:r/>
+            <w:hyperlink r:id="rId157">
+              <w:r>
+                <w:rPr>
+                  <w:color w:val="0B4F9E"/>
+                  <w:sz w:val="16"/>
+                  <w:u w:val="single"/>
+                </w:rPr>
+                <w:t>link</w:t>
+              </w:r>
+            </w:hyperlink>
+          </w:p>
+        </w:tc>
+      </w:tr>
+      <w:tr>
+        <w:tc>
+          <w:tcPr>
+            <w:tcW w:type="dxa" w:w="1680"/>
+          </w:tcPr>
+          <w:p>
+            <w:pPr>
+              <w:jc w:val="left"/>
+            </w:pPr>
+            <w:r/>
+            <w:hyperlink r:id="rId158">
+              <w:r>
+                <w:rPr>
+                  <w:color w:val="0B4F9E"/>
+                  <w:sz w:val="16"/>
+                  <w:u w:val="single"/>
+                </w:rPr>
+                <w:t>Dynamic Ensembles of Phosphine-Stabilized Gold Nanoclusters</w:t>
+              </w:r>
+            </w:hyperlink>
+          </w:p>
+        </w:tc>
+        <w:tc>
+          <w:tcPr>
+            <w:tcW w:type="dxa" w:w="1680"/>
+          </w:tcPr>
+          <w:p>
+            <w:pPr>
+              <w:jc w:val="left"/>
+            </w:pPr>
+            <w:r/>
+          </w:p>
+        </w:tc>
+        <w:tc>
+          <w:tcPr>
+            <w:tcW w:type="dxa" w:w="1680"/>
+          </w:tcPr>
+          <w:p>
+            <w:pPr>
+              <w:jc w:val="left"/>
+            </w:pPr>
+            <w:r/>
+          </w:p>
+        </w:tc>
+        <w:tc>
+          <w:tcPr>
+            <w:tcW w:type="dxa" w:w="1680"/>
+          </w:tcPr>
+          <w:p>
+            <w:pPr>
+              <w:jc w:val="left"/>
+            </w:pPr>
+            <w:r/>
+            <w:r>
+              <w:rPr>
+                <w:sz w:val="16"/>
+              </w:rPr>
+              <w:t>MD, MLIP</w:t>
+            </w:r>
+          </w:p>
+        </w:tc>
+        <w:tc>
+          <w:tcPr>
+            <w:tcW w:type="dxa" w:w="1680"/>
+          </w:tcPr>
+          <w:p>
+            <w:pPr>
+              <w:jc w:val="left"/>
+            </w:pPr>
+            <w:r/>
+            <w:r>
+              <w:rPr>
+                <w:sz w:val="16"/>
+              </w:rPr>
+              <w:t>2026-08-19</w:t>
+            </w:r>
+          </w:p>
+        </w:tc>
+        <w:tc>
+          <w:tcPr>
+            <w:tcW w:type="dxa" w:w="1680"/>
+          </w:tcPr>
+          <w:p>
+            <w:pPr>
+              <w:jc w:val="left"/>
+            </w:pPr>
+            <w:r/>
+            <w:hyperlink r:id="rId158">
+              <w:r>
+                <w:rPr>
+                  <w:color w:val="0B4F9E"/>
+                  <w:sz w:val="16"/>
+                  <w:u w:val="single"/>
+                </w:rPr>
+                <w:t>link</w:t>
+              </w:r>
+            </w:hyperlink>
+          </w:p>
+        </w:tc>
+      </w:tr>
+      <w:tr>
+        <w:tc>
+          <w:tcPr>
+            <w:tcW w:type="dxa" w:w="1680"/>
+          </w:tcPr>
+          <w:p>
+            <w:pPr>
+              <w:jc w:val="left"/>
+            </w:pPr>
+            <w:r/>
+            <w:hyperlink r:id="rId159">
+              <w:r>
+                <w:rPr>
+                  <w:color w:val="0B4F9E"/>
+                  <w:sz w:val="16"/>
+                  <w:u w:val="single"/>
+                </w:rPr>
                 <w:t>Generative AI and Emerging Technologies: Transforming Engineering, Innovation and Entrepreneurship</w:t>
               </w:r>
             </w:hyperlink>
@@ -13581,7 +14099,7 @@
               <w:jc w:val="left"/>
             </w:pPr>
             <w:r/>
-            <w:hyperlink r:id="rId154">
+            <w:hyperlink r:id="rId159">
               <w:r>
                 <w:rPr>
                   <w:color w:val="0B4F9E"/>
@@ -13604,7 +14122,7 @@
               <w:jc w:val="left"/>
             </w:pPr>
             <w:r/>
-            <w:hyperlink r:id="rId155">
+            <w:hyperlink r:id="rId160">
               <w:r>
                 <w:rPr>
                   <w:color w:val="0B4F9E"/>
@@ -13681,7 +14199,7 @@
               <w:jc w:val="left"/>
             </w:pPr>
             <w:r/>
-            <w:hyperlink r:id="rId155">
+            <w:hyperlink r:id="rId160">
               <w:r>
                 <w:rPr>
                   <w:color w:val="0B4F9E"/>
@@ -13704,7 +14222,7 @@
               <w:jc w:val="left"/>
             </w:pPr>
             <w:r/>
-            <w:hyperlink r:id="rId156">
+            <w:hyperlink r:id="rId161">
               <w:r>
                 <w:rPr>
                   <w:color w:val="0B4F9E"/>
@@ -13775,7 +14293,7 @@
               <w:jc w:val="left"/>
             </w:pPr>
             <w:r/>
-            <w:hyperlink r:id="rId156">
+            <w:hyperlink r:id="rId161">
               <w:r>
                 <w:rPr>
                   <w:color w:val="0B4F9E"/>
@@ -13798,7 +14316,7 @@
               <w:jc w:val="left"/>
             </w:pPr>
             <w:r/>
-            <w:hyperlink r:id="rId157">
+            <w:hyperlink r:id="rId162">
               <w:r>
                 <w:rPr>
                   <w:color w:val="0B4F9E"/>
@@ -13869,7 +14387,7 @@
               <w:jc w:val="left"/>
             </w:pPr>
             <w:r/>
-            <w:hyperlink r:id="rId157">
+            <w:hyperlink r:id="rId162">
               <w:r>
                 <w:rPr>
                   <w:color w:val="0B4F9E"/>
@@ -13892,7 +14410,7 @@
               <w:jc w:val="left"/>
             </w:pPr>
             <w:r/>
-            <w:hyperlink r:id="rId158">
+            <w:hyperlink r:id="rId163">
               <w:r>
                 <w:rPr>
                   <w:color w:val="0B4F9E"/>
@@ -13969,7 +14487,7 @@
               <w:jc w:val="left"/>
             </w:pPr>
             <w:r/>
-            <w:hyperlink r:id="rId158">
+            <w:hyperlink r:id="rId163">
               <w:r>
                 <w:rPr>
                   <w:color w:val="0B4F9E"/>
@@ -13992,7 +14510,7 @@
               <w:jc w:val="left"/>
             </w:pPr>
             <w:r/>
-            <w:hyperlink r:id="rId159">
+            <w:hyperlink r:id="rId164">
               <w:r>
                 <w:rPr>
                   <w:color w:val="0B4F9E"/>
@@ -14069,7 +14587,7 @@
               <w:jc w:val="left"/>
             </w:pPr>
             <w:r/>
-            <w:hyperlink r:id="rId159">
+            <w:hyperlink r:id="rId164">
               <w:r>
                 <w:rPr>
                   <w:color w:val="0B4F9E"/>
@@ -14092,7 +14610,7 @@
               <w:jc w:val="left"/>
             </w:pPr>
             <w:r/>
-            <w:hyperlink r:id="rId160">
+            <w:hyperlink r:id="rId165">
               <w:r>
                 <w:rPr>
                   <w:color w:val="0B4F9E"/>
@@ -14163,7 +14681,7 @@
               <w:jc w:val="left"/>
             </w:pPr>
             <w:r/>
-            <w:hyperlink r:id="rId160">
+            <w:hyperlink r:id="rId165">
               <w:r>
                 <w:rPr>
                   <w:color w:val="0B4F9E"/>
@@ -14186,7 +14704,7 @@
               <w:jc w:val="left"/>
             </w:pPr>
             <w:r/>
-            <w:hyperlink r:id="rId161">
+            <w:hyperlink r:id="rId166">
               <w:r>
                 <w:rPr>
                   <w:color w:val="0B4F9E"/>
@@ -14263,7 +14781,7 @@
               <w:jc w:val="left"/>
             </w:pPr>
             <w:r/>
-            <w:hyperlink r:id="rId161">
+            <w:hyperlink r:id="rId166">
               <w:r>
                 <w:rPr>
                   <w:color w:val="0B4F9E"/>
@@ -14286,7 +14804,7 @@
               <w:jc w:val="left"/>
             </w:pPr>
             <w:r/>
-            <w:hyperlink r:id="rId162">
+            <w:hyperlink r:id="rId167">
               <w:r>
                 <w:rPr>
                   <w:color w:val="0B4F9E"/>
@@ -14357,7 +14875,7 @@
               <w:jc w:val="left"/>
             </w:pPr>
             <w:r/>
-            <w:hyperlink r:id="rId162">
+            <w:hyperlink r:id="rId167">
               <w:r>
                 <w:rPr>
                   <w:color w:val="0B4F9E"/>
@@ -14380,7 +14898,7 @@
               <w:jc w:val="left"/>
             </w:pPr>
             <w:r/>
-            <w:hyperlink r:id="rId163">
+            <w:hyperlink r:id="rId168">
               <w:r>
                 <w:rPr>
                   <w:color w:val="0B4F9E"/>
@@ -14451,7 +14969,7 @@
               <w:jc w:val="left"/>
             </w:pPr>
             <w:r/>
-            <w:hyperlink r:id="rId164">
+            <w:hyperlink r:id="rId169">
               <w:r>
                 <w:rPr>
                   <w:color w:val="0B4F9E"/>
@@ -14474,7 +14992,7 @@
               <w:jc w:val="left"/>
             </w:pPr>
             <w:r/>
-            <w:hyperlink r:id="rId165">
+            <w:hyperlink r:id="rId170">
               <w:r>
                 <w:rPr>
                   <w:color w:val="0B4F9E"/>
@@ -14545,7 +15063,7 @@
               <w:jc w:val="left"/>
             </w:pPr>
             <w:r/>
-            <w:hyperlink r:id="rId165">
+            <w:hyperlink r:id="rId170">
               <w:r>
                 <w:rPr>
                   <w:color w:val="0B4F9E"/>
@@ -14568,7 +15086,7 @@
               <w:jc w:val="left"/>
             </w:pPr>
             <w:r/>
-            <w:hyperlink r:id="rId166">
+            <w:hyperlink r:id="rId171">
               <w:r>
                 <w:rPr>
                   <w:color w:val="0B4F9E"/>
@@ -14645,7 +15163,7 @@
               <w:jc w:val="left"/>
             </w:pPr>
             <w:r/>
-            <w:hyperlink r:id="rId166">
+            <w:hyperlink r:id="rId171">
               <w:r>
                 <w:rPr>
                   <w:color w:val="0B4F9E"/>
@@ -14668,7 +15186,7 @@
               <w:jc w:val="left"/>
             </w:pPr>
             <w:r/>
-            <w:hyperlink r:id="rId167">
+            <w:hyperlink r:id="rId172">
               <w:r>
                 <w:rPr>
                   <w:color w:val="0B4F9E"/>
@@ -14745,7 +15263,7 @@
               <w:jc w:val="left"/>
             </w:pPr>
             <w:r/>
-            <w:hyperlink r:id="rId167">
+            <w:hyperlink r:id="rId172">
               <w:r>
                 <w:rPr>
                   <w:color w:val="0B4F9E"/>
@@ -14768,7 +15286,7 @@
               <w:jc w:val="left"/>
             </w:pPr>
             <w:r/>
-            <w:hyperlink r:id="rId168">
+            <w:hyperlink r:id="rId173">
               <w:r>
                 <w:rPr>
                   <w:color w:val="0B4F9E"/>
@@ -14845,7 +15363,7 @@
               <w:jc w:val="left"/>
             </w:pPr>
             <w:r/>
-            <w:hyperlink r:id="rId168">
+            <w:hyperlink r:id="rId173">
               <w:r>
                 <w:rPr>
                   <w:color w:val="0B4F9E"/>
@@ -14868,7 +15386,7 @@
               <w:jc w:val="left"/>
             </w:pPr>
             <w:r/>
-            <w:hyperlink r:id="rId169">
+            <w:hyperlink r:id="rId174">
               <w:r>
                 <w:rPr>
                   <w:color w:val="0B4F9E"/>
@@ -14945,7 +15463,7 @@
               <w:jc w:val="left"/>
             </w:pPr>
             <w:r/>
-            <w:hyperlink r:id="rId169">
+            <w:hyperlink r:id="rId174">
               <w:r>
                 <w:rPr>
                   <w:color w:val="0B4F9E"/>
@@ -14968,7 +15486,7 @@
               <w:jc w:val="left"/>
             </w:pPr>
             <w:r/>
-            <w:hyperlink r:id="rId170">
+            <w:hyperlink r:id="rId175">
               <w:r>
                 <w:rPr>
                   <w:color w:val="0B4F9E"/>
@@ -15039,7 +15557,7 @@
               <w:jc w:val="left"/>
             </w:pPr>
             <w:r/>
-            <w:hyperlink r:id="rId170">
+            <w:hyperlink r:id="rId175">
               <w:r>
                 <w:rPr>
                   <w:color w:val="0B4F9E"/>
@@ -15062,7 +15580,7 @@
               <w:jc w:val="left"/>
             </w:pPr>
             <w:r/>
-            <w:hyperlink r:id="rId171">
+            <w:hyperlink r:id="rId176">
               <w:r>
                 <w:rPr>
                   <w:color w:val="0B4F9E"/>
@@ -15133,7 +15651,7 @@
               <w:jc w:val="left"/>
             </w:pPr>
             <w:r/>
-            <w:hyperlink r:id="rId171">
+            <w:hyperlink r:id="rId176">
               <w:r>
                 <w:rPr>
                   <w:color w:val="0B4F9E"/>
@@ -15156,7 +15674,7 @@
               <w:jc w:val="left"/>
             </w:pPr>
             <w:r/>
-            <w:hyperlink r:id="rId172">
+            <w:hyperlink r:id="rId177">
               <w:r>
                 <w:rPr>
                   <w:color w:val="0B4F9E"/>
@@ -15227,7 +15745,7 @@
               <w:jc w:val="left"/>
             </w:pPr>
             <w:r/>
-            <w:hyperlink r:id="rId172">
+            <w:hyperlink r:id="rId177">
               <w:r>
                 <w:rPr>
                   <w:color w:val="0B4F9E"/>
@@ -15250,7 +15768,7 @@
               <w:jc w:val="left"/>
             </w:pPr>
             <w:r/>
-            <w:hyperlink r:id="rId173">
+            <w:hyperlink r:id="rId178">
               <w:r>
                 <w:rPr>
                   <w:color w:val="0B4F9E"/>
@@ -15321,7 +15839,7 @@
               <w:jc w:val="left"/>
             </w:pPr>
             <w:r/>
-            <w:hyperlink r:id="rId173">
+            <w:hyperlink r:id="rId178">
               <w:r>
                 <w:rPr>
                   <w:color w:val="0B4F9E"/>
@@ -15344,7 +15862,7 @@
               <w:jc w:val="left"/>
             </w:pPr>
             <w:r/>
-            <w:hyperlink r:id="rId174">
+            <w:hyperlink r:id="rId179">
               <w:r>
                 <w:rPr>
                   <w:color w:val="0B4F9E"/>
@@ -15421,7 +15939,7 @@
               <w:jc w:val="left"/>
             </w:pPr>
             <w:r/>
-            <w:hyperlink r:id="rId174">
+            <w:hyperlink r:id="rId179">
               <w:r>
                 <w:rPr>
                   <w:color w:val="0B4F9E"/>
@@ -15444,7 +15962,7 @@
               <w:jc w:val="left"/>
             </w:pPr>
             <w:r/>
-            <w:hyperlink r:id="rId175">
+            <w:hyperlink r:id="rId180">
               <w:r>
                 <w:rPr>
                   <w:color w:val="0B4F9E"/>
@@ -15515,7 +16033,7 @@
               <w:jc w:val="left"/>
             </w:pPr>
             <w:r/>
-            <w:hyperlink r:id="rId176">
+            <w:hyperlink r:id="rId181">
               <w:r>
                 <w:rPr>
                   <w:color w:val="0B4F9E"/>
@@ -15538,7 +16056,7 @@
               <w:jc w:val="left"/>
             </w:pPr>
             <w:r/>
-            <w:hyperlink r:id="rId177">
+            <w:hyperlink r:id="rId182">
               <w:r>
                 <w:rPr>
                   <w:color w:val="0B4F9E"/>
@@ -15615,7 +16133,7 @@
               <w:jc w:val="left"/>
             </w:pPr>
             <w:r/>
-            <w:hyperlink r:id="rId177">
+            <w:hyperlink r:id="rId182">
               <w:r>
                 <w:rPr>
                   <w:color w:val="0B4F9E"/>
@@ -15638,7 +16156,7 @@
               <w:jc w:val="left"/>
             </w:pPr>
             <w:r/>
-            <w:hyperlink r:id="rId178">
+            <w:hyperlink r:id="rId183">
               <w:r>
                 <w:rPr>
                   <w:color w:val="0B4F9E"/>
@@ -15715,7 +16233,7 @@
               <w:jc w:val="left"/>
             </w:pPr>
             <w:r/>
-            <w:hyperlink r:id="rId178">
+            <w:hyperlink r:id="rId183">
               <w:r>
                 <w:rPr>
                   <w:color w:val="0B4F9E"/>
@@ -15738,7 +16256,7 @@
               <w:jc w:val="left"/>
             </w:pPr>
             <w:r/>
-            <w:hyperlink r:id="rId179">
+            <w:hyperlink r:id="rId184">
               <w:r>
                 <w:rPr>
                   <w:color w:val="0B4F9E"/>
@@ -15809,7 +16327,7 @@
               <w:jc w:val="left"/>
             </w:pPr>
             <w:r/>
-            <w:hyperlink r:id="rId179">
+            <w:hyperlink r:id="rId184">
               <w:r>
                 <w:rPr>
                   <w:color w:val="0B4F9E"/>
@@ -15832,7 +16350,7 @@
               <w:jc w:val="left"/>
             </w:pPr>
             <w:r/>
-            <w:hyperlink r:id="rId180">
+            <w:hyperlink r:id="rId185">
               <w:r>
                 <w:rPr>
                   <w:color w:val="0B4F9E"/>
@@ -15909,7 +16427,7 @@
               <w:jc w:val="left"/>
             </w:pPr>
             <w:r/>
-            <w:hyperlink r:id="rId180">
+            <w:hyperlink r:id="rId185">
               <w:r>
                 <w:rPr>
                   <w:color w:val="0B4F9E"/>
@@ -15932,7 +16450,7 @@
               <w:jc w:val="left"/>
             </w:pPr>
             <w:r/>
-            <w:hyperlink r:id="rId181">
+            <w:hyperlink r:id="rId186">
               <w:r>
                 <w:rPr>
                   <w:color w:val="0B4F9E"/>
@@ -16003,7 +16521,7 @@
               <w:jc w:val="left"/>
             </w:pPr>
             <w:r/>
-            <w:hyperlink r:id="rId181">
+            <w:hyperlink r:id="rId186">
               <w:r>
                 <w:rPr>
                   <w:color w:val="0B4F9E"/>
@@ -16026,7 +16544,7 @@
               <w:jc w:val="left"/>
             </w:pPr>
             <w:r/>
-            <w:hyperlink r:id="rId182">
+            <w:hyperlink r:id="rId187">
               <w:r>
                 <w:rPr>
                   <w:color w:val="0B4F9E"/>
@@ -16097,7 +16615,7 @@
               <w:jc w:val="left"/>
             </w:pPr>
             <w:r/>
-            <w:hyperlink r:id="rId182">
+            <w:hyperlink r:id="rId187">
               <w:r>
                 <w:rPr>
                   <w:color w:val="0B4F9E"/>
@@ -16120,7 +16638,7 @@
               <w:jc w:val="left"/>
             </w:pPr>
             <w:r/>
-            <w:hyperlink r:id="rId183">
+            <w:hyperlink r:id="rId188">
               <w:r>
                 <w:rPr>
                   <w:color w:val="0B4F9E"/>
@@ -16191,7 +16709,7 @@
               <w:jc w:val="left"/>
             </w:pPr>
             <w:r/>
-            <w:hyperlink r:id="rId183">
+            <w:hyperlink r:id="rId188">
               <w:r>
                 <w:rPr>
                   <w:color w:val="0B4F9E"/>
@@ -16214,7 +16732,7 @@
               <w:jc w:val="left"/>
             </w:pPr>
             <w:r/>
-            <w:hyperlink r:id="rId184">
+            <w:hyperlink r:id="rId189">
               <w:r>
                 <w:rPr>
                   <w:color w:val="0B4F9E"/>
@@ -16291,7 +16809,7 @@
               <w:jc w:val="left"/>
             </w:pPr>
             <w:r/>
-            <w:hyperlink r:id="rId184">
+            <w:hyperlink r:id="rId189">
               <w:r>
                 <w:rPr>
                   <w:color w:val="0B4F9E"/>
@@ -16314,7 +16832,7 @@
               <w:jc w:val="left"/>
             </w:pPr>
             <w:r/>
-            <w:hyperlink r:id="rId185">
+            <w:hyperlink r:id="rId190">
               <w:r>
                 <w:rPr>
                   <w:color w:val="0B4F9E"/>
@@ -16391,7 +16909,7 @@
               <w:jc w:val="left"/>
             </w:pPr>
             <w:r/>
-            <w:hyperlink r:id="rId185">
+            <w:hyperlink r:id="rId190">
               <w:r>
                 <w:rPr>
                   <w:color w:val="0B4F9E"/>
@@ -16414,7 +16932,7 @@
               <w:jc w:val="left"/>
             </w:pPr>
             <w:r/>
-            <w:hyperlink r:id="rId186">
+            <w:hyperlink r:id="rId191">
               <w:r>
                 <w:rPr>
                   <w:color w:val="0B4F9E"/>
@@ -16491,7 +17009,7 @@
               <w:jc w:val="left"/>
             </w:pPr>
             <w:r/>
-            <w:hyperlink r:id="rId186">
+            <w:hyperlink r:id="rId191">
               <w:r>
                 <w:rPr>
                   <w:color w:val="0B4F9E"/>
@@ -16514,7 +17032,7 @@
               <w:jc w:val="left"/>
             </w:pPr>
             <w:r/>
-            <w:hyperlink r:id="rId187">
+            <w:hyperlink r:id="rId192">
               <w:r>
                 <w:rPr>
                   <w:color w:val="0B4F9E"/>
@@ -16591,7 +17109,7 @@
               <w:jc w:val="left"/>
             </w:pPr>
             <w:r/>
-            <w:hyperlink r:id="rId187">
+            <w:hyperlink r:id="rId192">
               <w:r>
                 <w:rPr>
                   <w:color w:val="0B4F9E"/>
@@ -16614,7 +17132,7 @@
               <w:jc w:val="left"/>
             </w:pPr>
             <w:r/>
-            <w:hyperlink r:id="rId188">
+            <w:hyperlink r:id="rId193">
               <w:r>
                 <w:rPr>
                   <w:color w:val="0B4F9E"/>
@@ -16691,7 +17209,7 @@
               <w:jc w:val="left"/>
             </w:pPr>
             <w:r/>
-            <w:hyperlink r:id="rId188">
+            <w:hyperlink r:id="rId193">
               <w:r>
                 <w:rPr>
                   <w:color w:val="0B4F9E"/>
@@ -16714,7 +17232,7 @@
               <w:jc w:val="left"/>
             </w:pPr>
             <w:r/>
-            <w:hyperlink r:id="rId189">
+            <w:hyperlink r:id="rId194">
               <w:r>
                 <w:rPr>
                   <w:color w:val="0B4F9E"/>
@@ -16785,7 +17303,7 @@
               <w:jc w:val="left"/>
             </w:pPr>
             <w:r/>
-            <w:hyperlink r:id="rId189">
+            <w:hyperlink r:id="rId194">
               <w:r>
                 <w:rPr>
                   <w:color w:val="0B4F9E"/>
@@ -16808,7 +17326,7 @@
               <w:jc w:val="left"/>
             </w:pPr>
             <w:r/>
-            <w:hyperlink r:id="rId190">
+            <w:hyperlink r:id="rId195">
               <w:r>
                 <w:rPr>
                   <w:color w:val="0B4F9E"/>
@@ -16879,7 +17397,7 @@
               <w:jc w:val="left"/>
             </w:pPr>
             <w:r/>
-            <w:hyperlink r:id="rId190">
+            <w:hyperlink r:id="rId195">
               <w:r>
                 <w:rPr>
                   <w:color w:val="0B4F9E"/>
@@ -16902,7 +17420,7 @@
               <w:jc w:val="left"/>
             </w:pPr>
             <w:r/>
-            <w:hyperlink r:id="rId191">
+            <w:hyperlink r:id="rId196">
               <w:r>
                 <w:rPr>
                   <w:color w:val="0B4F9E"/>
@@ -16979,7 +17497,7 @@
               <w:jc w:val="left"/>
             </w:pPr>
             <w:r/>
-            <w:hyperlink r:id="rId191">
+            <w:hyperlink r:id="rId196">
               <w:r>
                 <w:rPr>
                   <w:color w:val="0B4F9E"/>
@@ -17002,7 +17520,7 @@
               <w:jc w:val="left"/>
             </w:pPr>
             <w:r/>
-            <w:hyperlink r:id="rId192">
+            <w:hyperlink r:id="rId197">
               <w:r>
                 <w:rPr>
                   <w:color w:val="0B4F9E"/>
@@ -17073,7 +17591,7 @@
               <w:jc w:val="left"/>
             </w:pPr>
             <w:r/>
-            <w:hyperlink r:id="rId192">
+            <w:hyperlink r:id="rId197">
               <w:r>
                 <w:rPr>
                   <w:color w:val="0B4F9E"/>
@@ -17096,7 +17614,7 @@
               <w:jc w:val="left"/>
             </w:pPr>
             <w:r/>
-            <w:hyperlink r:id="rId193">
+            <w:hyperlink r:id="rId198">
               <w:r>
                 <w:rPr>
                   <w:color w:val="0B4F9E"/>
@@ -17173,7 +17691,7 @@
               <w:jc w:val="left"/>
             </w:pPr>
             <w:r/>
-            <w:hyperlink r:id="rId193">
+            <w:hyperlink r:id="rId198">
               <w:r>
                 <w:rPr>
                   <w:color w:val="0B4F9E"/>
@@ -17196,7 +17714,7 @@
               <w:jc w:val="left"/>
             </w:pPr>
             <w:r/>
-            <w:hyperlink r:id="rId194">
+            <w:hyperlink r:id="rId199">
               <w:r>
                 <w:rPr>
                   <w:color w:val="0B4F9E"/>
@@ -17273,7 +17791,7 @@
               <w:jc w:val="left"/>
             </w:pPr>
             <w:r/>
-            <w:hyperlink r:id="rId194">
+            <w:hyperlink r:id="rId199">
               <w:r>
                 <w:rPr>
                   <w:color w:val="0B4F9E"/>
@@ -17296,7 +17814,7 @@
               <w:jc w:val="left"/>
             </w:pPr>
             <w:r/>
-            <w:hyperlink r:id="rId195">
+            <w:hyperlink r:id="rId200">
               <w:r>
                 <w:rPr>
                   <w:color w:val="0B4F9E"/>
@@ -17373,7 +17891,7 @@
               <w:jc w:val="left"/>
             </w:pPr>
             <w:r/>
-            <w:hyperlink r:id="rId195">
+            <w:hyperlink r:id="rId200">
               <w:r>
                 <w:rPr>
                   <w:color w:val="0B4F9E"/>
@@ -17396,7 +17914,7 @@
               <w:jc w:val="left"/>
             </w:pPr>
             <w:r/>
-            <w:hyperlink r:id="rId196">
+            <w:hyperlink r:id="rId201">
               <w:r>
                 <w:rPr>
                   <w:color w:val="0B4F9E"/>
@@ -17467,7 +17985,7 @@
               <w:jc w:val="left"/>
             </w:pPr>
             <w:r/>
-            <w:hyperlink r:id="rId196">
+            <w:hyperlink r:id="rId201">
               <w:r>
                 <w:rPr>
                   <w:color w:val="0B4F9E"/>
@@ -17490,7 +18008,7 @@
               <w:jc w:val="left"/>
             </w:pPr>
             <w:r/>
-            <w:hyperlink r:id="rId197">
+            <w:hyperlink r:id="rId202">
               <w:r>
                 <w:rPr>
                   <w:color w:val="0B4F9E"/>
@@ -17567,7 +18085,7 @@
               <w:jc w:val="left"/>
             </w:pPr>
             <w:r/>
-            <w:hyperlink r:id="rId197">
+            <w:hyperlink r:id="rId202">
               <w:r>
                 <w:rPr>
                   <w:color w:val="0B4F9E"/>
@@ -17590,7 +18108,7 @@
               <w:jc w:val="left"/>
             </w:pPr>
             <w:r/>
-            <w:hyperlink r:id="rId198">
+            <w:hyperlink r:id="rId203">
               <w:r>
                 <w:rPr>
                   <w:color w:val="0B4F9E"/>
@@ -17661,7 +18179,7 @@
               <w:jc w:val="left"/>
             </w:pPr>
             <w:r/>
-            <w:hyperlink r:id="rId198">
+            <w:hyperlink r:id="rId203">
               <w:r>
                 <w:rPr>
                   <w:color w:val="0B4F9E"/>
@@ -17684,7 +18202,7 @@
               <w:jc w:val="left"/>
             </w:pPr>
             <w:r/>
-            <w:hyperlink r:id="rId199">
+            <w:hyperlink r:id="rId204">
               <w:r>
                 <w:rPr>
                   <w:color w:val="0B4F9E"/>
@@ -17755,7 +18273,7 @@
               <w:jc w:val="left"/>
             </w:pPr>
             <w:r/>
-            <w:hyperlink r:id="rId199">
+            <w:hyperlink r:id="rId204">
               <w:r>
                 <w:rPr>
                   <w:color w:val="0B4F9E"/>
@@ -17778,7 +18296,7 @@
               <w:jc w:val="left"/>
             </w:pPr>
             <w:r/>
-            <w:hyperlink r:id="rId200">
+            <w:hyperlink r:id="rId205">
               <w:r>
                 <w:rPr>
                   <w:color w:val="0B4F9E"/>
@@ -17849,7 +18367,7 @@
               <w:jc w:val="left"/>
             </w:pPr>
             <w:r/>
-            <w:hyperlink r:id="rId200">
+            <w:hyperlink r:id="rId205">
               <w:r>
                 <w:rPr>
                   <w:color w:val="0B4F9E"/>
@@ -17872,7 +18390,7 @@
               <w:jc w:val="left"/>
             </w:pPr>
             <w:r/>
-            <w:hyperlink r:id="rId201">
+            <w:hyperlink r:id="rId206">
               <w:r>
                 <w:rPr>
                   <w:color w:val="0B4F9E"/>
@@ -17949,7 +18467,7 @@
               <w:jc w:val="left"/>
             </w:pPr>
             <w:r/>
-            <w:hyperlink r:id="rId201">
+            <w:hyperlink r:id="rId206">
               <w:r>
                 <w:rPr>
                   <w:color w:val="0B4F9E"/>
@@ -17972,7 +18490,7 @@
               <w:jc w:val="left"/>
             </w:pPr>
             <w:r/>
-            <w:hyperlink r:id="rId202">
+            <w:hyperlink r:id="rId207">
               <w:r>
                 <w:rPr>
                   <w:color w:val="0B4F9E"/>
@@ -18043,7 +18561,7 @@
               <w:jc w:val="left"/>
             </w:pPr>
             <w:r/>
-            <w:hyperlink r:id="rId202">
+            <w:hyperlink r:id="rId207">
               <w:r>
                 <w:rPr>
                   <w:color w:val="0B4F9E"/>
@@ -18066,7 +18584,7 @@
               <w:jc w:val="left"/>
             </w:pPr>
             <w:r/>
-            <w:hyperlink r:id="rId203">
+            <w:hyperlink r:id="rId208">
               <w:r>
                 <w:rPr>
                   <w:color w:val="0B4F9E"/>
@@ -18137,7 +18655,7 @@
               <w:jc w:val="left"/>
             </w:pPr>
             <w:r/>
-            <w:hyperlink r:id="rId203">
+            <w:hyperlink r:id="rId208">
               <w:r>
                 <w:rPr>
                   <w:color w:val="0B4F9E"/>
@@ -18160,7 +18678,7 @@
               <w:jc w:val="left"/>
             </w:pPr>
             <w:r/>
-            <w:hyperlink r:id="rId204">
+            <w:hyperlink r:id="rId209">
               <w:r>
                 <w:rPr>
                   <w:color w:val="0B4F9E"/>
@@ -18231,7 +18749,7 @@
               <w:jc w:val="left"/>
             </w:pPr>
             <w:r/>
-            <w:hyperlink r:id="rId204">
+            <w:hyperlink r:id="rId209">
               <w:r>
                 <w:rPr>
                   <w:color w:val="0B4F9E"/>
@@ -18254,7 +18772,7 @@
               <w:jc w:val="left"/>
             </w:pPr>
             <w:r/>
-            <w:hyperlink r:id="rId205">
+            <w:hyperlink r:id="rId210">
               <w:r>
                 <w:rPr>
                   <w:color w:val="0B4F9E"/>
@@ -18331,7 +18849,7 @@
               <w:jc w:val="left"/>
             </w:pPr>
             <w:r/>
-            <w:hyperlink r:id="rId205">
+            <w:hyperlink r:id="rId210">
               <w:r>
                 <w:rPr>
                   <w:color w:val="0B4F9E"/>
@@ -18354,7 +18872,7 @@
               <w:jc w:val="left"/>
             </w:pPr>
             <w:r/>
-            <w:hyperlink r:id="rId206">
+            <w:hyperlink r:id="rId211">
               <w:r>
                 <w:rPr>
                   <w:color w:val="0B4F9E"/>
@@ -18425,7 +18943,7 @@
               <w:jc w:val="left"/>
             </w:pPr>
             <w:r/>
-            <w:hyperlink r:id="rId206">
+            <w:hyperlink r:id="rId211">
               <w:r>
                 <w:rPr>
                   <w:color w:val="0B4F9E"/>
@@ -18448,7 +18966,7 @@
               <w:jc w:val="left"/>
             </w:pPr>
             <w:r/>
-            <w:hyperlink r:id="rId207">
+            <w:hyperlink r:id="rId212">
               <w:r>
                 <w:rPr>
                   <w:color w:val="0B4F9E"/>
@@ -18519,7 +19037,7 @@
               <w:jc w:val="left"/>
             </w:pPr>
             <w:r/>
-            <w:hyperlink r:id="rId207">
+            <w:hyperlink r:id="rId212">
               <w:r>
                 <w:rPr>
                   <w:color w:val="0B4F9E"/>
@@ -18542,7 +19060,7 @@
               <w:jc w:val="left"/>
             </w:pPr>
             <w:r/>
-            <w:hyperlink r:id="rId208">
+            <w:hyperlink r:id="rId213">
               <w:r>
                 <w:rPr>
                   <w:color w:val="0B4F9E"/>
@@ -18613,7 +19131,7 @@
               <w:jc w:val="left"/>
             </w:pPr>
             <w:r/>
-            <w:hyperlink r:id="rId208">
+            <w:hyperlink r:id="rId213">
               <w:r>
                 <w:rPr>
                   <w:color w:val="0B4F9E"/>
@@ -18636,7 +19154,7 @@
               <w:jc w:val="left"/>
             </w:pPr>
             <w:r/>
-            <w:hyperlink r:id="rId209">
+            <w:hyperlink r:id="rId214">
               <w:r>
                 <w:rPr>
                   <w:color w:val="0B4F9E"/>
@@ -18707,7 +19225,7 @@
               <w:jc w:val="left"/>
             </w:pPr>
             <w:r/>
-            <w:hyperlink r:id="rId209">
+            <w:hyperlink r:id="rId214">
               <w:r>
                 <w:rPr>
                   <w:color w:val="0B4F9E"/>
@@ -18730,7 +19248,7 @@
               <w:jc w:val="left"/>
             </w:pPr>
             <w:r/>
-            <w:hyperlink r:id="rId210">
+            <w:hyperlink r:id="rId215">
               <w:r>
                 <w:rPr>
                   <w:color w:val="0B4F9E"/>
@@ -18801,7 +19319,7 @@
               <w:jc w:val="left"/>
             </w:pPr>
             <w:r/>
-            <w:hyperlink r:id="rId210">
+            <w:hyperlink r:id="rId215">
               <w:r>
                 <w:rPr>
                   <w:color w:val="0B4F9E"/>
@@ -18824,7 +19342,7 @@
               <w:jc w:val="left"/>
             </w:pPr>
             <w:r/>
-            <w:hyperlink r:id="rId211">
+            <w:hyperlink r:id="rId216">
               <w:r>
                 <w:rPr>
                   <w:color w:val="0B4F9E"/>
@@ -18895,7 +19413,7 @@
               <w:jc w:val="left"/>
             </w:pPr>
             <w:r/>
-            <w:hyperlink r:id="rId211">
+            <w:hyperlink r:id="rId216">
               <w:r>
                 <w:rPr>
                   <w:color w:val="0B4F9E"/>
@@ -18918,7 +19436,7 @@
               <w:jc w:val="left"/>
             </w:pPr>
             <w:r/>
-            <w:hyperlink r:id="rId212">
+            <w:hyperlink r:id="rId217">
               <w:r>
                 <w:rPr>
                   <w:color w:val="0B4F9E"/>
@@ -18989,7 +19507,7 @@
               <w:jc w:val="left"/>
             </w:pPr>
             <w:r/>
-            <w:hyperlink r:id="rId212">
+            <w:hyperlink r:id="rId217">
               <w:r>
                 <w:rPr>
                   <w:color w:val="0B4F9E"/>
@@ -19012,7 +19530,7 @@
               <w:jc w:val="left"/>
             </w:pPr>
             <w:r/>
-            <w:hyperlink r:id="rId213">
+            <w:hyperlink r:id="rId218">
               <w:r>
                 <w:rPr>
                   <w:color w:val="0B4F9E"/>
@@ -19083,7 +19601,7 @@
               <w:jc w:val="left"/>
             </w:pPr>
             <w:r/>
-            <w:hyperlink r:id="rId213">
+            <w:hyperlink r:id="rId218">
               <w:r>
                 <w:rPr>
                   <w:color w:val="0B4F9E"/>
@@ -19106,7 +19624,7 @@
               <w:jc w:val="left"/>
             </w:pPr>
             <w:r/>
-            <w:hyperlink r:id="rId214">
+            <w:hyperlink r:id="rId219">
               <w:r>
                 <w:rPr>
                   <w:color w:val="0B4F9E"/>
@@ -19177,7 +19695,7 @@
               <w:jc w:val="left"/>
             </w:pPr>
             <w:r/>
-            <w:hyperlink r:id="rId214">
+            <w:hyperlink r:id="rId219">
               <w:r>
                 <w:rPr>
                   <w:color w:val="0B4F9E"/>
@@ -19200,7 +19718,7 @@
               <w:jc w:val="left"/>
             </w:pPr>
             <w:r/>
-            <w:hyperlink r:id="rId215">
+            <w:hyperlink r:id="rId220">
               <w:r>
                 <w:rPr>
                   <w:color w:val="0B4F9E"/>
@@ -19277,7 +19795,7 @@
               <w:jc w:val="left"/>
             </w:pPr>
             <w:r/>
-            <w:hyperlink r:id="rId215">
+            <w:hyperlink r:id="rId220">
               <w:r>
                 <w:rPr>
                   <w:color w:val="0B4F9E"/>
@@ -19300,7 +19818,7 @@
               <w:jc w:val="left"/>
             </w:pPr>
             <w:r/>
-            <w:hyperlink r:id="rId216">
+            <w:hyperlink r:id="rId221">
               <w:r>
                 <w:rPr>
                   <w:color w:val="0B4F9E"/>
@@ -19377,7 +19895,7 @@
               <w:jc w:val="left"/>
             </w:pPr>
             <w:r/>
-            <w:hyperlink r:id="rId216">
+            <w:hyperlink r:id="rId221">
               <w:r>
                 <w:rPr>
                   <w:color w:val="0B4F9E"/>
@@ -19400,7 +19918,7 @@
               <w:jc w:val="left"/>
             </w:pPr>
             <w:r/>
-            <w:hyperlink r:id="rId217">
+            <w:hyperlink r:id="rId222">
               <w:r>
                 <w:rPr>
                   <w:color w:val="0B4F9E"/>
@@ -19471,7 +19989,7 @@
               <w:jc w:val="left"/>
             </w:pPr>
             <w:r/>
-            <w:hyperlink r:id="rId217">
+            <w:hyperlink r:id="rId222">
               <w:r>
                 <w:rPr>
                   <w:color w:val="0B4F9E"/>
@@ -19494,7 +20012,7 @@
               <w:jc w:val="left"/>
             </w:pPr>
             <w:r/>
-            <w:hyperlink r:id="rId218">
+            <w:hyperlink r:id="rId223">
               <w:r>
                 <w:rPr>
                   <w:color w:val="0B4F9E"/>
@@ -19565,7 +20083,7 @@
               <w:jc w:val="left"/>
             </w:pPr>
             <w:r/>
-            <w:hyperlink r:id="rId218">
+            <w:hyperlink r:id="rId223">
               <w:r>
                 <w:rPr>
                   <w:color w:val="0B4F9E"/>
@@ -19588,7 +20106,7 @@
               <w:jc w:val="left"/>
             </w:pPr>
             <w:r/>
-            <w:hyperlink r:id="rId219">
+            <w:hyperlink r:id="rId224">
               <w:r>
                 <w:rPr>
                   <w:color w:val="0B4F9E"/>
@@ -19659,7 +20177,7 @@
               <w:jc w:val="left"/>
             </w:pPr>
             <w:r/>
-            <w:hyperlink r:id="rId219">
+            <w:hyperlink r:id="rId224">
               <w:r>
                 <w:rPr>
                   <w:color w:val="0B4F9E"/>
@@ -19682,7 +20200,7 @@
               <w:jc w:val="left"/>
             </w:pPr>
             <w:r/>
-            <w:hyperlink r:id="rId220">
+            <w:hyperlink r:id="rId225">
               <w:r>
                 <w:rPr>
                   <w:color w:val="0B4F9E"/>
@@ -19759,7 +20277,7 @@
               <w:jc w:val="left"/>
             </w:pPr>
             <w:r/>
-            <w:hyperlink r:id="rId220">
+            <w:hyperlink r:id="rId225">
               <w:r>
                 <w:rPr>
                   <w:color w:val="0B4F9E"/>
@@ -19782,7 +20300,7 @@
               <w:jc w:val="left"/>
             </w:pPr>
             <w:r/>
-            <w:hyperlink r:id="rId221">
+            <w:hyperlink r:id="rId226">
               <w:r>
                 <w:rPr>
                   <w:color w:val="0B4F9E"/>
@@ -19859,7 +20377,7 @@
               <w:jc w:val="left"/>
             </w:pPr>
             <w:r/>
-            <w:hyperlink r:id="rId221">
+            <w:hyperlink r:id="rId226">
               <w:r>
                 <w:rPr>
                   <w:color w:val="0B4F9E"/>
@@ -19882,7 +20400,7 @@
               <w:jc w:val="left"/>
             </w:pPr>
             <w:r/>
-            <w:hyperlink r:id="rId222">
+            <w:hyperlink r:id="rId227">
               <w:r>
                 <w:rPr>
                   <w:color w:val="0B4F9E"/>
@@ -19959,7 +20477,7 @@
               <w:jc w:val="left"/>
             </w:pPr>
             <w:r/>
-            <w:hyperlink r:id="rId222">
+            <w:hyperlink r:id="rId227">
               <w:r>
                 <w:rPr>
                   <w:color w:val="0B4F9E"/>
@@ -19982,7 +20500,7 @@
               <w:jc w:val="left"/>
             </w:pPr>
             <w:r/>
-            <w:hyperlink r:id="rId223">
+            <w:hyperlink r:id="rId228">
               <w:r>
                 <w:rPr>
                   <w:color w:val="0B4F9E"/>
@@ -20053,7 +20571,7 @@
               <w:jc w:val="left"/>
             </w:pPr>
             <w:r/>
-            <w:hyperlink r:id="rId223">
+            <w:hyperlink r:id="rId228">
               <w:r>
                 <w:rPr>
                   <w:color w:val="0B4F9E"/>
@@ -20076,7 +20594,7 @@
               <w:jc w:val="left"/>
             </w:pPr>
             <w:r/>
-            <w:hyperlink r:id="rId224">
+            <w:hyperlink r:id="rId229">
               <w:r>
                 <w:rPr>
                   <w:color w:val="0B4F9E"/>
@@ -20147,7 +20665,7 @@
               <w:jc w:val="left"/>
             </w:pPr>
             <w:r/>
-            <w:hyperlink r:id="rId224">
+            <w:hyperlink r:id="rId229">
               <w:r>
                 <w:rPr>
                   <w:color w:val="0B4F9E"/>
@@ -20170,7 +20688,7 @@
               <w:jc w:val="left"/>
             </w:pPr>
             <w:r/>
-            <w:hyperlink r:id="rId225">
+            <w:hyperlink r:id="rId230">
               <w:r>
                 <w:rPr>
                   <w:color w:val="0B4F9E"/>
@@ -20241,7 +20759,7 @@
               <w:jc w:val="left"/>
             </w:pPr>
             <w:r/>
-            <w:hyperlink r:id="rId225">
+            <w:hyperlink r:id="rId230">
               <w:r>
                 <w:rPr>
                   <w:color w:val="0B4F9E"/>
@@ -20264,7 +20782,7 @@
               <w:jc w:val="left"/>
             </w:pPr>
             <w:r/>
-            <w:hyperlink r:id="rId226">
+            <w:hyperlink r:id="rId231">
               <w:r>
                 <w:rPr>
                   <w:color w:val="0B4F9E"/>
@@ -20335,7 +20853,7 @@
               <w:jc w:val="left"/>
             </w:pPr>
             <w:r/>
-            <w:hyperlink r:id="rId226">
+            <w:hyperlink r:id="rId231">
               <w:r>
                 <w:rPr>
                   <w:color w:val="0B4F9E"/>
@@ -20358,7 +20876,7 @@
               <w:jc w:val="left"/>
             </w:pPr>
             <w:r/>
-            <w:hyperlink r:id="rId227">
+            <w:hyperlink r:id="rId232">
               <w:r>
                 <w:rPr>
                   <w:color w:val="0B4F9E"/>
@@ -20429,7 +20947,7 @@
               <w:jc w:val="left"/>
             </w:pPr>
             <w:r/>
-            <w:hyperlink r:id="rId227">
+            <w:hyperlink r:id="rId232">
               <w:r>
                 <w:rPr>
                   <w:color w:val="0B4F9E"/>
@@ -20452,7 +20970,7 @@
               <w:jc w:val="left"/>
             </w:pPr>
             <w:r/>
-            <w:hyperlink r:id="rId228">
+            <w:hyperlink r:id="rId233">
               <w:r>
                 <w:rPr>
                   <w:color w:val="0B4F9E"/>
@@ -20523,7 +21041,7 @@
               <w:jc w:val="left"/>
             </w:pPr>
             <w:r/>
-            <w:hyperlink r:id="rId228">
+            <w:hyperlink r:id="rId233">
               <w:r>
                 <w:rPr>
                   <w:color w:val="0B4F9E"/>
@@ -20546,7 +21064,7 @@
               <w:jc w:val="left"/>
             </w:pPr>
             <w:r/>
-            <w:hyperlink r:id="rId229">
+            <w:hyperlink r:id="rId234">
               <w:r>
                 <w:rPr>
                   <w:color w:val="0B4F9E"/>
@@ -20617,7 +21135,7 @@
               <w:jc w:val="left"/>
             </w:pPr>
             <w:r/>
-            <w:hyperlink r:id="rId229">
+            <w:hyperlink r:id="rId234">
               <w:r>
                 <w:rPr>
                   <w:color w:val="0B4F9E"/>
@@ -20640,7 +21158,7 @@
               <w:jc w:val="left"/>
             </w:pPr>
             <w:r/>
-            <w:hyperlink r:id="rId230">
+            <w:hyperlink r:id="rId235">
               <w:r>
                 <w:rPr>
                   <w:color w:val="0B4F9E"/>
@@ -20717,7 +21235,7 @@
               <w:jc w:val="left"/>
             </w:pPr>
             <w:r/>
-            <w:hyperlink r:id="rId230">
+            <w:hyperlink r:id="rId235">
               <w:r>
                 <w:rPr>
                   <w:color w:val="0B4F9E"/>
@@ -20740,7 +21258,7 @@
               <w:jc w:val="left"/>
             </w:pPr>
             <w:r/>
-            <w:hyperlink r:id="rId231">
+            <w:hyperlink r:id="rId236">
               <w:r>
                 <w:rPr>
                   <w:color w:val="0B4F9E"/>
@@ -20811,7 +21329,7 @@
               <w:jc w:val="left"/>
             </w:pPr>
             <w:r/>
-            <w:hyperlink r:id="rId231">
+            <w:hyperlink r:id="rId236">
               <w:r>
                 <w:rPr>
                   <w:color w:val="0B4F9E"/>
@@ -20834,7 +21352,107 @@
               <w:jc w:val="left"/>
             </w:pPr>
             <w:r/>
-            <w:hyperlink r:id="rId232">
+            <w:hyperlink r:id="rId237">
+              <w:r>
+                <w:rPr>
+                  <w:color w:val="0B4F9E"/>
+                  <w:sz w:val="16"/>
+                  <w:u w:val="single"/>
+                </w:rPr>
+                <w:t>The tabGAP files for "A General-Purpose and Eﬀicient Machine-Learned Potential for SiC from Ambient to Extreme Environme</w:t>
+              </w:r>
+            </w:hyperlink>
+          </w:p>
+        </w:tc>
+        <w:tc>
+          <w:tcPr>
+            <w:tcW w:type="dxa" w:w="1680"/>
+          </w:tcPr>
+          <w:p>
+            <w:pPr>
+              <w:jc w:val="left"/>
+            </w:pPr>
+            <w:r/>
+          </w:p>
+        </w:tc>
+        <w:tc>
+          <w:tcPr>
+            <w:tcW w:type="dxa" w:w="1680"/>
+          </w:tcPr>
+          <w:p>
+            <w:pPr>
+              <w:jc w:val="left"/>
+            </w:pPr>
+            <w:r/>
+          </w:p>
+        </w:tc>
+        <w:tc>
+          <w:tcPr>
+            <w:tcW w:type="dxa" w:w="1680"/>
+          </w:tcPr>
+          <w:p>
+            <w:pPr>
+              <w:jc w:val="left"/>
+            </w:pPr>
+            <w:r/>
+            <w:r>
+              <w:rPr>
+                <w:sz w:val="16"/>
+              </w:rPr>
+              <w:t>MLIP</w:t>
+            </w:r>
+          </w:p>
+        </w:tc>
+        <w:tc>
+          <w:tcPr>
+            <w:tcW w:type="dxa" w:w="1680"/>
+          </w:tcPr>
+          <w:p>
+            <w:pPr>
+              <w:jc w:val="left"/>
+            </w:pPr>
+            <w:r/>
+            <w:r>
+              <w:rPr>
+                <w:sz w:val="16"/>
+              </w:rPr>
+              <w:t>2026-09-07</w:t>
+            </w:r>
+          </w:p>
+        </w:tc>
+        <w:tc>
+          <w:tcPr>
+            <w:tcW w:type="dxa" w:w="1680"/>
+          </w:tcPr>
+          <w:p>
+            <w:pPr>
+              <w:jc w:val="left"/>
+            </w:pPr>
+            <w:r/>
+            <w:hyperlink r:id="rId237">
+              <w:r>
+                <w:rPr>
+                  <w:color w:val="0B4F9E"/>
+                  <w:sz w:val="16"/>
+                  <w:u w:val="single"/>
+                </w:rPr>
+                <w:t>10.6084/m9.figshare.33443881.v1</w:t>
+              </w:r>
+            </w:hyperlink>
+          </w:p>
+        </w:tc>
+      </w:tr>
+      <w:tr>
+        <w:tc>
+          <w:tcPr>
+            <w:tcW w:type="dxa" w:w="1680"/>
+          </w:tcPr>
+          <w:p>
+            <w:pPr>
+              <w:jc w:val="left"/>
+            </w:pPr>
+            <w:r/>
+            <w:hyperlink r:id="rId238">
               <w:r>
                 <w:rPr>
                   <w:color w:val="0B4F9E"/>
@@ -20905,7 +21523,7 @@
               <w:jc w:val="left"/>
             </w:pPr>
             <w:r/>
-            <w:hyperlink r:id="rId232">
+            <w:hyperlink r:id="rId238">
               <w:r>
                 <w:rPr>
                   <w:color w:val="0B4F9E"/>
@@ -20913,6 +21531,300 @@
                   <w:u w:val="single"/>
                 </w:rPr>
                 <w:t>10.1016/j.saa.2026.128744</w:t>
+              </w:r>
+            </w:hyperlink>
+          </w:p>
+        </w:tc>
+      </w:tr>
+      <w:tr>
+        <w:tc>
+          <w:tcPr>
+            <w:tcW w:type="dxa" w:w="1680"/>
+          </w:tcPr>
+          <w:p>
+            <w:pPr>
+              <w:jc w:val="left"/>
+            </w:pPr>
+            <w:r/>
+            <w:hyperlink r:id="rId239">
+              <w:r>
+                <w:rPr>
+                  <w:color w:val="0B4F9E"/>
+                  <w:sz w:val="16"/>
+                  <w:u w:val="single"/>
+                </w:rPr>
+                <w:t>∆-Machine Learning for LC-DFT-level Excitation Energies of Bacteriochlorophyll Molecules in a LH2 Complex</w:t>
+              </w:r>
+            </w:hyperlink>
+          </w:p>
+        </w:tc>
+        <w:tc>
+          <w:tcPr>
+            <w:tcW w:type="dxa" w:w="1680"/>
+          </w:tcPr>
+          <w:p>
+            <w:pPr>
+              <w:jc w:val="left"/>
+            </w:pPr>
+            <w:r/>
+          </w:p>
+        </w:tc>
+        <w:tc>
+          <w:tcPr>
+            <w:tcW w:type="dxa" w:w="1680"/>
+          </w:tcPr>
+          <w:p>
+            <w:pPr>
+              <w:jc w:val="left"/>
+            </w:pPr>
+            <w:r/>
+          </w:p>
+        </w:tc>
+        <w:tc>
+          <w:tcPr>
+            <w:tcW w:type="dxa" w:w="1680"/>
+          </w:tcPr>
+          <w:p>
+            <w:pPr>
+              <w:jc w:val="left"/>
+            </w:pPr>
+            <w:r/>
+            <w:r>
+              <w:rPr>
+                <w:sz w:val="16"/>
+              </w:rPr>
+              <w:t>DFT, tight-binding</w:t>
+            </w:r>
+          </w:p>
+        </w:tc>
+        <w:tc>
+          <w:tcPr>
+            <w:tcW w:type="dxa" w:w="1680"/>
+          </w:tcPr>
+          <w:p>
+            <w:pPr>
+              <w:jc w:val="left"/>
+            </w:pPr>
+            <w:r/>
+            <w:r>
+              <w:rPr>
+                <w:sz w:val="16"/>
+              </w:rPr>
+              <w:t>2026-09-08</w:t>
+            </w:r>
+          </w:p>
+        </w:tc>
+        <w:tc>
+          <w:tcPr>
+            <w:tcW w:type="dxa" w:w="1680"/>
+          </w:tcPr>
+          <w:p>
+            <w:pPr>
+              <w:jc w:val="left"/>
+            </w:pPr>
+            <w:r/>
+            <w:hyperlink r:id="rId239">
+              <w:r>
+                <w:rPr>
+                  <w:color w:val="0B4F9E"/>
+                  <w:sz w:val="16"/>
+                  <w:u w:val="single"/>
+                </w:rPr>
+                <w:t>10.26434/chemrxiv.15002714/v2</w:t>
+              </w:r>
+            </w:hyperlink>
+          </w:p>
+        </w:tc>
+      </w:tr>
+      <w:tr>
+        <w:tc>
+          <w:tcPr>
+            <w:tcW w:type="dxa" w:w="1680"/>
+          </w:tcPr>
+          <w:p>
+            <w:pPr>
+              <w:jc w:val="left"/>
+            </w:pPr>
+            <w:r/>
+            <w:hyperlink r:id="rId240">
+              <w:r>
+                <w:rPr>
+                  <w:color w:val="0B4F9E"/>
+                  <w:sz w:val="16"/>
+                  <w:u w:val="single"/>
+                </w:rPr>
+                <w:t>Research on the Architecture of Artificial Intelligence-Driven Personalized Customization Industrial Design System</w:t>
+              </w:r>
+            </w:hyperlink>
+          </w:p>
+        </w:tc>
+        <w:tc>
+          <w:tcPr>
+            <w:tcW w:type="dxa" w:w="1680"/>
+          </w:tcPr>
+          <w:p>
+            <w:pPr>
+              <w:jc w:val="left"/>
+            </w:pPr>
+            <w:r/>
+          </w:p>
+        </w:tc>
+        <w:tc>
+          <w:tcPr>
+            <w:tcW w:type="dxa" w:w="1680"/>
+          </w:tcPr>
+          <w:p>
+            <w:pPr>
+              <w:jc w:val="left"/>
+            </w:pPr>
+            <w:r/>
+          </w:p>
+        </w:tc>
+        <w:tc>
+          <w:tcPr>
+            <w:tcW w:type="dxa" w:w="1680"/>
+          </w:tcPr>
+          <w:p>
+            <w:pPr>
+              <w:jc w:val="left"/>
+            </w:pPr>
+            <w:r/>
+          </w:p>
+        </w:tc>
+        <w:tc>
+          <w:tcPr>
+            <w:tcW w:type="dxa" w:w="1680"/>
+          </w:tcPr>
+          <w:p>
+            <w:pPr>
+              <w:jc w:val="left"/>
+            </w:pPr>
+            <w:r/>
+            <w:r>
+              <w:rPr>
+                <w:sz w:val="16"/>
+              </w:rPr>
+              <w:t>2026-09-08</w:t>
+            </w:r>
+          </w:p>
+        </w:tc>
+        <w:tc>
+          <w:tcPr>
+            <w:tcW w:type="dxa" w:w="1680"/>
+          </w:tcPr>
+          <w:p>
+            <w:pPr>
+              <w:jc w:val="left"/>
+            </w:pPr>
+            <w:r/>
+            <w:hyperlink r:id="rId240">
+              <w:r>
+                <w:rPr>
+                  <w:color w:val="0B4F9E"/>
+                  <w:sz w:val="16"/>
+                  <w:u w:val="single"/>
+                </w:rPr>
+                <w:t>10.4018/ijismd.421484</w:t>
+              </w:r>
+            </w:hyperlink>
+          </w:p>
+        </w:tc>
+      </w:tr>
+      <w:tr>
+        <w:tc>
+          <w:tcPr>
+            <w:tcW w:type="dxa" w:w="1680"/>
+          </w:tcPr>
+          <w:p>
+            <w:pPr>
+              <w:jc w:val="left"/>
+            </w:pPr>
+            <w:r/>
+            <w:hyperlink r:id="rId241">
+              <w:r>
+                <w:rPr>
+                  <w:color w:val="0B4F9E"/>
+                  <w:sz w:val="16"/>
+                  <w:u w:val="single"/>
+                </w:rPr>
+                <w:t>QSARmil: A Package for Molecular Multi-Instance Machine Learning</w:t>
+              </w:r>
+            </w:hyperlink>
+          </w:p>
+        </w:tc>
+        <w:tc>
+          <w:tcPr>
+            <w:tcW w:type="dxa" w:w="1680"/>
+          </w:tcPr>
+          <w:p>
+            <w:pPr>
+              <w:jc w:val="left"/>
+            </w:pPr>
+            <w:r/>
+          </w:p>
+        </w:tc>
+        <w:tc>
+          <w:tcPr>
+            <w:tcW w:type="dxa" w:w="1680"/>
+          </w:tcPr>
+          <w:p>
+            <w:pPr>
+              <w:jc w:val="left"/>
+            </w:pPr>
+            <w:r/>
+          </w:p>
+        </w:tc>
+        <w:tc>
+          <w:tcPr>
+            <w:tcW w:type="dxa" w:w="1680"/>
+          </w:tcPr>
+          <w:p>
+            <w:pPr>
+              <w:jc w:val="left"/>
+            </w:pPr>
+            <w:r/>
+            <w:r>
+              <w:rPr>
+                <w:sz w:val="16"/>
+              </w:rPr>
+              <w:t>MLIP</w:t>
+            </w:r>
+          </w:p>
+        </w:tc>
+        <w:tc>
+          <w:tcPr>
+            <w:tcW w:type="dxa" w:w="1680"/>
+          </w:tcPr>
+          <w:p>
+            <w:pPr>
+              <w:jc w:val="left"/>
+            </w:pPr>
+            <w:r/>
+            <w:r>
+              <w:rPr>
+                <w:sz w:val="16"/>
+              </w:rPr>
+              <w:t>2026-09-08</w:t>
+            </w:r>
+          </w:p>
+        </w:tc>
+        <w:tc>
+          <w:tcPr>
+            <w:tcW w:type="dxa" w:w="1680"/>
+          </w:tcPr>
+          <w:p>
+            <w:pPr>
+              <w:jc w:val="left"/>
+            </w:pPr>
+            <w:r/>
+            <w:hyperlink r:id="rId241">
+              <w:r>
+                <w:rPr>
+                  <w:color w:val="0B4F9E"/>
+                  <w:sz w:val="16"/>
+                  <w:u w:val="single"/>
+                </w:rPr>
+                <w:t>10.26434/chemrxiv.15008449/v1</w:t>
               </w:r>
             </w:hyperlink>
           </w:p>
@@ -20939,7 +21851,7 @@
         <w:rPr>
           <w:b/>
         </w:rPr>
-        <w:t>172</w:t>
+        <w:t>184</w:t>
       </w:r>
     </w:p>
     <w:p>
@@ -20953,7 +21865,7 @@
         <w:rPr>
           <w:b/>
         </w:rPr>
-        <w:t>89</w:t>
+        <w:t>94</w:t>
       </w:r>
     </w:p>
     <w:p>
@@ -20967,7 +21879,7 @@
         <w:rPr>
           <w:b/>
         </w:rPr>
-        <w:t>192</w:t>
+        <w:t>201</w:t>
       </w:r>
     </w:p>
     <w:p>

</xml_diff>

<commit_message>
Digest + summary: 2026-09-12
</commit_message>
<xml_diff>
--- a/NEEDS_DATA.docx
+++ b/NEEDS_DATA.docx
@@ -17,7 +17,7 @@
     </w:p>
     <w:p>
       <w:r>
-        <w:t xml:space="preserve">Generated 2026-09-11. Every field below was blank in the automated sources. Fill any of them in </w:t>
+        <w:t xml:space="preserve">Generated 2026-09-12. Every field below was blank in the automated sources. Fill any of them in </w:t>
       </w:r>
       <w:r>
         <w:rPr>
@@ -1809,7 +1809,7 @@
               <w:rPr>
                 <w:sz w:val="16"/>
               </w:rPr>
-              <w:t>ALIGNN, MEGNet, CGCNN</w:t>
+              <w:t>MEGNet, ALIGNN, CGCNN</w:t>
             </w:r>
           </w:p>
         </w:tc>
@@ -4213,7 +4213,7 @@
               <w:rPr>
                 <w:sz w:val="16"/>
               </w:rPr>
-              <w:t>ALIGNN, CHGNet</w:t>
+              <w:t>CHGNet, ALIGNN</w:t>
             </w:r>
           </w:p>
         </w:tc>
@@ -4319,7 +4319,7 @@
               <w:rPr>
                 <w:sz w:val="16"/>
               </w:rPr>
-              <w:t>MatterGen, MatterSim</w:t>
+              <w:t>MatterSim, MatterGen</w:t>
             </w:r>
           </w:p>
         </w:tc>
@@ -4531,7 +4531,7 @@
               <w:rPr>
                 <w:sz w:val="16"/>
               </w:rPr>
-              <w:t>MatterSim, SevenNet, CHGNet, NequIP, MACE, UMA</w:t>
+              <w:t>MatterSim, SevenNet, NequIP, CHGNet, MACE, UMA</w:t>
             </w:r>
           </w:p>
         </w:tc>

</xml_diff>